<commit_message>
Added Goals, Scope, Definitions, and started System Requirements and Architecture section
</commit_message>
<xml_diff>
--- a/docs/SGC_Manual/1. MO-AME-RSN-XXX MODULO_SIEVECOMP.docx
+++ b/docs/SGC_Manual/1. MO-AME-RSN-XXX MODULO_SIEVECOMP.docx
@@ -274,7 +274,27 @@
                 <w:color w:val="000000"/>
               </w:rPr>
               <w:tab/>
-              <w:t>DESARROLLO</w:t>
+            </w:r>
+            <w:r>
+              <w:rPr>
+                <w:noProof/>
+                <w:color w:val="000000"/>
+              </w:rPr>
+              <w:t>ARQUITECTURA Y REQ</w:t>
+            </w:r>
+            <w:r>
+              <w:rPr>
+                <w:noProof/>
+                <w:color w:val="000000"/>
+              </w:rPr>
+              <w:t>U</w:t>
+            </w:r>
+            <w:r>
+              <w:rPr>
+                <w:noProof/>
+                <w:color w:val="000000"/>
+              </w:rPr>
+              <w:t>ISITOS DEL SISTEMA</w:t>
             </w:r>
             <w:r>
               <w:rPr>
@@ -1750,6 +1770,7 @@
           <w:ilvl w:val="0"/>
           <w:numId w:val="13"/>
         </w:numPr>
+        <w:ind w:left="720" w:hanging="720"/>
       </w:pPr>
       <w:bookmarkStart w:id="1" w:name="_heading=h.alfd938tg2mo" w:colFirst="0" w:colLast="0"/>
       <w:bookmarkEnd w:id="1"/>
@@ -1771,13 +1792,16 @@
         <w:spacing w:after="0"/>
       </w:pPr>
       <w:r>
-        <w:t xml:space="preserve">Definir </w:t>
-      </w:r>
-    </w:p>
-    <w:p>
-      <w:pPr>
-        <w:spacing w:after="0"/>
-      </w:pPr>
+        <w:t xml:space="preserve">Establecer las directrices técnicas y operativas para el uso, configuración y ejecución del paquete computacional </w:t>
+      </w:r>
+      <w:proofErr w:type="spellStart"/>
+      <w:r>
+        <w:t>SieveComP</w:t>
+      </w:r>
+      <w:proofErr w:type="spellEnd"/>
+      <w:r>
+        <w:t xml:space="preserve"> en la Red Sismológica Nacional de Colombia (RSNC), estandarizando y automatizando el proceso de auditoría, control de calidad y filtrado de los catálogos sísmicos paramétricos generados en los sistemas SeisComP del Servicio Geológico Colombiano (SGC).</w:t>
+      </w:r>
     </w:p>
     <w:p>
       <w:pPr>
@@ -1803,7 +1827,78 @@
         <w:spacing w:after="0"/>
       </w:pPr>
       <w:r>
-        <w:t>El</w:t>
+        <w:t xml:space="preserve">El presente manual aplica primordialmente a los analistas, sismólogos y personal técnico del grupo de trabajo de Evaluación, Monitoreo y Diagnóstico de Dinámicas Geológicas de la Dirección de </w:t>
+      </w:r>
+      <w:proofErr w:type="spellStart"/>
+      <w:r>
+        <w:t>Geoamenazas</w:t>
+      </w:r>
+      <w:proofErr w:type="spellEnd"/>
+      <w:r>
+        <w:t xml:space="preserve">, responsables de la revisión rutinaria y la calidad de los catálogos en la sala de monitoreo de la RSNC. Así mismo, su aplicación se extiende a cualquier otro grupo de investigación, observatorio vulcanológico o dependencia dentro </w:t>
+      </w:r>
+      <w:r>
+        <w:t>del SGC</w:t>
+      </w:r>
+      <w:r>
+        <w:t xml:space="preserve"> que requiera extraer, filtrar o auditar datos paramétricos provenientes de las bases de datos de SeisComP para fines investigativos, generación de reportes o desarrollos computacionales.</w:t>
+      </w:r>
+    </w:p>
+    <w:p>
+      <w:pPr>
+        <w:spacing w:after="0"/>
+      </w:pPr>
+    </w:p>
+    <w:p>
+      <w:pPr>
+        <w:spacing w:after="0"/>
+      </w:pPr>
+      <w:r>
+        <w:t xml:space="preserve">Este documento complementa el instructivo vigente </w:t>
+      </w:r>
+      <w:r>
+        <w:t>“</w:t>
+      </w:r>
+      <w:r>
+        <w:t>Operación y gestión del procesamiento de datos sismológicos con SeisComP</w:t>
+      </w:r>
+      <w:r>
+        <w:t>”</w:t>
+      </w:r>
+      <w:r>
+        <w:t xml:space="preserve"> (</w:t>
+      </w:r>
+      <w:r>
+        <w:rPr>
+          <w:b/>
+          <w:bCs/>
+        </w:rPr>
+        <w:t>IN-AME-RSN-016</w:t>
+      </w:r>
+      <w:r>
+        <w:t>) y los manuales operativos de SCOLV (</w:t>
+      </w:r>
+      <w:r>
+        <w:rPr>
+          <w:b/>
+          <w:bCs/>
+        </w:rPr>
+        <w:t>MO-AME-RSN-012</w:t>
+      </w:r>
+      <w:r>
+        <w:t xml:space="preserve">). Mientras que dichos documentos establecen los protocolos de detección, análisis manual y responsabilidades durante los turnos, este manual de </w:t>
+      </w:r>
+      <w:proofErr w:type="spellStart"/>
+      <w:r>
+        <w:rPr>
+          <w:b/>
+          <w:bCs/>
+        </w:rPr>
+        <w:t>SieveComP</w:t>
+      </w:r>
+      <w:proofErr w:type="spellEnd"/>
+      <w:r>
+        <w:t xml:space="preserve"> proporciona la guía detallada para ejecutar la etapa posterior de auditoría y control de calidad automatizado. La integración de esta herramienta de filtrado en los protocolos existentes asegura una depuración exhaustiva de los datos antes de su publicación definitiva, garantizando la confiabilidad del Catálogo Sísmico Nacional y la continuidad operativa de los estándares de monitoreo del SGC.</w:t>
       </w:r>
     </w:p>
     <w:p>
@@ -1834,11 +1929,150 @@
         <w:spacing w:after="0"/>
       </w:pPr>
       <w:r>
+        <w:t xml:space="preserve">La operación, auditoría y control de calidad de los catálogos sísmicos utilizando la herramienta </w:t>
+      </w:r>
+      <w:proofErr w:type="spellStart"/>
+      <w:r>
+        <w:t>SieveComP</w:t>
+      </w:r>
+      <w:proofErr w:type="spellEnd"/>
+      <w:r>
+        <w:t xml:space="preserve"> </w:t>
+      </w:r>
+      <w:r>
+        <w:t>se enmarca en</w:t>
+      </w:r>
+      <w:r>
+        <w:t xml:space="preserve"> las responsabilidades misionales y el marco normativo vigente que rige las actividades de la Red Sismológica Nacional de Colombia y el Servicio Geológico Colombiano:</w:t>
+      </w:r>
+    </w:p>
+    <w:p>
+      <w:pPr>
+        <w:spacing w:after="0"/>
         <w:rPr>
           <w:b/>
           <w:bCs/>
         </w:rPr>
-        <w:t>Decreto Ley 4131 de 2011,</w:t>
+      </w:pPr>
+    </w:p>
+    <w:p>
+      <w:pPr>
+        <w:spacing w:after="0"/>
+      </w:pPr>
+      <w:r>
+        <w:rPr>
+          <w:b/>
+          <w:bCs/>
+        </w:rPr>
+        <w:t>Decreto Ley 4131 de 2011</w:t>
+      </w:r>
+      <w:r>
+        <w:rPr>
+          <w:b/>
+          <w:bCs/>
+        </w:rPr>
+        <w:t xml:space="preserve">: </w:t>
+      </w:r>
+      <w:r>
+        <w:t>Define las funciones del SGC, incluyendo el mandato de generar, integrar conocimientos, compilar, validar, almacenar y suministrar, en forma automatizada y estandarizada, información sobre amenazas geológicas con afectación regional y nacional.</w:t>
+      </w:r>
+    </w:p>
+    <w:p>
+      <w:pPr>
+        <w:spacing w:after="0"/>
+      </w:pPr>
+    </w:p>
+    <w:p>
+      <w:pPr>
+        <w:spacing w:after="0"/>
+      </w:pPr>
+      <w:r>
+        <w:rPr>
+          <w:b/>
+          <w:bCs/>
+        </w:rPr>
+        <w:t>Ley 1523 de 2012:</w:t>
+      </w:r>
+      <w:r>
+        <w:t xml:space="preserve"> Adopta la política nacional de gestión del riesgo de desastres y establece el SNGRD. Asigna al SGC, en sus artículos 20 y 21, la función de orientar las acciones de monitoreo y </w:t>
+      </w:r>
+      <w:r>
+        <w:lastRenderedPageBreak/>
+        <w:t>seguimiento del riesgo, así como comunicar su existencia, alcance y dimensión al sistema nacional y a la sociedad.</w:t>
+      </w:r>
+    </w:p>
+    <w:p>
+      <w:pPr>
+        <w:spacing w:after="0"/>
+      </w:pPr>
+    </w:p>
+    <w:p>
+      <w:pPr>
+        <w:spacing w:after="0"/>
+      </w:pPr>
+      <w:r>
+        <w:rPr>
+          <w:b/>
+          <w:bCs/>
+        </w:rPr>
+        <w:t>Decreto 2703 de 2013:</w:t>
+      </w:r>
+      <w:r>
+        <w:t xml:space="preserve"> Establece la estructura interna del SGC. En su artículo 9, asigna a la Dirección de </w:t>
+      </w:r>
+      <w:proofErr w:type="spellStart"/>
+      <w:r>
+        <w:t>Geoamenazas</w:t>
+      </w:r>
+      <w:proofErr w:type="spellEnd"/>
+      <w:r>
+        <w:t xml:space="preserve"> la función de investigar, monitorear y evaluar fenómenos generadores de amenazas; elaborar estudios y monitorear la actividad sísmica del país; y proveer información sobre riesgo físico a las autoridades competentes y a la comunidad, además de operar y actualizar la Red Sismológica Nacional de Colombia.</w:t>
+      </w:r>
+    </w:p>
+    <w:p>
+      <w:pPr>
+        <w:spacing w:after="0"/>
+      </w:pPr>
+    </w:p>
+    <w:p>
+      <w:pPr>
+        <w:spacing w:after="0"/>
+      </w:pPr>
+      <w:r>
+        <w:rPr>
+          <w:b/>
+          <w:bCs/>
+        </w:rPr>
+        <w:t>Resolución 1281 de 2024:</w:t>
+      </w:r>
+      <w:r>
+        <w:t xml:space="preserve"> Asigna al grupo de trabajo Evaluación, Monitoreo y Diagnóstico de Dinámicas Geológicas de la Dirección de </w:t>
+      </w:r>
+      <w:proofErr w:type="spellStart"/>
+      <w:r>
+        <w:t>Geoamenazas</w:t>
+      </w:r>
+      <w:proofErr w:type="spellEnd"/>
+      <w:r>
+        <w:t xml:space="preserve"> las funciones de diseñar, instalar, mantener y operar las redes de monitoreo sísmico; participar en el diseño e implementación de servicios de datos e información; brindar asistencia técnica al SNGRD ante sismos importantes; y </w:t>
+      </w:r>
+      <w:r>
+        <w:rPr>
+          <w:b/>
+          <w:bCs/>
+        </w:rPr>
+        <w:t>elaborar boletines e informes técnicos sobre la actividad sísmica</w:t>
+      </w:r>
+      <w:r>
+        <w:t xml:space="preserve">, procesos que dependen directamente de la calidad de los datos filtrados por </w:t>
+      </w:r>
+      <w:proofErr w:type="spellStart"/>
+      <w:r>
+        <w:t>SieveComP</w:t>
+      </w:r>
+      <w:proofErr w:type="spellEnd"/>
+      <w:r>
+        <w:t>.</w:t>
       </w:r>
     </w:p>
     <w:p>
@@ -1881,7 +2115,272 @@
         <w:t xml:space="preserve">SeisComP: </w:t>
       </w:r>
       <w:r>
-        <w:t xml:space="preserve">programa informático especializado en el monitoreo sísmico. Es utilizado para la adquisición de datos sismológicos, así como para la detección, procesamiento y notificación de eventos sísmicos en tiempo real. Se compone de distintos módulos y herramientas con funciones específicas, entre los que se encuentra SCOLV, que permiten realizar ajustes detallados en la localización de sismos. </w:t>
+        <w:t>Programa informático especializado en el monitoreo sísmico. Es utilizado para la adquisición de datos sismológicos, así como para la detección, procesamiento y notificación de eventos sísmicos en tiempo real. Se compone de distintos módulos y herramientas con funciones específicas que permiten realizar ajustes detallados en la localización de sismos.</w:t>
+      </w:r>
+    </w:p>
+    <w:p>
+      <w:pPr>
+        <w:spacing w:after="0"/>
+      </w:pPr>
+    </w:p>
+    <w:p>
+      <w:pPr>
+        <w:spacing w:after="0"/>
+      </w:pPr>
+      <w:r>
+        <w:rPr>
+          <w:b/>
+          <w:bCs/>
+        </w:rPr>
+        <w:t>SCOLV:</w:t>
+      </w:r>
+      <w:r>
+        <w:t xml:space="preserve"> Módulo del programa informático SeisComP, utilizado como principal herramienta de interfaz gráfica para la localización manual y revisión detallada de eventos sísmicos por parte de los analistas. Permite ajustar parámetros fundamentales como la localización, profundidad y magnitud de un sismo.</w:t>
+      </w:r>
+    </w:p>
+    <w:p>
+      <w:pPr>
+        <w:spacing w:after="0"/>
+      </w:pPr>
+    </w:p>
+    <w:p>
+      <w:pPr>
+        <w:spacing w:after="0"/>
+      </w:pPr>
+      <w:proofErr w:type="spellStart"/>
+      <w:r>
+        <w:rPr>
+          <w:b/>
+          <w:bCs/>
+        </w:rPr>
+        <w:t>SieveComP</w:t>
+      </w:r>
+      <w:proofErr w:type="spellEnd"/>
+      <w:r>
+        <w:rPr>
+          <w:b/>
+          <w:bCs/>
+        </w:rPr>
+        <w:t>:</w:t>
+      </w:r>
+      <w:r>
+        <w:t xml:space="preserve"> Paquete computacional desarrollado en Python que actúa como una capa de abstracción, auditoría y control de calidad sobre las bases de datos de SeisComP. Permite la ejecución de reglas de validación complejas, filtrado espacial de eventos y estandarización de catálogos sin modificar la base de datos de producción.</w:t>
+      </w:r>
+    </w:p>
+    <w:p>
+      <w:pPr>
+        <w:spacing w:after="0"/>
+      </w:pPr>
+    </w:p>
+    <w:p>
+      <w:pPr>
+        <w:spacing w:after="0"/>
+      </w:pPr>
+      <w:r>
+        <w:rPr>
+          <w:b/>
+          <w:bCs/>
+        </w:rPr>
+        <w:t>TOML (</w:t>
+      </w:r>
+      <w:proofErr w:type="spellStart"/>
+      <w:r>
+        <w:rPr>
+          <w:b/>
+          <w:bCs/>
+          <w:i/>
+          <w:iCs/>
+        </w:rPr>
+        <w:t>Tom's</w:t>
+      </w:r>
+      <w:proofErr w:type="spellEnd"/>
+      <w:r>
+        <w:rPr>
+          <w:b/>
+          <w:bCs/>
+          <w:i/>
+          <w:iCs/>
+        </w:rPr>
+        <w:t xml:space="preserve"> </w:t>
+      </w:r>
+      <w:proofErr w:type="spellStart"/>
+      <w:r>
+        <w:rPr>
+          <w:b/>
+          <w:bCs/>
+          <w:i/>
+          <w:iCs/>
+        </w:rPr>
+        <w:t>Obvious</w:t>
+      </w:r>
+      <w:proofErr w:type="spellEnd"/>
+      <w:r>
+        <w:rPr>
+          <w:b/>
+          <w:bCs/>
+          <w:i/>
+          <w:iCs/>
+        </w:rPr>
+        <w:t xml:space="preserve">, </w:t>
+      </w:r>
+      <w:proofErr w:type="spellStart"/>
+      <w:r>
+        <w:rPr>
+          <w:b/>
+          <w:bCs/>
+          <w:i/>
+          <w:iCs/>
+        </w:rPr>
+        <w:t>Minimal</w:t>
+      </w:r>
+      <w:proofErr w:type="spellEnd"/>
+      <w:r>
+        <w:rPr>
+          <w:b/>
+          <w:bCs/>
+          <w:i/>
+          <w:iCs/>
+        </w:rPr>
+        <w:t xml:space="preserve"> </w:t>
+      </w:r>
+      <w:proofErr w:type="spellStart"/>
+      <w:r>
+        <w:rPr>
+          <w:b/>
+          <w:bCs/>
+          <w:i/>
+          <w:iCs/>
+        </w:rPr>
+        <w:t>Language</w:t>
+      </w:r>
+      <w:proofErr w:type="spellEnd"/>
+      <w:r>
+        <w:rPr>
+          <w:b/>
+          <w:bCs/>
+        </w:rPr>
+        <w:t>):</w:t>
+      </w:r>
+      <w:r>
+        <w:t xml:space="preserve"> Formato de archivo de texto estandarizado y legible por humanos utilizado por </w:t>
+      </w:r>
+      <w:proofErr w:type="spellStart"/>
+      <w:r>
+        <w:t>SieveComP</w:t>
+      </w:r>
+      <w:proofErr w:type="spellEnd"/>
+      <w:r>
+        <w:t xml:space="preserve"> para definir la configuración del sistema, las credenciales de base de datos, los límites poligonales y las reglas lógicas de control de calidad sin necesidad de escribir código de programación.</w:t>
+      </w:r>
+    </w:p>
+    <w:p>
+      <w:pPr>
+        <w:spacing w:after="0"/>
+      </w:pPr>
+      <w:r>
+        <w:rPr>
+          <w:b/>
+          <w:bCs/>
+        </w:rPr>
+        <w:lastRenderedPageBreak/>
+        <w:t>Catálogo Sísmico Paramétrico:</w:t>
+      </w:r>
+      <w:r>
+        <w:t xml:space="preserve"> Conjunto de datos tabulares que resumen los parámetros fundamentales de los eventos sísmicos localizados por la red (por ejemplo: tiempo de origen, latitud, longitud, profundidad, magnitud, número de fases, algoritmo utilizado), que sirve como insumo para el control de calidad, generación de boletines y publicación oficial.</w:t>
+      </w:r>
+    </w:p>
+    <w:p>
+      <w:pPr>
+        <w:spacing w:after="0"/>
+      </w:pPr>
+    </w:p>
+    <w:p>
+      <w:pPr>
+        <w:spacing w:after="0"/>
+      </w:pPr>
+      <w:r>
+        <w:rPr>
+          <w:b/>
+          <w:bCs/>
+        </w:rPr>
+        <w:t>Vectorización (</w:t>
+      </w:r>
+      <w:proofErr w:type="spellStart"/>
+      <w:r>
+        <w:rPr>
+          <w:b/>
+          <w:bCs/>
+          <w:i/>
+          <w:iCs/>
+        </w:rPr>
+        <w:t>NumPy</w:t>
+      </w:r>
+      <w:proofErr w:type="spellEnd"/>
+      <w:r>
+        <w:rPr>
+          <w:b/>
+          <w:bCs/>
+          <w:i/>
+          <w:iCs/>
+        </w:rPr>
+        <w:t xml:space="preserve"> </w:t>
+      </w:r>
+      <w:proofErr w:type="spellStart"/>
+      <w:r>
+        <w:rPr>
+          <w:b/>
+          <w:bCs/>
+          <w:i/>
+          <w:iCs/>
+        </w:rPr>
+        <w:t>Masks</w:t>
+      </w:r>
+      <w:proofErr w:type="spellEnd"/>
+      <w:r>
+        <w:rPr>
+          <w:b/>
+          <w:bCs/>
+        </w:rPr>
+        <w:t>):</w:t>
+      </w:r>
+      <w:r>
+        <w:t xml:space="preserve"> Técnica computacional empleada por el motor de </w:t>
+      </w:r>
+      <w:proofErr w:type="spellStart"/>
+      <w:r>
+        <w:t>SieveComP</w:t>
+      </w:r>
+      <w:proofErr w:type="spellEnd"/>
+      <w:r>
+        <w:t xml:space="preserve"> que permite aplicar operaciones matemáticas y lógicas a columnas enteras de datos (arreglos) de forma simultánea, evitando los bucles lentos de programación y logrando procesar miles de eventos sísmicos en fracciones de segundo.</w:t>
+      </w:r>
+    </w:p>
+    <w:p>
+      <w:pPr>
+        <w:spacing w:after="0"/>
+      </w:pPr>
+    </w:p>
+    <w:p>
+      <w:pPr>
+        <w:spacing w:after="0"/>
+      </w:pPr>
+      <w:r>
+        <w:rPr>
+          <w:b/>
+          <w:bCs/>
+        </w:rPr>
+        <w:t>Eventos Duplicados:</w:t>
+      </w:r>
+      <w:r>
+        <w:t xml:space="preserve"> Registros múltiples en la base de datos que corresponden al mismo fenómeno sísmico físico, usualmente generados por discrepancias en la asociación automática de fases. </w:t>
+      </w:r>
+      <w:proofErr w:type="spellStart"/>
+      <w:r>
+        <w:t>SieveComP</w:t>
+      </w:r>
+      <w:proofErr w:type="spellEnd"/>
+      <w:r>
+        <w:t xml:space="preserve"> los detecta utilizando algoritmos de ventana temporal y proximidad espacial (como la aproximación de ventana deslizante - SSWA).</w:t>
       </w:r>
     </w:p>
     <w:p>
@@ -1895,20 +2394,315 @@
       <w:bookmarkStart w:id="5" w:name="_heading=h.hgv0mdd45y7t" w:colFirst="0" w:colLast="0"/>
       <w:bookmarkEnd w:id="5"/>
       <w:r>
-        <w:t>DESARROLLO</w:t>
-      </w:r>
-    </w:p>
-    <w:p>
-      <w:pPr>
-        <w:spacing w:after="0"/>
-      </w:pPr>
-    </w:p>
-    <w:p>
-      <w:pPr>
-        <w:spacing w:after="0"/>
-      </w:pPr>
-      <w:r>
-        <w:t>Este documento.</w:t>
+        <w:t>ARQUITECTURA Y REQUISITOS DEL SISTEMA</w:t>
+      </w:r>
+    </w:p>
+    <w:p>
+      <w:pPr>
+        <w:spacing w:after="0"/>
+      </w:pPr>
+    </w:p>
+    <w:p>
+      <w:pPr>
+        <w:spacing w:after="0"/>
+      </w:pPr>
+      <w:proofErr w:type="spellStart"/>
+      <w:r>
+        <w:rPr>
+          <w:b/>
+          <w:bCs/>
+        </w:rPr>
+        <w:t>SieveComP</w:t>
+      </w:r>
+      <w:proofErr w:type="spellEnd"/>
+      <w:r>
+        <w:t xml:space="preserve"> está estructurado bajo una arquitectura modular y desacoplada que opera como una capa intermedia de auditoría y control de calidad entre las bases de datos operativas de SeisComP y los usuarios finales (analistas de turno, sismólogos o rutinas automatizadas). El principio</w:t>
+      </w:r>
+      <w:r>
+        <w:t xml:space="preserve"> </w:t>
+      </w:r>
+      <w:r>
+        <w:t>de su diseño es el acceso estrictamente de solo lectura (</w:t>
+      </w:r>
+      <w:proofErr w:type="spellStart"/>
+      <w:r>
+        <w:rPr>
+          <w:i/>
+          <w:iCs/>
+        </w:rPr>
+        <w:t>read-only</w:t>
+      </w:r>
+      <w:proofErr w:type="spellEnd"/>
+      <w:r>
+        <w:t>), lo que garantiza la protección integral de las bases de datos de producción de la RSNC, eliminando cualquier riesgo de alteración, bloqueo o sobreescritura accidental de la información sismológica en tiempo real.</w:t>
+      </w:r>
+    </w:p>
+    <w:p>
+      <w:pPr>
+        <w:spacing w:after="0"/>
+      </w:pPr>
+    </w:p>
+    <w:p>
+      <w:pPr>
+        <w:spacing w:after="0"/>
+      </w:pPr>
+      <w:r>
+        <w:t>Estructuralmente, la herramienta articula cuatro componentes principales:</w:t>
+      </w:r>
+    </w:p>
+    <w:p>
+      <w:pPr>
+        <w:spacing w:after="0"/>
+      </w:pPr>
+    </w:p>
+    <w:p>
+      <w:pPr>
+        <w:pStyle w:val="Prrafodelista"/>
+        <w:numPr>
+          <w:ilvl w:val="0"/>
+          <w:numId w:val="43"/>
+        </w:numPr>
+        <w:spacing w:after="0"/>
+      </w:pPr>
+      <w:r>
+        <w:rPr>
+          <w:b/>
+          <w:bCs/>
+        </w:rPr>
+        <w:t>Capa de configuración declarativa:</w:t>
+      </w:r>
+      <w:r>
+        <w:t xml:space="preserve"> Archivos en formato TOML donde se definen de manera estandarizada las credenciales de conexión, consultas SQL, polígonos de referencia y reglas lógicas de validación sin necesidad de modificar el código fuente.</w:t>
+      </w:r>
+    </w:p>
+    <w:p>
+      <w:pPr>
+        <w:pStyle w:val="Prrafodelista"/>
+        <w:numPr>
+          <w:ilvl w:val="0"/>
+          <w:numId w:val="43"/>
+        </w:numPr>
+        <w:spacing w:after="0"/>
+      </w:pPr>
+      <w:r>
+        <w:rPr>
+          <w:b/>
+          <w:bCs/>
+        </w:rPr>
+        <w:t>Capa de extracción y abstracción de datos:</w:t>
+      </w:r>
+      <w:r>
+        <w:t xml:space="preserve"> Conectores que ejecutan consultas parametrizadas sobre esquemas de base de datos de SeisComP</w:t>
+      </w:r>
+      <w:r>
+        <w:t xml:space="preserve"> </w:t>
+      </w:r>
+      <w:r>
+        <w:t>para extraer tablas de eventos, orígenes, magnitudes y comentarios.</w:t>
+      </w:r>
+    </w:p>
+    <w:p>
+      <w:pPr>
+        <w:pStyle w:val="Prrafodelista"/>
+        <w:numPr>
+          <w:ilvl w:val="0"/>
+          <w:numId w:val="43"/>
+        </w:numPr>
+        <w:spacing w:after="0"/>
+      </w:pPr>
+      <w:r>
+        <w:rPr>
+          <w:b/>
+          <w:bCs/>
+        </w:rPr>
+        <w:t>Motor vectorizado de evaluación:</w:t>
+      </w:r>
+      <w:r>
+        <w:t xml:space="preserve"> Orquestado por la clase central </w:t>
+      </w:r>
+      <w:r>
+        <w:rPr>
+          <w:i/>
+          <w:iCs/>
+        </w:rPr>
+        <w:t>Runner</w:t>
+      </w:r>
+      <w:r>
+        <w:t xml:space="preserve">, procesa catálogos masivos aplicando operaciones vectorizadas con </w:t>
+      </w:r>
+      <w:proofErr w:type="spellStart"/>
+      <w:r>
+        <w:rPr>
+          <w:i/>
+          <w:iCs/>
+        </w:rPr>
+        <w:t>NumPy</w:t>
+      </w:r>
+      <w:proofErr w:type="spellEnd"/>
+      <w:r>
+        <w:t xml:space="preserve"> </w:t>
+      </w:r>
+      <w:r>
+        <w:t>(Harris et al., 2020)</w:t>
+      </w:r>
+      <w:r>
+        <w:t xml:space="preserve"> </w:t>
+      </w:r>
+      <w:r>
+        <w:t xml:space="preserve">y </w:t>
+      </w:r>
+      <w:r>
+        <w:rPr>
+          <w:i/>
+          <w:iCs/>
+        </w:rPr>
+        <w:t>P</w:t>
+      </w:r>
+      <w:r>
+        <w:rPr>
+          <w:i/>
+          <w:iCs/>
+        </w:rPr>
+        <w:t>andas</w:t>
+      </w:r>
+      <w:r>
+        <w:rPr>
+          <w:i/>
+          <w:iCs/>
+        </w:rPr>
+        <w:t xml:space="preserve"> </w:t>
+      </w:r>
+      <w:r>
+        <w:t>(McKinney, 2010)</w:t>
+      </w:r>
+      <w:r>
+        <w:t xml:space="preserve">, integra análisis geométrico con </w:t>
+      </w:r>
+      <w:proofErr w:type="spellStart"/>
+      <w:r>
+        <w:t>S</w:t>
+      </w:r>
+      <w:r>
+        <w:rPr>
+          <w:i/>
+          <w:iCs/>
+        </w:rPr>
+        <w:t>hapely</w:t>
+      </w:r>
+      <w:proofErr w:type="spellEnd"/>
+      <w:r>
+        <w:t xml:space="preserve"> </w:t>
+      </w:r>
+      <w:r>
+        <w:t>(Gillies et al., 2007)</w:t>
+      </w:r>
+      <w:r>
+        <w:t xml:space="preserve"> </w:t>
+      </w:r>
+      <w:r>
+        <w:t xml:space="preserve">y ejecuta algoritmos de </w:t>
+      </w:r>
+      <w:r>
+        <w:t>detección de eventos duplicados con estándar</w:t>
+      </w:r>
+      <w:r>
+        <w:t xml:space="preserve"> temporal y espacial (como la aproximación por ventana deslizante </w:t>
+      </w:r>
+      <w:r>
+        <w:rPr>
+          <w:i/>
+          <w:iCs/>
+        </w:rPr>
+        <w:t>- SSWA</w:t>
+      </w:r>
+      <w:r>
+        <w:t>).</w:t>
+      </w:r>
+    </w:p>
+    <w:p>
+      <w:pPr>
+        <w:pStyle w:val="Prrafodelista"/>
+        <w:numPr>
+          <w:ilvl w:val="0"/>
+          <w:numId w:val="43"/>
+        </w:numPr>
+        <w:spacing w:after="0"/>
+      </w:pPr>
+      <w:r>
+        <w:rPr>
+          <w:b/>
+          <w:bCs/>
+        </w:rPr>
+        <w:lastRenderedPageBreak/>
+        <w:t>Capa de interfaz y salida:</w:t>
+      </w:r>
+      <w:r>
+        <w:t xml:space="preserve"> Módulos de interacción que permiten ejecutar auditorías por consola (</w:t>
+      </w:r>
+      <w:r>
+        <w:rPr>
+          <w:i/>
+          <w:iCs/>
+        </w:rPr>
+        <w:t>CLI</w:t>
+      </w:r>
+      <w:r>
+        <w:t xml:space="preserve">) para flujos por lotes o mediante una aplicación web interactiva desarrollada en </w:t>
+      </w:r>
+      <w:proofErr w:type="spellStart"/>
+      <w:r>
+        <w:rPr>
+          <w:i/>
+          <w:iCs/>
+        </w:rPr>
+        <w:t>Streamlit</w:t>
+      </w:r>
+      <w:proofErr w:type="spellEnd"/>
+      <w:r>
+        <w:rPr>
+          <w:i/>
+          <w:iCs/>
+        </w:rPr>
+        <w:t xml:space="preserve"> </w:t>
+      </w:r>
+      <w:r>
+        <w:rPr>
+          <w:i/>
+          <w:iCs/>
+        </w:rPr>
+        <w:t>(</w:t>
+      </w:r>
+      <w:proofErr w:type="spellStart"/>
+      <w:r>
+        <w:rPr>
+          <w:i/>
+          <w:iCs/>
+        </w:rPr>
+        <w:t>Streamlit</w:t>
+      </w:r>
+      <w:proofErr w:type="spellEnd"/>
+      <w:r>
+        <w:rPr>
+          <w:i/>
+          <w:iCs/>
+        </w:rPr>
+        <w:t xml:space="preserve"> Inc., 2019)</w:t>
+      </w:r>
+      <w:r>
+        <w:t>, exportando reportes consolidados para la toma de decisiones operativas.</w:t>
+      </w:r>
+    </w:p>
+    <w:p>
+      <w:pPr>
+        <w:spacing w:after="0"/>
+      </w:pPr>
+    </w:p>
+    <w:p>
+      <w:pPr>
+        <w:spacing w:after="0"/>
+      </w:pPr>
+      <w:r>
+        <w:t>A continuación, se detallan los requisitos técnicos de software, dependencias y protocolos de conexión requeridos para su correcta instalación y funcionamiento en las estaciones de trabajo y servidores institucionales.</w:t>
       </w:r>
     </w:p>
     <w:p>
@@ -1919,8 +2713,6 @@
           <w:numId w:val="13"/>
         </w:numPr>
       </w:pPr>
-      <w:bookmarkStart w:id="6" w:name="_heading=h.ejhvun4t0uof" w:colFirst="0" w:colLast="0"/>
-      <w:bookmarkEnd w:id="6"/>
       <w:r>
         <w:t>EJECUCIÓN DE SCOLV</w:t>
       </w:r>
@@ -1938,8 +2730,8 @@
           <w:numId w:val="13"/>
         </w:numPr>
       </w:pPr>
-      <w:bookmarkStart w:id="7" w:name="_heading=h.g6ef08n1gqb" w:colFirst="0" w:colLast="0"/>
-      <w:bookmarkEnd w:id="7"/>
+      <w:bookmarkStart w:id="6" w:name="_heading=h.g6ef08n1gqb" w:colFirst="0" w:colLast="0"/>
+      <w:bookmarkEnd w:id="6"/>
       <w:r>
         <w:t xml:space="preserve">PESTAÑA DE LOCALIZACIÓN - </w:t>
       </w:r>
@@ -1977,8 +2769,8 @@
           <w:numId w:val="13"/>
         </w:numPr>
       </w:pPr>
-      <w:bookmarkStart w:id="8" w:name="_heading=h.6ff0mfpo07rx" w:colFirst="0" w:colLast="0"/>
-      <w:bookmarkEnd w:id="8"/>
+      <w:bookmarkStart w:id="7" w:name="_heading=h.6ff0mfpo07rx" w:colFirst="0" w:colLast="0"/>
+      <w:bookmarkEnd w:id="7"/>
       <w:r>
         <w:t>MAPA</w:t>
       </w:r>
@@ -2026,8 +2818,8 @@
           <w:numId w:val="13"/>
         </w:numPr>
       </w:pPr>
-      <w:bookmarkStart w:id="9" w:name="_heading=h.ifmiayjb9sq3" w:colFirst="0" w:colLast="0"/>
-      <w:bookmarkEnd w:id="9"/>
+      <w:bookmarkStart w:id="8" w:name="_heading=h.ifmiayjb9sq3" w:colFirst="0" w:colLast="0"/>
+      <w:bookmarkEnd w:id="8"/>
       <w:r>
         <w:t>LOCALIZACIÓN</w:t>
       </w:r>
@@ -2058,8 +2850,8 @@
           <w:numId w:val="13"/>
         </w:numPr>
       </w:pPr>
-      <w:bookmarkStart w:id="10" w:name="_heading=h.dzqh497dtdcd" w:colFirst="0" w:colLast="0"/>
-      <w:bookmarkEnd w:id="10"/>
+      <w:bookmarkStart w:id="9" w:name="_heading=h.dzqh497dtdcd" w:colFirst="0" w:colLast="0"/>
+      <w:bookmarkEnd w:id="9"/>
       <w:r>
         <w:t>GRÁFICAS</w:t>
       </w:r>
@@ -2096,8 +2888,8 @@
           <w:numId w:val="13"/>
         </w:numPr>
       </w:pPr>
-      <w:bookmarkStart w:id="11" w:name="_heading=h.afqcp6j0g50q" w:colFirst="0" w:colLast="0"/>
-      <w:bookmarkEnd w:id="11"/>
+      <w:bookmarkStart w:id="10" w:name="_heading=h.afqcp6j0g50q" w:colFirst="0" w:colLast="0"/>
+      <w:bookmarkEnd w:id="10"/>
       <w:r>
         <w:t>TABLA DE ARRIBOS SÍSMICOS</w:t>
       </w:r>
@@ -2132,10 +2924,10 @@
           <w:numId w:val="13"/>
         </w:numPr>
       </w:pPr>
-      <w:bookmarkStart w:id="12" w:name="bookmark=id.sepc1857vhnu" w:colFirst="0" w:colLast="0"/>
-      <w:bookmarkStart w:id="13" w:name="_heading=h.upii45vx2ovc" w:colFirst="0" w:colLast="0"/>
+      <w:bookmarkStart w:id="11" w:name="bookmark=id.sepc1857vhnu" w:colFirst="0" w:colLast="0"/>
+      <w:bookmarkStart w:id="12" w:name="_heading=h.upii45vx2ovc" w:colFirst="0" w:colLast="0"/>
+      <w:bookmarkEnd w:id="11"/>
       <w:bookmarkEnd w:id="12"/>
-      <w:bookmarkEnd w:id="13"/>
       <w:r>
         <w:t>BARRA DE HERRAMIENTAS DE LOCALIZACIÓN</w:t>
       </w:r>
@@ -2161,9 +2953,10 @@
           <w:numId w:val="13"/>
         </w:numPr>
       </w:pPr>
-      <w:bookmarkStart w:id="14" w:name="_heading=h.jtmxxy2er7qf" w:colFirst="0" w:colLast="0"/>
-      <w:bookmarkEnd w:id="14"/>
-      <w:r>
+      <w:bookmarkStart w:id="13" w:name="_heading=h.jtmxxy2er7qf" w:colFirst="0" w:colLast="0"/>
+      <w:bookmarkEnd w:id="13"/>
+      <w:r>
+        <w:lastRenderedPageBreak/>
         <w:t>LOCALIZADOR</w:t>
       </w:r>
     </w:p>
@@ -2180,8 +2973,8 @@
       </w:r>
     </w:p>
     <w:p>
-      <w:bookmarkStart w:id="15" w:name="_heading=h.ts3iz02ve5x3" w:colFirst="0" w:colLast="0"/>
-      <w:bookmarkEnd w:id="15"/>
+      <w:bookmarkStart w:id="14" w:name="_heading=h.ts3iz02ve5x3" w:colFirst="0" w:colLast="0"/>
+      <w:bookmarkEnd w:id="14"/>
     </w:p>
     <w:p>
       <w:pPr>
@@ -2191,8 +2984,8 @@
           <w:numId w:val="13"/>
         </w:numPr>
       </w:pPr>
-      <w:bookmarkStart w:id="16" w:name="_heading=h.srq65hozgm06" w:colFirst="0" w:colLast="0"/>
-      <w:bookmarkEnd w:id="16"/>
+      <w:bookmarkStart w:id="15" w:name="_heading=h.srq65hozgm06" w:colFirst="0" w:colLast="0"/>
+      <w:bookmarkEnd w:id="15"/>
       <w:r>
         <w:t>PERFILES (MODELOS DE VELOCIDAD)</w:t>
       </w:r>
@@ -2206,8 +2999,13 @@
       <w:pPr>
         <w:spacing w:after="0"/>
       </w:pPr>
-      <w:r>
-        <w:t>zador.</w:t>
+      <w:proofErr w:type="spellStart"/>
+      <w:r>
+        <w:t>zador</w:t>
+      </w:r>
+      <w:proofErr w:type="spellEnd"/>
+      <w:r>
+        <w:t>.</w:t>
       </w:r>
     </w:p>
     <w:p>
@@ -2247,23 +3045,23 @@
           <w:numId w:val="13"/>
         </w:numPr>
       </w:pPr>
-      <w:bookmarkStart w:id="17" w:name="bookmark=id.6wp7hvpq7v39" w:colFirst="0" w:colLast="0"/>
-      <w:bookmarkStart w:id="18" w:name="_heading=h.vghvn3h95v" w:colFirst="0" w:colLast="0"/>
+      <w:bookmarkStart w:id="16" w:name="bookmark=id.6wp7hvpq7v39" w:colFirst="0" w:colLast="0"/>
+      <w:bookmarkStart w:id="17" w:name="_heading=h.vghvn3h95v" w:colFirst="0" w:colLast="0"/>
+      <w:bookmarkEnd w:id="16"/>
       <w:bookmarkEnd w:id="17"/>
+      <w:r>
+        <w:t>PICADO DE FASES - PICKER</w:t>
+      </w:r>
+    </w:p>
+    <w:p>
+      <w:pPr>
+        <w:spacing w:after="0"/>
+      </w:pPr>
+      <w:r>
+        <w:t xml:space="preserve">El </w:t>
+      </w:r>
+      <w:bookmarkStart w:id="18" w:name="_heading=h.14e1fovmkkp" w:colFirst="0" w:colLast="0"/>
       <w:bookmarkEnd w:id="18"/>
-      <w:r>
-        <w:t>PICADO DE FASES - PICKER</w:t>
-      </w:r>
-    </w:p>
-    <w:p>
-      <w:pPr>
-        <w:spacing w:after="0"/>
-      </w:pPr>
-      <w:r>
-        <w:t xml:space="preserve">El </w:t>
-      </w:r>
-      <w:bookmarkStart w:id="19" w:name="_heading=h.14e1fovmkkp" w:colFirst="0" w:colLast="0"/>
-      <w:bookmarkEnd w:id="19"/>
     </w:p>
     <w:p>
       <w:pPr>
@@ -2278,28 +3076,28 @@
           <w:numId w:val="13"/>
         </w:numPr>
       </w:pPr>
-      <w:bookmarkStart w:id="20" w:name="_heading=h.3sro9yodxf2c" w:colFirst="0" w:colLast="0"/>
+      <w:bookmarkStart w:id="19" w:name="_heading=h.3sro9yodxf2c" w:colFirst="0" w:colLast="0"/>
+      <w:bookmarkEnd w:id="19"/>
+      <w:r>
+        <w:t>CÁLCULO DE MAGNITUD</w:t>
+      </w:r>
+    </w:p>
+    <w:p>
+      <w:pPr>
+        <w:spacing w:after="0"/>
+      </w:pPr>
+    </w:p>
+    <w:p>
+      <w:pPr>
+        <w:spacing w:after="0"/>
+      </w:pPr>
+      <w:r>
+        <w:t xml:space="preserve">La </w:t>
+      </w:r>
+    </w:p>
+    <w:p>
+      <w:bookmarkStart w:id="20" w:name="_heading=h.xlplvubhhrib" w:colFirst="0" w:colLast="0"/>
       <w:bookmarkEnd w:id="20"/>
-      <w:r>
-        <w:t>CÁLCULO DE MAGNITUD</w:t>
-      </w:r>
-    </w:p>
-    <w:p>
-      <w:pPr>
-        <w:spacing w:after="0"/>
-      </w:pPr>
-    </w:p>
-    <w:p>
-      <w:pPr>
-        <w:spacing w:after="0"/>
-      </w:pPr>
-      <w:r>
-        <w:t xml:space="preserve">La </w:t>
-      </w:r>
-    </w:p>
-    <w:p>
-      <w:bookmarkStart w:id="21" w:name="_heading=h.xlplvubhhrib" w:colFirst="0" w:colLast="0"/>
-      <w:bookmarkEnd w:id="21"/>
     </w:p>
     <w:p>
       <w:pPr>
@@ -2309,10 +3107,9 @@
           <w:numId w:val="13"/>
         </w:numPr>
       </w:pPr>
-      <w:bookmarkStart w:id="22" w:name="_heading=h.zel6l3ljbm4o" w:colFirst="0" w:colLast="0"/>
-      <w:bookmarkEnd w:id="22"/>
-      <w:r>
-        <w:lastRenderedPageBreak/>
+      <w:bookmarkStart w:id="21" w:name="_heading=h.zel6l3ljbm4o" w:colFirst="0" w:colLast="0"/>
+      <w:bookmarkEnd w:id="21"/>
+      <w:r>
         <w:t xml:space="preserve">BOTONES RELOCATE Y COMMIT </w:t>
       </w:r>
     </w:p>
@@ -2347,12 +3144,21 @@
           <w:color w:val="000000"/>
         </w:rPr>
       </w:pPr>
+      <w:proofErr w:type="spellStart"/>
       <w:r>
         <w:rPr>
           <w:b/>
           <w:bCs/>
         </w:rPr>
-        <w:t xml:space="preserve">Relocate: </w:t>
+        <w:t>Relocate</w:t>
+      </w:r>
+      <w:proofErr w:type="spellEnd"/>
+      <w:r>
+        <w:rPr>
+          <w:b/>
+          <w:bCs/>
+        </w:rPr>
+        <w:t xml:space="preserve">: </w:t>
       </w:r>
     </w:p>
     <w:p>
@@ -2380,8 +3186,8 @@
           <w:numId w:val="13"/>
         </w:numPr>
       </w:pPr>
-      <w:bookmarkStart w:id="23" w:name="_heading=h.d5a66na1z336" w:colFirst="0" w:colLast="0"/>
-      <w:bookmarkEnd w:id="23"/>
+      <w:bookmarkStart w:id="22" w:name="_heading=h.d5a66na1z336" w:colFirst="0" w:colLast="0"/>
+      <w:bookmarkEnd w:id="22"/>
       <w:r>
         <w:t xml:space="preserve">PESTAÑA DE MAGNITUDES - </w:t>
       </w:r>
@@ -2419,8 +3225,8 @@
           <w:numId w:val="13"/>
         </w:numPr>
       </w:pPr>
-      <w:bookmarkStart w:id="24" w:name="_heading=h.fjmgtigpox3y" w:colFirst="0" w:colLast="0"/>
-      <w:bookmarkEnd w:id="24"/>
+      <w:bookmarkStart w:id="23" w:name="_heading=h.fjmgtigpox3y" w:colFirst="0" w:colLast="0"/>
+      <w:bookmarkEnd w:id="23"/>
       <w:r>
         <w:t>TIPOS DE MAGNITUDES CALCULADAS</w:t>
       </w:r>
@@ -2451,8 +3257,8 @@
           <w:numId w:val="13"/>
         </w:numPr>
       </w:pPr>
-      <w:bookmarkStart w:id="25" w:name="_heading=h.7wkkkh14jdx0" w:colFirst="0" w:colLast="0"/>
-      <w:bookmarkEnd w:id="25"/>
+      <w:bookmarkStart w:id="24" w:name="_heading=h.7wkkkh14jdx0" w:colFirst="0" w:colLast="0"/>
+      <w:bookmarkEnd w:id="24"/>
       <w:r>
         <w:t xml:space="preserve">MAPA, TABLA E INFORMACIÓN </w:t>
       </w:r>
@@ -2467,6 +3273,7 @@
         <w:spacing w:after="0"/>
       </w:pPr>
       <w:r>
+        <w:lastRenderedPageBreak/>
         <w:t xml:space="preserve">El mapa </w:t>
       </w:r>
     </w:p>
@@ -2483,26 +3290,26 @@
           <w:numId w:val="13"/>
         </w:numPr>
       </w:pPr>
-      <w:bookmarkStart w:id="26" w:name="_heading=h.a0qbyxdurqoo" w:colFirst="0" w:colLast="0"/>
+      <w:bookmarkStart w:id="25" w:name="_heading=h.a0qbyxdurqoo" w:colFirst="0" w:colLast="0"/>
+      <w:bookmarkEnd w:id="25"/>
+      <w:r>
+        <w:t>GRÁFICA DE MAGNITUD RESIDUAL</w:t>
+      </w:r>
+    </w:p>
+    <w:p>
+      <w:pPr>
+        <w:spacing w:after="0"/>
+      </w:pPr>
+    </w:p>
+    <w:p>
+      <w:pPr>
+        <w:spacing w:after="0"/>
+      </w:pPr>
+      <w:r>
+        <w:t xml:space="preserve">Esta </w:t>
+      </w:r>
+      <w:bookmarkStart w:id="26" w:name="_heading=h.kbtewncwidxs" w:colFirst="0" w:colLast="0"/>
       <w:bookmarkEnd w:id="26"/>
-      <w:r>
-        <w:t>GRÁFICA DE MAGNITUD RESIDUAL</w:t>
-      </w:r>
-    </w:p>
-    <w:p>
-      <w:pPr>
-        <w:spacing w:after="0"/>
-      </w:pPr>
-    </w:p>
-    <w:p>
-      <w:pPr>
-        <w:spacing w:after="0"/>
-      </w:pPr>
-      <w:r>
-        <w:t xml:space="preserve">Esta </w:t>
-      </w:r>
-      <w:bookmarkStart w:id="27" w:name="_heading=h.kbtewncwidxs" w:colFirst="0" w:colLast="0"/>
-      <w:bookmarkEnd w:id="27"/>
     </w:p>
     <w:p>
       <w:pPr>
@@ -2517,8 +3324,8 @@
           <w:numId w:val="13"/>
         </w:numPr>
       </w:pPr>
-      <w:bookmarkStart w:id="28" w:name="_heading=h.yoigfwaaqngv" w:colFirst="0" w:colLast="0"/>
-      <w:bookmarkEnd w:id="28"/>
+      <w:bookmarkStart w:id="27" w:name="_heading=h.yoigfwaaqngv" w:colFirst="0" w:colLast="0"/>
+      <w:bookmarkEnd w:id="27"/>
       <w:r>
         <w:t xml:space="preserve">BARRA DE HERRAMIENTAS </w:t>
       </w:r>
@@ -2549,8 +3356,8 @@
           <w:numId w:val="13"/>
         </w:numPr>
       </w:pPr>
-      <w:bookmarkStart w:id="29" w:name="_heading=h.ditsi6uksrma" w:colFirst="0" w:colLast="0"/>
-      <w:bookmarkEnd w:id="29"/>
+      <w:bookmarkStart w:id="28" w:name="_heading=h.ditsi6uksrma" w:colFirst="0" w:colLast="0"/>
+      <w:bookmarkEnd w:id="28"/>
       <w:r>
         <w:t xml:space="preserve"> BOTÓN WAVEFORMS</w:t>
       </w:r>
@@ -2576,10 +3383,10 @@
           <w:numId w:val="13"/>
         </w:numPr>
       </w:pPr>
-      <w:bookmarkStart w:id="30" w:name="bookmark=id.631hmagv5unr" w:colFirst="0" w:colLast="0"/>
-      <w:bookmarkStart w:id="31" w:name="_heading=h.84nwi33eo4l2" w:colFirst="0" w:colLast="0"/>
+      <w:bookmarkStart w:id="29" w:name="bookmark=id.631hmagv5unr" w:colFirst="0" w:colLast="0"/>
+      <w:bookmarkStart w:id="30" w:name="_heading=h.84nwi33eo4l2" w:colFirst="0" w:colLast="0"/>
+      <w:bookmarkEnd w:id="29"/>
       <w:bookmarkEnd w:id="30"/>
-      <w:bookmarkEnd w:id="31"/>
       <w:r>
         <w:t>PESTAÑA DE EVENTO - EVENT</w:t>
       </w:r>
@@ -2610,8 +3417,8 @@
           <w:numId w:val="13"/>
         </w:numPr>
       </w:pPr>
-      <w:bookmarkStart w:id="32" w:name="_heading=h.jy9wwj7wlt1j" w:colFirst="0" w:colLast="0"/>
-      <w:bookmarkEnd w:id="32"/>
+      <w:bookmarkStart w:id="31" w:name="_heading=h.jy9wwj7wlt1j" w:colFirst="0" w:colLast="0"/>
+      <w:bookmarkEnd w:id="31"/>
       <w:r>
         <w:t xml:space="preserve">PESTAÑA DE LISTADO DE EVENTOS - EVENTS </w:t>
       </w:r>
@@ -2631,7 +3438,6 @@
         </w:rPr>
       </w:pPr>
       <w:r>
-        <w:lastRenderedPageBreak/>
         <w:t xml:space="preserve">En esta pestaña </w:t>
       </w:r>
     </w:p>
@@ -2643,8 +3449,8 @@
           <w:numId w:val="13"/>
         </w:numPr>
       </w:pPr>
-      <w:bookmarkStart w:id="33" w:name="_heading=h.3srs01eew5tk" w:colFirst="0" w:colLast="0"/>
-      <w:bookmarkEnd w:id="33"/>
+      <w:bookmarkStart w:id="32" w:name="_heading=h.3srs01eew5tk" w:colFirst="0" w:colLast="0"/>
+      <w:bookmarkEnd w:id="32"/>
       <w:r>
         <w:t xml:space="preserve">CONFIGURACIONES </w:t>
       </w:r>
@@ -2692,26 +3498,26 @@
           <w:numId w:val="13"/>
         </w:numPr>
       </w:pPr>
-      <w:bookmarkStart w:id="34" w:name="_heading=h.10rk36impnk7" w:colFirst="0" w:colLast="0"/>
+      <w:bookmarkStart w:id="33" w:name="_heading=h.10rk36impnk7" w:colFirst="0" w:colLast="0"/>
+      <w:bookmarkEnd w:id="33"/>
+      <w:r>
+        <w:t>OTROS ELEMENTOS DE APOYO</w:t>
+      </w:r>
+    </w:p>
+    <w:p>
+      <w:pPr>
+        <w:spacing w:after="0"/>
+      </w:pPr>
+    </w:p>
+    <w:p>
+      <w:pPr>
+        <w:spacing w:after="0"/>
+      </w:pPr>
+      <w:r>
+        <w:t>A continuación</w:t>
+      </w:r>
+      <w:bookmarkStart w:id="34" w:name="_heading=h.34dwzsi3mg22" w:colFirst="0" w:colLast="0"/>
       <w:bookmarkEnd w:id="34"/>
-      <w:r>
-        <w:t>OTROS ELEMENTOS DE APOYO</w:t>
-      </w:r>
-    </w:p>
-    <w:p>
-      <w:pPr>
-        <w:spacing w:after="0"/>
-      </w:pPr>
-    </w:p>
-    <w:p>
-      <w:pPr>
-        <w:spacing w:after="0"/>
-      </w:pPr>
-      <w:r>
-        <w:t>A continuación</w:t>
-      </w:r>
-      <w:bookmarkStart w:id="35" w:name="_heading=h.34dwzsi3mg22" w:colFirst="0" w:colLast="0"/>
-      <w:bookmarkEnd w:id="35"/>
       <w:r>
         <w:t>.</w:t>
       </w:r>
@@ -2742,8 +3548,8 @@
       </w:r>
     </w:p>
     <w:p>
-      <w:bookmarkStart w:id="36" w:name="_heading=h.wewcnrvrahv9" w:colFirst="0" w:colLast="0"/>
-      <w:bookmarkEnd w:id="36"/>
+      <w:bookmarkStart w:id="35" w:name="_heading=h.wewcnrvrahv9" w:colFirst="0" w:colLast="0"/>
+      <w:bookmarkEnd w:id="35"/>
     </w:p>
     <w:p>
       <w:pPr>
@@ -2753,9 +3559,10 @@
           <w:numId w:val="13"/>
         </w:numPr>
       </w:pPr>
-      <w:bookmarkStart w:id="37" w:name="_heading=h.qyqi6q9pzbrf" w:colFirst="0" w:colLast="0"/>
-      <w:bookmarkEnd w:id="37"/>
-      <w:r>
+      <w:bookmarkStart w:id="36" w:name="_heading=h.qyqi6q9pzbrf" w:colFirst="0" w:colLast="0"/>
+      <w:bookmarkEnd w:id="36"/>
+      <w:r>
+        <w:lastRenderedPageBreak/>
         <w:t>ALGORITMOS DE AGRUPACIÓN DE PICKS TIPOS DE ALGORITMOS</w:t>
       </w:r>
     </w:p>
@@ -2785,8 +3592,8 @@
           <w:numId w:val="13"/>
         </w:numPr>
       </w:pPr>
-      <w:bookmarkStart w:id="38" w:name="_heading=h.wp0p73jnsasv" w:colFirst="0" w:colLast="0"/>
-      <w:bookmarkEnd w:id="38"/>
+      <w:bookmarkStart w:id="37" w:name="_heading=h.wp0p73jnsasv" w:colFirst="0" w:colLast="0"/>
+      <w:bookmarkEnd w:id="37"/>
       <w:r>
         <w:t xml:space="preserve">ALGORITMOS DE LOCALIZACIÓN </w:t>
       </w:r>
@@ -2817,8 +3624,8 @@
           <w:numId w:val="13"/>
         </w:numPr>
       </w:pPr>
-      <w:bookmarkStart w:id="39" w:name="_heading=h.74wt5utwkj2z" w:colFirst="0" w:colLast="0"/>
-      <w:bookmarkEnd w:id="39"/>
+      <w:bookmarkStart w:id="38" w:name="_heading=h.74wt5utwkj2z" w:colFirst="0" w:colLast="0"/>
+      <w:bookmarkEnd w:id="38"/>
       <w:r>
         <w:t>TIPOS DE MAGNITUDES</w:t>
       </w:r>
@@ -2844,8 +3651,8 @@
           <w:numId w:val="13"/>
         </w:numPr>
       </w:pPr>
-      <w:bookmarkStart w:id="40" w:name="_heading=h.iefnk6ku4nun" w:colFirst="0" w:colLast="0"/>
-      <w:bookmarkEnd w:id="40"/>
+      <w:bookmarkStart w:id="39" w:name="_heading=h.iefnk6ku4nun" w:colFirst="0" w:colLast="0"/>
+      <w:bookmarkEnd w:id="39"/>
       <w:r>
         <w:t>MÓDULOS IMPLICADOS EN EL CÁLCULO DE MAGNITUDES</w:t>
       </w:r>
@@ -2860,7 +3667,23 @@
         <w:spacing w:after="0"/>
       </w:pPr>
       <w:r>
-        <w:t>Hay dos módulos para medir amplitudes a partir de las formas de onda scamp y scautopick.</w:t>
+        <w:t xml:space="preserve">Hay dos módulos para medir amplitudes a partir de las formas de onda </w:t>
+      </w:r>
+      <w:proofErr w:type="spellStart"/>
+      <w:r>
+        <w:t>scamp</w:t>
+      </w:r>
+      <w:proofErr w:type="spellEnd"/>
+      <w:r>
+        <w:t xml:space="preserve"> y </w:t>
+      </w:r>
+      <w:proofErr w:type="spellStart"/>
+      <w:r>
+        <w:t>scautopick</w:t>
+      </w:r>
+      <w:proofErr w:type="spellEnd"/>
+      <w:r>
+        <w:t>.</w:t>
       </w:r>
     </w:p>
     <w:p>
@@ -2876,8 +3699,8 @@
           <w:numId w:val="13"/>
         </w:numPr>
       </w:pPr>
-      <w:bookmarkStart w:id="41" w:name="_heading=h.8vy72mimtewy" w:colFirst="0" w:colLast="0"/>
-      <w:bookmarkEnd w:id="41"/>
+      <w:bookmarkStart w:id="40" w:name="_heading=h.8vy72mimtewy" w:colFirst="0" w:colLast="0"/>
+      <w:bookmarkEnd w:id="40"/>
       <w:r>
         <w:t>SCAMP</w:t>
       </w:r>
@@ -2908,10 +3731,9 @@
           <w:numId w:val="13"/>
         </w:numPr>
       </w:pPr>
-      <w:bookmarkStart w:id="42" w:name="_heading=h.izmv83s53jlr" w:colFirst="0" w:colLast="0"/>
-      <w:bookmarkEnd w:id="42"/>
-      <w:r>
-        <w:lastRenderedPageBreak/>
+      <w:bookmarkStart w:id="41" w:name="_heading=h.izmv83s53jlr" w:colFirst="0" w:colLast="0"/>
+      <w:bookmarkEnd w:id="41"/>
+      <w:r>
         <w:t>SCAUTOPICK</w:t>
       </w:r>
     </w:p>
@@ -2941,8 +3763,8 @@
           <w:numId w:val="13"/>
         </w:numPr>
       </w:pPr>
-      <w:bookmarkStart w:id="43" w:name="_heading=h.5p96gx21sz41" w:colFirst="0" w:colLast="0"/>
-      <w:bookmarkEnd w:id="43"/>
+      <w:bookmarkStart w:id="42" w:name="_heading=h.5p96gx21sz41" w:colFirst="0" w:colLast="0"/>
+      <w:bookmarkEnd w:id="42"/>
       <w:r>
         <w:t>SCMAG</w:t>
       </w:r>
@@ -2956,9 +3778,11 @@
       <w:pPr>
         <w:spacing w:after="0"/>
       </w:pPr>
+      <w:proofErr w:type="gramStart"/>
       <w:r>
         <w:t>En .</w:t>
       </w:r>
+      <w:proofErr w:type="gramEnd"/>
     </w:p>
     <w:p>
       <w:pPr>
@@ -2973,8 +3797,8 @@
           <w:numId w:val="13"/>
         </w:numPr>
       </w:pPr>
-      <w:bookmarkStart w:id="44" w:name="_heading=h.337427syy9oz" w:colFirst="0" w:colLast="0"/>
-      <w:bookmarkEnd w:id="44"/>
+      <w:bookmarkStart w:id="43" w:name="_heading=h.337427syy9oz" w:colFirst="0" w:colLast="0"/>
+      <w:bookmarkEnd w:id="43"/>
       <w:r>
         <w:t>SELECCIÓN DE ALGORITMOS - MODELOS DE VELOCIDAD</w:t>
       </w:r>
@@ -3014,8 +3838,8 @@
           <w:numId w:val="13"/>
         </w:numPr>
       </w:pPr>
-      <w:bookmarkStart w:id="45" w:name="_heading=h.fnugoucc49im" w:colFirst="0" w:colLast="0"/>
-      <w:bookmarkEnd w:id="45"/>
+      <w:bookmarkStart w:id="44" w:name="_heading=h.fnugoucc49im" w:colFirst="0" w:colLast="0"/>
+      <w:bookmarkEnd w:id="44"/>
       <w:r>
         <w:t>DOCUMENTOS ASOCIADOS</w:t>
       </w:r>
@@ -3063,9 +3887,10 @@
           <w:numId w:val="13"/>
         </w:numPr>
       </w:pPr>
-      <w:bookmarkStart w:id="46" w:name="_heading=h.36xr58wu6gih" w:colFirst="0" w:colLast="0"/>
-      <w:bookmarkEnd w:id="46"/>
-      <w:r>
+      <w:bookmarkStart w:id="45" w:name="_heading=h.36xr58wu6gih" w:colFirst="0" w:colLast="0"/>
+      <w:bookmarkEnd w:id="45"/>
+      <w:r>
+        <w:lastRenderedPageBreak/>
         <w:t>BIBLIOGRAFÍA</w:t>
       </w:r>
     </w:p>
@@ -3077,50 +3902,351 @@
     <w:p>
       <w:pPr>
         <w:spacing w:after="0"/>
+      </w:pPr>
+      <w:r>
         <w:rPr>
           <w:lang w:val="en-US"/>
         </w:rPr>
-      </w:pPr>
+        <w:t xml:space="preserve">Harris, C. R., Millman, K. J., van der Walt, S. J., </w:t>
+      </w:r>
+      <w:proofErr w:type="spellStart"/>
       <w:r>
         <w:rPr>
           <w:lang w:val="en-US"/>
         </w:rPr>
-        <w:t>Bormann, P., &amp; Saul, J. (2008). The new IASPEI standard broadband magnitude m B. Seismological Research Letters, 79(5), 698-705. doi: https://doi.org/10.1785/gssrl.79.5.698</w:t>
-      </w:r>
-    </w:p>
-    <w:p>
-      <w:pPr>
-        <w:spacing w:after="0"/>
+        <w:t>Gommers</w:t>
+      </w:r>
+      <w:proofErr w:type="spellEnd"/>
+      <w:r>
         <w:rPr>
           <w:lang w:val="en-US"/>
         </w:rPr>
-      </w:pPr>
-    </w:p>
-    <w:p>
-      <w:pPr>
-        <w:spacing w:after="0"/>
-      </w:pPr>
+        <w:t xml:space="preserve">, R., Virtanen, P., </w:t>
+      </w:r>
+      <w:proofErr w:type="spellStart"/>
       <w:r>
         <w:rPr>
           <w:lang w:val="en-US"/>
         </w:rPr>
+        <w:t>Cournapeau</w:t>
+      </w:r>
+      <w:proofErr w:type="spellEnd"/>
+      <w:r>
+        <w:rPr>
+          <w:lang w:val="en-US"/>
+        </w:rPr>
+        <w:t xml:space="preserve">, D., ... &amp; Oliphant, T. E. (2020). Array programming with NumPy. Nature, 585(7825), 357-362. </w:t>
+      </w:r>
+      <w:proofErr w:type="spellStart"/>
+      <w:r>
+        <w:rPr>
+          <w:lang w:val="en-US"/>
+        </w:rPr>
+        <w:t>doi</w:t>
+      </w:r>
+      <w:proofErr w:type="spellEnd"/>
+      <w:r>
+        <w:rPr>
+          <w:lang w:val="en-US"/>
+        </w:rPr>
+        <w:t xml:space="preserve">: </w:t>
+      </w:r>
+      <w:hyperlink r:id="rId8" w:tgtFrame="_blank" w:history="1">
+        <w:r>
+          <w:rPr>
+            <w:rStyle w:val="Hipervnculo"/>
+            <w:lang w:val="en-US"/>
+          </w:rPr>
+          <w:t>https://doi.org/10.1038/s41586-020-2</w:t>
+        </w:r>
+        <w:r>
+          <w:rPr>
+            <w:rStyle w:val="Hipervnculo"/>
+            <w:lang w:val="en-US"/>
+          </w:rPr>
+          <w:t>6</w:t>
+        </w:r>
+        <w:r>
+          <w:rPr>
+            <w:rStyle w:val="Hipervnculo"/>
+            <w:lang w:val="en-US"/>
+          </w:rPr>
+          <w:t>49-2</w:t>
+        </w:r>
+      </w:hyperlink>
+    </w:p>
+    <w:p>
+      <w:pPr>
+        <w:spacing w:after="0"/>
+        <w:rPr>
+          <w:lang w:val="en-US"/>
+        </w:rPr>
+      </w:pPr>
+    </w:p>
+    <w:p>
+      <w:pPr>
+        <w:spacing w:after="0"/>
+      </w:pPr>
+      <w:r>
+        <w:rPr>
+          <w:lang w:val="en-US"/>
+        </w:rPr>
+        <w:t xml:space="preserve">McKinney, W. (2010). Data Structures for Statistical Computing in Python. Proceedings of the 9th Python in Science Conference, 51-56. </w:t>
+      </w:r>
+      <w:proofErr w:type="spellStart"/>
+      <w:r>
+        <w:rPr>
+          <w:lang w:val="en-US"/>
+        </w:rPr>
+        <w:t>doi</w:t>
+      </w:r>
+      <w:proofErr w:type="spellEnd"/>
+      <w:r>
+        <w:rPr>
+          <w:lang w:val="en-US"/>
+        </w:rPr>
+        <w:t xml:space="preserve">: </w:t>
+      </w:r>
+      <w:hyperlink r:id="rId9" w:tgtFrame="_blank" w:history="1">
+        <w:r>
+          <w:rPr>
+            <w:rStyle w:val="Hipervnculo"/>
+            <w:lang w:val="en-US"/>
+          </w:rPr>
+          <w:t>https://doi.org/10.25080/Majora-92bf1922-00a</w:t>
+        </w:r>
+      </w:hyperlink>
+    </w:p>
+    <w:p>
+      <w:pPr>
+        <w:spacing w:after="0"/>
+        <w:rPr>
+          <w:lang w:val="en-US"/>
+        </w:rPr>
+      </w:pPr>
+    </w:p>
+    <w:p>
+      <w:pPr>
+        <w:spacing w:after="0"/>
+      </w:pPr>
+      <w:r>
+        <w:rPr>
+          <w:lang w:val="en-US"/>
+        </w:rPr>
+        <w:t xml:space="preserve">Gillies, S., y </w:t>
+      </w:r>
+      <w:proofErr w:type="spellStart"/>
+      <w:r>
+        <w:rPr>
+          <w:lang w:val="en-US"/>
+        </w:rPr>
+        <w:t>otros</w:t>
+      </w:r>
+      <w:proofErr w:type="spellEnd"/>
+      <w:r>
+        <w:rPr>
+          <w:lang w:val="en-US"/>
+        </w:rPr>
+        <w:t xml:space="preserve">. (2007). Shapely: manipulation and analysis of geometric objects. </w:t>
+      </w:r>
+      <w:r>
+        <w:t xml:space="preserve">Toblerity.org. Recuperado de: </w:t>
+      </w:r>
+      <w:hyperlink r:id="rId10" w:tgtFrame="_blank" w:history="1">
+        <w:r>
+          <w:rPr>
+            <w:rStyle w:val="Hipervnculo"/>
+          </w:rPr>
+          <w:t>https://github.com/shapely/shapely</w:t>
+        </w:r>
+      </w:hyperlink>
+    </w:p>
+    <w:p>
+      <w:pPr>
+        <w:spacing w:after="0"/>
+      </w:pPr>
+    </w:p>
+    <w:p>
+      <w:pPr>
+        <w:spacing w:after="0"/>
+      </w:pPr>
+      <w:proofErr w:type="spellStart"/>
+      <w:r>
+        <w:t>Streamlit</w:t>
+      </w:r>
+      <w:proofErr w:type="spellEnd"/>
+      <w:r>
+        <w:t xml:space="preserve"> Inc. </w:t>
+      </w:r>
+      <w:r>
+        <w:rPr>
+          <w:lang w:val="en-US"/>
+        </w:rPr>
+        <w:t xml:space="preserve">(2019). </w:t>
+      </w:r>
+      <w:proofErr w:type="spellStart"/>
+      <w:r>
+        <w:rPr>
+          <w:lang w:val="en-US"/>
+        </w:rPr>
+        <w:t>Streamlit</w:t>
+      </w:r>
+      <w:proofErr w:type="spellEnd"/>
+      <w:r>
+        <w:rPr>
+          <w:lang w:val="en-US"/>
+        </w:rPr>
+        <w:t xml:space="preserve">: The fastest way to build and share data apps. </w:t>
+      </w:r>
+      <w:r>
+        <w:t xml:space="preserve">Software </w:t>
+      </w:r>
+      <w:proofErr w:type="spellStart"/>
+      <w:r>
+        <w:t>library</w:t>
+      </w:r>
+      <w:proofErr w:type="spellEnd"/>
+      <w:r>
+        <w:t xml:space="preserve">. Recuperado de: </w:t>
+      </w:r>
+      <w:hyperlink r:id="rId11" w:tgtFrame="_blank" w:history="1">
+        <w:r>
+          <w:rPr>
+            <w:rStyle w:val="Hipervnculo"/>
+          </w:rPr>
+          <w:t>https://streamlit.io/</w:t>
+        </w:r>
+      </w:hyperlink>
+    </w:p>
+    <w:p>
+      <w:pPr>
+        <w:spacing w:after="0"/>
+      </w:pPr>
+    </w:p>
+    <w:p>
+      <w:pPr>
+        <w:spacing w:after="0"/>
+      </w:pPr>
+    </w:p>
+    <w:p>
+      <w:pPr>
+        <w:spacing w:after="0"/>
+      </w:pPr>
+    </w:p>
+    <w:p>
+      <w:pPr>
+        <w:spacing w:after="0"/>
+        <w:rPr>
+          <w:lang w:val="en-US"/>
+        </w:rPr>
+      </w:pPr>
+      <w:r>
+        <w:rPr>
+          <w:lang w:val="en-US"/>
+        </w:rPr>
+        <w:t xml:space="preserve">Bormann, P., &amp; Saul, J. (2008). The new IASPEI standard broadband magnitude m B. Seismological Research Letters, 79(5), 698-705. </w:t>
+      </w:r>
+      <w:proofErr w:type="spellStart"/>
+      <w:r>
+        <w:rPr>
+          <w:lang w:val="en-US"/>
+        </w:rPr>
+        <w:t>doi</w:t>
+      </w:r>
+      <w:proofErr w:type="spellEnd"/>
+      <w:r>
+        <w:rPr>
+          <w:lang w:val="en-US"/>
+        </w:rPr>
+        <w:t>: https://doi.org/10.1785/gssrl.79.5.698</w:t>
+      </w:r>
+    </w:p>
+    <w:p>
+      <w:pPr>
+        <w:spacing w:after="0"/>
+        <w:rPr>
+          <w:lang w:val="en-US"/>
+        </w:rPr>
+      </w:pPr>
+    </w:p>
+    <w:p>
+      <w:pPr>
+        <w:spacing w:after="0"/>
+      </w:pPr>
+      <w:r>
+        <w:rPr>
+          <w:lang w:val="en-US"/>
+        </w:rPr>
         <w:t xml:space="preserve">  Brune, J. (1970). Tectonic Stress and the Spectra of Seismic Shear Waves from Earthquakes. </w:t>
       </w:r>
-      <w:r>
-        <w:t>Journal of Geophysical Research. 75 (26), 4997-5009. doi: 10.1029/JB075i026p04997</w:t>
-      </w:r>
-    </w:p>
-    <w:p>
-      <w:pPr>
-        <w:spacing w:after="0"/>
-      </w:pPr>
-    </w:p>
-    <w:p>
-      <w:pPr>
-        <w:spacing w:after="0"/>
-      </w:pPr>
-      <w:r>
-        <w:t xml:space="preserve">  Eraso, J. (2010) Cálculo de la Magnitud de Momento Mw mediante análisis espectral. Informe Interno. / Red Sismológica Nacional de Colombia - INGEOMINAS. - Bogotá D.C. : -; 1-44. - P IP026-31110.</w:t>
+      <w:proofErr w:type="spellStart"/>
+      <w:r>
+        <w:t>Journal</w:t>
+      </w:r>
+      <w:proofErr w:type="spellEnd"/>
+      <w:r>
+        <w:t xml:space="preserve"> </w:t>
+      </w:r>
+      <w:proofErr w:type="spellStart"/>
+      <w:r>
+        <w:t>of</w:t>
+      </w:r>
+      <w:proofErr w:type="spellEnd"/>
+      <w:r>
+        <w:t xml:space="preserve"> </w:t>
+      </w:r>
+      <w:proofErr w:type="spellStart"/>
+      <w:r>
+        <w:t>Geophysical</w:t>
+      </w:r>
+      <w:proofErr w:type="spellEnd"/>
+      <w:r>
+        <w:t xml:space="preserve"> </w:t>
+      </w:r>
+      <w:proofErr w:type="spellStart"/>
+      <w:r>
+        <w:t>Research</w:t>
+      </w:r>
+      <w:proofErr w:type="spellEnd"/>
+      <w:r>
+        <w:t xml:space="preserve">. 75 (26), 4997-5009. </w:t>
+      </w:r>
+      <w:proofErr w:type="spellStart"/>
+      <w:r>
+        <w:t>doi</w:t>
+      </w:r>
+      <w:proofErr w:type="spellEnd"/>
+      <w:r>
+        <w:t>: 10.1029/JB075i026p04997</w:t>
+      </w:r>
+    </w:p>
+    <w:p>
+      <w:pPr>
+        <w:spacing w:after="0"/>
+      </w:pPr>
+    </w:p>
+    <w:p>
+      <w:pPr>
+        <w:spacing w:after="0"/>
+      </w:pPr>
+      <w:r>
+        <w:t xml:space="preserve">  Eraso, J. (2010) Cálculo de la Magnitud de Momento </w:t>
+      </w:r>
+      <w:proofErr w:type="spellStart"/>
+      <w:r>
+        <w:t>Mw</w:t>
+      </w:r>
+      <w:proofErr w:type="spellEnd"/>
+      <w:r>
+        <w:t xml:space="preserve"> mediante análisis espectral. Informe Interno. / Red Sismológica Nacional de Colombia - INGEOMINAS. - Bogotá </w:t>
+      </w:r>
+      <w:proofErr w:type="gramStart"/>
+      <w:r>
+        <w:t>D.C. :</w:t>
+      </w:r>
+      <w:proofErr w:type="gramEnd"/>
+      <w:r>
+        <w:t xml:space="preserve"> -; 1-44. - P IP026-31110.</w:t>
       </w:r>
     </w:p>
     <w:p>
@@ -3142,30 +4268,30 @@
         <w:rPr>
           <w:lang w:val="en-US"/>
         </w:rPr>
-        <w:t>Gutenberg, B. &amp; C. F. Richter (1956). Magnitude and energy of earthquakes. Annali di Geofísica. 9. 1-15. ISSN 1593-5213. doi:10.4401/ag-5590</w:t>
-      </w:r>
-    </w:p>
-    <w:p>
-      <w:pPr>
-        <w:spacing w:after="0"/>
+        <w:t xml:space="preserve">Gutenberg, B. &amp; C. F. Richter (1956). Magnitude and energy of earthquakes. Annali di </w:t>
+      </w:r>
+      <w:proofErr w:type="spellStart"/>
+      <w:r>
         <w:rPr>
           <w:lang w:val="en-US"/>
         </w:rPr>
-      </w:pPr>
-    </w:p>
-    <w:p>
-      <w:pPr>
-        <w:spacing w:after="0"/>
+        <w:t>Geofísica</w:t>
+      </w:r>
+      <w:proofErr w:type="spellEnd"/>
+      <w:r>
         <w:rPr>
           <w:lang w:val="en-US"/>
         </w:rPr>
-      </w:pPr>
-      <w:r>
+        <w:t>. 9. 1-15. ISSN 1593-5213. doi:10.4401/ag-5590</w:t>
+      </w:r>
+    </w:p>
+    <w:p>
+      <w:pPr>
+        <w:spacing w:after="0"/>
         <w:rPr>
           <w:lang w:val="en-US"/>
         </w:rPr>
-        <w:t xml:space="preserve">  Kanamori, H., &amp; Rivera, L. (2008).Source inversion of W phase: speeding up seismic tsunami warning. Geophysical Journal International. 175 (1), 222–238. doi: https://doi.org/10.1111/j.1365-246X.2008.03887.x</w:t>
-      </w:r>
+      </w:pPr>
     </w:p>
     <w:p>
       <w:pPr>
@@ -3174,50 +4300,145 @@
           <w:lang w:val="en-US"/>
         </w:rPr>
       </w:pPr>
-    </w:p>
-    <w:p>
-      <w:pPr>
-        <w:spacing w:after="0"/>
+      <w:r>
         <w:rPr>
           <w:lang w:val="en-US"/>
         </w:rPr>
-      </w:pPr>
+        <w:t xml:space="preserve">  Kanamori, H., &amp; Rivera, L. (2008</w:t>
+      </w:r>
+      <w:proofErr w:type="gramStart"/>
       <w:r>
         <w:rPr>
           <w:lang w:val="en-US"/>
         </w:rPr>
-        <w:t xml:space="preserve">  Kikuchi, M., &amp; Kanamori, H. (1991). Inversion of complex body waves—III. Bulletin of the Seismological Society of America. 81 (6): 2335–2350. doi: https://doi.org/10.1785/BSSA0810062335</w:t>
-      </w:r>
-    </w:p>
-    <w:p>
-      <w:pPr>
-        <w:spacing w:after="0"/>
+        <w:t>).Source</w:t>
+      </w:r>
+      <w:proofErr w:type="gramEnd"/>
+      <w:r>
         <w:rPr>
           <w:lang w:val="en-US"/>
         </w:rPr>
-      </w:pPr>
-    </w:p>
-    <w:p>
-      <w:pPr>
-        <w:spacing w:after="0"/>
+        <w:t xml:space="preserve"> inversion of W phase: speeding up seismic tsunami warning. Geophysical Journal International. 175 (1), 222–238. </w:t>
+      </w:r>
+      <w:proofErr w:type="spellStart"/>
+      <w:r>
         <w:rPr>
           <w:lang w:val="en-US"/>
         </w:rPr>
-      </w:pPr>
+        <w:t>doi</w:t>
+      </w:r>
+      <w:proofErr w:type="spellEnd"/>
       <w:r>
         <w:rPr>
           <w:lang w:val="en-US"/>
         </w:rPr>
+        <w:t>: https://doi.org/10.1111/j.1365-246X.2008.03887.x</w:t>
+      </w:r>
+    </w:p>
+    <w:p>
+      <w:pPr>
+        <w:spacing w:after="0"/>
+        <w:rPr>
+          <w:lang w:val="en-US"/>
+        </w:rPr>
+      </w:pPr>
+    </w:p>
+    <w:p>
+      <w:pPr>
+        <w:spacing w:after="0"/>
+        <w:rPr>
+          <w:lang w:val="en-US"/>
+        </w:rPr>
+      </w:pPr>
+      <w:r>
+        <w:rPr>
+          <w:lang w:val="en-US"/>
+        </w:rPr>
+        <w:t xml:space="preserve">  Kikuchi, M., &amp; Kanamori, H. (1991). Inversion of complex body waves—III. Bulletin of the Seismological Society of America. 81 (6): 2335–2350. </w:t>
+      </w:r>
+      <w:proofErr w:type="spellStart"/>
+      <w:r>
+        <w:rPr>
+          <w:lang w:val="en-US"/>
+        </w:rPr>
+        <w:t>doi</w:t>
+      </w:r>
+      <w:proofErr w:type="spellEnd"/>
+      <w:r>
+        <w:rPr>
+          <w:lang w:val="en-US"/>
+        </w:rPr>
+        <w:t>: https://doi.org/10.1785/BSSA0810062335</w:t>
+      </w:r>
+    </w:p>
+    <w:p>
+      <w:pPr>
+        <w:spacing w:after="0"/>
+        <w:rPr>
+          <w:lang w:val="en-US"/>
+        </w:rPr>
+      </w:pPr>
+    </w:p>
+    <w:p>
+      <w:pPr>
+        <w:spacing w:after="0"/>
+        <w:rPr>
+          <w:lang w:val="en-US"/>
+        </w:rPr>
+      </w:pPr>
+      <w:r>
+        <w:rPr>
+          <w:lang w:val="en-US"/>
+        </w:rPr>
+        <w:lastRenderedPageBreak/>
         <w:t xml:space="preserve">  </w:t>
       </w:r>
       <w:r>
-        <w:t xml:space="preserve">Londoño, J., &amp; Romero, J. (2017). Local magnitude scale for Valle Medio del Magdalena región, Colombia. </w:t>
+        <w:t xml:space="preserve">Londoño, J., &amp; Romero, J. (2017). Local </w:t>
+      </w:r>
+      <w:proofErr w:type="spellStart"/>
+      <w:r>
+        <w:t>magnitude</w:t>
+      </w:r>
+      <w:proofErr w:type="spellEnd"/>
+      <w:r>
+        <w:t xml:space="preserve"> </w:t>
+      </w:r>
+      <w:proofErr w:type="spellStart"/>
+      <w:r>
+        <w:t>scale</w:t>
+      </w:r>
+      <w:proofErr w:type="spellEnd"/>
+      <w:r>
+        <w:t xml:space="preserve"> </w:t>
+      </w:r>
+      <w:proofErr w:type="spellStart"/>
+      <w:r>
+        <w:t>for</w:t>
+      </w:r>
+      <w:proofErr w:type="spellEnd"/>
+      <w:r>
+        <w:t xml:space="preserve"> Valle Medio del Magdalena región, Colombia. </w:t>
       </w:r>
       <w:r>
         <w:rPr>
           <w:lang w:val="en-US"/>
         </w:rPr>
-        <w:t>Journal of South American Earth Sciences. 80, 237-243. doi: https://doi.org/10.1016/j.jsames.2019.04.003</w:t>
+        <w:t xml:space="preserve">Journal of South American Earth Sciences. 80, 237-243. </w:t>
+      </w:r>
+      <w:proofErr w:type="spellStart"/>
+      <w:r>
+        <w:rPr>
+          <w:lang w:val="en-US"/>
+        </w:rPr>
+        <w:t>doi</w:t>
+      </w:r>
+      <w:proofErr w:type="spellEnd"/>
+      <w:r>
+        <w:rPr>
+          <w:lang w:val="en-US"/>
+        </w:rPr>
+        <w:t>: https://doi.org/10.1016/j.jsames.2019.04.003</w:t>
       </w:r>
     </w:p>
     <w:p>
@@ -3244,8 +4465,8 @@
           <w:numId w:val="13"/>
         </w:numPr>
       </w:pPr>
-      <w:bookmarkStart w:id="47" w:name="_heading=h.kxbtccd8dklk" w:colFirst="0" w:colLast="0"/>
-      <w:bookmarkEnd w:id="47"/>
+      <w:bookmarkStart w:id="46" w:name="_heading=h.kxbtccd8dklk" w:colFirst="0" w:colLast="0"/>
+      <w:bookmarkEnd w:id="46"/>
       <w:r>
         <w:t>HISTORIAL DE VERSIONES</w:t>
       </w:r>
@@ -3397,8 +4618,13 @@
               <w:t xml:space="preserve">Cargo: </w:t>
             </w:r>
             <w:r>
-              <w:t>Contratista Dirección de Geoamenazas</w:t>
+              <w:t xml:space="preserve">Contratista Dirección de </w:t>
             </w:r>
+            <w:proofErr w:type="spellStart"/>
+            <w:r>
+              <w:t>Geoamenazas</w:t>
+            </w:r>
+            <w:proofErr w:type="spellEnd"/>
           </w:p>
         </w:tc>
         <w:tc>
@@ -3437,10 +4663,10 @@
       </w:pPr>
     </w:p>
     <w:sectPr>
-      <w:headerReference w:type="even" r:id="rId8"/>
-      <w:headerReference w:type="default" r:id="rId9"/>
-      <w:footerReference w:type="default" r:id="rId10"/>
-      <w:headerReference w:type="first" r:id="rId11"/>
+      <w:headerReference w:type="even" r:id="rId12"/>
+      <w:headerReference w:type="default" r:id="rId13"/>
+      <w:footerReference w:type="default" r:id="rId14"/>
+      <w:headerReference w:type="first" r:id="rId15"/>
       <w:pgSz w:w="12240" w:h="15840"/>
       <w:pgMar w:top="567" w:right="1701" w:bottom="1701" w:left="1701" w:header="567" w:footer="680" w:gutter="0"/>
       <w:pgNumType w:start="1"/>
@@ -3684,7 +4910,7 @@
         <w:color w:val="000000"/>
       </w:rPr>
       <mc:AlternateContent>
-        <mc:Choice Requires="wpg">
+        <mc:Choice Requires="wps">
           <w:drawing>
             <wp:anchor distT="0" distB="0" distL="0" distR="0" simplePos="0" relativeHeight="251657728" behindDoc="1" locked="0" layoutInCell="1" hidden="0" allowOverlap="1" wp14:anchorId="4AF979BD" wp14:editId="5FC01F53">
               <wp:simplePos x="0" y="0"/>
@@ -3743,47 +4969,30 @@
             </wp:anchor>
           </w:drawing>
         </mc:Choice>
-        <mc:Fallback xmlns:sl="http://schemas.openxmlformats.org/schemaLibrary/2006/main" xmlns:a="http://schemas.openxmlformats.org/drawingml/2006/main" xmlns:pic="http://schemas.openxmlformats.org/drawingml/2006/picture" xmlns:c="http://schemas.openxmlformats.org/drawingml/2006/chart" xmlns:lc="http://schemas.openxmlformats.org/drawingml/2006/lockedCanvas" xmlns:dgm="http://schemas.openxmlformats.org/drawingml/2006/diagram" xmlns="http://schemas.microsoft.com/office/tasks/2019/documenttasks" xmlns:cr="http://schemas.microsoft.com/office/comments/2020/reactions">
-          <w:drawing>
-            <wp:anchor allowOverlap="1" behindDoc="1" distB="0" distT="0" distL="0" distR="0" hidden="0" layoutInCell="1" locked="0" relativeHeight="0" simplePos="0">
-              <wp:simplePos x="0" y="0"/>
-              <wp:positionH relativeFrom="margin">
-                <wp:align>center</wp:align>
-              </wp:positionH>
-              <wp:positionV relativeFrom="margin">
-                <wp:align>center</wp:align>
-              </wp:positionV>
-              <wp:extent cx="45085819" cy="45085819"/>
-              <wp:effectExtent b="0" l="0" r="0" t="0"/>
-              <wp:wrapNone/>
-              <wp:docPr id="1" name="image35.png"/>
-              <a:graphic>
-                <a:graphicData uri="http://schemas.openxmlformats.org/drawingml/2006/picture">
-                  <pic:pic>
-                    <pic:nvPicPr>
-                      <pic:cNvPr id="0" name="image35.png"/>
-                      <pic:cNvPicPr preferRelativeResize="0"/>
-                    </pic:nvPicPr>
-                    <pic:blipFill>
-                      <a:blip r:embed="rId1"/>
-                      <a:srcRect/>
-                      <a:stretch>
-                        <a:fillRect/>
-                      </a:stretch>
-                    </pic:blipFill>
-                    <pic:spPr>
-                      <a:xfrm>
-                        <a:off x="0" y="0"/>
-                        <a:ext cx="45085819" cy="45085819"/>
-                      </a:xfrm>
-                      <a:prstGeom prst="rect"/>
-                      <a:ln/>
-                    </pic:spPr>
-                  </pic:pic>
-                </a:graphicData>
-              </a:graphic>
-            </wp:anchor>
-          </w:drawing>
+        <mc:Fallback>
+          <w:pict>
+            <v:rect w14:anchorId="4AF979BD" id="Rectángulo 1" o:spid="_x0000_s1026" style="position:absolute;left:0;text-align:left;margin-left:0;margin-top:0;width:3550.05pt;height:3550.05pt;rotation:-45;z-index:-251658752;visibility:visible;mso-wrap-style:square;mso-wrap-distance-left:0;mso-wrap-distance-top:0;mso-wrap-distance-right:0;mso-wrap-distance-bottom:0;mso-position-horizontal:center;mso-position-horizontal-relative:margin;mso-position-vertical:center;mso-position-vertical-relative:margin;v-text-anchor:middle" o:gfxdata="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" filled="f" stroked="f">
+              <v:textbox inset="2.53958mm,2.53958mm,2.53958mm,2.53958mm">
+                <w:txbxContent>
+                  <w:p>
+                    <w:pPr>
+                      <w:spacing w:after="0" w:line="240" w:lineRule="auto"/>
+                      <w:jc w:val="center"/>
+                      <w:textDirection w:val="btLr"/>
+                    </w:pPr>
+                    <w:r>
+                      <w:rPr>
+                        <w:color w:val="C0C0C0"/>
+                        <w:sz w:val="144"/>
+                      </w:rPr>
+                      <w:t>COPIA NO CONTROLADA</w:t>
+                    </w:r>
+                  </w:p>
+                </w:txbxContent>
+              </v:textbox>
+              <w10:wrap anchorx="margin" anchory="margin"/>
+            </v:rect>
+          </w:pict>
         </mc:Fallback>
       </mc:AlternateContent>
     </w:r>
@@ -4265,6 +5474,119 @@
 <file path=word/numbering.xml><?xml version="1.0" encoding="utf-8"?>
 <w:numbering xmlns:wpc="http://schemas.microsoft.com/office/word/2010/wordprocessingCanvas" xmlns:cx="http://schemas.microsoft.com/office/drawing/2014/chartex" xmlns:cx1="http://schemas.microsoft.com/office/drawing/2015/9/8/chartex" xmlns:cx2="http://schemas.microsoft.com/office/drawing/2015/10/21/chartex" xmlns:cx3="http://schemas.microsoft.com/office/drawing/2016/5/9/chartex" xmlns:cx4="http://schemas.microsoft.com/office/drawing/2016/5/10/chartex" xmlns:cx5="http://schemas.microsoft.com/office/drawing/2016/5/11/chartex" xmlns:cx6="http://schemas.microsoft.com/office/drawing/2016/5/12/chartex" xmlns:cx7="http://schemas.microsoft.com/office/drawing/2016/5/13/chartex" xmlns:cx8="http://schemas.microsoft.com/office/drawing/2016/5/14/chartex" xmlns:mc="http://schemas.openxmlformats.org/markup-compatibility/2006" xmlns:aink="http://schemas.microsoft.com/office/drawing/2016/ink" xmlns:am3d="http://schemas.microsoft.com/office/drawing/2017/model3d" xmlns:o="urn:schemas-microsoft-com:office:office" xmlns:oel="http://schemas.microsoft.com/office/2019/extlst" xmlns:r="http://schemas.openxmlformats.org/officeDocument/2006/relationships" xmlns:m="http://schemas.openxmlformats.org/officeDocument/2006/math" xmlns:v="urn:schemas-microsoft-com:vml" xmlns:wp14="http://schemas.microsoft.com/office/word/2010/wordprocessingDrawing" xmlns:wp="http://schemas.openxmlformats.org/drawingml/2006/wordprocessingDrawing" xmlns:w10="urn:schemas-microsoft-com:office:word" xmlns:w="http://schemas.openxmlformats.org/wordprocessingml/2006/main" xmlns:w14="http://schemas.microsoft.com/office/word/2010/wordml" xmlns:w15="http://schemas.microsoft.com/office/word/2012/wordml" xmlns:w16cex="http://schemas.microsoft.com/office/word/2018/wordml/cex" xmlns:w16cid="http://schemas.microsoft.com/office/word/2016/wordml/cid" xmlns:w16="http://schemas.microsoft.com/office/word/2018/wordml" xmlns:w16du="http://schemas.microsoft.com/office/word/2023/wordml/word16du" xmlns:w16sdtdh="http://schemas.microsoft.com/office/word/2020/wordml/sdtdatahash" xmlns:w16sdtfl="http://schemas.microsoft.com/office/word/2024/wordml/sdtformatlock" xmlns:w16se="http://schemas.microsoft.com/office/word/2015/wordml/symex" xmlns:wpg="http://schemas.microsoft.com/office/word/2010/wordprocessingGroup" xmlns:wpi="http://schemas.microsoft.com/office/word/2010/wordprocessingInk" xmlns:wne="http://schemas.microsoft.com/office/word/2006/wordml" xmlns:wps="http://schemas.microsoft.com/office/word/2010/wordprocessingShape" mc:Ignorable="w14 w15 w16se w16cid w16 w16cex w16sdtdh w16sdtfl w16du wp14">
   <w:abstractNum w:abstractNumId="0" w15:restartNumberingAfterBreak="0">
+    <w:nsid w:val="01E14ACD"/>
+    <w:multiLevelType w:val="multilevel"/>
+    <w:tmpl w:val="DA3A810E"/>
+    <w:lvl w:ilvl="0">
+      <w:start w:val="1"/>
+      <w:numFmt w:val="decimal"/>
+      <w:lvlText w:val="%1."/>
+      <w:lvlJc w:val="left"/>
+      <w:pPr>
+        <w:ind w:left="360" w:hanging="360"/>
+      </w:pPr>
+      <w:rPr>
+        <w:rFonts w:hint="default"/>
+      </w:rPr>
+    </w:lvl>
+    <w:lvl w:ilvl="1">
+      <w:start w:val="1"/>
+      <w:numFmt w:val="decimal"/>
+      <w:lvlText w:val="%1.%2."/>
+      <w:lvlJc w:val="left"/>
+      <w:pPr>
+        <w:ind w:left="360" w:hanging="360"/>
+      </w:pPr>
+      <w:rPr>
+        <w:rFonts w:hint="default"/>
+      </w:rPr>
+    </w:lvl>
+    <w:lvl w:ilvl="2">
+      <w:start w:val="1"/>
+      <w:numFmt w:val="decimal"/>
+      <w:lvlText w:val="%1.%2.%3."/>
+      <w:lvlJc w:val="left"/>
+      <w:pPr>
+        <w:ind w:left="720" w:hanging="720"/>
+      </w:pPr>
+      <w:rPr>
+        <w:rFonts w:hint="default"/>
+      </w:rPr>
+    </w:lvl>
+    <w:lvl w:ilvl="3">
+      <w:start w:val="1"/>
+      <w:numFmt w:val="decimal"/>
+      <w:lvlText w:val="%1.%2.%3.%4."/>
+      <w:lvlJc w:val="left"/>
+      <w:pPr>
+        <w:ind w:left="720" w:hanging="720"/>
+      </w:pPr>
+      <w:rPr>
+        <w:rFonts w:hint="default"/>
+      </w:rPr>
+    </w:lvl>
+    <w:lvl w:ilvl="4">
+      <w:start w:val="1"/>
+      <w:numFmt w:val="decimal"/>
+      <w:lvlText w:val="%1.%2.%3.%4.%5."/>
+      <w:lvlJc w:val="left"/>
+      <w:pPr>
+        <w:ind w:left="1080" w:hanging="1080"/>
+      </w:pPr>
+      <w:rPr>
+        <w:rFonts w:hint="default"/>
+      </w:rPr>
+    </w:lvl>
+    <w:lvl w:ilvl="5">
+      <w:start w:val="1"/>
+      <w:numFmt w:val="decimal"/>
+      <w:lvlText w:val="%1.%2.%3.%4.%5.%6."/>
+      <w:lvlJc w:val="left"/>
+      <w:pPr>
+        <w:ind w:left="1080" w:hanging="1080"/>
+      </w:pPr>
+      <w:rPr>
+        <w:rFonts w:hint="default"/>
+      </w:rPr>
+    </w:lvl>
+    <w:lvl w:ilvl="6">
+      <w:start w:val="1"/>
+      <w:numFmt w:val="decimal"/>
+      <w:lvlText w:val="%1.%2.%3.%4.%5.%6.%7."/>
+      <w:lvlJc w:val="left"/>
+      <w:pPr>
+        <w:ind w:left="1440" w:hanging="1440"/>
+      </w:pPr>
+      <w:rPr>
+        <w:rFonts w:hint="default"/>
+      </w:rPr>
+    </w:lvl>
+    <w:lvl w:ilvl="7">
+      <w:start w:val="1"/>
+      <w:numFmt w:val="decimal"/>
+      <w:lvlText w:val="%1.%2.%3.%4.%5.%6.%7.%8."/>
+      <w:lvlJc w:val="left"/>
+      <w:pPr>
+        <w:ind w:left="1440" w:hanging="1440"/>
+      </w:pPr>
+      <w:rPr>
+        <w:rFonts w:hint="default"/>
+      </w:rPr>
+    </w:lvl>
+    <w:lvl w:ilvl="8">
+      <w:start w:val="1"/>
+      <w:numFmt w:val="decimal"/>
+      <w:lvlText w:val="%1.%2.%3.%4.%5.%6.%7.%8.%9."/>
+      <w:lvlJc w:val="left"/>
+      <w:pPr>
+        <w:ind w:left="1800" w:hanging="1800"/>
+      </w:pPr>
+      <w:rPr>
+        <w:rFonts w:hint="default"/>
+      </w:rPr>
+    </w:lvl>
+  </w:abstractNum>
+  <w:abstractNum w:abstractNumId="1" w15:restartNumberingAfterBreak="0">
     <w:nsid w:val="028B4DBE"/>
     <w:multiLevelType w:val="multilevel"/>
     <w:tmpl w:val="4B463A44"/>
@@ -4377,7 +5699,7 @@
       </w:rPr>
     </w:lvl>
   </w:abstractNum>
-  <w:abstractNum w:abstractNumId="1" w15:restartNumberingAfterBreak="0">
+  <w:abstractNum w:abstractNumId="2" w15:restartNumberingAfterBreak="0">
     <w:nsid w:val="0477695C"/>
     <w:multiLevelType w:val="multilevel"/>
     <w:tmpl w:val="7EACEA84"/>
@@ -4490,7 +5812,7 @@
       </w:rPr>
     </w:lvl>
   </w:abstractNum>
-  <w:abstractNum w:abstractNumId="2" w15:restartNumberingAfterBreak="0">
+  <w:abstractNum w:abstractNumId="3" w15:restartNumberingAfterBreak="0">
     <w:nsid w:val="09D01B22"/>
     <w:multiLevelType w:val="multilevel"/>
     <w:tmpl w:val="281C41EA"/>
@@ -4603,7 +5925,7 @@
       </w:rPr>
     </w:lvl>
   </w:abstractNum>
-  <w:abstractNum w:abstractNumId="3" w15:restartNumberingAfterBreak="0">
+  <w:abstractNum w:abstractNumId="4" w15:restartNumberingAfterBreak="0">
     <w:nsid w:val="13236AC4"/>
     <w:multiLevelType w:val="multilevel"/>
     <w:tmpl w:val="74C05C8E"/>
@@ -4716,7 +6038,7 @@
       </w:rPr>
     </w:lvl>
   </w:abstractNum>
-  <w:abstractNum w:abstractNumId="4" w15:restartNumberingAfterBreak="0">
+  <w:abstractNum w:abstractNumId="5" w15:restartNumberingAfterBreak="0">
     <w:nsid w:val="20AA64C2"/>
     <w:multiLevelType w:val="multilevel"/>
     <w:tmpl w:val="5E7424FC"/>
@@ -4829,7 +6151,7 @@
       </w:rPr>
     </w:lvl>
   </w:abstractNum>
-  <w:abstractNum w:abstractNumId="5" w15:restartNumberingAfterBreak="0">
+  <w:abstractNum w:abstractNumId="6" w15:restartNumberingAfterBreak="0">
     <w:nsid w:val="21753472"/>
     <w:multiLevelType w:val="multilevel"/>
     <w:tmpl w:val="7AA81580"/>
@@ -4919,7 +6241,7 @@
       </w:pPr>
     </w:lvl>
   </w:abstractNum>
-  <w:abstractNum w:abstractNumId="6" w15:restartNumberingAfterBreak="0">
+  <w:abstractNum w:abstractNumId="7" w15:restartNumberingAfterBreak="0">
     <w:nsid w:val="22195F22"/>
     <w:multiLevelType w:val="multilevel"/>
     <w:tmpl w:val="E10E7500"/>
@@ -5032,7 +6354,7 @@
       </w:rPr>
     </w:lvl>
   </w:abstractNum>
-  <w:abstractNum w:abstractNumId="7" w15:restartNumberingAfterBreak="0">
+  <w:abstractNum w:abstractNumId="8" w15:restartNumberingAfterBreak="0">
     <w:nsid w:val="25C65647"/>
     <w:multiLevelType w:val="multilevel"/>
     <w:tmpl w:val="6B7AB272"/>
@@ -5145,7 +6467,7 @@
       </w:rPr>
     </w:lvl>
   </w:abstractNum>
-  <w:abstractNum w:abstractNumId="8" w15:restartNumberingAfterBreak="0">
+  <w:abstractNum w:abstractNumId="9" w15:restartNumberingAfterBreak="0">
     <w:nsid w:val="28A32302"/>
     <w:multiLevelType w:val="multilevel"/>
     <w:tmpl w:val="560202F8"/>
@@ -5258,7 +6580,7 @@
       </w:rPr>
     </w:lvl>
   </w:abstractNum>
-  <w:abstractNum w:abstractNumId="9" w15:restartNumberingAfterBreak="0">
+  <w:abstractNum w:abstractNumId="10" w15:restartNumberingAfterBreak="0">
     <w:nsid w:val="2D541A58"/>
     <w:multiLevelType w:val="multilevel"/>
     <w:tmpl w:val="B3B25224"/>
@@ -5371,7 +6693,7 @@
       </w:rPr>
     </w:lvl>
   </w:abstractNum>
-  <w:abstractNum w:abstractNumId="10" w15:restartNumberingAfterBreak="0">
+  <w:abstractNum w:abstractNumId="11" w15:restartNumberingAfterBreak="0">
     <w:nsid w:val="2DEC7094"/>
     <w:multiLevelType w:val="multilevel"/>
     <w:tmpl w:val="3D2C4EBA"/>
@@ -5457,7 +6779,120 @@
       </w:pPr>
     </w:lvl>
   </w:abstractNum>
-  <w:abstractNum w:abstractNumId="11" w15:restartNumberingAfterBreak="0">
+  <w:abstractNum w:abstractNumId="12" w15:restartNumberingAfterBreak="0">
+    <w:nsid w:val="315F45FF"/>
+    <w:multiLevelType w:val="multilevel"/>
+    <w:tmpl w:val="070C9496"/>
+    <w:lvl w:ilvl="0">
+      <w:start w:val="1"/>
+      <w:numFmt w:val="decimal"/>
+      <w:lvlText w:val="%1."/>
+      <w:lvlJc w:val="left"/>
+      <w:pPr>
+        <w:ind w:left="360" w:hanging="360"/>
+      </w:pPr>
+      <w:rPr>
+        <w:rFonts w:hint="default"/>
+      </w:rPr>
+    </w:lvl>
+    <w:lvl w:ilvl="1">
+      <w:start w:val="1"/>
+      <w:numFmt w:val="decimal"/>
+      <w:lvlText w:val="%1.%2."/>
+      <w:lvlJc w:val="left"/>
+      <w:pPr>
+        <w:ind w:left="360" w:hanging="360"/>
+      </w:pPr>
+      <w:rPr>
+        <w:rFonts w:hint="default"/>
+      </w:rPr>
+    </w:lvl>
+    <w:lvl w:ilvl="2">
+      <w:start w:val="1"/>
+      <w:numFmt w:val="decimal"/>
+      <w:lvlText w:val="%1.%2.%3."/>
+      <w:lvlJc w:val="left"/>
+      <w:pPr>
+        <w:ind w:left="720" w:hanging="720"/>
+      </w:pPr>
+      <w:rPr>
+        <w:rFonts w:hint="default"/>
+      </w:rPr>
+    </w:lvl>
+    <w:lvl w:ilvl="3">
+      <w:start w:val="1"/>
+      <w:numFmt w:val="decimal"/>
+      <w:lvlText w:val="%1.%2.%3.%4."/>
+      <w:lvlJc w:val="left"/>
+      <w:pPr>
+        <w:ind w:left="720" w:hanging="720"/>
+      </w:pPr>
+      <w:rPr>
+        <w:rFonts w:hint="default"/>
+      </w:rPr>
+    </w:lvl>
+    <w:lvl w:ilvl="4">
+      <w:start w:val="1"/>
+      <w:numFmt w:val="decimal"/>
+      <w:lvlText w:val="%1.%2.%3.%4.%5."/>
+      <w:lvlJc w:val="left"/>
+      <w:pPr>
+        <w:ind w:left="1080" w:hanging="1080"/>
+      </w:pPr>
+      <w:rPr>
+        <w:rFonts w:hint="default"/>
+      </w:rPr>
+    </w:lvl>
+    <w:lvl w:ilvl="5">
+      <w:start w:val="1"/>
+      <w:numFmt w:val="decimal"/>
+      <w:lvlText w:val="%1.%2.%3.%4.%5.%6."/>
+      <w:lvlJc w:val="left"/>
+      <w:pPr>
+        <w:ind w:left="1080" w:hanging="1080"/>
+      </w:pPr>
+      <w:rPr>
+        <w:rFonts w:hint="default"/>
+      </w:rPr>
+    </w:lvl>
+    <w:lvl w:ilvl="6">
+      <w:start w:val="1"/>
+      <w:numFmt w:val="decimal"/>
+      <w:lvlText w:val="%1.%2.%3.%4.%5.%6.%7."/>
+      <w:lvlJc w:val="left"/>
+      <w:pPr>
+        <w:ind w:left="1440" w:hanging="1440"/>
+      </w:pPr>
+      <w:rPr>
+        <w:rFonts w:hint="default"/>
+      </w:rPr>
+    </w:lvl>
+    <w:lvl w:ilvl="7">
+      <w:start w:val="1"/>
+      <w:numFmt w:val="decimal"/>
+      <w:lvlText w:val="%1.%2.%3.%4.%5.%6.%7.%8."/>
+      <w:lvlJc w:val="left"/>
+      <w:pPr>
+        <w:ind w:left="1440" w:hanging="1440"/>
+      </w:pPr>
+      <w:rPr>
+        <w:rFonts w:hint="default"/>
+      </w:rPr>
+    </w:lvl>
+    <w:lvl w:ilvl="8">
+      <w:start w:val="1"/>
+      <w:numFmt w:val="decimal"/>
+      <w:lvlText w:val="%1.%2.%3.%4.%5.%6.%7.%8.%9."/>
+      <w:lvlJc w:val="left"/>
+      <w:pPr>
+        <w:ind w:left="1800" w:hanging="1800"/>
+      </w:pPr>
+      <w:rPr>
+        <w:rFonts w:hint="default"/>
+      </w:rPr>
+    </w:lvl>
+  </w:abstractNum>
+  <w:abstractNum w:abstractNumId="13" w15:restartNumberingAfterBreak="0">
     <w:nsid w:val="31F00A51"/>
     <w:multiLevelType w:val="multilevel"/>
     <w:tmpl w:val="E28487C8"/>
@@ -5570,7 +7005,7 @@
       </w:rPr>
     </w:lvl>
   </w:abstractNum>
-  <w:abstractNum w:abstractNumId="12" w15:restartNumberingAfterBreak="0">
+  <w:abstractNum w:abstractNumId="14" w15:restartNumberingAfterBreak="0">
     <w:nsid w:val="31FD71CD"/>
     <w:multiLevelType w:val="multilevel"/>
     <w:tmpl w:val="2BE0962E"/>
@@ -5683,7 +7118,7 @@
       </w:rPr>
     </w:lvl>
   </w:abstractNum>
-  <w:abstractNum w:abstractNumId="13" w15:restartNumberingAfterBreak="0">
+  <w:abstractNum w:abstractNumId="15" w15:restartNumberingAfterBreak="0">
     <w:nsid w:val="32E82F91"/>
     <w:multiLevelType w:val="multilevel"/>
     <w:tmpl w:val="05FC0542"/>
@@ -5796,7 +7231,7 @@
       </w:rPr>
     </w:lvl>
   </w:abstractNum>
-  <w:abstractNum w:abstractNumId="14" w15:restartNumberingAfterBreak="0">
+  <w:abstractNum w:abstractNumId="16" w15:restartNumberingAfterBreak="0">
     <w:nsid w:val="377B385A"/>
     <w:multiLevelType w:val="multilevel"/>
     <w:tmpl w:val="4796D91C"/>
@@ -5909,7 +7344,7 @@
       </w:rPr>
     </w:lvl>
   </w:abstractNum>
-  <w:abstractNum w:abstractNumId="15" w15:restartNumberingAfterBreak="0">
+  <w:abstractNum w:abstractNumId="17" w15:restartNumberingAfterBreak="0">
     <w:nsid w:val="3A56479D"/>
     <w:multiLevelType w:val="multilevel"/>
     <w:tmpl w:val="0EEE3082"/>
@@ -6022,7 +7457,7 @@
       </w:rPr>
     </w:lvl>
   </w:abstractNum>
-  <w:abstractNum w:abstractNumId="16" w15:restartNumberingAfterBreak="0">
+  <w:abstractNum w:abstractNumId="18" w15:restartNumberingAfterBreak="0">
     <w:nsid w:val="3E1A3858"/>
     <w:multiLevelType w:val="multilevel"/>
     <w:tmpl w:val="9266DD10"/>
@@ -6135,7 +7570,120 @@
       </w:rPr>
     </w:lvl>
   </w:abstractNum>
-  <w:abstractNum w:abstractNumId="17" w15:restartNumberingAfterBreak="0">
+  <w:abstractNum w:abstractNumId="19" w15:restartNumberingAfterBreak="0">
+    <w:nsid w:val="406D5F12"/>
+    <w:multiLevelType w:val="multilevel"/>
+    <w:tmpl w:val="070C9496"/>
+    <w:lvl w:ilvl="0">
+      <w:start w:val="1"/>
+      <w:numFmt w:val="decimal"/>
+      <w:lvlText w:val="%1."/>
+      <w:lvlJc w:val="left"/>
+      <w:pPr>
+        <w:ind w:left="360" w:hanging="360"/>
+      </w:pPr>
+      <w:rPr>
+        <w:rFonts w:hint="default"/>
+      </w:rPr>
+    </w:lvl>
+    <w:lvl w:ilvl="1">
+      <w:start w:val="1"/>
+      <w:numFmt w:val="decimal"/>
+      <w:lvlText w:val="%1.%2."/>
+      <w:lvlJc w:val="left"/>
+      <w:pPr>
+        <w:ind w:left="360" w:hanging="360"/>
+      </w:pPr>
+      <w:rPr>
+        <w:rFonts w:hint="default"/>
+      </w:rPr>
+    </w:lvl>
+    <w:lvl w:ilvl="2">
+      <w:start w:val="1"/>
+      <w:numFmt w:val="decimal"/>
+      <w:lvlText w:val="%1.%2.%3."/>
+      <w:lvlJc w:val="left"/>
+      <w:pPr>
+        <w:ind w:left="720" w:hanging="720"/>
+      </w:pPr>
+      <w:rPr>
+        <w:rFonts w:hint="default"/>
+      </w:rPr>
+    </w:lvl>
+    <w:lvl w:ilvl="3">
+      <w:start w:val="1"/>
+      <w:numFmt w:val="decimal"/>
+      <w:lvlText w:val="%1.%2.%3.%4."/>
+      <w:lvlJc w:val="left"/>
+      <w:pPr>
+        <w:ind w:left="720" w:hanging="720"/>
+      </w:pPr>
+      <w:rPr>
+        <w:rFonts w:hint="default"/>
+      </w:rPr>
+    </w:lvl>
+    <w:lvl w:ilvl="4">
+      <w:start w:val="1"/>
+      <w:numFmt w:val="decimal"/>
+      <w:lvlText w:val="%1.%2.%3.%4.%5."/>
+      <w:lvlJc w:val="left"/>
+      <w:pPr>
+        <w:ind w:left="1080" w:hanging="1080"/>
+      </w:pPr>
+      <w:rPr>
+        <w:rFonts w:hint="default"/>
+      </w:rPr>
+    </w:lvl>
+    <w:lvl w:ilvl="5">
+      <w:start w:val="1"/>
+      <w:numFmt w:val="decimal"/>
+      <w:lvlText w:val="%1.%2.%3.%4.%5.%6."/>
+      <w:lvlJc w:val="left"/>
+      <w:pPr>
+        <w:ind w:left="1080" w:hanging="1080"/>
+      </w:pPr>
+      <w:rPr>
+        <w:rFonts w:hint="default"/>
+      </w:rPr>
+    </w:lvl>
+    <w:lvl w:ilvl="6">
+      <w:start w:val="1"/>
+      <w:numFmt w:val="decimal"/>
+      <w:lvlText w:val="%1.%2.%3.%4.%5.%6.%7."/>
+      <w:lvlJc w:val="left"/>
+      <w:pPr>
+        <w:ind w:left="1440" w:hanging="1440"/>
+      </w:pPr>
+      <w:rPr>
+        <w:rFonts w:hint="default"/>
+      </w:rPr>
+    </w:lvl>
+    <w:lvl w:ilvl="7">
+      <w:start w:val="1"/>
+      <w:numFmt w:val="decimal"/>
+      <w:lvlText w:val="%1.%2.%3.%4.%5.%6.%7.%8."/>
+      <w:lvlJc w:val="left"/>
+      <w:pPr>
+        <w:ind w:left="1440" w:hanging="1440"/>
+      </w:pPr>
+      <w:rPr>
+        <w:rFonts w:hint="default"/>
+      </w:rPr>
+    </w:lvl>
+    <w:lvl w:ilvl="8">
+      <w:start w:val="1"/>
+      <w:numFmt w:val="decimal"/>
+      <w:lvlText w:val="%1.%2.%3.%4.%5.%6.%7.%8.%9."/>
+      <w:lvlJc w:val="left"/>
+      <w:pPr>
+        <w:ind w:left="1800" w:hanging="1800"/>
+      </w:pPr>
+      <w:rPr>
+        <w:rFonts w:hint="default"/>
+      </w:rPr>
+    </w:lvl>
+  </w:abstractNum>
+  <w:abstractNum w:abstractNumId="20" w15:restartNumberingAfterBreak="0">
     <w:nsid w:val="43085048"/>
     <w:multiLevelType w:val="multilevel"/>
     <w:tmpl w:val="39D87E44"/>
@@ -6248,7 +7796,7 @@
       </w:rPr>
     </w:lvl>
   </w:abstractNum>
-  <w:abstractNum w:abstractNumId="18" w15:restartNumberingAfterBreak="0">
+  <w:abstractNum w:abstractNumId="21" w15:restartNumberingAfterBreak="0">
     <w:nsid w:val="448C62E0"/>
     <w:multiLevelType w:val="multilevel"/>
     <w:tmpl w:val="06A680C4"/>
@@ -6361,7 +7909,7 @@
       </w:rPr>
     </w:lvl>
   </w:abstractNum>
-  <w:abstractNum w:abstractNumId="19" w15:restartNumberingAfterBreak="0">
+  <w:abstractNum w:abstractNumId="22" w15:restartNumberingAfterBreak="0">
     <w:nsid w:val="44D26ADB"/>
     <w:multiLevelType w:val="multilevel"/>
     <w:tmpl w:val="32600BB0"/>
@@ -6492,7 +8040,7 @@
       </w:rPr>
     </w:lvl>
   </w:abstractNum>
-  <w:abstractNum w:abstractNumId="20" w15:restartNumberingAfterBreak="0">
+  <w:abstractNum w:abstractNumId="23" w15:restartNumberingAfterBreak="0">
     <w:nsid w:val="47122E82"/>
     <w:multiLevelType w:val="multilevel"/>
     <w:tmpl w:val="ECA0588A"/>
@@ -6605,7 +8153,7 @@
       </w:rPr>
     </w:lvl>
   </w:abstractNum>
-  <w:abstractNum w:abstractNumId="21" w15:restartNumberingAfterBreak="0">
+  <w:abstractNum w:abstractNumId="24" w15:restartNumberingAfterBreak="0">
     <w:nsid w:val="4CA23164"/>
     <w:multiLevelType w:val="multilevel"/>
     <w:tmpl w:val="0C069F0C"/>
@@ -6718,7 +8266,7 @@
       </w:rPr>
     </w:lvl>
   </w:abstractNum>
-  <w:abstractNum w:abstractNumId="22" w15:restartNumberingAfterBreak="0">
+  <w:abstractNum w:abstractNumId="25" w15:restartNumberingAfterBreak="0">
     <w:nsid w:val="4DAD337D"/>
     <w:multiLevelType w:val="multilevel"/>
     <w:tmpl w:val="1000161C"/>
@@ -6831,7 +8379,7 @@
       </w:rPr>
     </w:lvl>
   </w:abstractNum>
-  <w:abstractNum w:abstractNumId="23" w15:restartNumberingAfterBreak="0">
+  <w:abstractNum w:abstractNumId="26" w15:restartNumberingAfterBreak="0">
     <w:nsid w:val="50DD6F0A"/>
     <w:multiLevelType w:val="multilevel"/>
     <w:tmpl w:val="21121E42"/>
@@ -6944,7 +8492,7 @@
       </w:rPr>
     </w:lvl>
   </w:abstractNum>
-  <w:abstractNum w:abstractNumId="24" w15:restartNumberingAfterBreak="0">
+  <w:abstractNum w:abstractNumId="27" w15:restartNumberingAfterBreak="0">
     <w:nsid w:val="56A674B5"/>
     <w:multiLevelType w:val="multilevel"/>
     <w:tmpl w:val="16B6C3E8"/>
@@ -7057,7 +8605,7 @@
       </w:rPr>
     </w:lvl>
   </w:abstractNum>
-  <w:abstractNum w:abstractNumId="25" w15:restartNumberingAfterBreak="0">
+  <w:abstractNum w:abstractNumId="28" w15:restartNumberingAfterBreak="0">
     <w:nsid w:val="578C610C"/>
     <w:multiLevelType w:val="multilevel"/>
     <w:tmpl w:val="95A0C00E"/>
@@ -7170,7 +8718,7 @@
       </w:rPr>
     </w:lvl>
   </w:abstractNum>
-  <w:abstractNum w:abstractNumId="26" w15:restartNumberingAfterBreak="0">
+  <w:abstractNum w:abstractNumId="29" w15:restartNumberingAfterBreak="0">
     <w:nsid w:val="5E721278"/>
     <w:multiLevelType w:val="multilevel"/>
     <w:tmpl w:val="6D7E059A"/>
@@ -7283,7 +8831,7 @@
       </w:rPr>
     </w:lvl>
   </w:abstractNum>
-  <w:abstractNum w:abstractNumId="27" w15:restartNumberingAfterBreak="0">
+  <w:abstractNum w:abstractNumId="30" w15:restartNumberingAfterBreak="0">
     <w:nsid w:val="64446062"/>
     <w:multiLevelType w:val="multilevel"/>
     <w:tmpl w:val="95A8D66C"/>
@@ -7396,7 +8944,7 @@
       </w:rPr>
     </w:lvl>
   </w:abstractNum>
-  <w:abstractNum w:abstractNumId="28" w15:restartNumberingAfterBreak="0">
+  <w:abstractNum w:abstractNumId="31" w15:restartNumberingAfterBreak="0">
     <w:nsid w:val="654964F9"/>
     <w:multiLevelType w:val="multilevel"/>
     <w:tmpl w:val="CF965A2A"/>
@@ -7509,7 +9057,7 @@
       </w:rPr>
     </w:lvl>
   </w:abstractNum>
-  <w:abstractNum w:abstractNumId="29" w15:restartNumberingAfterBreak="0">
+  <w:abstractNum w:abstractNumId="32" w15:restartNumberingAfterBreak="0">
     <w:nsid w:val="6828091F"/>
     <w:multiLevelType w:val="multilevel"/>
     <w:tmpl w:val="57720BBC"/>
@@ -7622,7 +9170,7 @@
       </w:rPr>
     </w:lvl>
   </w:abstractNum>
-  <w:abstractNum w:abstractNumId="30" w15:restartNumberingAfterBreak="0">
+  <w:abstractNum w:abstractNumId="33" w15:restartNumberingAfterBreak="0">
     <w:nsid w:val="686E124C"/>
     <w:multiLevelType w:val="multilevel"/>
     <w:tmpl w:val="7C0C3F82"/>
@@ -7735,7 +9283,7 @@
       </w:rPr>
     </w:lvl>
   </w:abstractNum>
-  <w:abstractNum w:abstractNumId="31" w15:restartNumberingAfterBreak="0">
+  <w:abstractNum w:abstractNumId="34" w15:restartNumberingAfterBreak="0">
     <w:nsid w:val="70CE5510"/>
     <w:multiLevelType w:val="multilevel"/>
     <w:tmpl w:val="27BE2B9E"/>
@@ -7848,7 +9396,7 @@
       </w:rPr>
     </w:lvl>
   </w:abstractNum>
-  <w:abstractNum w:abstractNumId="32" w15:restartNumberingAfterBreak="0">
+  <w:abstractNum w:abstractNumId="35" w15:restartNumberingAfterBreak="0">
     <w:nsid w:val="712B4D19"/>
     <w:multiLevelType w:val="multilevel"/>
     <w:tmpl w:val="1A36D4EE"/>
@@ -7961,7 +9509,7 @@
       </w:rPr>
     </w:lvl>
   </w:abstractNum>
-  <w:abstractNum w:abstractNumId="33" w15:restartNumberingAfterBreak="0">
+  <w:abstractNum w:abstractNumId="36" w15:restartNumberingAfterBreak="0">
     <w:nsid w:val="71690753"/>
     <w:multiLevelType w:val="multilevel"/>
     <w:tmpl w:val="605C1E50"/>
@@ -8074,7 +9622,7 @@
       </w:rPr>
     </w:lvl>
   </w:abstractNum>
-  <w:abstractNum w:abstractNumId="34" w15:restartNumberingAfterBreak="0">
+  <w:abstractNum w:abstractNumId="37" w15:restartNumberingAfterBreak="0">
     <w:nsid w:val="73BD5D65"/>
     <w:multiLevelType w:val="multilevel"/>
     <w:tmpl w:val="82CA2742"/>
@@ -8187,7 +9735,7 @@
       </w:rPr>
     </w:lvl>
   </w:abstractNum>
-  <w:abstractNum w:abstractNumId="35" w15:restartNumberingAfterBreak="0">
+  <w:abstractNum w:abstractNumId="38" w15:restartNumberingAfterBreak="0">
     <w:nsid w:val="74C90917"/>
     <w:multiLevelType w:val="multilevel"/>
     <w:tmpl w:val="D932ECDC"/>
@@ -8300,7 +9848,7 @@
       </w:rPr>
     </w:lvl>
   </w:abstractNum>
-  <w:abstractNum w:abstractNumId="36" w15:restartNumberingAfterBreak="0">
+  <w:abstractNum w:abstractNumId="39" w15:restartNumberingAfterBreak="0">
     <w:nsid w:val="7598255B"/>
     <w:multiLevelType w:val="multilevel"/>
     <w:tmpl w:val="82FEEB8C"/>
@@ -8413,7 +9961,7 @@
       </w:rPr>
     </w:lvl>
   </w:abstractNum>
-  <w:abstractNum w:abstractNumId="37" w15:restartNumberingAfterBreak="0">
+  <w:abstractNum w:abstractNumId="40" w15:restartNumberingAfterBreak="0">
     <w:nsid w:val="76A84F54"/>
     <w:multiLevelType w:val="multilevel"/>
     <w:tmpl w:val="07EEA836"/>
@@ -8526,7 +10074,7 @@
       </w:rPr>
     </w:lvl>
   </w:abstractNum>
-  <w:abstractNum w:abstractNumId="38" w15:restartNumberingAfterBreak="0">
+  <w:abstractNum w:abstractNumId="41" w15:restartNumberingAfterBreak="0">
     <w:nsid w:val="7A850B53"/>
     <w:multiLevelType w:val="multilevel"/>
     <w:tmpl w:val="668EAFCA"/>
@@ -8616,7 +10164,7 @@
       </w:pPr>
     </w:lvl>
   </w:abstractNum>
-  <w:abstractNum w:abstractNumId="39" w15:restartNumberingAfterBreak="0">
+  <w:abstractNum w:abstractNumId="42" w15:restartNumberingAfterBreak="0">
     <w:nsid w:val="7CBD2DFF"/>
     <w:multiLevelType w:val="multilevel"/>
     <w:tmpl w:val="9918D834"/>
@@ -8748,124 +10296,133 @@
     </w:lvl>
   </w:abstractNum>
   <w:num w:numId="1" w16cid:durableId="2005162141">
+    <w:abstractNumId w:val="33"/>
+  </w:num>
+  <w:num w:numId="2" w16cid:durableId="974144106">
+    <w:abstractNumId w:val="8"/>
+  </w:num>
+  <w:num w:numId="3" w16cid:durableId="680359532">
+    <w:abstractNumId w:val="9"/>
+  </w:num>
+  <w:num w:numId="4" w16cid:durableId="808671696">
+    <w:abstractNumId w:val="20"/>
+  </w:num>
+  <w:num w:numId="5" w16cid:durableId="1995911992">
+    <w:abstractNumId w:val="27"/>
+  </w:num>
+  <w:num w:numId="6" w16cid:durableId="932471781">
+    <w:abstractNumId w:val="38"/>
+  </w:num>
+  <w:num w:numId="7" w16cid:durableId="1774859570">
+    <w:abstractNumId w:val="41"/>
+  </w:num>
+  <w:num w:numId="8" w16cid:durableId="533275737">
+    <w:abstractNumId w:val="6"/>
+  </w:num>
+  <w:num w:numId="9" w16cid:durableId="1638604403">
+    <w:abstractNumId w:val="1"/>
+  </w:num>
+  <w:num w:numId="10" w16cid:durableId="1796946577">
+    <w:abstractNumId w:val="40"/>
+  </w:num>
+  <w:num w:numId="11" w16cid:durableId="919486259">
+    <w:abstractNumId w:val="31"/>
+  </w:num>
+  <w:num w:numId="12" w16cid:durableId="1374576884">
+    <w:abstractNumId w:val="28"/>
+  </w:num>
+  <w:num w:numId="13" w16cid:durableId="1444108437">
+    <w:abstractNumId w:val="11"/>
+  </w:num>
+  <w:num w:numId="14" w16cid:durableId="424694711">
     <w:abstractNumId w:val="30"/>
   </w:num>
-  <w:num w:numId="2" w16cid:durableId="974144106">
+  <w:num w:numId="15" w16cid:durableId="2112431466">
+    <w:abstractNumId w:val="24"/>
+  </w:num>
+  <w:num w:numId="16" w16cid:durableId="1523588018">
+    <w:abstractNumId w:val="26"/>
+  </w:num>
+  <w:num w:numId="17" w16cid:durableId="1258713890">
+    <w:abstractNumId w:val="39"/>
+  </w:num>
+  <w:num w:numId="18" w16cid:durableId="327635277">
+    <w:abstractNumId w:val="21"/>
+  </w:num>
+  <w:num w:numId="19" w16cid:durableId="637495969">
+    <w:abstractNumId w:val="3"/>
+  </w:num>
+  <w:num w:numId="20" w16cid:durableId="461270579">
+    <w:abstractNumId w:val="13"/>
+  </w:num>
+  <w:num w:numId="21" w16cid:durableId="1650556670">
+    <w:abstractNumId w:val="17"/>
+  </w:num>
+  <w:num w:numId="22" w16cid:durableId="84621286">
+    <w:abstractNumId w:val="32"/>
+  </w:num>
+  <w:num w:numId="23" w16cid:durableId="2000228554">
+    <w:abstractNumId w:val="23"/>
+  </w:num>
+  <w:num w:numId="24" w16cid:durableId="1604263756">
+    <w:abstractNumId w:val="42"/>
+  </w:num>
+  <w:num w:numId="25" w16cid:durableId="616526946">
+    <w:abstractNumId w:val="22"/>
+  </w:num>
+  <w:num w:numId="26" w16cid:durableId="201947715">
+    <w:abstractNumId w:val="35"/>
+  </w:num>
+  <w:num w:numId="27" w16cid:durableId="1766612433">
+    <w:abstractNumId w:val="18"/>
+  </w:num>
+  <w:num w:numId="28" w16cid:durableId="663437943">
+    <w:abstractNumId w:val="37"/>
+  </w:num>
+  <w:num w:numId="29" w16cid:durableId="1657150165">
+    <w:abstractNumId w:val="15"/>
+  </w:num>
+  <w:num w:numId="30" w16cid:durableId="1610117533">
+    <w:abstractNumId w:val="16"/>
+  </w:num>
+  <w:num w:numId="31" w16cid:durableId="2112772112">
+    <w:abstractNumId w:val="10"/>
+  </w:num>
+  <w:num w:numId="32" w16cid:durableId="1960915331">
+    <w:abstractNumId w:val="29"/>
+  </w:num>
+  <w:num w:numId="33" w16cid:durableId="1342705417">
+    <w:abstractNumId w:val="25"/>
+  </w:num>
+  <w:num w:numId="34" w16cid:durableId="1163199392">
     <w:abstractNumId w:val="7"/>
   </w:num>
-  <w:num w:numId="3" w16cid:durableId="680359532">
-    <w:abstractNumId w:val="8"/>
+  <w:num w:numId="35" w16cid:durableId="1570727569">
+    <w:abstractNumId w:val="34"/>
   </w:num>
-  <w:num w:numId="4" w16cid:durableId="808671696">
-    <w:abstractNumId w:val="17"/>
+  <w:num w:numId="36" w16cid:durableId="684787578">
+    <w:abstractNumId w:val="2"/>
   </w:num>
-  <w:num w:numId="5" w16cid:durableId="1995911992">
-    <w:abstractNumId w:val="24"/>
+  <w:num w:numId="37" w16cid:durableId="890578656">
+    <w:abstractNumId w:val="36"/>
   </w:num>
-  <w:num w:numId="6" w16cid:durableId="932471781">
-    <w:abstractNumId w:val="35"/>
+  <w:num w:numId="38" w16cid:durableId="341665835">
+    <w:abstractNumId w:val="4"/>
   </w:num>
-  <w:num w:numId="7" w16cid:durableId="1774859570">
-    <w:abstractNumId w:val="38"/>
+  <w:num w:numId="39" w16cid:durableId="1824354167">
+    <w:abstractNumId w:val="14"/>
   </w:num>
-  <w:num w:numId="8" w16cid:durableId="533275737">
+  <w:num w:numId="40" w16cid:durableId="286397430">
     <w:abstractNumId w:val="5"/>
   </w:num>
-  <w:num w:numId="9" w16cid:durableId="1638604403">
+  <w:num w:numId="41" w16cid:durableId="918632130">
     <w:abstractNumId w:val="0"/>
   </w:num>
-  <w:num w:numId="10" w16cid:durableId="1796946577">
-    <w:abstractNumId w:val="37"/>
-  </w:num>
-  <w:num w:numId="11" w16cid:durableId="919486259">
-    <w:abstractNumId w:val="28"/>
-  </w:num>
-  <w:num w:numId="12" w16cid:durableId="1374576884">
-    <w:abstractNumId w:val="25"/>
-  </w:num>
-  <w:num w:numId="13" w16cid:durableId="1444108437">
-    <w:abstractNumId w:val="10"/>
-  </w:num>
-  <w:num w:numId="14" w16cid:durableId="424694711">
-    <w:abstractNumId w:val="27"/>
-  </w:num>
-  <w:num w:numId="15" w16cid:durableId="2112431466">
-    <w:abstractNumId w:val="21"/>
-  </w:num>
-  <w:num w:numId="16" w16cid:durableId="1523588018">
-    <w:abstractNumId w:val="23"/>
-  </w:num>
-  <w:num w:numId="17" w16cid:durableId="1258713890">
-    <w:abstractNumId w:val="36"/>
-  </w:num>
-  <w:num w:numId="18" w16cid:durableId="327635277">
-    <w:abstractNumId w:val="18"/>
-  </w:num>
-  <w:num w:numId="19" w16cid:durableId="637495969">
-    <w:abstractNumId w:val="2"/>
-  </w:num>
-  <w:num w:numId="20" w16cid:durableId="461270579">
-    <w:abstractNumId w:val="11"/>
-  </w:num>
-  <w:num w:numId="21" w16cid:durableId="1650556670">
-    <w:abstractNumId w:val="15"/>
-  </w:num>
-  <w:num w:numId="22" w16cid:durableId="84621286">
-    <w:abstractNumId w:val="29"/>
-  </w:num>
-  <w:num w:numId="23" w16cid:durableId="2000228554">
-    <w:abstractNumId w:val="20"/>
-  </w:num>
-  <w:num w:numId="24" w16cid:durableId="1604263756">
-    <w:abstractNumId w:val="39"/>
-  </w:num>
-  <w:num w:numId="25" w16cid:durableId="616526946">
+  <w:num w:numId="42" w16cid:durableId="1830441435">
     <w:abstractNumId w:val="19"/>
   </w:num>
-  <w:num w:numId="26" w16cid:durableId="201947715">
-    <w:abstractNumId w:val="32"/>
-  </w:num>
-  <w:num w:numId="27" w16cid:durableId="1766612433">
-    <w:abstractNumId w:val="16"/>
-  </w:num>
-  <w:num w:numId="28" w16cid:durableId="663437943">
-    <w:abstractNumId w:val="34"/>
-  </w:num>
-  <w:num w:numId="29" w16cid:durableId="1657150165">
-    <w:abstractNumId w:val="13"/>
-  </w:num>
-  <w:num w:numId="30" w16cid:durableId="1610117533">
-    <w:abstractNumId w:val="14"/>
-  </w:num>
-  <w:num w:numId="31" w16cid:durableId="2112772112">
-    <w:abstractNumId w:val="9"/>
-  </w:num>
-  <w:num w:numId="32" w16cid:durableId="1960915331">
-    <w:abstractNumId w:val="26"/>
-  </w:num>
-  <w:num w:numId="33" w16cid:durableId="1342705417">
-    <w:abstractNumId w:val="22"/>
-  </w:num>
-  <w:num w:numId="34" w16cid:durableId="1163199392">
-    <w:abstractNumId w:val="6"/>
-  </w:num>
-  <w:num w:numId="35" w16cid:durableId="1570727569">
-    <w:abstractNumId w:val="31"/>
-  </w:num>
-  <w:num w:numId="36" w16cid:durableId="684787578">
-    <w:abstractNumId w:val="1"/>
-  </w:num>
-  <w:num w:numId="37" w16cid:durableId="890578656">
-    <w:abstractNumId w:val="33"/>
-  </w:num>
-  <w:num w:numId="38" w16cid:durableId="341665835">
-    <w:abstractNumId w:val="3"/>
-  </w:num>
-  <w:num w:numId="39" w16cid:durableId="1824354167">
+  <w:num w:numId="43" w16cid:durableId="2062556729">
     <w:abstractNumId w:val="12"/>
-  </w:num>
-  <w:num w:numId="40" w16cid:durableId="286397430">
-    <w:abstractNumId w:val="4"/>
   </w:num>
 </w:numbering>
 </file>
@@ -9391,7 +10948,6 @@
   <w:style w:type="character" w:default="1" w:styleId="Fuentedeprrafopredeter">
     <w:name w:val="Default Paragraph Font"/>
     <w:uiPriority w:val="1"/>
-    <w:semiHidden/>
     <w:unhideWhenUsed/>
   </w:style>
   <w:style w:type="table" w:default="1" w:styleId="Tablanormal">
@@ -9524,6 +11080,52 @@
     <w:link w:val="Piedepgina"/>
     <w:uiPriority w:val="99"/>
     <w:rsid w:val="00EE2A38"/>
+  </w:style>
+  <w:style w:type="paragraph" w:styleId="Prrafodelista">
+    <w:name w:val="List Paragraph"/>
+    <w:basedOn w:val="Normal"/>
+    <w:uiPriority w:val="34"/>
+    <w:qFormat/>
+    <w:rsid w:val="00E120B5"/>
+    <w:pPr>
+      <w:ind w:left="720"/>
+      <w:contextualSpacing/>
+    </w:pPr>
+  </w:style>
+  <w:style w:type="character" w:styleId="Hipervnculo">
+    <w:name w:val="Hyperlink"/>
+    <w:basedOn w:val="Fuentedeprrafopredeter"/>
+    <w:uiPriority w:val="99"/>
+    <w:unhideWhenUsed/>
+    <w:rsid w:val="00160D6D"/>
+    <w:rPr>
+      <w:color w:val="0000FF" w:themeColor="hyperlink"/>
+      <w:u w:val="single"/>
+    </w:rPr>
+  </w:style>
+  <w:style w:type="character" w:styleId="Mencinsinresolver">
+    <w:name w:val="Unresolved Mention"/>
+    <w:basedOn w:val="Fuentedeprrafopredeter"/>
+    <w:uiPriority w:val="99"/>
+    <w:semiHidden/>
+    <w:unhideWhenUsed/>
+    <w:rsid w:val="00160D6D"/>
+    <w:rPr>
+      <w:color w:val="605E5C"/>
+      <w:shd w:val="clear" w:color="auto" w:fill="E1DFDD"/>
+    </w:rPr>
+  </w:style>
+  <w:style w:type="character" w:styleId="Hipervnculovisitado">
+    <w:name w:val="FollowedHyperlink"/>
+    <w:basedOn w:val="Fuentedeprrafopredeter"/>
+    <w:uiPriority w:val="99"/>
+    <w:semiHidden/>
+    <w:unhideWhenUsed/>
+    <w:rsid w:val="00160D6D"/>
+    <w:rPr>
+      <w:color w:val="800080" w:themeColor="followedHyperlink"/>
+      <w:u w:val="single"/>
+    </w:rPr>
   </w:style>
 </w:styles>
 </file>

</xml_diff>

<commit_message>
Continued working in System Requirements and Architecture Structure section
</commit_message>
<xml_diff>
--- a/docs/SGC_Manual/1. MO-AME-RSN-XXX MODULO_SIEVECOMP.docx
+++ b/docs/SGC_Manual/1. MO-AME-RSN-XXX MODULO_SIEVECOMP.docx
@@ -340,7 +340,13 @@
                 <w:color w:val="000000"/>
               </w:rPr>
               <w:tab/>
-              <w:t>EJECUCIÓN DE SCOLV</w:t>
+            </w:r>
+            <w:r>
+              <w:rPr>
+                <w:noProof/>
+                <w:color w:val="000000"/>
+              </w:rPr>
+              <w:t>REQUISITOS DE SOFTWARE Y DEPENDENCIAS</w:t>
             </w:r>
             <w:r>
               <w:rPr>
@@ -386,7 +392,34 @@
                 <w:color w:val="000000"/>
               </w:rPr>
               <w:tab/>
-              <w:t xml:space="preserve">PESTAÑA DE LOCALIZACIÓN - </w:t>
+            </w:r>
+            <w:r>
+              <w:rPr>
+                <w:noProof/>
+                <w:color w:val="000000"/>
+              </w:rPr>
+              <w:t>CONFIGURACION DE CONEXIONES Y CREDENCIALES DE SO</w:t>
+            </w:r>
+            <w:r>
+              <w:rPr>
+                <w:noProof/>
+                <w:color w:val="000000"/>
+              </w:rPr>
+              <w:t>L</w:t>
+            </w:r>
+            <w:r>
+              <w:rPr>
+                <w:noProof/>
+                <w:color w:val="000000"/>
+              </w:rPr>
+              <w:t>O LECTURA</w:t>
+            </w:r>
+            <w:r>
+              <w:rPr>
+                <w:noProof/>
+                <w:color w:val="000000"/>
+              </w:rPr>
+              <w:t xml:space="preserve"> </w:t>
             </w:r>
           </w:hyperlink>
           <w:r>
@@ -411,15 +444,6 @@
               <w:noProof/>
             </w:rPr>
             <w:fldChar w:fldCharType="separate"/>
-          </w:r>
-          <w:r>
-            <w:rPr>
-              <w:i/>
-              <w:iCs/>
-              <w:noProof/>
-              <w:color w:val="000000"/>
-            </w:rPr>
-            <w:t>LOCATION</w:t>
           </w:r>
           <w:r>
             <w:rPr>
@@ -470,7 +494,13 @@
                 <w:color w:val="000000"/>
               </w:rPr>
               <w:tab/>
-              <w:t>MAPA</w:t>
+            </w:r>
+            <w:r>
+              <w:rPr>
+                <w:noProof/>
+                <w:color w:val="000000"/>
+              </w:rPr>
+              <w:t>ARCHIVO DE ENTORNO ÚNICO</w:t>
             </w:r>
             <w:r>
               <w:rPr>
@@ -1792,15 +1822,7 @@
         <w:spacing w:after="0"/>
       </w:pPr>
       <w:r>
-        <w:t xml:space="preserve">Establecer las directrices técnicas y operativas para el uso, configuración y ejecución del paquete computacional </w:t>
-      </w:r>
-      <w:proofErr w:type="spellStart"/>
-      <w:r>
-        <w:t>SieveComP</w:t>
-      </w:r>
-      <w:proofErr w:type="spellEnd"/>
-      <w:r>
-        <w:t xml:space="preserve"> en la Red Sismológica Nacional de Colombia (RSNC), estandarizando y automatizando el proceso de auditoría, control de calidad y filtrado de los catálogos sísmicos paramétricos generados en los sistemas SeisComP del Servicio Geológico Colombiano (SGC).</w:t>
+        <w:t>Establecer las directrices técnicas y operativas para el uso, configuración y ejecución del paquete computacional SieveComP en la Red Sismológica Nacional de Colombia (RSNC), estandarizando y automatizando el proceso de auditoría, control de calidad y filtrado de los catálogos sísmicos paramétricos generados en los sistemas SeisComP del Servicio Geológico Colombiano (SGC).</w:t>
       </w:r>
     </w:p>
     <w:p>
@@ -1827,15 +1849,7 @@
         <w:spacing w:after="0"/>
       </w:pPr>
       <w:r>
-        <w:t xml:space="preserve">El presente manual aplica primordialmente a los analistas, sismólogos y personal técnico del grupo de trabajo de Evaluación, Monitoreo y Diagnóstico de Dinámicas Geológicas de la Dirección de </w:t>
-      </w:r>
-      <w:proofErr w:type="spellStart"/>
-      <w:r>
-        <w:t>Geoamenazas</w:t>
-      </w:r>
-      <w:proofErr w:type="spellEnd"/>
-      <w:r>
-        <w:t xml:space="preserve">, responsables de la revisión rutinaria y la calidad de los catálogos en la sala de monitoreo de la RSNC. Así mismo, su aplicación se extiende a cualquier otro grupo de investigación, observatorio vulcanológico o dependencia dentro </w:t>
+        <w:t xml:space="preserve">El presente manual aplica primordialmente a los analistas, sismólogos y personal técnico del grupo de trabajo de Evaluación, Monitoreo y Diagnóstico de Dinámicas Geológicas de la Dirección de Geoamenazas, responsables de la revisión rutinaria y la calidad de los catálogos en la sala de monitoreo de la RSNC. Así mismo, su aplicación se extiende a cualquier otro grupo de investigación, observatorio vulcanológico o dependencia dentro </w:t>
       </w:r>
       <w:r>
         <w:t>del SGC</w:t>
@@ -1888,7 +1902,6 @@
       <w:r>
         <w:t xml:space="preserve">). Mientras que dichos documentos establecen los protocolos de detección, análisis manual y responsabilidades durante los turnos, este manual de </w:t>
       </w:r>
-      <w:proofErr w:type="spellStart"/>
       <w:r>
         <w:rPr>
           <w:b/>
@@ -1896,7 +1909,6 @@
         </w:rPr>
         <w:t>SieveComP</w:t>
       </w:r>
-      <w:proofErr w:type="spellEnd"/>
       <w:r>
         <w:t xml:space="preserve"> proporciona la guía detallada para ejecutar la etapa posterior de auditoría y control de calidad automatizado. La integración de esta herramienta de filtrado en los protocolos existentes asegura una depuración exhaustiva de los datos antes de su publicación definitiva, garantizando la confiabilidad del Catálogo Sísmico Nacional y la continuidad operativa de los estándares de monitoreo del SGC.</w:t>
       </w:r>
@@ -1929,15 +1941,7 @@
         <w:spacing w:after="0"/>
       </w:pPr>
       <w:r>
-        <w:t xml:space="preserve">La operación, auditoría y control de calidad de los catálogos sísmicos utilizando la herramienta </w:t>
-      </w:r>
-      <w:proofErr w:type="spellStart"/>
-      <w:r>
-        <w:t>SieveComP</w:t>
-      </w:r>
-      <w:proofErr w:type="spellEnd"/>
-      <w:r>
-        <w:t xml:space="preserve"> </w:t>
+        <w:t xml:space="preserve">La operación, auditoría y control de calidad de los catálogos sísmicos utilizando la herramienta SieveComP </w:t>
       </w:r>
       <w:r>
         <w:t>se enmarca en</w:t>
@@ -2018,15 +2022,7 @@
         <w:t>Decreto 2703 de 2013:</w:t>
       </w:r>
       <w:r>
-        <w:t xml:space="preserve"> Establece la estructura interna del SGC. En su artículo 9, asigna a la Dirección de </w:t>
-      </w:r>
-      <w:proofErr w:type="spellStart"/>
-      <w:r>
-        <w:t>Geoamenazas</w:t>
-      </w:r>
-      <w:proofErr w:type="spellEnd"/>
-      <w:r>
-        <w:t xml:space="preserve"> la función de investigar, monitorear y evaluar fenómenos generadores de amenazas; elaborar estudios y monitorear la actividad sísmica del país; y proveer información sobre riesgo físico a las autoridades competentes y a la comunidad, además de operar y actualizar la Red Sismológica Nacional de Colombia.</w:t>
+        <w:t xml:space="preserve"> Establece la estructura interna del SGC. En su artículo 9, asigna a la Dirección de Geoamenazas la función de investigar, monitorear y evaluar fenómenos generadores de amenazas; elaborar estudios y monitorear la actividad sísmica del país; y proveer información sobre riesgo físico a las autoridades competentes y a la comunidad, además de operar y actualizar la Red Sismológica Nacional de Colombia.</w:t>
       </w:r>
     </w:p>
     <w:p>
@@ -2046,15 +2042,7 @@
         <w:t>Resolución 1281 de 2024:</w:t>
       </w:r>
       <w:r>
-        <w:t xml:space="preserve"> Asigna al grupo de trabajo Evaluación, Monitoreo y Diagnóstico de Dinámicas Geológicas de la Dirección de </w:t>
-      </w:r>
-      <w:proofErr w:type="spellStart"/>
-      <w:r>
-        <w:t>Geoamenazas</w:t>
-      </w:r>
-      <w:proofErr w:type="spellEnd"/>
-      <w:r>
-        <w:t xml:space="preserve"> las funciones de diseñar, instalar, mantener y operar las redes de monitoreo sísmico; participar en el diseño e implementación de servicios de datos e información; brindar asistencia técnica al SNGRD ante sismos importantes; y </w:t>
+        <w:t xml:space="preserve"> Asigna al grupo de trabajo Evaluación, Monitoreo y Diagnóstico de Dinámicas Geológicas de la Dirección de Geoamenazas las funciones de diseñar, instalar, mantener y operar las redes de monitoreo sísmico; participar en el diseño e implementación de servicios de datos e información; brindar asistencia técnica al SNGRD ante sismos importantes; y </w:t>
       </w:r>
       <w:r>
         <w:rPr>
@@ -2064,15 +2052,7 @@
         <w:t>elaborar boletines e informes técnicos sobre la actividad sísmica</w:t>
       </w:r>
       <w:r>
-        <w:t xml:space="preserve">, procesos que dependen directamente de la calidad de los datos filtrados por </w:t>
-      </w:r>
-      <w:proofErr w:type="spellStart"/>
-      <w:r>
-        <w:t>SieveComP</w:t>
-      </w:r>
-      <w:proofErr w:type="spellEnd"/>
-      <w:r>
-        <w:t>.</w:t>
+        <w:t>, procesos que dependen directamente de la calidad de los datos filtrados por SieveComP.</w:t>
       </w:r>
     </w:p>
     <w:p>
@@ -2147,43 +2127,33 @@
       <w:pPr>
         <w:spacing w:after="0"/>
       </w:pPr>
-      <w:proofErr w:type="spellStart"/>
       <w:r>
         <w:rPr>
           <w:b/>
           <w:bCs/>
         </w:rPr>
-        <w:t>SieveComP</w:t>
-      </w:r>
-      <w:proofErr w:type="spellEnd"/>
+        <w:t>SieveComP:</w:t>
+      </w:r>
+      <w:r>
+        <w:t xml:space="preserve"> Paquete computacional desarrollado en Python que actúa como una capa de abstracción, auditoría y control de calidad sobre las bases de datos de SeisComP. Permite la ejecución de reglas de validación complejas, filtrado espacial de eventos y estandarización de catálogos sin modificar la base de datos de producción.</w:t>
+      </w:r>
+    </w:p>
+    <w:p>
+      <w:pPr>
+        <w:spacing w:after="0"/>
+      </w:pPr>
+    </w:p>
+    <w:p>
+      <w:pPr>
+        <w:spacing w:after="0"/>
+      </w:pPr>
       <w:r>
         <w:rPr>
           <w:b/>
           <w:bCs/>
         </w:rPr>
-        <w:t>:</w:t>
-      </w:r>
-      <w:r>
-        <w:t xml:space="preserve"> Paquete computacional desarrollado en Python que actúa como una capa de abstracción, auditoría y control de calidad sobre las bases de datos de SeisComP. Permite la ejecución de reglas de validación complejas, filtrado espacial de eventos y estandarización de catálogos sin modificar la base de datos de producción.</w:t>
-      </w:r>
-    </w:p>
-    <w:p>
-      <w:pPr>
-        <w:spacing w:after="0"/>
-      </w:pPr>
-    </w:p>
-    <w:p>
-      <w:pPr>
-        <w:spacing w:after="0"/>
-      </w:pPr>
-      <w:r>
-        <w:rPr>
-          <w:b/>
-          <w:bCs/>
-        </w:rPr>
         <w:t>TOML (</w:t>
       </w:r>
-      <w:proofErr w:type="spellStart"/>
       <w:r>
         <w:rPr>
           <w:b/>
@@ -2191,9 +2161,51 @@
           <w:i/>
           <w:iCs/>
         </w:rPr>
-        <w:t>Tom's</w:t>
-      </w:r>
-      <w:proofErr w:type="spellEnd"/>
+        <w:t>Tom's Obvious, Minimal Language</w:t>
+      </w:r>
+      <w:r>
+        <w:rPr>
+          <w:b/>
+          <w:bCs/>
+        </w:rPr>
+        <w:t>):</w:t>
+      </w:r>
+      <w:r>
+        <w:t xml:space="preserve"> Formato de archivo de texto estandarizado y legible por humanos utilizado por SieveComP para definir la configuración del sistema, las credenciales de base de datos, los límites poligonales y las reglas lógicas de control de calidad sin necesidad de escribir código de programación.</w:t>
+      </w:r>
+    </w:p>
+    <w:p>
+      <w:pPr>
+        <w:spacing w:after="0"/>
+      </w:pPr>
+      <w:r>
+        <w:rPr>
+          <w:b/>
+          <w:bCs/>
+        </w:rPr>
+        <w:lastRenderedPageBreak/>
+        <w:t>Catálogo Sísmico Paramétrico:</w:t>
+      </w:r>
+      <w:r>
+        <w:t xml:space="preserve"> Conjunto de datos tabulares que resumen los parámetros fundamentales de los eventos sísmicos localizados por la red (por ejemplo: tiempo de origen, latitud, longitud, profundidad, magnitud, número de fases, algoritmo utilizado), que sirve como insumo para el control de calidad, generación de boletines y publicación oficial.</w:t>
+      </w:r>
+    </w:p>
+    <w:p>
+      <w:pPr>
+        <w:spacing w:after="0"/>
+      </w:pPr>
+    </w:p>
+    <w:p>
+      <w:pPr>
+        <w:spacing w:after="0"/>
+      </w:pPr>
+      <w:r>
+        <w:rPr>
+          <w:b/>
+          <w:bCs/>
+        </w:rPr>
+        <w:t>Vectorización (</w:t>
+      </w:r>
       <w:r>
         <w:rPr>
           <w:b/>
@@ -2201,186 +2213,37 @@
           <w:i/>
           <w:iCs/>
         </w:rPr>
-        <w:t xml:space="preserve"> </w:t>
-      </w:r>
-      <w:proofErr w:type="spellStart"/>
+        <w:t>NumPy Masks</w:t>
+      </w:r>
       <w:r>
         <w:rPr>
           <w:b/>
           <w:bCs/>
-          <w:i/>
-          <w:iCs/>
-        </w:rPr>
-        <w:t>Obvious</w:t>
-      </w:r>
-      <w:proofErr w:type="spellEnd"/>
+        </w:rPr>
+        <w:t>):</w:t>
+      </w:r>
+      <w:r>
+        <w:t xml:space="preserve"> Técnica computacional empleada por el motor de SieveComP que permite aplicar operaciones matemáticas y lógicas a columnas enteras de datos (arreglos) de forma simultánea, evitando los bucles lentos de programación y logrando procesar miles de eventos sísmicos en fracciones de segundo.</w:t>
+      </w:r>
+    </w:p>
+    <w:p>
+      <w:pPr>
+        <w:spacing w:after="0"/>
+      </w:pPr>
+    </w:p>
+    <w:p>
+      <w:pPr>
+        <w:spacing w:after="0"/>
+      </w:pPr>
       <w:r>
         <w:rPr>
           <w:b/>
           <w:bCs/>
-          <w:i/>
-          <w:iCs/>
-        </w:rPr>
-        <w:t xml:space="preserve">, </w:t>
-      </w:r>
-      <w:proofErr w:type="spellStart"/>
-      <w:r>
-        <w:rPr>
-          <w:b/>
-          <w:bCs/>
-          <w:i/>
-          <w:iCs/>
-        </w:rPr>
-        <w:t>Minimal</w:t>
-      </w:r>
-      <w:proofErr w:type="spellEnd"/>
-      <w:r>
-        <w:rPr>
-          <w:b/>
-          <w:bCs/>
-          <w:i/>
-          <w:iCs/>
-        </w:rPr>
-        <w:t xml:space="preserve"> </w:t>
-      </w:r>
-      <w:proofErr w:type="spellStart"/>
-      <w:r>
-        <w:rPr>
-          <w:b/>
-          <w:bCs/>
-          <w:i/>
-          <w:iCs/>
-        </w:rPr>
-        <w:t>Language</w:t>
-      </w:r>
-      <w:proofErr w:type="spellEnd"/>
-      <w:r>
-        <w:rPr>
-          <w:b/>
-          <w:bCs/>
-        </w:rPr>
-        <w:t>):</w:t>
-      </w:r>
-      <w:r>
-        <w:t xml:space="preserve"> Formato de archivo de texto estandarizado y legible por humanos utilizado por </w:t>
-      </w:r>
-      <w:proofErr w:type="spellStart"/>
-      <w:r>
-        <w:t>SieveComP</w:t>
-      </w:r>
-      <w:proofErr w:type="spellEnd"/>
-      <w:r>
-        <w:t xml:space="preserve"> para definir la configuración del sistema, las credenciales de base de datos, los límites poligonales y las reglas lógicas de control de calidad sin necesidad de escribir código de programación.</w:t>
-      </w:r>
-    </w:p>
-    <w:p>
-      <w:pPr>
-        <w:spacing w:after="0"/>
-      </w:pPr>
-      <w:r>
-        <w:rPr>
-          <w:b/>
-          <w:bCs/>
-        </w:rPr>
-        <w:lastRenderedPageBreak/>
-        <w:t>Catálogo Sísmico Paramétrico:</w:t>
-      </w:r>
-      <w:r>
-        <w:t xml:space="preserve"> Conjunto de datos tabulares que resumen los parámetros fundamentales de los eventos sísmicos localizados por la red (por ejemplo: tiempo de origen, latitud, longitud, profundidad, magnitud, número de fases, algoritmo utilizado), que sirve como insumo para el control de calidad, generación de boletines y publicación oficial.</w:t>
-      </w:r>
-    </w:p>
-    <w:p>
-      <w:pPr>
-        <w:spacing w:after="0"/>
-      </w:pPr>
-    </w:p>
-    <w:p>
-      <w:pPr>
-        <w:spacing w:after="0"/>
-      </w:pPr>
-      <w:r>
-        <w:rPr>
-          <w:b/>
-          <w:bCs/>
-        </w:rPr>
-        <w:t>Vectorización (</w:t>
-      </w:r>
-      <w:proofErr w:type="spellStart"/>
-      <w:r>
-        <w:rPr>
-          <w:b/>
-          <w:bCs/>
-          <w:i/>
-          <w:iCs/>
-        </w:rPr>
-        <w:t>NumPy</w:t>
-      </w:r>
-      <w:proofErr w:type="spellEnd"/>
-      <w:r>
-        <w:rPr>
-          <w:b/>
-          <w:bCs/>
-          <w:i/>
-          <w:iCs/>
-        </w:rPr>
-        <w:t xml:space="preserve"> </w:t>
-      </w:r>
-      <w:proofErr w:type="spellStart"/>
-      <w:r>
-        <w:rPr>
-          <w:b/>
-          <w:bCs/>
-          <w:i/>
-          <w:iCs/>
-        </w:rPr>
-        <w:t>Masks</w:t>
-      </w:r>
-      <w:proofErr w:type="spellEnd"/>
-      <w:r>
-        <w:rPr>
-          <w:b/>
-          <w:bCs/>
-        </w:rPr>
-        <w:t>):</w:t>
-      </w:r>
-      <w:r>
-        <w:t xml:space="preserve"> Técnica computacional empleada por el motor de </w:t>
-      </w:r>
-      <w:proofErr w:type="spellStart"/>
-      <w:r>
-        <w:t>SieveComP</w:t>
-      </w:r>
-      <w:proofErr w:type="spellEnd"/>
-      <w:r>
-        <w:t xml:space="preserve"> que permite aplicar operaciones matemáticas y lógicas a columnas enteras de datos (arreglos) de forma simultánea, evitando los bucles lentos de programación y logrando procesar miles de eventos sísmicos en fracciones de segundo.</w:t>
-      </w:r>
-    </w:p>
-    <w:p>
-      <w:pPr>
-        <w:spacing w:after="0"/>
-      </w:pPr>
-    </w:p>
-    <w:p>
-      <w:pPr>
-        <w:spacing w:after="0"/>
-      </w:pPr>
-      <w:r>
-        <w:rPr>
-          <w:b/>
-          <w:bCs/>
         </w:rPr>
         <w:t>Eventos Duplicados:</w:t>
       </w:r>
       <w:r>
-        <w:t xml:space="preserve"> Registros múltiples en la base de datos que corresponden al mismo fenómeno sísmico físico, usualmente generados por discrepancias en la asociación automática de fases. </w:t>
-      </w:r>
-      <w:proofErr w:type="spellStart"/>
-      <w:r>
-        <w:t>SieveComP</w:t>
-      </w:r>
-      <w:proofErr w:type="spellEnd"/>
-      <w:r>
-        <w:t xml:space="preserve"> los detecta utilizando algoritmos de ventana temporal y proximidad espacial (como la aproximación de ventana deslizante - SSWA).</w:t>
+        <w:t xml:space="preserve"> Registros múltiples en la base de datos que corresponden al mismo fenómeno sísmico físico, usualmente generados por discrepancias en la asociación automática de fases. SieveComP los detecta utilizando algoritmos de ventana temporal y proximidad espacial (como la aproximación de ventana deslizante - SSWA).</w:t>
       </w:r>
     </w:p>
     <w:p>
@@ -2406,7 +2269,6 @@
       <w:pPr>
         <w:spacing w:after="0"/>
       </w:pPr>
-      <w:proofErr w:type="spellStart"/>
       <w:r>
         <w:rPr>
           <w:b/>
@@ -2414,7 +2276,6 @@
         </w:rPr>
         <w:t>SieveComP</w:t>
       </w:r>
-      <w:proofErr w:type="spellEnd"/>
       <w:r>
         <w:t xml:space="preserve"> está estructurado bajo una arquitectura modular y desacoplada que opera como una capa intermedia de auditoría y control de calidad entre las bases de datos operativas de SeisComP y los usuarios finales (analistas de turno, sismólogos o rutinas automatizadas). El principio</w:t>
       </w:r>
@@ -2424,7 +2285,6 @@
       <w:r>
         <w:t>de su diseño es el acceso estrictamente de solo lectura (</w:t>
       </w:r>
-      <w:proofErr w:type="spellStart"/>
       <w:r>
         <w:rPr>
           <w:i/>
@@ -2432,7 +2292,6 @@
         </w:rPr>
         <w:t>read-only</w:t>
       </w:r>
-      <w:proofErr w:type="spellEnd"/>
       <w:r>
         <w:t>), lo que garantiza la protección integral de las bases de datos de producción de la RSNC, eliminando cualquier riesgo de alteración, bloqueo o sobreescritura accidental de la información sismológica en tiempo real.</w:t>
       </w:r>
@@ -2530,7 +2389,6 @@
       <w:r>
         <w:t xml:space="preserve">, procesa catálogos masivos aplicando operaciones vectorizadas con </w:t>
       </w:r>
-      <w:proofErr w:type="spellStart"/>
       <w:r>
         <w:rPr>
           <w:i/>
@@ -2538,7 +2396,6 @@
         </w:rPr>
         <w:t>NumPy</w:t>
       </w:r>
-      <w:proofErr w:type="spellEnd"/>
       <w:r>
         <w:t xml:space="preserve"> </w:t>
       </w:r>
@@ -2578,7 +2435,6 @@
       <w:r>
         <w:t xml:space="preserve">, integra análisis geométrico con </w:t>
       </w:r>
-      <w:proofErr w:type="spellStart"/>
       <w:r>
         <w:t>S</w:t>
       </w:r>
@@ -2589,7 +2445,6 @@
         </w:rPr>
         <w:t>hapely</w:t>
       </w:r>
-      <w:proofErr w:type="spellEnd"/>
       <w:r>
         <w:t xml:space="preserve"> </w:t>
       </w:r>
@@ -2649,7 +2504,6 @@
       <w:r>
         <w:t xml:space="preserve">) para flujos por lotes o mediante una aplicación web interactiva desarrollada en </w:t>
       </w:r>
-      <w:proofErr w:type="spellStart"/>
       <w:r>
         <w:rPr>
           <w:i/>
@@ -2657,7 +2511,6 @@
         </w:rPr>
         <w:t>Streamlit</w:t>
       </w:r>
-      <w:proofErr w:type="spellEnd"/>
       <w:r>
         <w:rPr>
           <w:i/>
@@ -2670,23 +2523,7 @@
           <w:i/>
           <w:iCs/>
         </w:rPr>
-        <w:t>(</w:t>
-      </w:r>
-      <w:proofErr w:type="spellStart"/>
-      <w:r>
-        <w:rPr>
-          <w:i/>
-          <w:iCs/>
-        </w:rPr>
-        <w:t>Streamlit</w:t>
-      </w:r>
-      <w:proofErr w:type="spellEnd"/>
-      <w:r>
-        <w:rPr>
-          <w:i/>
-          <w:iCs/>
-        </w:rPr>
-        <w:t xml:space="preserve"> Inc., 2019)</w:t>
+        <w:t>(Streamlit Inc., 2019)</w:t>
       </w:r>
       <w:r>
         <w:t>, exportando reportes consolidados para la toma de decisiones operativas.</w:t>
@@ -2714,12 +2551,331 @@
         </w:numPr>
       </w:pPr>
       <w:r>
-        <w:t>EJECUCIÓN DE SCOLV</w:t>
-      </w:r>
-    </w:p>
-    <w:p>
-      <w:r>
-        <w:t>a</w:t>
+        <w:t>REQUISITOS DE SOFTWARE Y DEPENDENCIAS</w:t>
+      </w:r>
+    </w:p>
+    <w:p>
+      <w:r>
+        <w:t>Para garantizar la correcta ejecución del paquete SieveComP tanto en las estaciones de trabajo de los analistas en la sala de monitoreo, como en los servidores de la RSNC, el sistema anfitrión debe cumplir con los siguientes requerimientos técnicos y dependencias de software:</w:t>
+      </w:r>
+    </w:p>
+    <w:p>
+      <w:pPr>
+        <w:pStyle w:val="Prrafodelista"/>
+        <w:numPr>
+          <w:ilvl w:val="0"/>
+          <w:numId w:val="44"/>
+        </w:numPr>
+      </w:pPr>
+      <w:r>
+        <w:rPr>
+          <w:b/>
+          <w:bCs/>
+        </w:rPr>
+        <w:t>Entorno de ejecución base</w:t>
+      </w:r>
+    </w:p>
+    <w:p>
+      <w:pPr>
+        <w:pStyle w:val="Prrafodelista"/>
+        <w:numPr>
+          <w:ilvl w:val="0"/>
+          <w:numId w:val="45"/>
+        </w:numPr>
+      </w:pPr>
+      <w:r>
+        <w:rPr>
+          <w:b/>
+          <w:bCs/>
+        </w:rPr>
+        <w:t>Lenguaje de Programación:</w:t>
+      </w:r>
+      <w:r>
+        <w:t xml:space="preserve"> Python 3.12 o </w:t>
+      </w:r>
+      <w:r>
+        <w:t>superior.</w:t>
+      </w:r>
+    </w:p>
+    <w:p>
+      <w:pPr>
+        <w:pStyle w:val="Prrafodelista"/>
+        <w:numPr>
+          <w:ilvl w:val="0"/>
+          <w:numId w:val="45"/>
+        </w:numPr>
+      </w:pPr>
+      <w:r>
+        <w:rPr>
+          <w:b/>
+          <w:bCs/>
+        </w:rPr>
+        <w:t>Gestor de Entornos:</w:t>
+      </w:r>
+      <w:r>
+        <w:t xml:space="preserve"> Se recomienda instalar el paquete dentro de un entorno virtual aislado (usando venv o conda) para evitar conflictos de dependencias con otros aplicativos del SGC.</w:t>
+      </w:r>
+    </w:p>
+    <w:p>
+      <w:pPr>
+        <w:pStyle w:val="Prrafodelista"/>
+        <w:numPr>
+          <w:ilvl w:val="0"/>
+          <w:numId w:val="45"/>
+        </w:numPr>
+      </w:pPr>
+      <w:r>
+        <w:rPr>
+          <w:b/>
+          <w:bCs/>
+        </w:rPr>
+        <w:t>Sistema Operativo:</w:t>
+      </w:r>
+      <w:r>
+        <w:t xml:space="preserve"> Multiplataforma. Compatible con distribuciones Linux (estándar en los servidores de adquisición y procesamiento de SeisComP), Windows (equipos de analistas) y macOS.</w:t>
+      </w:r>
+    </w:p>
+    <w:p>
+      <w:pPr>
+        <w:pStyle w:val="Prrafodelista"/>
+        <w:numPr>
+          <w:ilvl w:val="0"/>
+          <w:numId w:val="44"/>
+        </w:numPr>
+        <w:rPr>
+          <w:b/>
+          <w:bCs/>
+        </w:rPr>
+      </w:pPr>
+      <w:r>
+        <w:rPr>
+          <w:b/>
+          <w:bCs/>
+        </w:rPr>
+        <w:t>Librerías y Paquetes de Terceros (Dependencias):</w:t>
+      </w:r>
+    </w:p>
+    <w:p>
+      <w:pPr>
+        <w:ind w:left="360"/>
+      </w:pPr>
+      <w:r>
+        <w:t>El correcto funcionamiento del motor de extracción, evaluación geométrica y despliegue gráfico requiere la instalación de las siguientes librerías especializadas:</w:t>
+      </w:r>
+    </w:p>
+    <w:p>
+      <w:pPr>
+        <w:pStyle w:val="Prrafodelista"/>
+        <w:numPr>
+          <w:ilvl w:val="0"/>
+          <w:numId w:val="45"/>
+        </w:numPr>
+      </w:pPr>
+      <w:r>
+        <w:rPr>
+          <w:b/>
+          <w:bCs/>
+        </w:rPr>
+        <w:t>pandas (McKinney, 2010):</w:t>
+      </w:r>
+      <w:r>
+        <w:t xml:space="preserve"> Manejo y estructuración del catálogo sísmico extraído mediante </w:t>
+      </w:r>
+      <w:r>
+        <w:rPr>
+          <w:i/>
+          <w:iCs/>
+        </w:rPr>
+        <w:t>DataFrames</w:t>
+      </w:r>
+      <w:r>
+        <w:t>, facilitando la manipulación tabular de los eventos, orígenes y magnitudes.</w:t>
+      </w:r>
+    </w:p>
+    <w:p>
+      <w:pPr>
+        <w:pStyle w:val="Prrafodelista"/>
+        <w:numPr>
+          <w:ilvl w:val="0"/>
+          <w:numId w:val="45"/>
+        </w:numPr>
+      </w:pPr>
+      <w:r>
+        <w:rPr>
+          <w:b/>
+          <w:bCs/>
+        </w:rPr>
+        <w:t>NumPy (Harris et al., 2020):</w:t>
+      </w:r>
+      <w:r>
+        <w:t xml:space="preserve"> Base computacional del motor de SieveComP. Habilita las operaciones vectorizadas de alto rendimiento (máscaras booleanas) y el cálculo matricial necesario para el algoritmo </w:t>
+      </w:r>
+      <w:r>
+        <w:t>de detección de duplicados</w:t>
+      </w:r>
+      <w:r>
+        <w:t xml:space="preserve"> (SSWA).</w:t>
+      </w:r>
+    </w:p>
+    <w:p>
+      <w:pPr>
+        <w:pStyle w:val="Prrafodelista"/>
+        <w:numPr>
+          <w:ilvl w:val="0"/>
+          <w:numId w:val="45"/>
+        </w:numPr>
+      </w:pPr>
+      <w:r>
+        <w:rPr>
+          <w:b/>
+          <w:bCs/>
+        </w:rPr>
+        <w:t>Shapely (Gillies et al., 2007):</w:t>
+      </w:r>
+      <w:r>
+        <w:t xml:space="preserve"> Módulo encargado del análisis geométrico espacial. Permite comprobar matemáticamente si los epicentros calculados caen dentro (o fuera) de los polígonos predefinidos de la RSNC (zonas de magnitud, observatorios vulcanológicos, regiones tectónicas).</w:t>
+      </w:r>
+    </w:p>
+    <w:p>
+      <w:pPr>
+        <w:pStyle w:val="Prrafodelista"/>
+        <w:numPr>
+          <w:ilvl w:val="0"/>
+          <w:numId w:val="45"/>
+        </w:numPr>
+      </w:pPr>
+      <w:r>
+        <w:rPr>
+          <w:b/>
+          <w:bCs/>
+        </w:rPr>
+        <w:t>PyMySQL (Yuh et al., 2010):</w:t>
+      </w:r>
+      <w:r>
+        <w:t xml:space="preserve"> Controlador (</w:t>
+      </w:r>
+      <w:proofErr w:type="gramStart"/>
+      <w:r>
+        <w:rPr>
+          <w:i/>
+          <w:iCs/>
+        </w:rPr>
+        <w:t>driver</w:t>
+      </w:r>
+      <w:proofErr w:type="gramEnd"/>
+      <w:r>
+        <w:t>) nativo de Python que permite la conexión y extracción de información directamente desde las bases de datos MariaDB/MySQL de los sistemas SeisComP3 y SeisComP6.</w:t>
+      </w:r>
+    </w:p>
+    <w:p>
+      <w:pPr>
+        <w:pStyle w:val="Prrafodelista"/>
+        <w:numPr>
+          <w:ilvl w:val="0"/>
+          <w:numId w:val="45"/>
+        </w:numPr>
+      </w:pPr>
+      <w:r>
+        <w:rPr>
+          <w:b/>
+          <w:bCs/>
+        </w:rPr>
+        <w:lastRenderedPageBreak/>
+        <w:t>Streamlit (Streamlit Inc., 2019):</w:t>
+      </w:r>
+      <w:r>
+        <w:t xml:space="preserve"> </w:t>
+      </w:r>
+      <w:r>
+        <w:rPr>
+          <w:i/>
+          <w:iCs/>
+        </w:rPr>
+        <w:t>Framework</w:t>
+      </w:r>
+      <w:r>
+        <w:t xml:space="preserve"> utilizado para el despliegue del modo </w:t>
+      </w:r>
+      <w:r>
+        <w:rPr>
+          <w:i/>
+          <w:iCs/>
+        </w:rPr>
+        <w:t>frontend</w:t>
+      </w:r>
+      <w:r>
+        <w:t xml:space="preserve"> (interfaz gráfica interactiva), permitiendo a los analistas en turno auditar los datos desde el navegador web sin necesidad de ejecutar código de consola.</w:t>
+      </w:r>
+    </w:p>
+    <w:p>
+      <w:pPr>
+        <w:pStyle w:val="Prrafodelista"/>
+        <w:numPr>
+          <w:ilvl w:val="0"/>
+          <w:numId w:val="44"/>
+        </w:numPr>
+        <w:rPr>
+          <w:b/>
+          <w:bCs/>
+        </w:rPr>
+      </w:pPr>
+      <w:r>
+        <w:rPr>
+          <w:b/>
+          <w:bCs/>
+        </w:rPr>
+        <w:t>Instalación:</w:t>
+      </w:r>
+    </w:p>
+    <w:p>
+      <w:pPr>
+        <w:ind w:left="360"/>
+      </w:pPr>
+      <w:r>
+        <w:t>La instalación del paquete y todas las dependencias listadas se realiza de manera automática ejecutando el gestor de paquetes de Python en el directorio raíz del repositorio oficial (clonado en el equipo local o servidor), mediante el comando:</w:t>
+      </w:r>
+    </w:p>
+    <w:p>
+      <w:pPr>
+        <w:ind w:left="360"/>
+        <w:jc w:val="center"/>
+        <w:rPr>
+          <w:b/>
+          <w:bCs/>
+          <w:i/>
+          <w:iCs/>
+          <w:color w:val="1F497D" w:themeColor="text2"/>
+        </w:rPr>
+      </w:pPr>
+      <w:r>
+        <w:rPr>
+          <w:b/>
+          <w:bCs/>
+          <w:i/>
+          <w:iCs/>
+          <w:color w:val="1F497D" w:themeColor="text2"/>
+        </w:rPr>
+        <w:t>pip install -</w:t>
+      </w:r>
+      <w:proofErr w:type="gramStart"/>
+      <w:r>
+        <w:rPr>
+          <w:b/>
+          <w:bCs/>
+          <w:i/>
+          <w:iCs/>
+          <w:color w:val="1F497D" w:themeColor="text2"/>
+        </w:rPr>
+        <w:t>e .</w:t>
+      </w:r>
+      <w:proofErr w:type="gramEnd"/>
+    </w:p>
+    <w:p>
+      <w:pPr>
+        <w:ind w:left="360"/>
+      </w:pPr>
+      <w:r>
+        <w:t>(Nota: El uso del flag -e permite instalar el paquete en modo editable, facilitando futuras actualizaciones del repositorio sin requerir reinstalación).</w:t>
       </w:r>
     </w:p>
     <w:p>
@@ -2733,27 +2889,119 @@
       <w:bookmarkStart w:id="6" w:name="_heading=h.g6ef08n1gqb" w:colFirst="0" w:colLast="0"/>
       <w:bookmarkEnd w:id="6"/>
       <w:r>
-        <w:t xml:space="preserve">PESTAÑA DE LOCALIZACIÓN - </w:t>
-      </w:r>
-      <w:r>
-        <w:rPr>
-          <w:i/>
-          <w:iCs/>
-        </w:rPr>
-        <w:t xml:space="preserve">LOCATION </w:t>
-      </w:r>
-    </w:p>
-    <w:p>
-      <w:pPr>
-        <w:spacing w:after="0"/>
-      </w:pPr>
-    </w:p>
-    <w:p>
-      <w:pPr>
-        <w:spacing w:after="0"/>
-      </w:pPr>
-      <w:r>
-        <w:t>e</w:t>
+        <w:t>CONFIGURACIÓN DE CONEXIONES Y CREDENCIALES DE SOLO LECTURA</w:t>
+      </w:r>
+    </w:p>
+    <w:p>
+      <w:pPr>
+        <w:spacing w:after="0"/>
+      </w:pPr>
+    </w:p>
+    <w:p>
+      <w:pPr>
+        <w:spacing w:after="0"/>
+      </w:pPr>
+      <w:r>
+        <w:t>Para garantizar la seguridad y la integridad de la infraestructura operativa de SeisComP en la RSNC, SieveComP soporta múltiples formatos para la gestión de conexiones a las bases de datos.</w:t>
+      </w:r>
+    </w:p>
+    <w:p>
+      <w:pPr>
+        <w:spacing w:after="0"/>
+      </w:pPr>
+    </w:p>
+    <w:p>
+      <w:pPr>
+        <w:spacing w:after="0"/>
+        <w:rPr>
+          <w:b/>
+          <w:bCs/>
+        </w:rPr>
+      </w:pPr>
+      <w:r>
+        <w:rPr>
+          <w:b/>
+          <w:bCs/>
+        </w:rPr>
+        <w:t>Política Estricta de Seguridad (Solo Lectura)</w:t>
+      </w:r>
+    </w:p>
+    <w:p>
+      <w:pPr>
+        <w:spacing w:after="0"/>
+        <w:rPr>
+          <w:b/>
+          <w:bCs/>
+        </w:rPr>
+      </w:pPr>
+    </w:p>
+    <w:p>
+      <w:pPr>
+        <w:spacing w:after="0"/>
+      </w:pPr>
+      <w:r>
+        <w:t xml:space="preserve">Es un requisito </w:t>
+      </w:r>
+      <w:r>
+        <w:rPr>
+          <w:b/>
+          <w:bCs/>
+        </w:rPr>
+        <w:t>obligatorio</w:t>
+      </w:r>
+      <w:r>
+        <w:t xml:space="preserve"> que cualquier credencial proporcionada a SieveComP corresponda a un usuario de base de datos con privilegios estrictamente limitados a </w:t>
+      </w:r>
+      <w:r>
+        <w:rPr>
+          <w:b/>
+          <w:bCs/>
+        </w:rPr>
+        <w:t>SOLO LECTURA (SELECT)</w:t>
+      </w:r>
+      <w:r>
+        <w:t>. Restringir los permisos a nivel de motor de base de datos (MySQL/MariaDB) mitiga cualquier riesgo de alteración, inserción (INSERT) o borrado (DELETE) accidental sobre los catálogos en producción.</w:t>
+      </w:r>
+    </w:p>
+    <w:p>
+      <w:pPr>
+        <w:spacing w:after="0"/>
+      </w:pPr>
+    </w:p>
+    <w:p>
+      <w:pPr>
+        <w:spacing w:after="0"/>
+        <w:rPr>
+          <w:b/>
+          <w:bCs/>
+        </w:rPr>
+      </w:pPr>
+      <w:r>
+        <w:rPr>
+          <w:b/>
+          <w:bCs/>
+        </w:rPr>
+        <w:t>Formatos de Declaración de Conexiones</w:t>
+      </w:r>
+    </w:p>
+    <w:p>
+      <w:pPr>
+        <w:spacing w:after="0"/>
+        <w:rPr>
+          <w:b/>
+          <w:bCs/>
+        </w:rPr>
+      </w:pPr>
+    </w:p>
+    <w:p>
+      <w:pPr>
+        <w:spacing w:after="0"/>
+      </w:pPr>
+      <w:r>
+        <w:t>El esquema TOML de SieveComP permite definir la conexión a la base de datos de diversas formas, adaptándose a despliegues simples o a requerimientos de múltiples servidores (ej. servidor principal, respaldo o pruebas).</w:t>
+      </w:r>
+      <w:r>
+        <w:t xml:space="preserve"> A continuación, presentaremos las diferentes formas de configurar conexiones a bases de datos de SeisComP.</w:t>
       </w:r>
     </w:p>
     <w:p>
@@ -2772,37 +3020,288 @@
       <w:bookmarkStart w:id="7" w:name="_heading=h.6ff0mfpo07rx" w:colFirst="0" w:colLast="0"/>
       <w:bookmarkEnd w:id="7"/>
       <w:r>
-        <w:t>MAPA</w:t>
-      </w:r>
-    </w:p>
-    <w:p>
-      <w:pPr>
-        <w:spacing w:after="0"/>
-      </w:pPr>
-    </w:p>
-    <w:p>
-      <w:pPr>
-        <w:spacing w:after="0"/>
-      </w:pPr>
-      <w:r>
-        <w:t xml:space="preserve">i </w:t>
-      </w:r>
-    </w:p>
-    <w:p>
-      <w:pPr>
-        <w:spacing w:after="0"/>
-      </w:pPr>
-    </w:p>
-    <w:p>
-      <w:pPr>
-        <w:spacing w:after="0"/>
-        <w:jc w:val="center"/>
-        <w:rPr>
-          <w:color w:val="000000"/>
-          <w:sz w:val="20"/>
-          <w:szCs w:val="20"/>
-        </w:rPr>
-      </w:pPr>
+        <w:t>ARCHIVO DE ENTORNO ÚNICO</w:t>
+      </w:r>
+    </w:p>
+    <w:p>
+      <w:pPr>
+        <w:spacing w:after="0"/>
+      </w:pPr>
+    </w:p>
+    <w:p>
+      <w:pPr>
+        <w:spacing w:after="0"/>
+      </w:pPr>
+      <w:r>
+        <w:t xml:space="preserve">El método más seguro y recomendado es crear un archivo de texto oculto </w:t>
+      </w:r>
+      <w:proofErr w:type="gramStart"/>
+      <w:r>
+        <w:t xml:space="preserve">llamado </w:t>
+      </w:r>
+      <w:r>
+        <w:rPr>
+          <w:i/>
+          <w:iCs/>
+        </w:rPr>
+        <w:t>.env</w:t>
+      </w:r>
+      <w:proofErr w:type="gramEnd"/>
+      <w:r>
+        <w:t xml:space="preserve"> en el directorio de ejecución, manteniendo las credenciales fuera del código. El administrador del sistema o el analista debe crear un archivo de texto plano, el cual contendrá los parámetros de red y autenticación.</w:t>
+      </w:r>
+    </w:p>
+    <w:p>
+      <w:r>
+        <w:lastRenderedPageBreak/>
+        <w:t>A continuación, se presenta la estructura estándar requerida para conectar SieveComP a una instancia de SeisComP:</w:t>
+      </w:r>
+    </w:p>
+    <w:p>
+      <w:pPr>
+        <w:spacing w:after="0"/>
+      </w:pPr>
+    </w:p>
+    <w:p>
+      <w:pPr>
+        <w:pStyle w:val="Codigo"/>
+      </w:pPr>
+      <w:r>
+        <w:t># Credenciales de lectura para la base de datos de SeisComP</w:t>
+      </w:r>
+    </w:p>
+    <w:p>
+      <w:pPr>
+        <w:pStyle w:val="Codigo"/>
+        <w:rPr>
+          <w:lang w:val="en-US"/>
+        </w:rPr>
+      </w:pPr>
+      <w:r>
+        <w:rPr>
+          <w:lang w:val="en-US"/>
+        </w:rPr>
+        <w:t>SERVER_SC6_USER=consulta</w:t>
+      </w:r>
+    </w:p>
+    <w:p>
+      <w:pPr>
+        <w:pStyle w:val="Codigo"/>
+        <w:rPr>
+          <w:lang w:val="en-US"/>
+        </w:rPr>
+      </w:pPr>
+      <w:r>
+        <w:rPr>
+          <w:lang w:val="en-US"/>
+        </w:rPr>
+        <w:t>SERVER_SC6_PASSWORD=consulta</w:t>
+      </w:r>
+    </w:p>
+    <w:p>
+      <w:pPr>
+        <w:pStyle w:val="Codigo"/>
+        <w:rPr>
+          <w:lang w:val="en-US"/>
+        </w:rPr>
+      </w:pPr>
+      <w:r>
+        <w:rPr>
+          <w:lang w:val="en-US"/>
+        </w:rPr>
+        <w:t>SERVER_SC6_HOST=10.100.100.xxx</w:t>
+      </w:r>
+    </w:p>
+    <w:p>
+      <w:pPr>
+        <w:pStyle w:val="Codigo"/>
+        <w:rPr>
+          <w:lang w:val="en-US"/>
+        </w:rPr>
+      </w:pPr>
+      <w:r>
+        <w:rPr>
+          <w:lang w:val="en-US"/>
+        </w:rPr>
+        <w:t>SERVER_SC6_PORT=3306</w:t>
+      </w:r>
+    </w:p>
+    <w:p>
+      <w:pPr>
+        <w:pStyle w:val="Codigo"/>
+      </w:pPr>
+      <w:r>
+        <w:t>SERVER_SC6_DATABASE=seiscomp3</w:t>
+      </w:r>
+    </w:p>
+    <w:p>
+      <w:pPr>
+        <w:spacing w:after="0"/>
+      </w:pPr>
+    </w:p>
+    <w:p>
+      <w:pPr>
+        <w:spacing w:after="0"/>
+      </w:pPr>
+      <w:r>
+        <w:rPr>
+          <w:b/>
+          <w:bCs/>
+        </w:rPr>
+        <w:t>Descripción de los parámetros:</w:t>
+      </w:r>
+    </w:p>
+    <w:p>
+      <w:pPr>
+        <w:numPr>
+          <w:ilvl w:val="0"/>
+          <w:numId w:val="46"/>
+        </w:numPr>
+        <w:spacing w:after="0"/>
+      </w:pPr>
+      <w:r>
+        <w:rPr>
+          <w:rStyle w:val="CodigoCar"/>
+        </w:rPr>
+        <w:t>SERVER_SC6_USER</w:t>
+      </w:r>
+      <w:r>
+        <w:t xml:space="preserve">: Nombre del usuario de la base de datos (ej. </w:t>
+      </w:r>
+      <w:r>
+        <w:rPr>
+          <w:i/>
+          <w:iCs/>
+        </w:rPr>
+        <w:t>consulta</w:t>
+      </w:r>
+      <w:r>
+        <w:t>).</w:t>
+      </w:r>
+    </w:p>
+    <w:p>
+      <w:pPr>
+        <w:numPr>
+          <w:ilvl w:val="0"/>
+          <w:numId w:val="46"/>
+        </w:numPr>
+        <w:spacing w:after="0"/>
+      </w:pPr>
+      <w:r>
+        <w:rPr>
+          <w:rStyle w:val="CodigoCar"/>
+        </w:rPr>
+        <w:t>SERVER_SC6_PASSWORD</w:t>
+      </w:r>
+      <w:r>
+        <w:t>: Contraseña asignada al usuario de solo lectura.</w:t>
+      </w:r>
+    </w:p>
+    <w:p>
+      <w:pPr>
+        <w:numPr>
+          <w:ilvl w:val="0"/>
+          <w:numId w:val="46"/>
+        </w:numPr>
+        <w:spacing w:after="0"/>
+      </w:pPr>
+      <w:r>
+        <w:rPr>
+          <w:rStyle w:val="CodigoCar"/>
+        </w:rPr>
+        <w:t>SERVER_SC6_HOST</w:t>
+      </w:r>
+      <w:r>
+        <w:t>: Dirección IP o nombre de dominio del servidor de base de datos de SeisComP.</w:t>
+      </w:r>
+    </w:p>
+    <w:p>
+      <w:pPr>
+        <w:numPr>
+          <w:ilvl w:val="0"/>
+          <w:numId w:val="46"/>
+        </w:numPr>
+        <w:spacing w:after="0"/>
+      </w:pPr>
+      <w:r>
+        <w:rPr>
+          <w:rStyle w:val="CodigoCar"/>
+        </w:rPr>
+        <w:t>SERVER_SC6_PORT</w:t>
+      </w:r>
+      <w:r>
+        <w:t>: Puerto de conexión al motor de base de datos (por defecto 3306 para MySQL/MariaDB).</w:t>
+      </w:r>
+    </w:p>
+    <w:p>
+      <w:pPr>
+        <w:numPr>
+          <w:ilvl w:val="0"/>
+          <w:numId w:val="46"/>
+        </w:numPr>
+        <w:spacing w:after="0"/>
+      </w:pPr>
+      <w:r>
+        <w:rPr>
+          <w:rStyle w:val="CodigoCar"/>
+        </w:rPr>
+        <w:t>SERVER_SC6_DATABASE</w:t>
+      </w:r>
+      <w:r>
+        <w:t>: Nombre de la base de datos que contiene el catálogo (comúnmente seiscomp3 o seiscomp).</w:t>
+      </w:r>
+    </w:p>
+    <w:p>
+      <w:pPr>
+        <w:spacing w:after="0"/>
+      </w:pPr>
+      <w:r>
+        <w:rPr>
+          <w:b/>
+          <w:bCs/>
+          <w:i/>
+          <w:iCs/>
+        </w:rPr>
+        <w:t>Nota operativa:</w:t>
+      </w:r>
+      <w:r>
+        <w:t xml:space="preserve"> El prefijo </w:t>
+      </w:r>
+      <w:r>
+        <w:rPr>
+          <w:rStyle w:val="CodigoCar"/>
+        </w:rPr>
+        <w:t>SERVER_SC6_</w:t>
+      </w:r>
+      <w:r>
+        <w:t xml:space="preserve"> es personalizable. Si la RSNC maneja múltiples servidores (por ejemplo, el servidor principal, el de respaldo o uno de pruebas), se pueden configurar diferentes bloques en el mismo </w:t>
+      </w:r>
+      <w:proofErr w:type="gramStart"/>
+      <w:r>
+        <w:t>archivo .env</w:t>
+      </w:r>
+      <w:proofErr w:type="gramEnd"/>
+      <w:r>
+        <w:t xml:space="preserve"> (ej. </w:t>
+      </w:r>
+      <w:r>
+        <w:rPr>
+          <w:rStyle w:val="CodigoCar"/>
+        </w:rPr>
+        <w:t>SERVER_TEST_USER</w:t>
+      </w:r>
+      <w:r>
+        <w:t xml:space="preserve">, </w:t>
+      </w:r>
+      <w:r>
+        <w:rPr>
+          <w:rStyle w:val="CodigoCar"/>
+        </w:rPr>
+        <w:t>SERVER_SC3_HOST</w:t>
+      </w:r>
+      <w:r>
+        <w:t>, etc.). Posteriormente, el archivo de reglas principal (formato TOML) utilizará este prefijo para indicarle a SieveComP a qué servidor específico debe conectarse durante la auditoría.</w:t>
+      </w:r>
     </w:p>
     <w:p>
       <w:pPr>
@@ -2929,6 +3428,7 @@
       <w:bookmarkEnd w:id="11"/>
       <w:bookmarkEnd w:id="12"/>
       <w:r>
+        <w:lastRenderedPageBreak/>
         <w:t>BARRA DE HERRAMIENTAS DE LOCALIZACIÓN</w:t>
       </w:r>
     </w:p>
@@ -2956,7 +3456,6 @@
       <w:bookmarkStart w:id="13" w:name="_heading=h.jtmxxy2er7qf" w:colFirst="0" w:colLast="0"/>
       <w:bookmarkEnd w:id="13"/>
       <w:r>
-        <w:lastRenderedPageBreak/>
         <w:t>LOCALIZADOR</w:t>
       </w:r>
     </w:p>
@@ -2999,13 +3498,8 @@
       <w:pPr>
         <w:spacing w:after="0"/>
       </w:pPr>
-      <w:proofErr w:type="spellStart"/>
-      <w:r>
-        <w:t>zador</w:t>
-      </w:r>
-      <w:proofErr w:type="spellEnd"/>
-      <w:r>
-        <w:t>.</w:t>
+      <w:r>
+        <w:t>zador.</w:t>
       </w:r>
     </w:p>
     <w:p>
@@ -3144,21 +3638,12 @@
           <w:color w:val="000000"/>
         </w:rPr>
       </w:pPr>
-      <w:proofErr w:type="spellStart"/>
       <w:r>
         <w:rPr>
           <w:b/>
           <w:bCs/>
         </w:rPr>
-        <w:t>Relocate</w:t>
-      </w:r>
-      <w:proofErr w:type="spellEnd"/>
-      <w:r>
-        <w:rPr>
-          <w:b/>
-          <w:bCs/>
-        </w:rPr>
-        <w:t xml:space="preserve">: </w:t>
+        <w:t xml:space="preserve">Relocate: </w:t>
       </w:r>
     </w:p>
     <w:p>
@@ -3241,6 +3726,7 @@
         <w:spacing w:after="0"/>
       </w:pPr>
       <w:r>
+        <w:lastRenderedPageBreak/>
         <w:t xml:space="preserve">En esta </w:t>
       </w:r>
     </w:p>
@@ -3273,7 +3759,6 @@
         <w:spacing w:after="0"/>
       </w:pPr>
       <w:r>
-        <w:lastRenderedPageBreak/>
         <w:t xml:space="preserve">El mapa </w:t>
       </w:r>
     </w:p>
@@ -3544,6 +4029,7 @@
         <w:spacing w:after="0"/>
       </w:pPr>
       <w:r>
+        <w:lastRenderedPageBreak/>
         <w:t xml:space="preserve">SeisComP </w:t>
       </w:r>
     </w:p>
@@ -3562,7 +4048,6 @@
       <w:bookmarkStart w:id="36" w:name="_heading=h.qyqi6q9pzbrf" w:colFirst="0" w:colLast="0"/>
       <w:bookmarkEnd w:id="36"/>
       <w:r>
-        <w:lastRenderedPageBreak/>
         <w:t>ALGORITMOS DE AGRUPACIÓN DE PICKS TIPOS DE ALGORITMOS</w:t>
       </w:r>
     </w:p>
@@ -3667,23 +4152,7 @@
         <w:spacing w:after="0"/>
       </w:pPr>
       <w:r>
-        <w:t xml:space="preserve">Hay dos módulos para medir amplitudes a partir de las formas de onda </w:t>
-      </w:r>
-      <w:proofErr w:type="spellStart"/>
-      <w:r>
-        <w:t>scamp</w:t>
-      </w:r>
-      <w:proofErr w:type="spellEnd"/>
-      <w:r>
-        <w:t xml:space="preserve"> y </w:t>
-      </w:r>
-      <w:proofErr w:type="spellStart"/>
-      <w:r>
-        <w:t>scautopick</w:t>
-      </w:r>
-      <w:proofErr w:type="spellEnd"/>
-      <w:r>
-        <w:t>.</w:t>
+        <w:t>Hay dos módulos para medir amplitudes a partir de las formas de onda scamp y scautopick.</w:t>
       </w:r>
     </w:p>
     <w:p>
@@ -3841,6 +4310,7 @@
       <w:bookmarkStart w:id="44" w:name="_heading=h.fnugoucc49im" w:colFirst="0" w:colLast="0"/>
       <w:bookmarkEnd w:id="44"/>
       <w:r>
+        <w:lastRenderedPageBreak/>
         <w:t>DOCUMENTOS ASOCIADOS</w:t>
       </w:r>
     </w:p>
@@ -3890,7 +4360,6 @@
       <w:bookmarkStart w:id="45" w:name="_heading=h.36xr58wu6gih" w:colFirst="0" w:colLast="0"/>
       <w:bookmarkEnd w:id="45"/>
       <w:r>
-        <w:lastRenderedPageBreak/>
         <w:t>BIBLIOGRAFÍA</w:t>
       </w:r>
     </w:p>
@@ -3907,49 +4376,7 @@
         <w:rPr>
           <w:lang w:val="en-US"/>
         </w:rPr>
-        <w:t xml:space="preserve">Harris, C. R., Millman, K. J., van der Walt, S. J., </w:t>
-      </w:r>
-      <w:proofErr w:type="spellStart"/>
-      <w:r>
-        <w:rPr>
-          <w:lang w:val="en-US"/>
-        </w:rPr>
-        <w:t>Gommers</w:t>
-      </w:r>
-      <w:proofErr w:type="spellEnd"/>
-      <w:r>
-        <w:rPr>
-          <w:lang w:val="en-US"/>
-        </w:rPr>
-        <w:t xml:space="preserve">, R., Virtanen, P., </w:t>
-      </w:r>
-      <w:proofErr w:type="spellStart"/>
-      <w:r>
-        <w:rPr>
-          <w:lang w:val="en-US"/>
-        </w:rPr>
-        <w:t>Cournapeau</w:t>
-      </w:r>
-      <w:proofErr w:type="spellEnd"/>
-      <w:r>
-        <w:rPr>
-          <w:lang w:val="en-US"/>
-        </w:rPr>
-        <w:t xml:space="preserve">, D., ... &amp; Oliphant, T. E. (2020). Array programming with NumPy. Nature, 585(7825), 357-362. </w:t>
-      </w:r>
-      <w:proofErr w:type="spellStart"/>
-      <w:r>
-        <w:rPr>
-          <w:lang w:val="en-US"/>
-        </w:rPr>
-        <w:t>doi</w:t>
-      </w:r>
-      <w:proofErr w:type="spellEnd"/>
-      <w:r>
-        <w:rPr>
-          <w:lang w:val="en-US"/>
-        </w:rPr>
-        <w:t xml:space="preserve">: </w:t>
+        <w:t xml:space="preserve">Harris, C. R., Millman, K. J., van der Walt, S. J., Gommers, R., Virtanen, P., Cournapeau, D., ... &amp; Oliphant, T. E. (2020). Array programming with NumPy. Nature, 585(7825), 357-362. doi: </w:t>
       </w:r>
       <w:hyperlink r:id="rId8" w:tgtFrame="_blank" w:history="1">
         <w:r>
@@ -3991,21 +4418,7 @@
         <w:rPr>
           <w:lang w:val="en-US"/>
         </w:rPr>
-        <w:t xml:space="preserve">McKinney, W. (2010). Data Structures for Statistical Computing in Python. Proceedings of the 9th Python in Science Conference, 51-56. </w:t>
-      </w:r>
-      <w:proofErr w:type="spellStart"/>
-      <w:r>
-        <w:rPr>
-          <w:lang w:val="en-US"/>
-        </w:rPr>
-        <w:t>doi</w:t>
-      </w:r>
-      <w:proofErr w:type="spellEnd"/>
-      <w:r>
-        <w:rPr>
-          <w:lang w:val="en-US"/>
-        </w:rPr>
-        <w:t xml:space="preserve">: </w:t>
+        <w:t xml:space="preserve">McKinney, W. (2010). Data Structures for Statistical Computing in Python. Proceedings of the 9th Python in Science Conference, 51-56. doi: </w:t>
       </w:r>
       <w:hyperlink r:id="rId9" w:tgtFrame="_blank" w:history="1">
         <w:r>
@@ -4033,21 +4446,7 @@
         <w:rPr>
           <w:lang w:val="en-US"/>
         </w:rPr>
-        <w:t xml:space="preserve">Gillies, S., y </w:t>
-      </w:r>
-      <w:proofErr w:type="spellStart"/>
-      <w:r>
-        <w:rPr>
-          <w:lang w:val="en-US"/>
-        </w:rPr>
-        <w:t>otros</w:t>
-      </w:r>
-      <w:proofErr w:type="spellEnd"/>
-      <w:r>
-        <w:rPr>
-          <w:lang w:val="en-US"/>
-        </w:rPr>
-        <w:t xml:space="preserve">. (2007). Shapely: manipulation and analysis of geometric objects. </w:t>
+        <w:t xml:space="preserve">Gillies, S., y otros. (2007). Shapely: manipulation and analysis of geometric objects. </w:t>
       </w:r>
       <w:r>
         <w:t xml:space="preserve">Toblerity.org. Recuperado de: </w:t>
@@ -4070,44 +4469,17 @@
       <w:pPr>
         <w:spacing w:after="0"/>
       </w:pPr>
-      <w:proofErr w:type="spellStart"/>
-      <w:r>
-        <w:t>Streamlit</w:t>
-      </w:r>
-      <w:proofErr w:type="spellEnd"/>
-      <w:r>
-        <w:t xml:space="preserve"> Inc. </w:t>
+      <w:r>
+        <w:t xml:space="preserve">Streamlit Inc. </w:t>
       </w:r>
       <w:r>
         <w:rPr>
           <w:lang w:val="en-US"/>
         </w:rPr>
-        <w:t xml:space="preserve">(2019). </w:t>
-      </w:r>
-      <w:proofErr w:type="spellStart"/>
-      <w:r>
-        <w:rPr>
-          <w:lang w:val="en-US"/>
-        </w:rPr>
-        <w:t>Streamlit</w:t>
-      </w:r>
-      <w:proofErr w:type="spellEnd"/>
-      <w:r>
-        <w:rPr>
-          <w:lang w:val="en-US"/>
-        </w:rPr>
-        <w:t xml:space="preserve">: The fastest way to build and share data apps. </w:t>
-      </w:r>
-      <w:r>
-        <w:t xml:space="preserve">Software </w:t>
-      </w:r>
-      <w:proofErr w:type="spellStart"/>
-      <w:r>
-        <w:t>library</w:t>
-      </w:r>
-      <w:proofErr w:type="spellEnd"/>
-      <w:r>
-        <w:t xml:space="preserve">. Recuperado de: </w:t>
+        <w:t xml:space="preserve">(2019). Streamlit: The fastest way to build and share data apps. </w:t>
+      </w:r>
+      <w:r>
+        <w:t xml:space="preserve">Software library. Recuperado de: </w:t>
       </w:r>
       <w:hyperlink r:id="rId11" w:tgtFrame="_blank" w:history="1">
         <w:r>
@@ -4144,22 +4516,56 @@
         <w:rPr>
           <w:lang w:val="en-US"/>
         </w:rPr>
-        <w:t xml:space="preserve">Bormann, P., &amp; Saul, J. (2008). The new IASPEI standard broadband magnitude m B. Seismological Research Letters, 79(5), 698-705. </w:t>
-      </w:r>
-      <w:proofErr w:type="spellStart"/>
-      <w:r>
+        <w:t>Bormann, P., &amp; Saul, J. (2008). The new IASPEI standard broadband magnitude m B. Seismological Research Letters, 79(5), 698-705. doi: https://doi.org/10.1785/gssrl.79.5.698</w:t>
+      </w:r>
+    </w:p>
+    <w:p>
+      <w:pPr>
+        <w:spacing w:after="0"/>
         <w:rPr>
           <w:lang w:val="en-US"/>
         </w:rPr>
-        <w:t>doi</w:t>
-      </w:r>
-      <w:proofErr w:type="spellEnd"/>
+      </w:pPr>
+    </w:p>
+    <w:p>
+      <w:pPr>
+        <w:spacing w:after="0"/>
+      </w:pPr>
       <w:r>
         <w:rPr>
           <w:lang w:val="en-US"/>
         </w:rPr>
-        <w:t>: https://doi.org/10.1785/gssrl.79.5.698</w:t>
-      </w:r>
+        <w:t xml:space="preserve">  Brune, J. (1970). Tectonic Stress and the Spectra of Seismic Shear Waves from Earthquakes. </w:t>
+      </w:r>
+      <w:r>
+        <w:t>Journal of Geophysical Research. 75 (26), 4997-5009. doi: 10.1029/JB075i026p04997</w:t>
+      </w:r>
+    </w:p>
+    <w:p>
+      <w:pPr>
+        <w:spacing w:after="0"/>
+      </w:pPr>
+    </w:p>
+    <w:p>
+      <w:pPr>
+        <w:spacing w:after="0"/>
+      </w:pPr>
+      <w:r>
+        <w:t xml:space="preserve">  Eraso, J. (2010) Cálculo de la Magnitud de Momento Mw mediante análisis espectral. Informe Interno. / Red Sismológica Nacional de Colombia - INGEOMINAS. - Bogotá </w:t>
+      </w:r>
+      <w:proofErr w:type="gramStart"/>
+      <w:r>
+        <w:t>D.C. :</w:t>
+      </w:r>
+      <w:proofErr w:type="gramEnd"/>
+      <w:r>
+        <w:t xml:space="preserve"> -; 1-44. - P IP026-31110.</w:t>
+      </w:r>
+    </w:p>
+    <w:p>
+      <w:pPr>
+        <w:spacing w:after="0"/>
+      </w:pPr>
     </w:p>
     <w:p>
       <w:pPr>
@@ -4168,277 +4574,103 @@
           <w:lang w:val="en-US"/>
         </w:rPr>
       </w:pPr>
-    </w:p>
-    <w:p>
-      <w:pPr>
-        <w:spacing w:after="0"/>
-      </w:pPr>
+      <w:r>
+        <w:t xml:space="preserve">  </w:t>
+      </w:r>
       <w:r>
         <w:rPr>
           <w:lang w:val="en-US"/>
         </w:rPr>
-        <w:t xml:space="preserve">  Brune, J. (1970). Tectonic Stress and the Spectra of Seismic Shear Waves from Earthquakes. </w:t>
-      </w:r>
-      <w:proofErr w:type="spellStart"/>
-      <w:r>
-        <w:t>Journal</w:t>
-      </w:r>
-      <w:proofErr w:type="spellEnd"/>
-      <w:r>
-        <w:t xml:space="preserve"> </w:t>
-      </w:r>
-      <w:proofErr w:type="spellStart"/>
-      <w:r>
-        <w:t>of</w:t>
-      </w:r>
-      <w:proofErr w:type="spellEnd"/>
-      <w:r>
-        <w:t xml:space="preserve"> </w:t>
-      </w:r>
-      <w:proofErr w:type="spellStart"/>
-      <w:r>
-        <w:t>Geophysical</w:t>
-      </w:r>
-      <w:proofErr w:type="spellEnd"/>
-      <w:r>
-        <w:t xml:space="preserve"> </w:t>
-      </w:r>
-      <w:proofErr w:type="spellStart"/>
-      <w:r>
-        <w:t>Research</w:t>
-      </w:r>
-      <w:proofErr w:type="spellEnd"/>
-      <w:r>
-        <w:t xml:space="preserve">. 75 (26), 4997-5009. </w:t>
-      </w:r>
-      <w:proofErr w:type="spellStart"/>
-      <w:r>
-        <w:t>doi</w:t>
-      </w:r>
-      <w:proofErr w:type="spellEnd"/>
-      <w:r>
-        <w:t>: 10.1029/JB075i026p04997</w:t>
-      </w:r>
-    </w:p>
-    <w:p>
-      <w:pPr>
-        <w:spacing w:after="0"/>
-      </w:pPr>
-    </w:p>
-    <w:p>
-      <w:pPr>
-        <w:spacing w:after="0"/>
-      </w:pPr>
-      <w:r>
-        <w:t xml:space="preserve">  Eraso, J. (2010) Cálculo de la Magnitud de Momento </w:t>
-      </w:r>
-      <w:proofErr w:type="spellStart"/>
-      <w:r>
-        <w:t>Mw</w:t>
-      </w:r>
-      <w:proofErr w:type="spellEnd"/>
-      <w:r>
-        <w:t xml:space="preserve"> mediante análisis espectral. Informe Interno. / Red Sismológica Nacional de Colombia - INGEOMINAS. - Bogotá </w:t>
+        <w:t>Gutenberg, B. &amp; C. F. Richter (1956). Magnitude and energy of earthquakes. Annali di Geofísica. 9. 1-15. ISSN 1593-5213. doi:10.4401/ag-5590</w:t>
+      </w:r>
+    </w:p>
+    <w:p>
+      <w:pPr>
+        <w:spacing w:after="0"/>
+        <w:rPr>
+          <w:lang w:val="en-US"/>
+        </w:rPr>
+      </w:pPr>
+    </w:p>
+    <w:p>
+      <w:pPr>
+        <w:spacing w:after="0"/>
+        <w:rPr>
+          <w:lang w:val="en-US"/>
+        </w:rPr>
+      </w:pPr>
+      <w:r>
+        <w:rPr>
+          <w:lang w:val="en-US"/>
+        </w:rPr>
+        <w:t xml:space="preserve">  Kanamori, H., &amp; Rivera, L. (2008</w:t>
       </w:r>
       <w:proofErr w:type="gramStart"/>
       <w:r>
-        <w:t>D.C. :</w:t>
+        <w:rPr>
+          <w:lang w:val="en-US"/>
+        </w:rPr>
+        <w:t>).Source</w:t>
       </w:r>
       <w:proofErr w:type="gramEnd"/>
       <w:r>
-        <w:t xml:space="preserve"> -; 1-44. - P IP026-31110.</w:t>
-      </w:r>
-    </w:p>
-    <w:p>
-      <w:pPr>
-        <w:spacing w:after="0"/>
-      </w:pPr>
-    </w:p>
-    <w:p>
-      <w:pPr>
-        <w:spacing w:after="0"/>
         <w:rPr>
           <w:lang w:val="en-US"/>
         </w:rPr>
-      </w:pPr>
-      <w:r>
+        <w:t xml:space="preserve"> inversion of W phase: speeding up seismic tsunami warning. Geophysical Journal International. 175 (1), 222–238. doi: https://doi.org/10.1111/j.1365-246X.2008.03887.x</w:t>
+      </w:r>
+    </w:p>
+    <w:p>
+      <w:pPr>
+        <w:spacing w:after="0"/>
+        <w:rPr>
+          <w:lang w:val="en-US"/>
+        </w:rPr>
+      </w:pPr>
+    </w:p>
+    <w:p>
+      <w:pPr>
+        <w:spacing w:after="0"/>
+        <w:rPr>
+          <w:lang w:val="en-US"/>
+        </w:rPr>
+      </w:pPr>
+      <w:r>
+        <w:rPr>
+          <w:lang w:val="en-US"/>
+        </w:rPr>
+        <w:t xml:space="preserve">  Kikuchi, M., &amp; Kanamori, H. (1991). Inversion of complex body waves—III. Bulletin of the Seismological Society of America. 81 (6): 2335–2350. doi: https://doi.org/10.1785/BSSA0810062335</w:t>
+      </w:r>
+    </w:p>
+    <w:p>
+      <w:pPr>
+        <w:spacing w:after="0"/>
+        <w:rPr>
+          <w:lang w:val="en-US"/>
+        </w:rPr>
+      </w:pPr>
+    </w:p>
+    <w:p>
+      <w:pPr>
+        <w:spacing w:after="0"/>
+        <w:rPr>
+          <w:lang w:val="en-US"/>
+        </w:rPr>
+      </w:pPr>
+      <w:r>
+        <w:rPr>
+          <w:lang w:val="en-US"/>
+        </w:rPr>
         <w:t xml:space="preserve">  </w:t>
       </w:r>
       <w:r>
+        <w:t xml:space="preserve">Londoño, J., &amp; Romero, J. (2017). Local magnitude scale for Valle Medio del Magdalena región, Colombia. </w:t>
+      </w:r>
+      <w:r>
         <w:rPr>
           <w:lang w:val="en-US"/>
         </w:rPr>
-        <w:t xml:space="preserve">Gutenberg, B. &amp; C. F. Richter (1956). Magnitude and energy of earthquakes. Annali di </w:t>
-      </w:r>
-      <w:proofErr w:type="spellStart"/>
-      <w:r>
-        <w:rPr>
-          <w:lang w:val="en-US"/>
-        </w:rPr>
-        <w:t>Geofísica</w:t>
-      </w:r>
-      <w:proofErr w:type="spellEnd"/>
-      <w:r>
-        <w:rPr>
-          <w:lang w:val="en-US"/>
-        </w:rPr>
-        <w:t>. 9. 1-15. ISSN 1593-5213. doi:10.4401/ag-5590</w:t>
-      </w:r>
-    </w:p>
-    <w:p>
-      <w:pPr>
-        <w:spacing w:after="0"/>
-        <w:rPr>
-          <w:lang w:val="en-US"/>
-        </w:rPr>
-      </w:pPr>
-    </w:p>
-    <w:p>
-      <w:pPr>
-        <w:spacing w:after="0"/>
-        <w:rPr>
-          <w:lang w:val="en-US"/>
-        </w:rPr>
-      </w:pPr>
-      <w:r>
-        <w:rPr>
-          <w:lang w:val="en-US"/>
-        </w:rPr>
-        <w:t xml:space="preserve">  Kanamori, H., &amp; Rivera, L. (2008</w:t>
-      </w:r>
-      <w:proofErr w:type="gramStart"/>
-      <w:r>
-        <w:rPr>
-          <w:lang w:val="en-US"/>
-        </w:rPr>
-        <w:t>).Source</w:t>
-      </w:r>
-      <w:proofErr w:type="gramEnd"/>
-      <w:r>
-        <w:rPr>
-          <w:lang w:val="en-US"/>
-        </w:rPr>
-        <w:t xml:space="preserve"> inversion of W phase: speeding up seismic tsunami warning. Geophysical Journal International. 175 (1), 222–238. </w:t>
-      </w:r>
-      <w:proofErr w:type="spellStart"/>
-      <w:r>
-        <w:rPr>
-          <w:lang w:val="en-US"/>
-        </w:rPr>
-        <w:t>doi</w:t>
-      </w:r>
-      <w:proofErr w:type="spellEnd"/>
-      <w:r>
-        <w:rPr>
-          <w:lang w:val="en-US"/>
-        </w:rPr>
-        <w:t>: https://doi.org/10.1111/j.1365-246X.2008.03887.x</w:t>
-      </w:r>
-    </w:p>
-    <w:p>
-      <w:pPr>
-        <w:spacing w:after="0"/>
-        <w:rPr>
-          <w:lang w:val="en-US"/>
-        </w:rPr>
-      </w:pPr>
-    </w:p>
-    <w:p>
-      <w:pPr>
-        <w:spacing w:after="0"/>
-        <w:rPr>
-          <w:lang w:val="en-US"/>
-        </w:rPr>
-      </w:pPr>
-      <w:r>
-        <w:rPr>
-          <w:lang w:val="en-US"/>
-        </w:rPr>
-        <w:t xml:space="preserve">  Kikuchi, M., &amp; Kanamori, H. (1991). Inversion of complex body waves—III. Bulletin of the Seismological Society of America. 81 (6): 2335–2350. </w:t>
-      </w:r>
-      <w:proofErr w:type="spellStart"/>
-      <w:r>
-        <w:rPr>
-          <w:lang w:val="en-US"/>
-        </w:rPr>
-        <w:t>doi</w:t>
-      </w:r>
-      <w:proofErr w:type="spellEnd"/>
-      <w:r>
-        <w:rPr>
-          <w:lang w:val="en-US"/>
-        </w:rPr>
-        <w:t>: https://doi.org/10.1785/BSSA0810062335</w:t>
-      </w:r>
-    </w:p>
-    <w:p>
-      <w:pPr>
-        <w:spacing w:after="0"/>
-        <w:rPr>
-          <w:lang w:val="en-US"/>
-        </w:rPr>
-      </w:pPr>
-    </w:p>
-    <w:p>
-      <w:pPr>
-        <w:spacing w:after="0"/>
-        <w:rPr>
-          <w:lang w:val="en-US"/>
-        </w:rPr>
-      </w:pPr>
-      <w:r>
-        <w:rPr>
-          <w:lang w:val="en-US"/>
-        </w:rPr>
-        <w:lastRenderedPageBreak/>
-        <w:t xml:space="preserve">  </w:t>
-      </w:r>
-      <w:r>
-        <w:t xml:space="preserve">Londoño, J., &amp; Romero, J. (2017). Local </w:t>
-      </w:r>
-      <w:proofErr w:type="spellStart"/>
-      <w:r>
-        <w:t>magnitude</w:t>
-      </w:r>
-      <w:proofErr w:type="spellEnd"/>
-      <w:r>
-        <w:t xml:space="preserve"> </w:t>
-      </w:r>
-      <w:proofErr w:type="spellStart"/>
-      <w:r>
-        <w:t>scale</w:t>
-      </w:r>
-      <w:proofErr w:type="spellEnd"/>
-      <w:r>
-        <w:t xml:space="preserve"> </w:t>
-      </w:r>
-      <w:proofErr w:type="spellStart"/>
-      <w:r>
-        <w:t>for</w:t>
-      </w:r>
-      <w:proofErr w:type="spellEnd"/>
-      <w:r>
-        <w:t xml:space="preserve"> Valle Medio del Magdalena región, Colombia. </w:t>
-      </w:r>
-      <w:r>
-        <w:rPr>
-          <w:lang w:val="en-US"/>
-        </w:rPr>
-        <w:t xml:space="preserve">Journal of South American Earth Sciences. 80, 237-243. </w:t>
-      </w:r>
-      <w:proofErr w:type="spellStart"/>
-      <w:r>
-        <w:rPr>
-          <w:lang w:val="en-US"/>
-        </w:rPr>
-        <w:t>doi</w:t>
-      </w:r>
-      <w:proofErr w:type="spellEnd"/>
-      <w:r>
-        <w:rPr>
-          <w:lang w:val="en-US"/>
-        </w:rPr>
-        <w:t>: https://doi.org/10.1016/j.jsames.2019.04.003</w:t>
+        <w:t>Journal of South American Earth Sciences. 80, 237-243. doi: https://doi.org/10.1016/j.jsames.2019.04.003</w:t>
       </w:r>
     </w:p>
     <w:p>
@@ -4618,13 +4850,8 @@
               <w:t xml:space="preserve">Cargo: </w:t>
             </w:r>
             <w:r>
-              <w:t xml:space="preserve">Contratista Dirección de </w:t>
+              <w:t>Contratista Dirección de Geoamenazas</w:t>
             </w:r>
-            <w:proofErr w:type="spellStart"/>
-            <w:r>
-              <w:t>Geoamenazas</w:t>
-            </w:r>
-            <w:proofErr w:type="spellEnd"/>
           </w:p>
         </w:tc>
         <w:tc>
@@ -6242,6 +6469,155 @@
     </w:lvl>
   </w:abstractNum>
   <w:abstractNum w:abstractNumId="7" w15:restartNumberingAfterBreak="0">
+    <w:nsid w:val="220A10CA"/>
+    <w:multiLevelType w:val="multilevel"/>
+    <w:tmpl w:val="958C9FF0"/>
+    <w:lvl w:ilvl="0">
+      <w:start w:val="1"/>
+      <w:numFmt w:val="bullet"/>
+      <w:lvlText w:val=""/>
+      <w:lvlJc w:val="left"/>
+      <w:pPr>
+        <w:tabs>
+          <w:tab w:val="num" w:pos="720"/>
+        </w:tabs>
+        <w:ind w:left="720" w:hanging="360"/>
+      </w:pPr>
+      <w:rPr>
+        <w:rFonts w:ascii="Symbol" w:hAnsi="Symbol" w:hint="default"/>
+        <w:sz w:val="20"/>
+      </w:rPr>
+    </w:lvl>
+    <w:lvl w:ilvl="1" w:tentative="1">
+      <w:start w:val="1"/>
+      <w:numFmt w:val="bullet"/>
+      <w:lvlText w:val="o"/>
+      <w:lvlJc w:val="left"/>
+      <w:pPr>
+        <w:tabs>
+          <w:tab w:val="num" w:pos="1440"/>
+        </w:tabs>
+        <w:ind w:left="1440" w:hanging="360"/>
+      </w:pPr>
+      <w:rPr>
+        <w:rFonts w:ascii="Courier New" w:hAnsi="Courier New" w:hint="default"/>
+        <w:sz w:val="20"/>
+      </w:rPr>
+    </w:lvl>
+    <w:lvl w:ilvl="2" w:tentative="1">
+      <w:start w:val="1"/>
+      <w:numFmt w:val="bullet"/>
+      <w:lvlText w:val=""/>
+      <w:lvlJc w:val="left"/>
+      <w:pPr>
+        <w:tabs>
+          <w:tab w:val="num" w:pos="2160"/>
+        </w:tabs>
+        <w:ind w:left="2160" w:hanging="360"/>
+      </w:pPr>
+      <w:rPr>
+        <w:rFonts w:ascii="Wingdings" w:hAnsi="Wingdings" w:hint="default"/>
+        <w:sz w:val="20"/>
+      </w:rPr>
+    </w:lvl>
+    <w:lvl w:ilvl="3" w:tentative="1">
+      <w:start w:val="1"/>
+      <w:numFmt w:val="bullet"/>
+      <w:lvlText w:val=""/>
+      <w:lvlJc w:val="left"/>
+      <w:pPr>
+        <w:tabs>
+          <w:tab w:val="num" w:pos="2880"/>
+        </w:tabs>
+        <w:ind w:left="2880" w:hanging="360"/>
+      </w:pPr>
+      <w:rPr>
+        <w:rFonts w:ascii="Wingdings" w:hAnsi="Wingdings" w:hint="default"/>
+        <w:sz w:val="20"/>
+      </w:rPr>
+    </w:lvl>
+    <w:lvl w:ilvl="4" w:tentative="1">
+      <w:start w:val="1"/>
+      <w:numFmt w:val="bullet"/>
+      <w:lvlText w:val=""/>
+      <w:lvlJc w:val="left"/>
+      <w:pPr>
+        <w:tabs>
+          <w:tab w:val="num" w:pos="3600"/>
+        </w:tabs>
+        <w:ind w:left="3600" w:hanging="360"/>
+      </w:pPr>
+      <w:rPr>
+        <w:rFonts w:ascii="Wingdings" w:hAnsi="Wingdings" w:hint="default"/>
+        <w:sz w:val="20"/>
+      </w:rPr>
+    </w:lvl>
+    <w:lvl w:ilvl="5" w:tentative="1">
+      <w:start w:val="1"/>
+      <w:numFmt w:val="bullet"/>
+      <w:lvlText w:val=""/>
+      <w:lvlJc w:val="left"/>
+      <w:pPr>
+        <w:tabs>
+          <w:tab w:val="num" w:pos="4320"/>
+        </w:tabs>
+        <w:ind w:left="4320" w:hanging="360"/>
+      </w:pPr>
+      <w:rPr>
+        <w:rFonts w:ascii="Wingdings" w:hAnsi="Wingdings" w:hint="default"/>
+        <w:sz w:val="20"/>
+      </w:rPr>
+    </w:lvl>
+    <w:lvl w:ilvl="6" w:tentative="1">
+      <w:start w:val="1"/>
+      <w:numFmt w:val="bullet"/>
+      <w:lvlText w:val=""/>
+      <w:lvlJc w:val="left"/>
+      <w:pPr>
+        <w:tabs>
+          <w:tab w:val="num" w:pos="5040"/>
+        </w:tabs>
+        <w:ind w:left="5040" w:hanging="360"/>
+      </w:pPr>
+      <w:rPr>
+        <w:rFonts w:ascii="Wingdings" w:hAnsi="Wingdings" w:hint="default"/>
+        <w:sz w:val="20"/>
+      </w:rPr>
+    </w:lvl>
+    <w:lvl w:ilvl="7" w:tentative="1">
+      <w:start w:val="1"/>
+      <w:numFmt w:val="bullet"/>
+      <w:lvlText w:val=""/>
+      <w:lvlJc w:val="left"/>
+      <w:pPr>
+        <w:tabs>
+          <w:tab w:val="num" w:pos="5760"/>
+        </w:tabs>
+        <w:ind w:left="5760" w:hanging="360"/>
+      </w:pPr>
+      <w:rPr>
+        <w:rFonts w:ascii="Wingdings" w:hAnsi="Wingdings" w:hint="default"/>
+        <w:sz w:val="20"/>
+      </w:rPr>
+    </w:lvl>
+    <w:lvl w:ilvl="8" w:tentative="1">
+      <w:start w:val="1"/>
+      <w:numFmt w:val="bullet"/>
+      <w:lvlText w:val=""/>
+      <w:lvlJc w:val="left"/>
+      <w:pPr>
+        <w:tabs>
+          <w:tab w:val="num" w:pos="6480"/>
+        </w:tabs>
+        <w:ind w:left="6480" w:hanging="360"/>
+      </w:pPr>
+      <w:rPr>
+        <w:rFonts w:ascii="Wingdings" w:hAnsi="Wingdings" w:hint="default"/>
+        <w:sz w:val="20"/>
+      </w:rPr>
+    </w:lvl>
+  </w:abstractNum>
+  <w:abstractNum w:abstractNumId="8" w15:restartNumberingAfterBreak="0">
     <w:nsid w:val="22195F22"/>
     <w:multiLevelType w:val="multilevel"/>
     <w:tmpl w:val="E10E7500"/>
@@ -6354,7 +6730,7 @@
       </w:rPr>
     </w:lvl>
   </w:abstractNum>
-  <w:abstractNum w:abstractNumId="8" w15:restartNumberingAfterBreak="0">
+  <w:abstractNum w:abstractNumId="9" w15:restartNumberingAfterBreak="0">
     <w:nsid w:val="25C65647"/>
     <w:multiLevelType w:val="multilevel"/>
     <w:tmpl w:val="6B7AB272"/>
@@ -6467,7 +6843,7 @@
       </w:rPr>
     </w:lvl>
   </w:abstractNum>
-  <w:abstractNum w:abstractNumId="9" w15:restartNumberingAfterBreak="0">
+  <w:abstractNum w:abstractNumId="10" w15:restartNumberingAfterBreak="0">
     <w:nsid w:val="28A32302"/>
     <w:multiLevelType w:val="multilevel"/>
     <w:tmpl w:val="560202F8"/>
@@ -6580,7 +6956,7 @@
       </w:rPr>
     </w:lvl>
   </w:abstractNum>
-  <w:abstractNum w:abstractNumId="10" w15:restartNumberingAfterBreak="0">
+  <w:abstractNum w:abstractNumId="11" w15:restartNumberingAfterBreak="0">
     <w:nsid w:val="2D541A58"/>
     <w:multiLevelType w:val="multilevel"/>
     <w:tmpl w:val="B3B25224"/>
@@ -6693,7 +7069,7 @@
       </w:rPr>
     </w:lvl>
   </w:abstractNum>
-  <w:abstractNum w:abstractNumId="11" w15:restartNumberingAfterBreak="0">
+  <w:abstractNum w:abstractNumId="12" w15:restartNumberingAfterBreak="0">
     <w:nsid w:val="2DEC7094"/>
     <w:multiLevelType w:val="multilevel"/>
     <w:tmpl w:val="3D2C4EBA"/>
@@ -6779,7 +7155,120 @@
       </w:pPr>
     </w:lvl>
   </w:abstractNum>
-  <w:abstractNum w:abstractNumId="12" w15:restartNumberingAfterBreak="0">
+  <w:abstractNum w:abstractNumId="13" w15:restartNumberingAfterBreak="0">
+    <w:nsid w:val="2F4D4EF4"/>
+    <w:multiLevelType w:val="hybridMultilevel"/>
+    <w:tmpl w:val="EB9AF86E"/>
+    <w:lvl w:ilvl="0" w:tplc="7D720908">
+      <w:start w:val="1"/>
+      <w:numFmt w:val="bullet"/>
+      <w:lvlText w:val="-"/>
+      <w:lvlJc w:val="left"/>
+      <w:pPr>
+        <w:ind w:left="720" w:hanging="360"/>
+      </w:pPr>
+      <w:rPr>
+        <w:rFonts w:ascii="Calibri" w:eastAsia="Calibri" w:hAnsi="Calibri" w:cs="Calibri" w:hint="default"/>
+      </w:rPr>
+    </w:lvl>
+    <w:lvl w:ilvl="1" w:tplc="240A0003" w:tentative="1">
+      <w:start w:val="1"/>
+      <w:numFmt w:val="bullet"/>
+      <w:lvlText w:val="o"/>
+      <w:lvlJc w:val="left"/>
+      <w:pPr>
+        <w:ind w:left="1440" w:hanging="360"/>
+      </w:pPr>
+      <w:rPr>
+        <w:rFonts w:ascii="Courier New" w:hAnsi="Courier New" w:cs="Courier New" w:hint="default"/>
+      </w:rPr>
+    </w:lvl>
+    <w:lvl w:ilvl="2" w:tplc="240A0005" w:tentative="1">
+      <w:start w:val="1"/>
+      <w:numFmt w:val="bullet"/>
+      <w:lvlText w:val=""/>
+      <w:lvlJc w:val="left"/>
+      <w:pPr>
+        <w:ind w:left="2160" w:hanging="360"/>
+      </w:pPr>
+      <w:rPr>
+        <w:rFonts w:ascii="Wingdings" w:hAnsi="Wingdings" w:hint="default"/>
+      </w:rPr>
+    </w:lvl>
+    <w:lvl w:ilvl="3" w:tplc="240A0001" w:tentative="1">
+      <w:start w:val="1"/>
+      <w:numFmt w:val="bullet"/>
+      <w:lvlText w:val=""/>
+      <w:lvlJc w:val="left"/>
+      <w:pPr>
+        <w:ind w:left="2880" w:hanging="360"/>
+      </w:pPr>
+      <w:rPr>
+        <w:rFonts w:ascii="Symbol" w:hAnsi="Symbol" w:hint="default"/>
+      </w:rPr>
+    </w:lvl>
+    <w:lvl w:ilvl="4" w:tplc="240A0003" w:tentative="1">
+      <w:start w:val="1"/>
+      <w:numFmt w:val="bullet"/>
+      <w:lvlText w:val="o"/>
+      <w:lvlJc w:val="left"/>
+      <w:pPr>
+        <w:ind w:left="3600" w:hanging="360"/>
+      </w:pPr>
+      <w:rPr>
+        <w:rFonts w:ascii="Courier New" w:hAnsi="Courier New" w:cs="Courier New" w:hint="default"/>
+      </w:rPr>
+    </w:lvl>
+    <w:lvl w:ilvl="5" w:tplc="240A0005" w:tentative="1">
+      <w:start w:val="1"/>
+      <w:numFmt w:val="bullet"/>
+      <w:lvlText w:val=""/>
+      <w:lvlJc w:val="left"/>
+      <w:pPr>
+        <w:ind w:left="4320" w:hanging="360"/>
+      </w:pPr>
+      <w:rPr>
+        <w:rFonts w:ascii="Wingdings" w:hAnsi="Wingdings" w:hint="default"/>
+      </w:rPr>
+    </w:lvl>
+    <w:lvl w:ilvl="6" w:tplc="240A0001" w:tentative="1">
+      <w:start w:val="1"/>
+      <w:numFmt w:val="bullet"/>
+      <w:lvlText w:val=""/>
+      <w:lvlJc w:val="left"/>
+      <w:pPr>
+        <w:ind w:left="5040" w:hanging="360"/>
+      </w:pPr>
+      <w:rPr>
+        <w:rFonts w:ascii="Symbol" w:hAnsi="Symbol" w:hint="default"/>
+      </w:rPr>
+    </w:lvl>
+    <w:lvl w:ilvl="7" w:tplc="240A0003" w:tentative="1">
+      <w:start w:val="1"/>
+      <w:numFmt w:val="bullet"/>
+      <w:lvlText w:val="o"/>
+      <w:lvlJc w:val="left"/>
+      <w:pPr>
+        <w:ind w:left="5760" w:hanging="360"/>
+      </w:pPr>
+      <w:rPr>
+        <w:rFonts w:ascii="Courier New" w:hAnsi="Courier New" w:cs="Courier New" w:hint="default"/>
+      </w:rPr>
+    </w:lvl>
+    <w:lvl w:ilvl="8" w:tplc="240A0005" w:tentative="1">
+      <w:start w:val="1"/>
+      <w:numFmt w:val="bullet"/>
+      <w:lvlText w:val=""/>
+      <w:lvlJc w:val="left"/>
+      <w:pPr>
+        <w:ind w:left="6480" w:hanging="360"/>
+      </w:pPr>
+      <w:rPr>
+        <w:rFonts w:ascii="Wingdings" w:hAnsi="Wingdings" w:hint="default"/>
+      </w:rPr>
+    </w:lvl>
+  </w:abstractNum>
+  <w:abstractNum w:abstractNumId="14" w15:restartNumberingAfterBreak="0">
     <w:nsid w:val="315F45FF"/>
     <w:multiLevelType w:val="multilevel"/>
     <w:tmpl w:val="070C9496"/>
@@ -6892,7 +7381,7 @@
       </w:rPr>
     </w:lvl>
   </w:abstractNum>
-  <w:abstractNum w:abstractNumId="13" w15:restartNumberingAfterBreak="0">
+  <w:abstractNum w:abstractNumId="15" w15:restartNumberingAfterBreak="0">
     <w:nsid w:val="31F00A51"/>
     <w:multiLevelType w:val="multilevel"/>
     <w:tmpl w:val="E28487C8"/>
@@ -7005,7 +7494,7 @@
       </w:rPr>
     </w:lvl>
   </w:abstractNum>
-  <w:abstractNum w:abstractNumId="14" w15:restartNumberingAfterBreak="0">
+  <w:abstractNum w:abstractNumId="16" w15:restartNumberingAfterBreak="0">
     <w:nsid w:val="31FD71CD"/>
     <w:multiLevelType w:val="multilevel"/>
     <w:tmpl w:val="2BE0962E"/>
@@ -7118,7 +7607,96 @@
       </w:rPr>
     </w:lvl>
   </w:abstractNum>
-  <w:abstractNum w:abstractNumId="15" w15:restartNumberingAfterBreak="0">
+  <w:abstractNum w:abstractNumId="17" w15:restartNumberingAfterBreak="0">
+    <w:nsid w:val="32A52517"/>
+    <w:multiLevelType w:val="hybridMultilevel"/>
+    <w:tmpl w:val="1F58C2C2"/>
+    <w:lvl w:ilvl="0" w:tplc="240A000F">
+      <w:start w:val="1"/>
+      <w:numFmt w:val="decimal"/>
+      <w:lvlText w:val="%1."/>
+      <w:lvlJc w:val="left"/>
+      <w:pPr>
+        <w:ind w:left="720" w:hanging="360"/>
+      </w:pPr>
+      <w:rPr>
+        <w:rFonts w:hint="default"/>
+      </w:rPr>
+    </w:lvl>
+    <w:lvl w:ilvl="1" w:tplc="240A0019" w:tentative="1">
+      <w:start w:val="1"/>
+      <w:numFmt w:val="lowerLetter"/>
+      <w:lvlText w:val="%2."/>
+      <w:lvlJc w:val="left"/>
+      <w:pPr>
+        <w:ind w:left="1440" w:hanging="360"/>
+      </w:pPr>
+    </w:lvl>
+    <w:lvl w:ilvl="2" w:tplc="240A001B" w:tentative="1">
+      <w:start w:val="1"/>
+      <w:numFmt w:val="lowerRoman"/>
+      <w:lvlText w:val="%3."/>
+      <w:lvlJc w:val="right"/>
+      <w:pPr>
+        <w:ind w:left="2160" w:hanging="180"/>
+      </w:pPr>
+    </w:lvl>
+    <w:lvl w:ilvl="3" w:tplc="240A000F" w:tentative="1">
+      <w:start w:val="1"/>
+      <w:numFmt w:val="decimal"/>
+      <w:lvlText w:val="%4."/>
+      <w:lvlJc w:val="left"/>
+      <w:pPr>
+        <w:ind w:left="2880" w:hanging="360"/>
+      </w:pPr>
+    </w:lvl>
+    <w:lvl w:ilvl="4" w:tplc="240A0019" w:tentative="1">
+      <w:start w:val="1"/>
+      <w:numFmt w:val="lowerLetter"/>
+      <w:lvlText w:val="%5."/>
+      <w:lvlJc w:val="left"/>
+      <w:pPr>
+        <w:ind w:left="3600" w:hanging="360"/>
+      </w:pPr>
+    </w:lvl>
+    <w:lvl w:ilvl="5" w:tplc="240A001B" w:tentative="1">
+      <w:start w:val="1"/>
+      <w:numFmt w:val="lowerRoman"/>
+      <w:lvlText w:val="%6."/>
+      <w:lvlJc w:val="right"/>
+      <w:pPr>
+        <w:ind w:left="4320" w:hanging="180"/>
+      </w:pPr>
+    </w:lvl>
+    <w:lvl w:ilvl="6" w:tplc="240A000F" w:tentative="1">
+      <w:start w:val="1"/>
+      <w:numFmt w:val="decimal"/>
+      <w:lvlText w:val="%7."/>
+      <w:lvlJc w:val="left"/>
+      <w:pPr>
+        <w:ind w:left="5040" w:hanging="360"/>
+      </w:pPr>
+    </w:lvl>
+    <w:lvl w:ilvl="7" w:tplc="240A0019" w:tentative="1">
+      <w:start w:val="1"/>
+      <w:numFmt w:val="lowerLetter"/>
+      <w:lvlText w:val="%8."/>
+      <w:lvlJc w:val="left"/>
+      <w:pPr>
+        <w:ind w:left="5760" w:hanging="360"/>
+      </w:pPr>
+    </w:lvl>
+    <w:lvl w:ilvl="8" w:tplc="240A001B" w:tentative="1">
+      <w:start w:val="1"/>
+      <w:numFmt w:val="lowerRoman"/>
+      <w:lvlText w:val="%9."/>
+      <w:lvlJc w:val="right"/>
+      <w:pPr>
+        <w:ind w:left="6480" w:hanging="180"/>
+      </w:pPr>
+    </w:lvl>
+  </w:abstractNum>
+  <w:abstractNum w:abstractNumId="18" w15:restartNumberingAfterBreak="0">
     <w:nsid w:val="32E82F91"/>
     <w:multiLevelType w:val="multilevel"/>
     <w:tmpl w:val="05FC0542"/>
@@ -7231,7 +7809,7 @@
       </w:rPr>
     </w:lvl>
   </w:abstractNum>
-  <w:abstractNum w:abstractNumId="16" w15:restartNumberingAfterBreak="0">
+  <w:abstractNum w:abstractNumId="19" w15:restartNumberingAfterBreak="0">
     <w:nsid w:val="377B385A"/>
     <w:multiLevelType w:val="multilevel"/>
     <w:tmpl w:val="4796D91C"/>
@@ -7344,7 +7922,7 @@
       </w:rPr>
     </w:lvl>
   </w:abstractNum>
-  <w:abstractNum w:abstractNumId="17" w15:restartNumberingAfterBreak="0">
+  <w:abstractNum w:abstractNumId="20" w15:restartNumberingAfterBreak="0">
     <w:nsid w:val="3A56479D"/>
     <w:multiLevelType w:val="multilevel"/>
     <w:tmpl w:val="0EEE3082"/>
@@ -7457,7 +8035,7 @@
       </w:rPr>
     </w:lvl>
   </w:abstractNum>
-  <w:abstractNum w:abstractNumId="18" w15:restartNumberingAfterBreak="0">
+  <w:abstractNum w:abstractNumId="21" w15:restartNumberingAfterBreak="0">
     <w:nsid w:val="3E1A3858"/>
     <w:multiLevelType w:val="multilevel"/>
     <w:tmpl w:val="9266DD10"/>
@@ -7570,7 +8148,7 @@
       </w:rPr>
     </w:lvl>
   </w:abstractNum>
-  <w:abstractNum w:abstractNumId="19" w15:restartNumberingAfterBreak="0">
+  <w:abstractNum w:abstractNumId="22" w15:restartNumberingAfterBreak="0">
     <w:nsid w:val="406D5F12"/>
     <w:multiLevelType w:val="multilevel"/>
     <w:tmpl w:val="070C9496"/>
@@ -7683,7 +8261,7 @@
       </w:rPr>
     </w:lvl>
   </w:abstractNum>
-  <w:abstractNum w:abstractNumId="20" w15:restartNumberingAfterBreak="0">
+  <w:abstractNum w:abstractNumId="23" w15:restartNumberingAfterBreak="0">
     <w:nsid w:val="43085048"/>
     <w:multiLevelType w:val="multilevel"/>
     <w:tmpl w:val="39D87E44"/>
@@ -7796,7 +8374,7 @@
       </w:rPr>
     </w:lvl>
   </w:abstractNum>
-  <w:abstractNum w:abstractNumId="21" w15:restartNumberingAfterBreak="0">
+  <w:abstractNum w:abstractNumId="24" w15:restartNumberingAfterBreak="0">
     <w:nsid w:val="448C62E0"/>
     <w:multiLevelType w:val="multilevel"/>
     <w:tmpl w:val="06A680C4"/>
@@ -7909,7 +8487,7 @@
       </w:rPr>
     </w:lvl>
   </w:abstractNum>
-  <w:abstractNum w:abstractNumId="22" w15:restartNumberingAfterBreak="0">
+  <w:abstractNum w:abstractNumId="25" w15:restartNumberingAfterBreak="0">
     <w:nsid w:val="44D26ADB"/>
     <w:multiLevelType w:val="multilevel"/>
     <w:tmpl w:val="32600BB0"/>
@@ -8040,7 +8618,7 @@
       </w:rPr>
     </w:lvl>
   </w:abstractNum>
-  <w:abstractNum w:abstractNumId="23" w15:restartNumberingAfterBreak="0">
+  <w:abstractNum w:abstractNumId="26" w15:restartNumberingAfterBreak="0">
     <w:nsid w:val="47122E82"/>
     <w:multiLevelType w:val="multilevel"/>
     <w:tmpl w:val="ECA0588A"/>
@@ -8153,7 +8731,7 @@
       </w:rPr>
     </w:lvl>
   </w:abstractNum>
-  <w:abstractNum w:abstractNumId="24" w15:restartNumberingAfterBreak="0">
+  <w:abstractNum w:abstractNumId="27" w15:restartNumberingAfterBreak="0">
     <w:nsid w:val="4CA23164"/>
     <w:multiLevelType w:val="multilevel"/>
     <w:tmpl w:val="0C069F0C"/>
@@ -8266,7 +8844,7 @@
       </w:rPr>
     </w:lvl>
   </w:abstractNum>
-  <w:abstractNum w:abstractNumId="25" w15:restartNumberingAfterBreak="0">
+  <w:abstractNum w:abstractNumId="28" w15:restartNumberingAfterBreak="0">
     <w:nsid w:val="4DAD337D"/>
     <w:multiLevelType w:val="multilevel"/>
     <w:tmpl w:val="1000161C"/>
@@ -8379,7 +8957,7 @@
       </w:rPr>
     </w:lvl>
   </w:abstractNum>
-  <w:abstractNum w:abstractNumId="26" w15:restartNumberingAfterBreak="0">
+  <w:abstractNum w:abstractNumId="29" w15:restartNumberingAfterBreak="0">
     <w:nsid w:val="50DD6F0A"/>
     <w:multiLevelType w:val="multilevel"/>
     <w:tmpl w:val="21121E42"/>
@@ -8492,7 +9070,7 @@
       </w:rPr>
     </w:lvl>
   </w:abstractNum>
-  <w:abstractNum w:abstractNumId="27" w15:restartNumberingAfterBreak="0">
+  <w:abstractNum w:abstractNumId="30" w15:restartNumberingAfterBreak="0">
     <w:nsid w:val="56A674B5"/>
     <w:multiLevelType w:val="multilevel"/>
     <w:tmpl w:val="16B6C3E8"/>
@@ -8605,7 +9183,7 @@
       </w:rPr>
     </w:lvl>
   </w:abstractNum>
-  <w:abstractNum w:abstractNumId="28" w15:restartNumberingAfterBreak="0">
+  <w:abstractNum w:abstractNumId="31" w15:restartNumberingAfterBreak="0">
     <w:nsid w:val="578C610C"/>
     <w:multiLevelType w:val="multilevel"/>
     <w:tmpl w:val="95A0C00E"/>
@@ -8718,7 +9296,7 @@
       </w:rPr>
     </w:lvl>
   </w:abstractNum>
-  <w:abstractNum w:abstractNumId="29" w15:restartNumberingAfterBreak="0">
+  <w:abstractNum w:abstractNumId="32" w15:restartNumberingAfterBreak="0">
     <w:nsid w:val="5E721278"/>
     <w:multiLevelType w:val="multilevel"/>
     <w:tmpl w:val="6D7E059A"/>
@@ -8831,7 +9409,7 @@
       </w:rPr>
     </w:lvl>
   </w:abstractNum>
-  <w:abstractNum w:abstractNumId="30" w15:restartNumberingAfterBreak="0">
+  <w:abstractNum w:abstractNumId="33" w15:restartNumberingAfterBreak="0">
     <w:nsid w:val="64446062"/>
     <w:multiLevelType w:val="multilevel"/>
     <w:tmpl w:val="95A8D66C"/>
@@ -8944,7 +9522,7 @@
       </w:rPr>
     </w:lvl>
   </w:abstractNum>
-  <w:abstractNum w:abstractNumId="31" w15:restartNumberingAfterBreak="0">
+  <w:abstractNum w:abstractNumId="34" w15:restartNumberingAfterBreak="0">
     <w:nsid w:val="654964F9"/>
     <w:multiLevelType w:val="multilevel"/>
     <w:tmpl w:val="CF965A2A"/>
@@ -9057,7 +9635,7 @@
       </w:rPr>
     </w:lvl>
   </w:abstractNum>
-  <w:abstractNum w:abstractNumId="32" w15:restartNumberingAfterBreak="0">
+  <w:abstractNum w:abstractNumId="35" w15:restartNumberingAfterBreak="0">
     <w:nsid w:val="6828091F"/>
     <w:multiLevelType w:val="multilevel"/>
     <w:tmpl w:val="57720BBC"/>
@@ -9170,7 +9748,7 @@
       </w:rPr>
     </w:lvl>
   </w:abstractNum>
-  <w:abstractNum w:abstractNumId="33" w15:restartNumberingAfterBreak="0">
+  <w:abstractNum w:abstractNumId="36" w15:restartNumberingAfterBreak="0">
     <w:nsid w:val="686E124C"/>
     <w:multiLevelType w:val="multilevel"/>
     <w:tmpl w:val="7C0C3F82"/>
@@ -9283,7 +9861,7 @@
       </w:rPr>
     </w:lvl>
   </w:abstractNum>
-  <w:abstractNum w:abstractNumId="34" w15:restartNumberingAfterBreak="0">
+  <w:abstractNum w:abstractNumId="37" w15:restartNumberingAfterBreak="0">
     <w:nsid w:val="70CE5510"/>
     <w:multiLevelType w:val="multilevel"/>
     <w:tmpl w:val="27BE2B9E"/>
@@ -9396,7 +9974,7 @@
       </w:rPr>
     </w:lvl>
   </w:abstractNum>
-  <w:abstractNum w:abstractNumId="35" w15:restartNumberingAfterBreak="0">
+  <w:abstractNum w:abstractNumId="38" w15:restartNumberingAfterBreak="0">
     <w:nsid w:val="712B4D19"/>
     <w:multiLevelType w:val="multilevel"/>
     <w:tmpl w:val="1A36D4EE"/>
@@ -9509,7 +10087,7 @@
       </w:rPr>
     </w:lvl>
   </w:abstractNum>
-  <w:abstractNum w:abstractNumId="36" w15:restartNumberingAfterBreak="0">
+  <w:abstractNum w:abstractNumId="39" w15:restartNumberingAfterBreak="0">
     <w:nsid w:val="71690753"/>
     <w:multiLevelType w:val="multilevel"/>
     <w:tmpl w:val="605C1E50"/>
@@ -9622,7 +10200,7 @@
       </w:rPr>
     </w:lvl>
   </w:abstractNum>
-  <w:abstractNum w:abstractNumId="37" w15:restartNumberingAfterBreak="0">
+  <w:abstractNum w:abstractNumId="40" w15:restartNumberingAfterBreak="0">
     <w:nsid w:val="73BD5D65"/>
     <w:multiLevelType w:val="multilevel"/>
     <w:tmpl w:val="82CA2742"/>
@@ -9735,7 +10313,7 @@
       </w:rPr>
     </w:lvl>
   </w:abstractNum>
-  <w:abstractNum w:abstractNumId="38" w15:restartNumberingAfterBreak="0">
+  <w:abstractNum w:abstractNumId="41" w15:restartNumberingAfterBreak="0">
     <w:nsid w:val="74C90917"/>
     <w:multiLevelType w:val="multilevel"/>
     <w:tmpl w:val="D932ECDC"/>
@@ -9848,7 +10426,7 @@
       </w:rPr>
     </w:lvl>
   </w:abstractNum>
-  <w:abstractNum w:abstractNumId="39" w15:restartNumberingAfterBreak="0">
+  <w:abstractNum w:abstractNumId="42" w15:restartNumberingAfterBreak="0">
     <w:nsid w:val="7598255B"/>
     <w:multiLevelType w:val="multilevel"/>
     <w:tmpl w:val="82FEEB8C"/>
@@ -9961,7 +10539,7 @@
       </w:rPr>
     </w:lvl>
   </w:abstractNum>
-  <w:abstractNum w:abstractNumId="40" w15:restartNumberingAfterBreak="0">
+  <w:abstractNum w:abstractNumId="43" w15:restartNumberingAfterBreak="0">
     <w:nsid w:val="76A84F54"/>
     <w:multiLevelType w:val="multilevel"/>
     <w:tmpl w:val="07EEA836"/>
@@ -10074,7 +10652,7 @@
       </w:rPr>
     </w:lvl>
   </w:abstractNum>
-  <w:abstractNum w:abstractNumId="41" w15:restartNumberingAfterBreak="0">
+  <w:abstractNum w:abstractNumId="44" w15:restartNumberingAfterBreak="0">
     <w:nsid w:val="7A850B53"/>
     <w:multiLevelType w:val="multilevel"/>
     <w:tmpl w:val="668EAFCA"/>
@@ -10164,7 +10742,7 @@
       </w:pPr>
     </w:lvl>
   </w:abstractNum>
-  <w:abstractNum w:abstractNumId="42" w15:restartNumberingAfterBreak="0">
+  <w:abstractNum w:abstractNumId="45" w15:restartNumberingAfterBreak="0">
     <w:nsid w:val="7CBD2DFF"/>
     <w:multiLevelType w:val="multilevel"/>
     <w:tmpl w:val="9918D834"/>
@@ -10296,25 +10874,25 @@
     </w:lvl>
   </w:abstractNum>
   <w:num w:numId="1" w16cid:durableId="2005162141">
-    <w:abstractNumId w:val="33"/>
+    <w:abstractNumId w:val="36"/>
   </w:num>
   <w:num w:numId="2" w16cid:durableId="974144106">
-    <w:abstractNumId w:val="8"/>
+    <w:abstractNumId w:val="9"/>
   </w:num>
   <w:num w:numId="3" w16cid:durableId="680359532">
-    <w:abstractNumId w:val="9"/>
+    <w:abstractNumId w:val="10"/>
   </w:num>
   <w:num w:numId="4" w16cid:durableId="808671696">
-    <w:abstractNumId w:val="20"/>
+    <w:abstractNumId w:val="23"/>
   </w:num>
   <w:num w:numId="5" w16cid:durableId="1995911992">
-    <w:abstractNumId w:val="27"/>
+    <w:abstractNumId w:val="30"/>
   </w:num>
   <w:num w:numId="6" w16cid:durableId="932471781">
-    <w:abstractNumId w:val="38"/>
+    <w:abstractNumId w:val="41"/>
   </w:num>
   <w:num w:numId="7" w16cid:durableId="1774859570">
-    <w:abstractNumId w:val="41"/>
+    <w:abstractNumId w:val="44"/>
   </w:num>
   <w:num w:numId="8" w16cid:durableId="533275737">
     <w:abstractNumId w:val="6"/>
@@ -10323,94 +10901,94 @@
     <w:abstractNumId w:val="1"/>
   </w:num>
   <w:num w:numId="10" w16cid:durableId="1796946577">
-    <w:abstractNumId w:val="40"/>
+    <w:abstractNumId w:val="43"/>
   </w:num>
   <w:num w:numId="11" w16cid:durableId="919486259">
+    <w:abstractNumId w:val="34"/>
+  </w:num>
+  <w:num w:numId="12" w16cid:durableId="1374576884">
     <w:abstractNumId w:val="31"/>
   </w:num>
-  <w:num w:numId="12" w16cid:durableId="1374576884">
-    <w:abstractNumId w:val="28"/>
-  </w:num>
   <w:num w:numId="13" w16cid:durableId="1444108437">
-    <w:abstractNumId w:val="11"/>
+    <w:abstractNumId w:val="12"/>
   </w:num>
   <w:num w:numId="14" w16cid:durableId="424694711">
-    <w:abstractNumId w:val="30"/>
+    <w:abstractNumId w:val="33"/>
   </w:num>
   <w:num w:numId="15" w16cid:durableId="2112431466">
-    <w:abstractNumId w:val="24"/>
+    <w:abstractNumId w:val="27"/>
   </w:num>
   <w:num w:numId="16" w16cid:durableId="1523588018">
-    <w:abstractNumId w:val="26"/>
+    <w:abstractNumId w:val="29"/>
   </w:num>
   <w:num w:numId="17" w16cid:durableId="1258713890">
-    <w:abstractNumId w:val="39"/>
+    <w:abstractNumId w:val="42"/>
   </w:num>
   <w:num w:numId="18" w16cid:durableId="327635277">
-    <w:abstractNumId w:val="21"/>
+    <w:abstractNumId w:val="24"/>
   </w:num>
   <w:num w:numId="19" w16cid:durableId="637495969">
     <w:abstractNumId w:val="3"/>
   </w:num>
   <w:num w:numId="20" w16cid:durableId="461270579">
-    <w:abstractNumId w:val="13"/>
+    <w:abstractNumId w:val="15"/>
   </w:num>
   <w:num w:numId="21" w16cid:durableId="1650556670">
-    <w:abstractNumId w:val="17"/>
+    <w:abstractNumId w:val="20"/>
   </w:num>
   <w:num w:numId="22" w16cid:durableId="84621286">
+    <w:abstractNumId w:val="35"/>
+  </w:num>
+  <w:num w:numId="23" w16cid:durableId="2000228554">
+    <w:abstractNumId w:val="26"/>
+  </w:num>
+  <w:num w:numId="24" w16cid:durableId="1604263756">
+    <w:abstractNumId w:val="45"/>
+  </w:num>
+  <w:num w:numId="25" w16cid:durableId="616526946">
+    <w:abstractNumId w:val="25"/>
+  </w:num>
+  <w:num w:numId="26" w16cid:durableId="201947715">
+    <w:abstractNumId w:val="38"/>
+  </w:num>
+  <w:num w:numId="27" w16cid:durableId="1766612433">
+    <w:abstractNumId w:val="21"/>
+  </w:num>
+  <w:num w:numId="28" w16cid:durableId="663437943">
+    <w:abstractNumId w:val="40"/>
+  </w:num>
+  <w:num w:numId="29" w16cid:durableId="1657150165">
+    <w:abstractNumId w:val="18"/>
+  </w:num>
+  <w:num w:numId="30" w16cid:durableId="1610117533">
+    <w:abstractNumId w:val="19"/>
+  </w:num>
+  <w:num w:numId="31" w16cid:durableId="2112772112">
+    <w:abstractNumId w:val="11"/>
+  </w:num>
+  <w:num w:numId="32" w16cid:durableId="1960915331">
     <w:abstractNumId w:val="32"/>
   </w:num>
-  <w:num w:numId="23" w16cid:durableId="2000228554">
-    <w:abstractNumId w:val="23"/>
-  </w:num>
-  <w:num w:numId="24" w16cid:durableId="1604263756">
-    <w:abstractNumId w:val="42"/>
-  </w:num>
-  <w:num w:numId="25" w16cid:durableId="616526946">
-    <w:abstractNumId w:val="22"/>
-  </w:num>
-  <w:num w:numId="26" w16cid:durableId="201947715">
-    <w:abstractNumId w:val="35"/>
-  </w:num>
-  <w:num w:numId="27" w16cid:durableId="1766612433">
-    <w:abstractNumId w:val="18"/>
-  </w:num>
-  <w:num w:numId="28" w16cid:durableId="663437943">
-    <w:abstractNumId w:val="37"/>
-  </w:num>
-  <w:num w:numId="29" w16cid:durableId="1657150165">
-    <w:abstractNumId w:val="15"/>
-  </w:num>
-  <w:num w:numId="30" w16cid:durableId="1610117533">
-    <w:abstractNumId w:val="16"/>
-  </w:num>
-  <w:num w:numId="31" w16cid:durableId="2112772112">
-    <w:abstractNumId w:val="10"/>
-  </w:num>
-  <w:num w:numId="32" w16cid:durableId="1960915331">
-    <w:abstractNumId w:val="29"/>
-  </w:num>
   <w:num w:numId="33" w16cid:durableId="1342705417">
-    <w:abstractNumId w:val="25"/>
+    <w:abstractNumId w:val="28"/>
   </w:num>
   <w:num w:numId="34" w16cid:durableId="1163199392">
-    <w:abstractNumId w:val="7"/>
+    <w:abstractNumId w:val="8"/>
   </w:num>
   <w:num w:numId="35" w16cid:durableId="1570727569">
-    <w:abstractNumId w:val="34"/>
+    <w:abstractNumId w:val="37"/>
   </w:num>
   <w:num w:numId="36" w16cid:durableId="684787578">
     <w:abstractNumId w:val="2"/>
   </w:num>
   <w:num w:numId="37" w16cid:durableId="890578656">
-    <w:abstractNumId w:val="36"/>
+    <w:abstractNumId w:val="39"/>
   </w:num>
   <w:num w:numId="38" w16cid:durableId="341665835">
     <w:abstractNumId w:val="4"/>
   </w:num>
   <w:num w:numId="39" w16cid:durableId="1824354167">
-    <w:abstractNumId w:val="14"/>
+    <w:abstractNumId w:val="16"/>
   </w:num>
   <w:num w:numId="40" w16cid:durableId="286397430">
     <w:abstractNumId w:val="5"/>
@@ -10419,10 +10997,19 @@
     <w:abstractNumId w:val="0"/>
   </w:num>
   <w:num w:numId="42" w16cid:durableId="1830441435">
-    <w:abstractNumId w:val="19"/>
+    <w:abstractNumId w:val="22"/>
   </w:num>
   <w:num w:numId="43" w16cid:durableId="2062556729">
-    <w:abstractNumId w:val="12"/>
+    <w:abstractNumId w:val="14"/>
+  </w:num>
+  <w:num w:numId="44" w16cid:durableId="762922789">
+    <w:abstractNumId w:val="17"/>
+  </w:num>
+  <w:num w:numId="45" w16cid:durableId="1914315182">
+    <w:abstractNumId w:val="13"/>
+  </w:num>
+  <w:num w:numId="46" w16cid:durableId="333000804">
+    <w:abstractNumId w:val="7"/>
   </w:num>
 </w:numbering>
 </file>
@@ -11127,6 +11714,49 @@
       <w:u w:val="single"/>
     </w:rPr>
   </w:style>
+  <w:style w:type="paragraph" w:styleId="NormalWeb">
+    <w:name w:val="Normal (Web)"/>
+    <w:basedOn w:val="Normal"/>
+    <w:uiPriority w:val="99"/>
+    <w:semiHidden/>
+    <w:unhideWhenUsed/>
+    <w:rsid w:val="00084412"/>
+    <w:rPr>
+      <w:rFonts w:ascii="Times New Roman" w:hAnsi="Times New Roman" w:cs="Times New Roman"/>
+      <w:sz w:val="24"/>
+      <w:szCs w:val="24"/>
+    </w:rPr>
+  </w:style>
+  <w:style w:type="paragraph" w:customStyle="1" w:styleId="Codigo">
+    <w:name w:val="Codigo"/>
+    <w:basedOn w:val="Normal"/>
+    <w:link w:val="CodigoCar"/>
+    <w:qFormat/>
+    <w:rsid w:val="00084412"/>
+    <w:pPr>
+      <w:shd w:val="clear" w:color="auto" w:fill="D9D9D9" w:themeFill="background1" w:themeFillShade="D9"/>
+      <w:spacing w:after="0"/>
+      <w:ind w:left="567"/>
+      <w:contextualSpacing/>
+    </w:pPr>
+    <w:rPr>
+      <w:rFonts w:ascii="Courier New" w:hAnsi="Courier New" w:cs="Courier New"/>
+      <w:b/>
+      <w:bCs/>
+    </w:rPr>
+  </w:style>
+  <w:style w:type="character" w:customStyle="1" w:styleId="CodigoCar">
+    <w:name w:val="Codigo Car"/>
+    <w:basedOn w:val="Fuentedeprrafopredeter"/>
+    <w:link w:val="Codigo"/>
+    <w:rsid w:val="00084412"/>
+    <w:rPr>
+      <w:rFonts w:ascii="Courier New" w:hAnsi="Courier New" w:cs="Courier New"/>
+      <w:b/>
+      <w:bCs/>
+      <w:shd w:val="clear" w:color="auto" w:fill="D9D9D9" w:themeFill="background1" w:themeFillShade="D9"/>
+    </w:rPr>
+  </w:style>
 </w:styles>
 </file>
 

</xml_diff>

<commit_message>
Ended System Requirements and Architecture Structure section, started Rule Configuration (TOML)
</commit_message>
<xml_diff>
--- a/docs/SGC_Manual/1. MO-AME-RSN-XXX MODULO_SIEVECOMP.docx
+++ b/docs/SGC_Manual/1. MO-AME-RSN-XXX MODULO_SIEVECOMP.docx
@@ -280,21 +280,7 @@
                 <w:noProof/>
                 <w:color w:val="000000"/>
               </w:rPr>
-              <w:t>ARQUITECTURA Y REQ</w:t>
-            </w:r>
-            <w:r>
-              <w:rPr>
-                <w:noProof/>
-                <w:color w:val="000000"/>
-              </w:rPr>
-              <w:t>U</w:t>
-            </w:r>
-            <w:r>
-              <w:rPr>
-                <w:noProof/>
-                <w:color w:val="000000"/>
-              </w:rPr>
-              <w:t>ISITOS DEL SISTEMA</w:t>
+              <w:t>ARQUITECTURA Y REQUISITOS DEL SISTEMA</w:t>
             </w:r>
             <w:r>
               <w:rPr>
@@ -398,21 +384,7 @@
                 <w:noProof/>
                 <w:color w:val="000000"/>
               </w:rPr>
-              <w:t>CONFIGURACION DE CONEXIONES Y CREDENCIALES DE SO</w:t>
-            </w:r>
-            <w:r>
-              <w:rPr>
-                <w:noProof/>
-                <w:color w:val="000000"/>
-              </w:rPr>
-              <w:t>L</w:t>
-            </w:r>
-            <w:r>
-              <w:rPr>
-                <w:noProof/>
-                <w:color w:val="000000"/>
-              </w:rPr>
-              <w:t>O LECTURA</w:t>
+              <w:t>CONFIGURACION DE CONEXIONES Y CREDENCIALES DE SOLO LECTURA</w:t>
             </w:r>
             <w:r>
               <w:rPr>
@@ -546,7 +518,13 @@
                 <w:color w:val="000000"/>
               </w:rPr>
               <w:tab/>
-              <w:t>LOCALIZACIÓN</w:t>
+            </w:r>
+            <w:r>
+              <w:rPr>
+                <w:noProof/>
+                <w:color w:val="000000"/>
+              </w:rPr>
+              <w:t>MÚLTIPLES SERVIDORES MEDIANTE PREFIJOS</w:t>
             </w:r>
             <w:r>
               <w:rPr>
@@ -592,7 +570,13 @@
                 <w:color w:val="000000"/>
               </w:rPr>
               <w:tab/>
-              <w:t>GRÁFICAS</w:t>
+            </w:r>
+            <w:r>
+              <w:rPr>
+                <w:noProof/>
+                <w:color w:val="000000"/>
+              </w:rPr>
+              <w:t>VARIABLES DE ENTORNO DEL SISTEMA OPERATIVO</w:t>
             </w:r>
             <w:r>
               <w:rPr>
@@ -638,7 +622,13 @@
                 <w:color w:val="000000"/>
               </w:rPr>
               <w:tab/>
-              <w:t>TABLA DE ARRIBOS SÍSMICOS</w:t>
+            </w:r>
+            <w:r>
+              <w:rPr>
+                <w:noProof/>
+                <w:color w:val="000000"/>
+              </w:rPr>
+              <w:t>DECLARACIÓN DIRECTA EN EL ARCHIVO TOML</w:t>
             </w:r>
             <w:r>
               <w:rPr>
@@ -647,504 +637,6 @@
               </w:rPr>
               <w:tab/>
               <w:t>9</w:t>
-            </w:r>
-          </w:hyperlink>
-        </w:p>
-        <w:p>
-          <w:pPr>
-            <w:pBdr>
-              <w:top w:val="nil"/>
-              <w:left w:val="nil"/>
-              <w:bottom w:val="nil"/>
-              <w:right w:val="nil"/>
-              <w:between w:val="nil"/>
-            </w:pBdr>
-            <w:tabs>
-              <w:tab w:val="left" w:pos="1440"/>
-              <w:tab w:val="right" w:pos="8828"/>
-            </w:tabs>
-            <w:spacing w:after="100"/>
-            <w:ind w:left="440"/>
-            <w:rPr>
-              <w:noProof/>
-              <w:color w:val="000000"/>
-            </w:rPr>
-          </w:pPr>
-          <w:hyperlink w:anchor="_heading=h.upii45vx2ovc">
-            <w:r>
-              <w:rPr>
-                <w:noProof/>
-                <w:color w:val="000000"/>
-              </w:rPr>
-              <w:t>5.2.5</w:t>
-            </w:r>
-            <w:r>
-              <w:rPr>
-                <w:noProof/>
-                <w:color w:val="000000"/>
-              </w:rPr>
-              <w:tab/>
-              <w:t>BARRA DE HERRAMIENTAS DE LOCALIZACIÓN</w:t>
-            </w:r>
-            <w:r>
-              <w:rPr>
-                <w:noProof/>
-                <w:color w:val="000000"/>
-              </w:rPr>
-              <w:tab/>
-              <w:t>13</w:t>
-            </w:r>
-          </w:hyperlink>
-        </w:p>
-        <w:p>
-          <w:pPr>
-            <w:pBdr>
-              <w:top w:val="nil"/>
-              <w:left w:val="nil"/>
-              <w:bottom w:val="nil"/>
-              <w:right w:val="nil"/>
-              <w:between w:val="nil"/>
-            </w:pBdr>
-            <w:tabs>
-              <w:tab w:val="left" w:pos="960"/>
-              <w:tab w:val="right" w:pos="8828"/>
-            </w:tabs>
-            <w:spacing w:after="100"/>
-            <w:ind w:left="220"/>
-            <w:rPr>
-              <w:noProof/>
-              <w:color w:val="000000"/>
-            </w:rPr>
-          </w:pPr>
-          <w:hyperlink w:anchor="_heading=h.d5a66na1z336">
-            <w:r>
-              <w:rPr>
-                <w:noProof/>
-                <w:color w:val="000000"/>
-              </w:rPr>
-              <w:t>5.3</w:t>
-            </w:r>
-            <w:r>
-              <w:rPr>
-                <w:noProof/>
-                <w:color w:val="000000"/>
-              </w:rPr>
-              <w:tab/>
-              <w:t xml:space="preserve">PESTAÑA DE MAGNITUDES - </w:t>
-            </w:r>
-          </w:hyperlink>
-          <w:r>
-            <w:rPr>
-              <w:noProof/>
-            </w:rPr>
-            <w:fldChar w:fldCharType="begin"/>
-          </w:r>
-          <w:r>
-            <w:rPr>
-              <w:noProof/>
-            </w:rPr>
-            <w:instrText xml:space="preserve"> PAGEREF _heading=h.d5a66na1z336 \h </w:instrText>
-          </w:r>
-          <w:r>
-            <w:rPr>
-              <w:noProof/>
-            </w:rPr>
-          </w:r>
-          <w:r>
-            <w:rPr>
-              <w:noProof/>
-            </w:rPr>
-            <w:fldChar w:fldCharType="separate"/>
-          </w:r>
-          <w:r>
-            <w:rPr>
-              <w:i/>
-              <w:iCs/>
-              <w:noProof/>
-              <w:color w:val="000000"/>
-            </w:rPr>
-            <w:t>MAGNITUDES</w:t>
-          </w:r>
-          <w:r>
-            <w:rPr>
-              <w:noProof/>
-              <w:color w:val="000000"/>
-            </w:rPr>
-            <w:tab/>
-            <w:t>23</w:t>
-          </w:r>
-          <w:r>
-            <w:rPr>
-              <w:noProof/>
-            </w:rPr>
-            <w:fldChar w:fldCharType="end"/>
-          </w:r>
-        </w:p>
-        <w:p>
-          <w:pPr>
-            <w:pBdr>
-              <w:top w:val="nil"/>
-              <w:left w:val="nil"/>
-              <w:bottom w:val="nil"/>
-              <w:right w:val="nil"/>
-              <w:between w:val="nil"/>
-            </w:pBdr>
-            <w:tabs>
-              <w:tab w:val="left" w:pos="1440"/>
-              <w:tab w:val="right" w:pos="8828"/>
-            </w:tabs>
-            <w:spacing w:after="100"/>
-            <w:ind w:left="440"/>
-            <w:rPr>
-              <w:noProof/>
-              <w:color w:val="000000"/>
-            </w:rPr>
-          </w:pPr>
-          <w:hyperlink w:anchor="_heading=h.fjmgtigpox3y">
-            <w:r>
-              <w:rPr>
-                <w:noProof/>
-                <w:color w:val="000000"/>
-              </w:rPr>
-              <w:t>5.3.1</w:t>
-            </w:r>
-            <w:r>
-              <w:rPr>
-                <w:noProof/>
-                <w:color w:val="000000"/>
-              </w:rPr>
-              <w:tab/>
-              <w:t>TIPOS DE MAGNITUDES CALCULADAS</w:t>
-            </w:r>
-            <w:r>
-              <w:rPr>
-                <w:noProof/>
-                <w:color w:val="000000"/>
-              </w:rPr>
-              <w:tab/>
-              <w:t>24</w:t>
-            </w:r>
-          </w:hyperlink>
-        </w:p>
-        <w:p>
-          <w:pPr>
-            <w:pBdr>
-              <w:top w:val="nil"/>
-              <w:left w:val="nil"/>
-              <w:bottom w:val="nil"/>
-              <w:right w:val="nil"/>
-              <w:between w:val="nil"/>
-            </w:pBdr>
-            <w:tabs>
-              <w:tab w:val="left" w:pos="1440"/>
-              <w:tab w:val="right" w:pos="8828"/>
-            </w:tabs>
-            <w:spacing w:after="100"/>
-            <w:ind w:left="440"/>
-            <w:rPr>
-              <w:noProof/>
-              <w:color w:val="000000"/>
-            </w:rPr>
-          </w:pPr>
-          <w:hyperlink w:anchor="_heading=h.7wkkkh14jdx0">
-            <w:r>
-              <w:rPr>
-                <w:noProof/>
-                <w:color w:val="000000"/>
-              </w:rPr>
-              <w:t>5.3.2</w:t>
-            </w:r>
-            <w:r>
-              <w:rPr>
-                <w:noProof/>
-                <w:color w:val="000000"/>
-              </w:rPr>
-              <w:tab/>
-              <w:t>MAPA, TABLA E INFORMACIÓN</w:t>
-            </w:r>
-            <w:r>
-              <w:rPr>
-                <w:noProof/>
-                <w:color w:val="000000"/>
-              </w:rPr>
-              <w:tab/>
-              <w:t>24</w:t>
-            </w:r>
-          </w:hyperlink>
-        </w:p>
-        <w:p>
-          <w:pPr>
-            <w:pBdr>
-              <w:top w:val="nil"/>
-              <w:left w:val="nil"/>
-              <w:bottom w:val="nil"/>
-              <w:right w:val="nil"/>
-              <w:between w:val="nil"/>
-            </w:pBdr>
-            <w:tabs>
-              <w:tab w:val="left" w:pos="1440"/>
-              <w:tab w:val="right" w:pos="8828"/>
-            </w:tabs>
-            <w:spacing w:after="100"/>
-            <w:ind w:left="440"/>
-            <w:rPr>
-              <w:noProof/>
-              <w:color w:val="000000"/>
-            </w:rPr>
-          </w:pPr>
-          <w:hyperlink w:anchor="_heading=h.a0qbyxdurqoo">
-            <w:r>
-              <w:rPr>
-                <w:noProof/>
-                <w:color w:val="000000"/>
-              </w:rPr>
-              <w:t>5.3.3</w:t>
-            </w:r>
-            <w:r>
-              <w:rPr>
-                <w:noProof/>
-                <w:color w:val="000000"/>
-              </w:rPr>
-              <w:tab/>
-              <w:t>GRÁFICA DE MAGNITUD RESIDUAL</w:t>
-            </w:r>
-            <w:r>
-              <w:rPr>
-                <w:noProof/>
-                <w:color w:val="000000"/>
-              </w:rPr>
-              <w:tab/>
-              <w:t>25</w:t>
-            </w:r>
-          </w:hyperlink>
-        </w:p>
-        <w:p>
-          <w:pPr>
-            <w:pBdr>
-              <w:top w:val="nil"/>
-              <w:left w:val="nil"/>
-              <w:bottom w:val="nil"/>
-              <w:right w:val="nil"/>
-              <w:between w:val="nil"/>
-            </w:pBdr>
-            <w:tabs>
-              <w:tab w:val="left" w:pos="1440"/>
-              <w:tab w:val="right" w:pos="8828"/>
-            </w:tabs>
-            <w:spacing w:after="100"/>
-            <w:ind w:left="440"/>
-            <w:rPr>
-              <w:noProof/>
-              <w:color w:val="000000"/>
-            </w:rPr>
-          </w:pPr>
-          <w:hyperlink w:anchor="_heading=h.yoigfwaaqngv">
-            <w:r>
-              <w:rPr>
-                <w:noProof/>
-                <w:color w:val="000000"/>
-              </w:rPr>
-              <w:t>5.3.4</w:t>
-            </w:r>
-            <w:r>
-              <w:rPr>
-                <w:noProof/>
-                <w:color w:val="000000"/>
-              </w:rPr>
-              <w:tab/>
-              <w:t>BARRA DE HERRAMIENTAS</w:t>
-            </w:r>
-            <w:r>
-              <w:rPr>
-                <w:noProof/>
-                <w:color w:val="000000"/>
-              </w:rPr>
-              <w:tab/>
-              <w:t>25</w:t>
-            </w:r>
-          </w:hyperlink>
-        </w:p>
-        <w:p>
-          <w:pPr>
-            <w:pBdr>
-              <w:top w:val="nil"/>
-              <w:left w:val="nil"/>
-              <w:bottom w:val="nil"/>
-              <w:right w:val="nil"/>
-              <w:between w:val="nil"/>
-            </w:pBdr>
-            <w:tabs>
-              <w:tab w:val="left" w:pos="1440"/>
-              <w:tab w:val="right" w:pos="8828"/>
-            </w:tabs>
-            <w:spacing w:after="100"/>
-            <w:ind w:left="440"/>
-            <w:rPr>
-              <w:noProof/>
-              <w:color w:val="000000"/>
-            </w:rPr>
-          </w:pPr>
-          <w:hyperlink w:anchor="_heading=h.ditsi6uksrma">
-            <w:r>
-              <w:rPr>
-                <w:noProof/>
-                <w:color w:val="000000"/>
-              </w:rPr>
-              <w:t>5.3.5</w:t>
-            </w:r>
-            <w:r>
-              <w:rPr>
-                <w:noProof/>
-                <w:color w:val="000000"/>
-              </w:rPr>
-              <w:tab/>
-              <w:t>BOTÓN WAVEFORMS</w:t>
-            </w:r>
-            <w:r>
-              <w:rPr>
-                <w:noProof/>
-                <w:color w:val="000000"/>
-              </w:rPr>
-              <w:tab/>
-              <w:t>25</w:t>
-            </w:r>
-          </w:hyperlink>
-        </w:p>
-        <w:p>
-          <w:pPr>
-            <w:pBdr>
-              <w:top w:val="nil"/>
-              <w:left w:val="nil"/>
-              <w:bottom w:val="nil"/>
-              <w:right w:val="nil"/>
-              <w:between w:val="nil"/>
-            </w:pBdr>
-            <w:tabs>
-              <w:tab w:val="left" w:pos="960"/>
-              <w:tab w:val="right" w:pos="8828"/>
-            </w:tabs>
-            <w:spacing w:after="100"/>
-            <w:ind w:left="220"/>
-            <w:rPr>
-              <w:noProof/>
-              <w:color w:val="000000"/>
-            </w:rPr>
-          </w:pPr>
-          <w:hyperlink w:anchor="_heading=h.84nwi33eo4l2">
-            <w:r>
-              <w:rPr>
-                <w:noProof/>
-                <w:color w:val="000000"/>
-              </w:rPr>
-              <w:t>5.4</w:t>
-            </w:r>
-            <w:r>
-              <w:rPr>
-                <w:noProof/>
-                <w:color w:val="000000"/>
-              </w:rPr>
-              <w:tab/>
-              <w:t>PESTAÑA DE EVENTO - EVENT</w:t>
-            </w:r>
-            <w:r>
-              <w:rPr>
-                <w:noProof/>
-                <w:color w:val="000000"/>
-              </w:rPr>
-              <w:tab/>
-              <w:t>28</w:t>
-            </w:r>
-          </w:hyperlink>
-        </w:p>
-        <w:p>
-          <w:pPr>
-            <w:pBdr>
-              <w:top w:val="nil"/>
-              <w:left w:val="nil"/>
-              <w:bottom w:val="nil"/>
-              <w:right w:val="nil"/>
-              <w:between w:val="nil"/>
-            </w:pBdr>
-            <w:tabs>
-              <w:tab w:val="left" w:pos="960"/>
-              <w:tab w:val="right" w:pos="8828"/>
-            </w:tabs>
-            <w:spacing w:after="100"/>
-            <w:ind w:left="220"/>
-            <w:rPr>
-              <w:noProof/>
-              <w:color w:val="000000"/>
-            </w:rPr>
-          </w:pPr>
-          <w:hyperlink w:anchor="_heading=h.jy9wwj7wlt1j">
-            <w:r>
-              <w:rPr>
-                <w:noProof/>
-                <w:color w:val="000000"/>
-              </w:rPr>
-              <w:t>5.5</w:t>
-            </w:r>
-            <w:r>
-              <w:rPr>
-                <w:noProof/>
-                <w:color w:val="000000"/>
-              </w:rPr>
-              <w:tab/>
-              <w:t>PESTAÑA DE LISTADO DE EVENTOS - EVENTS</w:t>
-            </w:r>
-            <w:r>
-              <w:rPr>
-                <w:noProof/>
-                <w:color w:val="000000"/>
-              </w:rPr>
-              <w:tab/>
-              <w:t>30</w:t>
-            </w:r>
-          </w:hyperlink>
-        </w:p>
-        <w:p>
-          <w:pPr>
-            <w:pBdr>
-              <w:top w:val="nil"/>
-              <w:left w:val="nil"/>
-              <w:bottom w:val="nil"/>
-              <w:right w:val="nil"/>
-              <w:between w:val="nil"/>
-            </w:pBdr>
-            <w:tabs>
-              <w:tab w:val="left" w:pos="960"/>
-              <w:tab w:val="right" w:pos="8828"/>
-            </w:tabs>
-            <w:spacing w:after="100"/>
-            <w:ind w:left="220"/>
-            <w:rPr>
-              <w:noProof/>
-              <w:color w:val="000000"/>
-            </w:rPr>
-          </w:pPr>
-          <w:hyperlink w:anchor="_heading=h.3srs01eew5tk">
-            <w:r>
-              <w:rPr>
-                <w:noProof/>
-                <w:color w:val="000000"/>
-              </w:rPr>
-              <w:t>5.6</w:t>
-            </w:r>
-            <w:r>
-              <w:rPr>
-                <w:noProof/>
-                <w:color w:val="000000"/>
-              </w:rPr>
-              <w:tab/>
-              <w:t>CONFIGURACIONES</w:t>
-            </w:r>
-            <w:r>
-              <w:rPr>
-                <w:noProof/>
-                <w:color w:val="000000"/>
-              </w:rPr>
-              <w:tab/>
-              <w:t>31</w:t>
             </w:r>
           </w:hyperlink>
         </w:p>
@@ -1181,7 +673,13 @@
                 <w:color w:val="000000"/>
               </w:rPr>
               <w:tab/>
-              <w:t>OTROS ELEMENTOS DE APOYO</w:t>
+            </w:r>
+            <w:r>
+              <w:rPr>
+                <w:noProof/>
+                <w:color w:val="000000"/>
+              </w:rPr>
+              <w:t>CONFIGURACIÓN DE REGLAS (ARCHIVO TOML)</w:t>
             </w:r>
             <w:r>
               <w:rPr>
@@ -1300,10 +798,6 @@
             </w:tabs>
             <w:spacing w:after="100"/>
             <w:ind w:left="440"/>
-            <w:rPr>
-              <w:noProof/>
-              <w:color w:val="000000"/>
-            </w:rPr>
           </w:pPr>
           <w:hyperlink w:anchor="_heading=h.wp0p73jnsasv">
             <w:r>
@@ -1341,6 +835,38 @@
               <w:between w:val="nil"/>
             </w:pBdr>
             <w:tabs>
+              <w:tab w:val="left" w:pos="1440"/>
+              <w:tab w:val="right" w:pos="8828"/>
+            </w:tabs>
+            <w:spacing w:after="100"/>
+            <w:ind w:left="440"/>
+            <w:rPr>
+              <w:noProof/>
+              <w:color w:val="000000"/>
+            </w:rPr>
+          </w:pPr>
+          <w:r>
+            <w:t>6.1.3.</w:t>
+          </w:r>
+          <w:r>
+            <w:tab/>
+            <w:t>DECLARACIÓN DE LAS CONSULTAS</w:t>
+          </w:r>
+          <w:r>
+            <w:tab/>
+            <w:t>15</w:t>
+          </w:r>
+        </w:p>
+        <w:p>
+          <w:pPr>
+            <w:pBdr>
+              <w:top w:val="nil"/>
+              <w:left w:val="nil"/>
+              <w:bottom w:val="nil"/>
+              <w:right w:val="nil"/>
+              <w:between w:val="nil"/>
+            </w:pBdr>
+            <w:tabs>
               <w:tab w:val="left" w:pos="960"/>
               <w:tab w:val="right" w:pos="8828"/>
             </w:tabs>
@@ -1365,7 +891,13 @@
                 <w:color w:val="000000"/>
               </w:rPr>
               <w:tab/>
-              <w:t>TIPOS DE MAGNITUDES</w:t>
+            </w:r>
+            <w:r>
+              <w:rPr>
+                <w:noProof/>
+                <w:color w:val="000000"/>
+              </w:rPr>
+              <w:t>DEFINICIÓN DE POLÍGONOS Y BÚSQUEDA DE DUPLICADOS</w:t>
             </w:r>
             <w:r>
               <w:rPr>
@@ -1822,7 +1354,15 @@
         <w:spacing w:after="0"/>
       </w:pPr>
       <w:r>
-        <w:t>Establecer las directrices técnicas y operativas para el uso, configuración y ejecución del paquete computacional SieveComP en la Red Sismológica Nacional de Colombia (RSNC), estandarizando y automatizando el proceso de auditoría, control de calidad y filtrado de los catálogos sísmicos paramétricos generados en los sistemas SeisComP del Servicio Geológico Colombiano (SGC).</w:t>
+        <w:t xml:space="preserve">Establecer las directrices técnicas y operativas para el uso, configuración y ejecución del paquete computacional </w:t>
+      </w:r>
+      <w:proofErr w:type="spellStart"/>
+      <w:r>
+        <w:t>SieveComP</w:t>
+      </w:r>
+      <w:proofErr w:type="spellEnd"/>
+      <w:r>
+        <w:t xml:space="preserve"> en la Red Sismológica Nacional de Colombia (RSNC), estandarizando y automatizando el proceso de auditoría, control de calidad y filtrado de los catálogos sísmicos paramétricos generados en los sistemas SeisComP del Servicio Geológico Colombiano (SGC).</w:t>
       </w:r>
     </w:p>
     <w:p>
@@ -1849,38 +1389,28 @@
         <w:spacing w:after="0"/>
       </w:pPr>
       <w:r>
-        <w:t xml:space="preserve">El presente manual aplica primordialmente a los analistas, sismólogos y personal técnico del grupo de trabajo de Evaluación, Monitoreo y Diagnóstico de Dinámicas Geológicas de la Dirección de Geoamenazas, responsables de la revisión rutinaria y la calidad de los catálogos en la sala de monitoreo de la RSNC. Así mismo, su aplicación se extiende a cualquier otro grupo de investigación, observatorio vulcanológico o dependencia dentro </w:t>
-      </w:r>
-      <w:r>
-        <w:t>del SGC</w:t>
-      </w:r>
-      <w:r>
-        <w:t xml:space="preserve"> que requiera extraer, filtrar o auditar datos paramétricos provenientes de las bases de datos de SeisComP para fines investigativos, generación de reportes o desarrollos computacionales.</w:t>
-      </w:r>
-    </w:p>
-    <w:p>
-      <w:pPr>
-        <w:spacing w:after="0"/>
-      </w:pPr>
-    </w:p>
-    <w:p>
-      <w:pPr>
-        <w:spacing w:after="0"/>
-      </w:pPr>
-      <w:r>
-        <w:t xml:space="preserve">Este documento complementa el instructivo vigente </w:t>
-      </w:r>
-      <w:r>
-        <w:t>“</w:t>
-      </w:r>
-      <w:r>
-        <w:t>Operación y gestión del procesamiento de datos sismológicos con SeisComP</w:t>
-      </w:r>
-      <w:r>
-        <w:t>”</w:t>
-      </w:r>
-      <w:r>
-        <w:t xml:space="preserve"> (</w:t>
+        <w:t xml:space="preserve">El presente manual aplica primordialmente a los analistas, sismólogos y personal técnico del grupo de trabajo de Evaluación, Monitoreo y Diagnóstico de Dinámicas Geológicas de la Dirección de </w:t>
+      </w:r>
+      <w:proofErr w:type="spellStart"/>
+      <w:r>
+        <w:t>Geoamenazas</w:t>
+      </w:r>
+      <w:proofErr w:type="spellEnd"/>
+      <w:r>
+        <w:t>, responsables de la revisión rutinaria y la calidad de los catálogos en la sala de monitoreo de la RSNC. Así mismo, su aplicación se extiende a cualquier otro grupo de investigación, observatorio vulcanológico o dependencia dentro del SGC que requiera extraer, filtrar o auditar datos paramétricos provenientes de las bases de datos de SeisComP para fines investigativos, generación de reportes o desarrollos computacionales.</w:t>
+      </w:r>
+    </w:p>
+    <w:p>
+      <w:pPr>
+        <w:spacing w:after="0"/>
+      </w:pPr>
+    </w:p>
+    <w:p>
+      <w:pPr>
+        <w:spacing w:after="0"/>
+      </w:pPr>
+      <w:r>
+        <w:t>Este documento complementa el instructivo vigente “Operación y gestión del procesamiento de datos sismológicos con SeisComP” (</w:t>
       </w:r>
       <w:r>
         <w:rPr>
@@ -1902,6 +1432,7 @@
       <w:r>
         <w:t xml:space="preserve">). Mientras que dichos documentos establecen los protocolos de detección, análisis manual y responsabilidades durante los turnos, este manual de </w:t>
       </w:r>
+      <w:proofErr w:type="spellStart"/>
       <w:r>
         <w:rPr>
           <w:b/>
@@ -1909,6 +1440,7 @@
         </w:rPr>
         <w:t>SieveComP</w:t>
       </w:r>
+      <w:proofErr w:type="spellEnd"/>
       <w:r>
         <w:t xml:space="preserve"> proporciona la guía detallada para ejecutar la etapa posterior de auditoría y control de calidad automatizado. La integración de esta herramienta de filtrado en los protocolos existentes asegura una depuración exhaustiva de los datos antes de su publicación definitiva, garantizando la confiabilidad del Catálogo Sísmico Nacional y la continuidad operativa de los estándares de monitoreo del SGC.</w:t>
       </w:r>
@@ -1941,13 +1473,15 @@
         <w:spacing w:after="0"/>
       </w:pPr>
       <w:r>
-        <w:t xml:space="preserve">La operación, auditoría y control de calidad de los catálogos sísmicos utilizando la herramienta SieveComP </w:t>
-      </w:r>
-      <w:r>
-        <w:t>se enmarca en</w:t>
-      </w:r>
-      <w:r>
-        <w:t xml:space="preserve"> las responsabilidades misionales y el marco normativo vigente que rige las actividades de la Red Sismológica Nacional de Colombia y el Servicio Geológico Colombiano:</w:t>
+        <w:t xml:space="preserve">La operación, auditoría y control de calidad de los catálogos sísmicos utilizando la herramienta </w:t>
+      </w:r>
+      <w:proofErr w:type="spellStart"/>
+      <w:r>
+        <w:t>SieveComP</w:t>
+      </w:r>
+      <w:proofErr w:type="spellEnd"/>
+      <w:r>
+        <w:t xml:space="preserve"> se enmarca en las responsabilidades misionales y el marco normativo vigente que rige las actividades de la Red Sismológica Nacional de Colombia y el Servicio Geológico Colombiano:</w:t>
       </w:r>
     </w:p>
     <w:p>
@@ -2022,7 +1556,15 @@
         <w:t>Decreto 2703 de 2013:</w:t>
       </w:r>
       <w:r>
-        <w:t xml:space="preserve"> Establece la estructura interna del SGC. En su artículo 9, asigna a la Dirección de Geoamenazas la función de investigar, monitorear y evaluar fenómenos generadores de amenazas; elaborar estudios y monitorear la actividad sísmica del país; y proveer información sobre riesgo físico a las autoridades competentes y a la comunidad, además de operar y actualizar la Red Sismológica Nacional de Colombia.</w:t>
+        <w:t xml:space="preserve"> Establece la estructura interna del SGC. En su artículo 9, asigna a la Dirección de </w:t>
+      </w:r>
+      <w:proofErr w:type="spellStart"/>
+      <w:r>
+        <w:t>Geoamenazas</w:t>
+      </w:r>
+      <w:proofErr w:type="spellEnd"/>
+      <w:r>
+        <w:t xml:space="preserve"> la función de investigar, monitorear y evaluar fenómenos generadores de amenazas; elaborar estudios y monitorear la actividad sísmica del país; y proveer información sobre riesgo físico a las autoridades competentes y a la comunidad, además de operar y actualizar la Red Sismológica Nacional de Colombia.</w:t>
       </w:r>
     </w:p>
     <w:p>
@@ -2042,7 +1584,15 @@
         <w:t>Resolución 1281 de 2024:</w:t>
       </w:r>
       <w:r>
-        <w:t xml:space="preserve"> Asigna al grupo de trabajo Evaluación, Monitoreo y Diagnóstico de Dinámicas Geológicas de la Dirección de Geoamenazas las funciones de diseñar, instalar, mantener y operar las redes de monitoreo sísmico; participar en el diseño e implementación de servicios de datos e información; brindar asistencia técnica al SNGRD ante sismos importantes; y </w:t>
+        <w:t xml:space="preserve"> Asigna al grupo de trabajo Evaluación, Monitoreo y Diagnóstico de Dinámicas Geológicas de la Dirección de </w:t>
+      </w:r>
+      <w:proofErr w:type="spellStart"/>
+      <w:r>
+        <w:t>Geoamenazas</w:t>
+      </w:r>
+      <w:proofErr w:type="spellEnd"/>
+      <w:r>
+        <w:t xml:space="preserve"> las funciones de diseñar, instalar, mantener y operar las redes de monitoreo sísmico; participar en el diseño e implementación de servicios de datos e información; brindar asistencia técnica al SNGRD ante sismos importantes; y </w:t>
       </w:r>
       <w:r>
         <w:rPr>
@@ -2052,7 +1602,15 @@
         <w:t>elaborar boletines e informes técnicos sobre la actividad sísmica</w:t>
       </w:r>
       <w:r>
-        <w:t>, procesos que dependen directamente de la calidad de los datos filtrados por SieveComP.</w:t>
+        <w:t xml:space="preserve">, procesos que dependen directamente de la calidad de los datos filtrados por </w:t>
+      </w:r>
+      <w:proofErr w:type="spellStart"/>
+      <w:r>
+        <w:t>SieveComP</w:t>
+      </w:r>
+      <w:proofErr w:type="spellEnd"/>
+      <w:r>
+        <w:t>.</w:t>
       </w:r>
     </w:p>
     <w:p>
@@ -2127,33 +1685,43 @@
       <w:pPr>
         <w:spacing w:after="0"/>
       </w:pPr>
+      <w:proofErr w:type="spellStart"/>
       <w:r>
         <w:rPr>
           <w:b/>
           <w:bCs/>
         </w:rPr>
-        <w:t>SieveComP:</w:t>
-      </w:r>
-      <w:r>
-        <w:t xml:space="preserve"> Paquete computacional desarrollado en Python que actúa como una capa de abstracción, auditoría y control de calidad sobre las bases de datos de SeisComP. Permite la ejecución de reglas de validación complejas, filtrado espacial de eventos y estandarización de catálogos sin modificar la base de datos de producción.</w:t>
-      </w:r>
-    </w:p>
-    <w:p>
-      <w:pPr>
-        <w:spacing w:after="0"/>
-      </w:pPr>
-    </w:p>
-    <w:p>
-      <w:pPr>
-        <w:spacing w:after="0"/>
-      </w:pPr>
+        <w:t>SieveComP</w:t>
+      </w:r>
+      <w:proofErr w:type="spellEnd"/>
       <w:r>
         <w:rPr>
           <w:b/>
           <w:bCs/>
         </w:rPr>
+        <w:t>:</w:t>
+      </w:r>
+      <w:r>
+        <w:t xml:space="preserve"> Paquete computacional desarrollado en Python que actúa como una capa de abstracción, auditoría y control de calidad sobre las bases de datos de SeisComP. Permite la ejecución de reglas de validación complejas, filtrado espacial de eventos y estandarización de catálogos sin modificar la base de datos de producción.</w:t>
+      </w:r>
+    </w:p>
+    <w:p>
+      <w:pPr>
+        <w:spacing w:after="0"/>
+      </w:pPr>
+    </w:p>
+    <w:p>
+      <w:pPr>
+        <w:spacing w:after="0"/>
+      </w:pPr>
+      <w:r>
+        <w:rPr>
+          <w:b/>
+          <w:bCs/>
+        </w:rPr>
         <w:t>TOML (</w:t>
       </w:r>
+      <w:proofErr w:type="spellStart"/>
       <w:r>
         <w:rPr>
           <w:b/>
@@ -2161,51 +1729,9 @@
           <w:i/>
           <w:iCs/>
         </w:rPr>
-        <w:t>Tom's Obvious, Minimal Language</w:t>
-      </w:r>
-      <w:r>
-        <w:rPr>
-          <w:b/>
-          <w:bCs/>
-        </w:rPr>
-        <w:t>):</w:t>
-      </w:r>
-      <w:r>
-        <w:t xml:space="preserve"> Formato de archivo de texto estandarizado y legible por humanos utilizado por SieveComP para definir la configuración del sistema, las credenciales de base de datos, los límites poligonales y las reglas lógicas de control de calidad sin necesidad de escribir código de programación.</w:t>
-      </w:r>
-    </w:p>
-    <w:p>
-      <w:pPr>
-        <w:spacing w:after="0"/>
-      </w:pPr>
-      <w:r>
-        <w:rPr>
-          <w:b/>
-          <w:bCs/>
-        </w:rPr>
-        <w:lastRenderedPageBreak/>
-        <w:t>Catálogo Sísmico Paramétrico:</w:t>
-      </w:r>
-      <w:r>
-        <w:t xml:space="preserve"> Conjunto de datos tabulares que resumen los parámetros fundamentales de los eventos sísmicos localizados por la red (por ejemplo: tiempo de origen, latitud, longitud, profundidad, magnitud, número de fases, algoritmo utilizado), que sirve como insumo para el control de calidad, generación de boletines y publicación oficial.</w:t>
-      </w:r>
-    </w:p>
-    <w:p>
-      <w:pPr>
-        <w:spacing w:after="0"/>
-      </w:pPr>
-    </w:p>
-    <w:p>
-      <w:pPr>
-        <w:spacing w:after="0"/>
-      </w:pPr>
-      <w:r>
-        <w:rPr>
-          <w:b/>
-          <w:bCs/>
-        </w:rPr>
-        <w:t>Vectorización (</w:t>
-      </w:r>
+        <w:t>Tom's</w:t>
+      </w:r>
+      <w:proofErr w:type="spellEnd"/>
       <w:r>
         <w:rPr>
           <w:b/>
@@ -2213,37 +1739,186 @@
           <w:i/>
           <w:iCs/>
         </w:rPr>
-        <w:t>NumPy Masks</w:t>
-      </w:r>
+        <w:t xml:space="preserve"> </w:t>
+      </w:r>
+      <w:proofErr w:type="spellStart"/>
       <w:r>
         <w:rPr>
           <w:b/>
           <w:bCs/>
-        </w:rPr>
-        <w:t>):</w:t>
-      </w:r>
-      <w:r>
-        <w:t xml:space="preserve"> Técnica computacional empleada por el motor de SieveComP que permite aplicar operaciones matemáticas y lógicas a columnas enteras de datos (arreglos) de forma simultánea, evitando los bucles lentos de programación y logrando procesar miles de eventos sísmicos en fracciones de segundo.</w:t>
-      </w:r>
-    </w:p>
-    <w:p>
-      <w:pPr>
-        <w:spacing w:after="0"/>
-      </w:pPr>
-    </w:p>
-    <w:p>
-      <w:pPr>
-        <w:spacing w:after="0"/>
-      </w:pPr>
+          <w:i/>
+          <w:iCs/>
+        </w:rPr>
+        <w:t>Obvious</w:t>
+      </w:r>
+      <w:proofErr w:type="spellEnd"/>
       <w:r>
         <w:rPr>
           <w:b/>
           <w:bCs/>
+          <w:i/>
+          <w:iCs/>
+        </w:rPr>
+        <w:t xml:space="preserve">, </w:t>
+      </w:r>
+      <w:proofErr w:type="spellStart"/>
+      <w:r>
+        <w:rPr>
+          <w:b/>
+          <w:bCs/>
+          <w:i/>
+          <w:iCs/>
+        </w:rPr>
+        <w:t>Minimal</w:t>
+      </w:r>
+      <w:proofErr w:type="spellEnd"/>
+      <w:r>
+        <w:rPr>
+          <w:b/>
+          <w:bCs/>
+          <w:i/>
+          <w:iCs/>
+        </w:rPr>
+        <w:t xml:space="preserve"> </w:t>
+      </w:r>
+      <w:proofErr w:type="spellStart"/>
+      <w:r>
+        <w:rPr>
+          <w:b/>
+          <w:bCs/>
+          <w:i/>
+          <w:iCs/>
+        </w:rPr>
+        <w:t>Language</w:t>
+      </w:r>
+      <w:proofErr w:type="spellEnd"/>
+      <w:r>
+        <w:rPr>
+          <w:b/>
+          <w:bCs/>
+        </w:rPr>
+        <w:t>):</w:t>
+      </w:r>
+      <w:r>
+        <w:t xml:space="preserve"> Formato de archivo de texto estandarizado y legible por humanos utilizado por </w:t>
+      </w:r>
+      <w:proofErr w:type="spellStart"/>
+      <w:r>
+        <w:t>SieveComP</w:t>
+      </w:r>
+      <w:proofErr w:type="spellEnd"/>
+      <w:r>
+        <w:t xml:space="preserve"> para definir la configuración del sistema, las credenciales de base de datos, los límites poligonales y las reglas lógicas de control de calidad sin necesidad de escribir código de programación.</w:t>
+      </w:r>
+    </w:p>
+    <w:p>
+      <w:pPr>
+        <w:spacing w:after="0"/>
+      </w:pPr>
+      <w:r>
+        <w:rPr>
+          <w:b/>
+          <w:bCs/>
+        </w:rPr>
+        <w:lastRenderedPageBreak/>
+        <w:t>Catálogo Sísmico Paramétrico:</w:t>
+      </w:r>
+      <w:r>
+        <w:t xml:space="preserve"> Conjunto de datos tabulares que resumen los parámetros fundamentales de los eventos sísmicos localizados por la red (por ejemplo: tiempo de origen, latitud, longitud, profundidad, magnitud, número de fases, algoritmo utilizado), que sirve como insumo para el control de calidad, generación de boletines y publicación oficial.</w:t>
+      </w:r>
+    </w:p>
+    <w:p>
+      <w:pPr>
+        <w:spacing w:after="0"/>
+      </w:pPr>
+    </w:p>
+    <w:p>
+      <w:pPr>
+        <w:spacing w:after="0"/>
+      </w:pPr>
+      <w:r>
+        <w:rPr>
+          <w:b/>
+          <w:bCs/>
+        </w:rPr>
+        <w:t>Vectorización (</w:t>
+      </w:r>
+      <w:proofErr w:type="spellStart"/>
+      <w:r>
+        <w:rPr>
+          <w:b/>
+          <w:bCs/>
+          <w:i/>
+          <w:iCs/>
+        </w:rPr>
+        <w:t>NumPy</w:t>
+      </w:r>
+      <w:proofErr w:type="spellEnd"/>
+      <w:r>
+        <w:rPr>
+          <w:b/>
+          <w:bCs/>
+          <w:i/>
+          <w:iCs/>
+        </w:rPr>
+        <w:t xml:space="preserve"> </w:t>
+      </w:r>
+      <w:proofErr w:type="spellStart"/>
+      <w:r>
+        <w:rPr>
+          <w:b/>
+          <w:bCs/>
+          <w:i/>
+          <w:iCs/>
+        </w:rPr>
+        <w:t>Masks</w:t>
+      </w:r>
+      <w:proofErr w:type="spellEnd"/>
+      <w:r>
+        <w:rPr>
+          <w:b/>
+          <w:bCs/>
+        </w:rPr>
+        <w:t>):</w:t>
+      </w:r>
+      <w:r>
+        <w:t xml:space="preserve"> Técnica computacional empleada por el motor de </w:t>
+      </w:r>
+      <w:proofErr w:type="spellStart"/>
+      <w:r>
+        <w:t>SieveComP</w:t>
+      </w:r>
+      <w:proofErr w:type="spellEnd"/>
+      <w:r>
+        <w:t xml:space="preserve"> que permite aplicar operaciones matemáticas y lógicas a columnas enteras de datos (arreglos) de forma simultánea, evitando los bucles lentos de programación y logrando procesar miles de eventos sísmicos en fracciones de segundo.</w:t>
+      </w:r>
+    </w:p>
+    <w:p>
+      <w:pPr>
+        <w:spacing w:after="0"/>
+      </w:pPr>
+    </w:p>
+    <w:p>
+      <w:pPr>
+        <w:spacing w:after="0"/>
+      </w:pPr>
+      <w:r>
+        <w:rPr>
+          <w:b/>
+          <w:bCs/>
         </w:rPr>
         <w:t>Eventos Duplicados:</w:t>
       </w:r>
       <w:r>
-        <w:t xml:space="preserve"> Registros múltiples en la base de datos que corresponden al mismo fenómeno sísmico físico, usualmente generados por discrepancias en la asociación automática de fases. SieveComP los detecta utilizando algoritmos de ventana temporal y proximidad espacial (como la aproximación de ventana deslizante - SSWA).</w:t>
+        <w:t xml:space="preserve"> Registros múltiples en la base de datos que corresponden al mismo fenómeno sísmico físico, usualmente generados por discrepancias en la asociación automática de fases. </w:t>
+      </w:r>
+      <w:proofErr w:type="spellStart"/>
+      <w:r>
+        <w:t>SieveComP</w:t>
+      </w:r>
+      <w:proofErr w:type="spellEnd"/>
+      <w:r>
+        <w:t xml:space="preserve"> los detecta utilizando algoritmos de ventana temporal y proximidad espacial (como la aproximación de ventana deslizante - SSWA).</w:t>
       </w:r>
     </w:p>
     <w:p>
@@ -2269,6 +1944,7 @@
       <w:pPr>
         <w:spacing w:after="0"/>
       </w:pPr>
+      <w:proofErr w:type="spellStart"/>
       <w:r>
         <w:rPr>
           <w:b/>
@@ -2276,6 +1952,7 @@
         </w:rPr>
         <w:t>SieveComP</w:t>
       </w:r>
+      <w:proofErr w:type="spellEnd"/>
       <w:r>
         <w:t xml:space="preserve"> está estructurado bajo una arquitectura modular y desacoplada que opera como una capa intermedia de auditoría y control de calidad entre las bases de datos operativas de SeisComP y los usuarios finales (analistas de turno, sismólogos o rutinas automatizadas). El principio</w:t>
       </w:r>
@@ -2285,6 +1962,7 @@
       <w:r>
         <w:t>de su diseño es el acceso estrictamente de solo lectura (</w:t>
       </w:r>
+      <w:proofErr w:type="spellStart"/>
       <w:r>
         <w:rPr>
           <w:i/>
@@ -2292,6 +1970,7 @@
         </w:rPr>
         <w:t>read-only</w:t>
       </w:r>
+      <w:proofErr w:type="spellEnd"/>
       <w:r>
         <w:t>), lo que garantiza la protección integral de las bases de datos de producción de la RSNC, eliminando cualquier riesgo de alteración, bloqueo o sobreescritura accidental de la información sismológica en tiempo real.</w:t>
       </w:r>
@@ -2389,6 +2068,7 @@
       <w:r>
         <w:t xml:space="preserve">, procesa catálogos masivos aplicando operaciones vectorizadas con </w:t>
       </w:r>
+      <w:proofErr w:type="spellStart"/>
       <w:r>
         <w:rPr>
           <w:i/>
@@ -2396,6 +2076,7 @@
         </w:rPr>
         <w:t>NumPy</w:t>
       </w:r>
+      <w:proofErr w:type="spellEnd"/>
       <w:r>
         <w:t xml:space="preserve"> </w:t>
       </w:r>
@@ -2435,6 +2116,7 @@
       <w:r>
         <w:t xml:space="preserve">, integra análisis geométrico con </w:t>
       </w:r>
+      <w:proofErr w:type="spellStart"/>
       <w:r>
         <w:t>S</w:t>
       </w:r>
@@ -2445,6 +2127,7 @@
         </w:rPr>
         <w:t>hapely</w:t>
       </w:r>
+      <w:proofErr w:type="spellEnd"/>
       <w:r>
         <w:t xml:space="preserve"> </w:t>
       </w:r>
@@ -2504,6 +2187,7 @@
       <w:r>
         <w:t xml:space="preserve">) para flujos por lotes o mediante una aplicación web interactiva desarrollada en </w:t>
       </w:r>
+      <w:proofErr w:type="spellStart"/>
       <w:r>
         <w:rPr>
           <w:i/>
@@ -2511,6 +2195,7 @@
         </w:rPr>
         <w:t>Streamlit</w:t>
       </w:r>
+      <w:proofErr w:type="spellEnd"/>
       <w:r>
         <w:rPr>
           <w:i/>
@@ -2523,7 +2208,23 @@
           <w:i/>
           <w:iCs/>
         </w:rPr>
-        <w:t>(Streamlit Inc., 2019)</w:t>
+        <w:t>(</w:t>
+      </w:r>
+      <w:proofErr w:type="spellStart"/>
+      <w:r>
+        <w:rPr>
+          <w:i/>
+          <w:iCs/>
+        </w:rPr>
+        <w:t>Streamlit</w:t>
+      </w:r>
+      <w:proofErr w:type="spellEnd"/>
+      <w:r>
+        <w:rPr>
+          <w:i/>
+          <w:iCs/>
+        </w:rPr>
+        <w:t xml:space="preserve"> Inc., 2019)</w:t>
       </w:r>
       <w:r>
         <w:t>, exportando reportes consolidados para la toma de decisiones operativas.</w:t>
@@ -2556,7 +2257,15 @@
     </w:p>
     <w:p>
       <w:r>
-        <w:t>Para garantizar la correcta ejecución del paquete SieveComP tanto en las estaciones de trabajo de los analistas en la sala de monitoreo, como en los servidores de la RSNC, el sistema anfitrión debe cumplir con los siguientes requerimientos técnicos y dependencias de software:</w:t>
+        <w:t xml:space="preserve">Para garantizar la correcta ejecución del paquete </w:t>
+      </w:r>
+      <w:proofErr w:type="spellStart"/>
+      <w:r>
+        <w:t>SieveComP</w:t>
+      </w:r>
+      <w:proofErr w:type="spellEnd"/>
+      <w:r>
+        <w:t xml:space="preserve"> tanto en las estaciones de trabajo de los analistas en la sala de monitoreo, como en los servidores de la RSNC, el sistema anfitrión debe cumplir con los siguientes requerimientos técnicos y dependencias de software:</w:t>
       </w:r>
     </w:p>
     <w:p>
@@ -2591,10 +2300,7 @@
         <w:t>Lenguaje de Programación:</w:t>
       </w:r>
       <w:r>
-        <w:t xml:space="preserve"> Python 3.12 o </w:t>
-      </w:r>
-      <w:r>
-        <w:t>superior.</w:t>
+        <w:t xml:space="preserve"> Python 3.12 o superior.</w:t>
       </w:r>
     </w:p>
     <w:p>
@@ -2613,7 +2319,23 @@
         <w:t>Gestor de Entornos:</w:t>
       </w:r>
       <w:r>
-        <w:t xml:space="preserve"> Se recomienda instalar el paquete dentro de un entorno virtual aislado (usando venv o conda) para evitar conflictos de dependencias con otros aplicativos del SGC.</w:t>
+        <w:t xml:space="preserve"> Se recomienda instalar el paquete dentro de un entorno virtual aislado (usando </w:t>
+      </w:r>
+      <w:proofErr w:type="spellStart"/>
+      <w:r>
+        <w:t>venv</w:t>
+      </w:r>
+      <w:proofErr w:type="spellEnd"/>
+      <w:r>
+        <w:t xml:space="preserve"> o </w:t>
+      </w:r>
+      <w:proofErr w:type="spellStart"/>
+      <w:r>
+        <w:t>conda</w:t>
+      </w:r>
+      <w:proofErr w:type="spellEnd"/>
+      <w:r>
+        <w:t>) para evitar conflictos de dependencias con otros aplicativos del SGC.</w:t>
       </w:r>
     </w:p>
     <w:p>
@@ -2681,6 +2403,7 @@
       <w:r>
         <w:t xml:space="preserve"> Manejo y estructuración del catálogo sísmico extraído mediante </w:t>
       </w:r>
+      <w:proofErr w:type="spellStart"/>
       <w:r>
         <w:rPr>
           <w:i/>
@@ -2688,6 +2411,7 @@
         </w:rPr>
         <w:t>DataFrames</w:t>
       </w:r>
+      <w:proofErr w:type="spellEnd"/>
       <w:r>
         <w:t>, facilitando la manipulación tabular de los eventos, orígenes y magnitudes.</w:t>
       </w:r>
@@ -2700,15 +2424,32 @@
           <w:numId w:val="45"/>
         </w:numPr>
       </w:pPr>
+      <w:proofErr w:type="spellStart"/>
       <w:r>
         <w:rPr>
           <w:b/>
           <w:bCs/>
         </w:rPr>
-        <w:t>NumPy (Harris et al., 2020):</w:t>
-      </w:r>
-      <w:r>
-        <w:t xml:space="preserve"> Base computacional del motor de SieveComP. Habilita las operaciones vectorizadas de alto rendimiento (máscaras booleanas) y el cálculo matricial necesario para el algoritmo </w:t>
+        <w:t>NumPy</w:t>
+      </w:r>
+      <w:proofErr w:type="spellEnd"/>
+      <w:r>
+        <w:rPr>
+          <w:b/>
+          <w:bCs/>
+        </w:rPr>
+        <w:t xml:space="preserve"> (Harris et al., 2020):</w:t>
+      </w:r>
+      <w:r>
+        <w:t xml:space="preserve"> Base computacional del motor de </w:t>
+      </w:r>
+      <w:proofErr w:type="spellStart"/>
+      <w:r>
+        <w:t>SieveComP</w:t>
+      </w:r>
+      <w:proofErr w:type="spellEnd"/>
+      <w:r>
+        <w:t xml:space="preserve">. Habilita las operaciones vectorizadas de alto rendimiento (máscaras booleanas) y el cálculo matricial necesario para el algoritmo </w:t>
       </w:r>
       <w:r>
         <w:t>de detección de duplicados</w:t>
@@ -2725,12 +2466,21 @@
           <w:numId w:val="45"/>
         </w:numPr>
       </w:pPr>
+      <w:proofErr w:type="spellStart"/>
       <w:r>
         <w:rPr>
           <w:b/>
           <w:bCs/>
         </w:rPr>
-        <w:t>Shapely (Gillies et al., 2007):</w:t>
+        <w:t>Shapely</w:t>
+      </w:r>
+      <w:proofErr w:type="spellEnd"/>
+      <w:r>
+        <w:rPr>
+          <w:b/>
+          <w:bCs/>
+        </w:rPr>
+        <w:t xml:space="preserve"> (Gillies et al., 2007):</w:t>
       </w:r>
       <w:r>
         <w:t xml:space="preserve"> Módulo encargado del análisis geométrico espacial. Permite comprobar matemáticamente si los epicentros calculados caen dentro (o fuera) de los polígonos predefinidos de la RSNC (zonas de magnitud, observatorios vulcanológicos, regiones tectónicas).</w:t>
@@ -2744,12 +2494,21 @@
           <w:numId w:val="45"/>
         </w:numPr>
       </w:pPr>
+      <w:proofErr w:type="spellStart"/>
       <w:r>
         <w:rPr>
           <w:b/>
           <w:bCs/>
         </w:rPr>
-        <w:t>PyMySQL (Yuh et al., 2010):</w:t>
+        <w:t>PyMySQL</w:t>
+      </w:r>
+      <w:proofErr w:type="spellEnd"/>
+      <w:r>
+        <w:rPr>
+          <w:b/>
+          <w:bCs/>
+        </w:rPr>
+        <w:t xml:space="preserve"> (Yuh et al., 2010):</w:t>
       </w:r>
       <w:r>
         <w:t xml:space="preserve"> Controlador (</w:t>
@@ -2764,7 +2523,15 @@
       </w:r>
       <w:proofErr w:type="gramEnd"/>
       <w:r>
-        <w:t>) nativo de Python que permite la conexión y extracción de información directamente desde las bases de datos MariaDB/MySQL de los sistemas SeisComP3 y SeisComP6.</w:t>
+        <w:t xml:space="preserve">) nativo de Python que permite la conexión y extracción de información directamente desde las bases de datos </w:t>
+      </w:r>
+      <w:proofErr w:type="spellStart"/>
+      <w:r>
+        <w:t>MariaDB</w:t>
+      </w:r>
+      <w:proofErr w:type="spellEnd"/>
+      <w:r>
+        <w:t>/MySQL de los sistemas SeisComP3 y SeisComP6.</w:t>
       </w:r>
     </w:p>
     <w:p>
@@ -2775,13 +2542,38 @@
           <w:numId w:val="45"/>
         </w:numPr>
       </w:pPr>
+      <w:proofErr w:type="spellStart"/>
       <w:r>
         <w:rPr>
           <w:b/>
           <w:bCs/>
         </w:rPr>
         <w:lastRenderedPageBreak/>
-        <w:t>Streamlit (Streamlit Inc., 2019):</w:t>
+        <w:t>Streamlit</w:t>
+      </w:r>
+      <w:proofErr w:type="spellEnd"/>
+      <w:r>
+        <w:rPr>
+          <w:b/>
+          <w:bCs/>
+        </w:rPr>
+        <w:t xml:space="preserve"> (</w:t>
+      </w:r>
+      <w:proofErr w:type="spellStart"/>
+      <w:r>
+        <w:rPr>
+          <w:b/>
+          <w:bCs/>
+        </w:rPr>
+        <w:t>Streamlit</w:t>
+      </w:r>
+      <w:proofErr w:type="spellEnd"/>
+      <w:r>
+        <w:rPr>
+          <w:b/>
+          <w:bCs/>
+        </w:rPr>
+        <w:t xml:space="preserve"> Inc., 2019):</w:t>
       </w:r>
       <w:r>
         <w:t xml:space="preserve"> </w:t>
@@ -2796,6 +2588,7 @@
       <w:r>
         <w:t xml:space="preserve"> utilizado para el despliegue del modo </w:t>
       </w:r>
+      <w:proofErr w:type="spellStart"/>
       <w:r>
         <w:rPr>
           <w:i/>
@@ -2803,6 +2596,7 @@
         </w:rPr>
         <w:t>frontend</w:t>
       </w:r>
+      <w:proofErr w:type="spellEnd"/>
       <w:r>
         <w:t xml:space="preserve"> (interfaz gráfica interactiva), permitiendo a los analistas en turno auditar los datos desde el navegador web sin necesidad de ejecutar código de consola.</w:t>
       </w:r>
@@ -2847,6 +2641,7 @@
           <w:color w:val="1F497D" w:themeColor="text2"/>
         </w:rPr>
       </w:pPr>
+      <w:proofErr w:type="spellStart"/>
       <w:r>
         <w:rPr>
           <w:b/>
@@ -2855,9 +2650,9 @@
           <w:iCs/>
           <w:color w:val="1F497D" w:themeColor="text2"/>
         </w:rPr>
-        <w:t>pip install -</w:t>
-      </w:r>
-      <w:proofErr w:type="gramStart"/>
+        <w:t>pip</w:t>
+      </w:r>
+      <w:proofErr w:type="spellEnd"/>
       <w:r>
         <w:rPr>
           <w:b/>
@@ -2866,6 +2661,39 @@
           <w:iCs/>
           <w:color w:val="1F497D" w:themeColor="text2"/>
         </w:rPr>
+        <w:t xml:space="preserve"> </w:t>
+      </w:r>
+      <w:proofErr w:type="spellStart"/>
+      <w:r>
+        <w:rPr>
+          <w:b/>
+          <w:bCs/>
+          <w:i/>
+          <w:iCs/>
+          <w:color w:val="1F497D" w:themeColor="text2"/>
+        </w:rPr>
+        <w:t>install</w:t>
+      </w:r>
+      <w:proofErr w:type="spellEnd"/>
+      <w:r>
+        <w:rPr>
+          <w:b/>
+          <w:bCs/>
+          <w:i/>
+          <w:iCs/>
+          <w:color w:val="1F497D" w:themeColor="text2"/>
+        </w:rPr>
+        <w:t xml:space="preserve"> -</w:t>
+      </w:r>
+      <w:proofErr w:type="gramStart"/>
+      <w:r>
+        <w:rPr>
+          <w:b/>
+          <w:bCs/>
+          <w:i/>
+          <w:iCs/>
+          <w:color w:val="1F497D" w:themeColor="text2"/>
+        </w:rPr>
         <w:t>e .</w:t>
       </w:r>
       <w:proofErr w:type="gramEnd"/>
@@ -2875,7 +2703,15 @@
         <w:ind w:left="360"/>
       </w:pPr>
       <w:r>
-        <w:t>(Nota: El uso del flag -e permite instalar el paquete en modo editable, facilitando futuras actualizaciones del repositorio sin requerir reinstalación).</w:t>
+        <w:t xml:space="preserve">(Nota: El uso del </w:t>
+      </w:r>
+      <w:proofErr w:type="spellStart"/>
+      <w:r>
+        <w:t>flag</w:t>
+      </w:r>
+      <w:proofErr w:type="spellEnd"/>
+      <w:r>
+        <w:t xml:space="preserve"> -e permite instalar el paquete en modo editable, facilitando futuras actualizaciones del repositorio sin requerir reinstalación).</w:t>
       </w:r>
     </w:p>
     <w:p>
@@ -2902,7 +2738,15 @@
         <w:spacing w:after="0"/>
       </w:pPr>
       <w:r>
-        <w:t>Para garantizar la seguridad y la integridad de la infraestructura operativa de SeisComP en la RSNC, SieveComP soporta múltiples formatos para la gestión de conexiones a las bases de datos.</w:t>
+        <w:t xml:space="preserve">Para garantizar la seguridad y la integridad de la infraestructura operativa de SeisComP en la RSNC, </w:t>
+      </w:r>
+      <w:proofErr w:type="spellStart"/>
+      <w:r>
+        <w:t>SieveComP</w:t>
+      </w:r>
+      <w:proofErr w:type="spellEnd"/>
+      <w:r>
+        <w:t xml:space="preserve"> soporta múltiples formatos para la gestión de conexiones a las bases de datos.</w:t>
       </w:r>
     </w:p>
     <w:p>
@@ -2950,7 +2794,15 @@
         <w:t>obligatorio</w:t>
       </w:r>
       <w:r>
-        <w:t xml:space="preserve"> que cualquier credencial proporcionada a SieveComP corresponda a un usuario de base de datos con privilegios estrictamente limitados a </w:t>
+        <w:t xml:space="preserve"> que cualquier credencial proporcionada a </w:t>
+      </w:r>
+      <w:proofErr w:type="spellStart"/>
+      <w:r>
+        <w:t>SieveComP</w:t>
+      </w:r>
+      <w:proofErr w:type="spellEnd"/>
+      <w:r>
+        <w:t xml:space="preserve"> corresponda a un usuario de base de datos con privilegios estrictamente limitados a </w:t>
       </w:r>
       <w:r>
         <w:rPr>
@@ -2960,7 +2812,15 @@
         <w:t>SOLO LECTURA (SELECT)</w:t>
       </w:r>
       <w:r>
-        <w:t>. Restringir los permisos a nivel de motor de base de datos (MySQL/MariaDB) mitiga cualquier riesgo de alteración, inserción (INSERT) o borrado (DELETE) accidental sobre los catálogos en producción.</w:t>
+        <w:t>. Restringir los permisos a nivel de motor de base de datos (MySQL/</w:t>
+      </w:r>
+      <w:proofErr w:type="spellStart"/>
+      <w:r>
+        <w:t>MariaDB</w:t>
+      </w:r>
+      <w:proofErr w:type="spellEnd"/>
+      <w:r>
+        <w:t>) mitiga cualquier riesgo de alteración, inserción (INSERT) o borrado (DELETE) accidental sobre los catálogos en producción.</w:t>
       </w:r>
     </w:p>
     <w:p>
@@ -2998,7 +2858,15 @@
         <w:spacing w:after="0"/>
       </w:pPr>
       <w:r>
-        <w:t>El esquema TOML de SieveComP permite definir la conexión a la base de datos de diversas formas, adaptándose a despliegues simples o a requerimientos de múltiples servidores (ej. servidor principal, respaldo o pruebas).</w:t>
+        <w:t xml:space="preserve">El esquema TOML de </w:t>
+      </w:r>
+      <w:proofErr w:type="spellStart"/>
+      <w:r>
+        <w:t>SieveComP</w:t>
+      </w:r>
+      <w:proofErr w:type="spellEnd"/>
+      <w:r>
+        <w:t xml:space="preserve"> permite definir la conexión a la base de datos de diversas formas, adaptándose a despliegues simples o a requerimientos de múltiples servidores (ej. servidor principal, respaldo o pruebas).</w:t>
       </w:r>
       <w:r>
         <w:t xml:space="preserve"> A continuación, presentaremos las diferentes formas de configurar conexiones a bases de datos de SeisComP.</w:t>
@@ -3044,8 +2912,17 @@
           <w:i/>
           <w:iCs/>
         </w:rPr>
-        <w:t>.env</w:t>
-      </w:r>
+        <w:t>.</w:t>
+      </w:r>
+      <w:proofErr w:type="spellStart"/>
+      <w:r>
+        <w:rPr>
+          <w:i/>
+          <w:iCs/>
+        </w:rPr>
+        <w:t>env</w:t>
+      </w:r>
+      <w:proofErr w:type="spellEnd"/>
       <w:proofErr w:type="gramEnd"/>
       <w:r>
         <w:t xml:space="preserve"> en el directorio de ejecución, manteniendo las credenciales fuera del código. El administrador del sistema o el analista debe crear un archivo de texto plano, el cual contendrá los parámetros de red y autenticación.</w:t>
@@ -3054,7 +2931,15 @@
     <w:p>
       <w:r>
         <w:lastRenderedPageBreak/>
-        <w:t>A continuación, se presenta la estructura estándar requerida para conectar SieveComP a una instancia de SeisComP:</w:t>
+        <w:t xml:space="preserve">A continuación, se presenta la estructura estándar requerida para conectar </w:t>
+      </w:r>
+      <w:proofErr w:type="spellStart"/>
+      <w:r>
+        <w:t>SieveComP</w:t>
+      </w:r>
+      <w:proofErr w:type="spellEnd"/>
+      <w:r>
+        <w:t xml:space="preserve"> a una instancia de SeisComP:</w:t>
       </w:r>
     </w:p>
     <w:p>
@@ -3230,7 +3115,15 @@
         <w:t>SERVER_SC6_PORT</w:t>
       </w:r>
       <w:r>
-        <w:t>: Puerto de conexión al motor de base de datos (por defecto 3306 para MySQL/MariaDB).</w:t>
+        <w:t>: Puerto de conexión al motor de base de datos (por defecto 3306 para MySQL/</w:t>
+      </w:r>
+      <w:proofErr w:type="spellStart"/>
+      <w:r>
+        <w:t>MariaDB</w:t>
+      </w:r>
+      <w:proofErr w:type="spellEnd"/>
+      <w:r>
+        <w:t>).</w:t>
       </w:r>
     </w:p>
     <w:p>
@@ -3248,7 +3141,15 @@
         <w:t>SERVER_SC6_DATABASE</w:t>
       </w:r>
       <w:r>
-        <w:t>: Nombre de la base de datos que contiene el catálogo (comúnmente seiscomp3 o seiscomp).</w:t>
+        <w:t xml:space="preserve">: Nombre de la base de datos que contiene el catálogo (comúnmente seiscomp3 o </w:t>
+      </w:r>
+      <w:proofErr w:type="spellStart"/>
+      <w:r>
+        <w:t>seiscomp</w:t>
+      </w:r>
+      <w:proofErr w:type="spellEnd"/>
+      <w:r>
+        <w:t>).</w:t>
       </w:r>
     </w:p>
     <w:p>
@@ -3278,8 +3179,13 @@
       </w:r>
       <w:proofErr w:type="gramStart"/>
       <w:r>
-        <w:t>archivo .env</w:t>
-      </w:r>
+        <w:t>archivo .</w:t>
+      </w:r>
+      <w:proofErr w:type="spellStart"/>
+      <w:r>
+        <w:t>env</w:t>
+      </w:r>
+      <w:proofErr w:type="spellEnd"/>
       <w:proofErr w:type="gramEnd"/>
       <w:r>
         <w:t xml:space="preserve"> (ej. </w:t>
@@ -3300,7 +3206,15 @@
         <w:t>SERVER_SC3_HOST</w:t>
       </w:r>
       <w:r>
-        <w:t>, etc.). Posteriormente, el archivo de reglas principal (formato TOML) utilizará este prefijo para indicarle a SieveComP a qué servidor específico debe conectarse durante la auditoría.</w:t>
+        <w:t xml:space="preserve">, etc.). Posteriormente, el archivo de reglas principal (formato TOML) utilizará este prefijo para indicarle a </w:t>
+      </w:r>
+      <w:proofErr w:type="spellStart"/>
+      <w:r>
+        <w:t>SieveComP</w:t>
+      </w:r>
+      <w:proofErr w:type="spellEnd"/>
+      <w:r>
+        <w:t xml:space="preserve"> a qué servidor específico debe conectarse durante la auditoría.</w:t>
       </w:r>
     </w:p>
     <w:p>
@@ -3320,20 +3234,248 @@
       <w:bookmarkStart w:id="8" w:name="_heading=h.ifmiayjb9sq3" w:colFirst="0" w:colLast="0"/>
       <w:bookmarkEnd w:id="8"/>
       <w:r>
-        <w:t>LOCALIZACIÓN</w:t>
-      </w:r>
-    </w:p>
-    <w:p>
-      <w:pPr>
-        <w:spacing w:after="0"/>
-      </w:pPr>
-    </w:p>
-    <w:p>
-      <w:pPr>
-        <w:spacing w:after="0"/>
-      </w:pPr>
-      <w:r>
-        <w:t>E</w:t>
+        <w:t>MÚLTIPLES SERVIDORES MEDIANTE PREFIJOS</w:t>
+      </w:r>
+    </w:p>
+    <w:p>
+      <w:pPr>
+        <w:spacing w:after="0"/>
+      </w:pPr>
+    </w:p>
+    <w:p>
+      <w:pPr>
+        <w:spacing w:after="0"/>
+      </w:pPr>
+      <w:r>
+        <w:t xml:space="preserve">Si </w:t>
+      </w:r>
+      <w:r>
+        <w:t>el procedimiento</w:t>
+      </w:r>
+      <w:r>
+        <w:t xml:space="preserve"> requiere extraer datos de múltiples bases de datos simultáneamente (ej. </w:t>
+      </w:r>
+      <w:proofErr w:type="spellStart"/>
+      <w:r>
+        <w:t>transicionar</w:t>
+      </w:r>
+      <w:proofErr w:type="spellEnd"/>
+      <w:r>
+        <w:t xml:space="preserve"> entre SeisComP3 y SeisComP6), se puede usar un único </w:t>
+      </w:r>
+      <w:proofErr w:type="gramStart"/>
+      <w:r>
+        <w:t xml:space="preserve">archivo </w:t>
+      </w:r>
+      <w:r>
+        <w:rPr>
+          <w:rStyle w:val="CodigoCar"/>
+        </w:rPr>
+        <w:t>.</w:t>
+      </w:r>
+      <w:proofErr w:type="spellStart"/>
+      <w:r>
+        <w:rPr>
+          <w:rStyle w:val="CodigoCar"/>
+        </w:rPr>
+        <w:t>env</w:t>
+      </w:r>
+      <w:proofErr w:type="spellEnd"/>
+      <w:proofErr w:type="gramEnd"/>
+      <w:r>
+        <w:t xml:space="preserve"> diferenciando las credenciales mediante prefijos.</w:t>
+      </w:r>
+      <w:r>
+        <w:t xml:space="preserve"> </w:t>
+      </w:r>
+      <w:r>
+        <w:t xml:space="preserve">En el </w:t>
+      </w:r>
+      <w:proofErr w:type="gramStart"/>
+      <w:r>
+        <w:t xml:space="preserve">archivo </w:t>
+      </w:r>
+      <w:r>
+        <w:rPr>
+          <w:rStyle w:val="CodigoCar"/>
+        </w:rPr>
+        <w:t>.</w:t>
+      </w:r>
+      <w:proofErr w:type="spellStart"/>
+      <w:r>
+        <w:rPr>
+          <w:rStyle w:val="CodigoCar"/>
+        </w:rPr>
+        <w:t>env</w:t>
+      </w:r>
+      <w:proofErr w:type="spellEnd"/>
+      <w:proofErr w:type="gramEnd"/>
+      <w:r>
+        <w:t>:</w:t>
+      </w:r>
+    </w:p>
+    <w:p>
+      <w:pPr>
+        <w:spacing w:after="0"/>
+      </w:pPr>
+    </w:p>
+    <w:p>
+      <w:pPr>
+        <w:pStyle w:val="Codigo"/>
+      </w:pPr>
+      <w:r>
+        <w:t># Servidor SeisComP 6</w:t>
+      </w:r>
+    </w:p>
+    <w:p>
+      <w:pPr>
+        <w:pStyle w:val="Codigo"/>
+      </w:pPr>
+      <w:r>
+        <w:t>SC6_HOST=10.100.100.xxx</w:t>
+      </w:r>
+    </w:p>
+    <w:p>
+      <w:pPr>
+        <w:pStyle w:val="Codigo"/>
+      </w:pPr>
+      <w:r>
+        <w:t>SC6_USER=consulta</w:t>
+      </w:r>
+    </w:p>
+    <w:p>
+      <w:pPr>
+        <w:pStyle w:val="Codigo"/>
+        <w:rPr>
+          <w:lang w:val="en-US"/>
+        </w:rPr>
+      </w:pPr>
+      <w:r>
+        <w:rPr>
+          <w:lang w:val="en-US"/>
+        </w:rPr>
+        <w:t>SC6_PASSWORD=</w:t>
+      </w:r>
+      <w:proofErr w:type="spellStart"/>
+      <w:r>
+        <w:rPr>
+          <w:lang w:val="en-US"/>
+        </w:rPr>
+        <w:t>consulta_pwd</w:t>
+      </w:r>
+      <w:proofErr w:type="spellEnd"/>
+    </w:p>
+    <w:p>
+      <w:pPr>
+        <w:pStyle w:val="Codigo"/>
+        <w:rPr>
+          <w:lang w:val="en-US"/>
+        </w:rPr>
+      </w:pPr>
+      <w:r>
+        <w:rPr>
+          <w:lang w:val="en-US"/>
+        </w:rPr>
+        <w:t>SC6_DATABASE=</w:t>
+      </w:r>
+      <w:proofErr w:type="spellStart"/>
+      <w:r>
+        <w:rPr>
+          <w:lang w:val="en-US"/>
+        </w:rPr>
+        <w:t>seiscomp</w:t>
+      </w:r>
+      <w:proofErr w:type="spellEnd"/>
+    </w:p>
+    <w:p>
+      <w:pPr>
+        <w:pStyle w:val="Codigo"/>
+        <w:rPr>
+          <w:lang w:val="en-US"/>
+        </w:rPr>
+      </w:pPr>
+      <w:r>
+        <w:rPr>
+          <w:lang w:val="en-US"/>
+        </w:rPr>
+        <w:t>SC6_PORT=3306</w:t>
+      </w:r>
+    </w:p>
+    <w:p>
+      <w:pPr>
+        <w:pStyle w:val="Codigo"/>
+        <w:rPr>
+          <w:lang w:val="en-US"/>
+        </w:rPr>
+      </w:pPr>
+    </w:p>
+    <w:p>
+      <w:pPr>
+        <w:pStyle w:val="Codigo"/>
+      </w:pPr>
+      <w:r>
+        <w:lastRenderedPageBreak/>
+        <w:t># Servidor SeisComP 3 (Histórico)</w:t>
+      </w:r>
+    </w:p>
+    <w:p>
+      <w:pPr>
+        <w:pStyle w:val="Codigo"/>
+      </w:pPr>
+      <w:r>
+        <w:t>SC3_HOST=10.100.100.yyy</w:t>
+      </w:r>
+    </w:p>
+    <w:p>
+      <w:pPr>
+        <w:pStyle w:val="Codigo"/>
+        <w:rPr>
+          <w:lang w:val="en-US"/>
+        </w:rPr>
+      </w:pPr>
+      <w:r>
+        <w:rPr>
+          <w:lang w:val="en-US"/>
+        </w:rPr>
+        <w:t>SC3_USER=consulta_sc3</w:t>
+      </w:r>
+    </w:p>
+    <w:p>
+      <w:pPr>
+        <w:pStyle w:val="Codigo"/>
+        <w:rPr>
+          <w:lang w:val="en-US"/>
+        </w:rPr>
+      </w:pPr>
+      <w:r>
+        <w:rPr>
+          <w:lang w:val="en-US"/>
+        </w:rPr>
+        <w:t>SC3_PASSWORD=</w:t>
+      </w:r>
+      <w:proofErr w:type="spellStart"/>
+      <w:r>
+        <w:rPr>
+          <w:lang w:val="en-US"/>
+        </w:rPr>
+        <w:t>consulta_pwd</w:t>
+      </w:r>
+      <w:proofErr w:type="spellEnd"/>
+    </w:p>
+    <w:p>
+      <w:pPr>
+        <w:pStyle w:val="Codigo"/>
+      </w:pPr>
+      <w:r>
+        <w:t>SC3_DATABASE=seiscomp3</w:t>
+      </w:r>
+    </w:p>
+    <w:p>
+      <w:pPr>
+        <w:pStyle w:val="Codigo"/>
+      </w:pPr>
+      <w:r>
+        <w:t>SC3_PORT=3306</w:t>
       </w:r>
     </w:p>
     <w:p>
@@ -3352,7 +3494,7 @@
       <w:bookmarkStart w:id="9" w:name="_heading=h.dzqh497dtdcd" w:colFirst="0" w:colLast="0"/>
       <w:bookmarkEnd w:id="9"/>
       <w:r>
-        <w:t>GRÁFICAS</w:t>
+        <w:t>VARIABLES DE ENTORNO DEL SISTEMA OPERATIVO</w:t>
       </w:r>
     </w:p>
     <w:p>
@@ -3365,12 +3507,129 @@
         <w:spacing w:after="0"/>
         <w:rPr>
           <w:color w:val="000000"/>
-          <w:sz w:val="18"/>
-          <w:szCs w:val="18"/>
-        </w:rPr>
-      </w:pPr>
-      <w:r>
-        <w:t xml:space="preserve">La </w:t>
+        </w:rPr>
+      </w:pPr>
+      <w:r>
+        <w:rPr>
+          <w:color w:val="000000"/>
+        </w:rPr>
+        <w:t xml:space="preserve">Para despliegues automatizados (ej. contenedores Docker, tareas </w:t>
+      </w:r>
+      <w:r>
+        <w:rPr>
+          <w:i/>
+          <w:iCs/>
+          <w:color w:val="000000"/>
+        </w:rPr>
+        <w:t>cron</w:t>
+      </w:r>
+      <w:r>
+        <w:rPr>
+          <w:color w:val="000000"/>
+        </w:rPr>
+        <w:t xml:space="preserve"> o servicios </w:t>
+      </w:r>
+      <w:proofErr w:type="spellStart"/>
+      <w:r>
+        <w:rPr>
+          <w:i/>
+          <w:iCs/>
+          <w:color w:val="000000"/>
+        </w:rPr>
+        <w:t>systemd</w:t>
+      </w:r>
+      <w:proofErr w:type="spellEnd"/>
+      <w:r>
+        <w:rPr>
+          <w:color w:val="000000"/>
+        </w:rPr>
+        <w:t xml:space="preserve">), </w:t>
+      </w:r>
+      <w:proofErr w:type="spellStart"/>
+      <w:r>
+        <w:rPr>
+          <w:color w:val="000000"/>
+        </w:rPr>
+        <w:t>SieveComP</w:t>
+      </w:r>
+      <w:proofErr w:type="spellEnd"/>
+      <w:r>
+        <w:rPr>
+          <w:color w:val="000000"/>
+        </w:rPr>
+        <w:t xml:space="preserve"> puede leer directamente las variables de entorno del sistema exportadas en la terminal, utilizando la misma lógica de prefijos sin necesidad de un archivo </w:t>
+      </w:r>
+      <w:proofErr w:type="gramStart"/>
+      <w:r>
+        <w:rPr>
+          <w:color w:val="000000"/>
+        </w:rPr>
+        <w:t xml:space="preserve">físico </w:t>
+      </w:r>
+      <w:r>
+        <w:rPr>
+          <w:rStyle w:val="CodigoCar"/>
+        </w:rPr>
+        <w:t>.</w:t>
+      </w:r>
+      <w:proofErr w:type="spellStart"/>
+      <w:r>
+        <w:rPr>
+          <w:rStyle w:val="CodigoCar"/>
+        </w:rPr>
+        <w:t>env</w:t>
+      </w:r>
+      <w:proofErr w:type="spellEnd"/>
+      <w:proofErr w:type="gramEnd"/>
+      <w:r>
+        <w:rPr>
+          <w:color w:val="000000"/>
+        </w:rPr>
+        <w:t>:</w:t>
+      </w:r>
+    </w:p>
+    <w:p>
+      <w:pPr>
+        <w:spacing w:after="0"/>
+        <w:rPr>
+          <w:color w:val="000000"/>
+        </w:rPr>
+      </w:pPr>
+    </w:p>
+    <w:p>
+      <w:pPr>
+        <w:pStyle w:val="Codigo"/>
+        <w:rPr>
+          <w:lang w:val="en-US"/>
+        </w:rPr>
+      </w:pPr>
+      <w:r>
+        <w:rPr>
+          <w:lang w:val="en-US"/>
+        </w:rPr>
+        <w:t>export SERVERSC6_HOST="10.100.100.xxx"</w:t>
+      </w:r>
+    </w:p>
+    <w:p>
+      <w:pPr>
+        <w:pStyle w:val="Codigo"/>
+        <w:rPr>
+          <w:lang w:val="en-US"/>
+        </w:rPr>
+      </w:pPr>
+      <w:r>
+        <w:rPr>
+          <w:lang w:val="en-US"/>
+        </w:rPr>
+        <w:t>export SERVERSC6_USER="consulta"</w:t>
+      </w:r>
+    </w:p>
+    <w:p>
+      <w:pPr>
+        <w:pStyle w:val="Codigo"/>
+      </w:pPr>
+      <w:r>
+        <w:t># ... (resto de credenciales)</w:t>
       </w:r>
     </w:p>
     <w:p>
@@ -3390,7 +3649,7 @@
       <w:bookmarkStart w:id="10" w:name="_heading=h.afqcp6j0g50q" w:colFirst="0" w:colLast="0"/>
       <w:bookmarkEnd w:id="10"/>
       <w:r>
-        <w:t>TABLA DE ARRIBOS SÍSMICOS</w:t>
+        <w:t>DECLARACIÓN INTERNA EN EL ARCHIVO TOML</w:t>
       </w:r>
     </w:p>
     <w:p>
@@ -3401,19 +3660,303 @@
     <w:p>
       <w:pPr>
         <w:spacing w:after="0" w:line="288" w:lineRule="auto"/>
-        <w:rPr>
-          <w:sz w:val="20"/>
-          <w:szCs w:val="20"/>
-        </w:rPr>
-      </w:pPr>
-      <w:r>
-        <w:t xml:space="preserve">La </w:t>
-      </w:r>
-    </w:p>
-    <w:p>
-      <w:pPr>
-        <w:spacing w:after="0"/>
-      </w:pPr>
+      </w:pPr>
+      <w:proofErr w:type="spellStart"/>
+      <w:r>
+        <w:t>SieveComP</w:t>
+      </w:r>
+      <w:proofErr w:type="spellEnd"/>
+      <w:r>
+        <w:t xml:space="preserve"> permite escribir las credenciales directamente en el bloque </w:t>
+      </w:r>
+      <w:r>
+        <w:rPr>
+          <w:rStyle w:val="CodigoCar"/>
+          <w:sz w:val="24"/>
+          <w:szCs w:val="24"/>
+        </w:rPr>
+        <w:t>[[</w:t>
+      </w:r>
+      <w:proofErr w:type="spellStart"/>
+      <w:r>
+        <w:rPr>
+          <w:rStyle w:val="CodigoCar"/>
+          <w:sz w:val="24"/>
+          <w:szCs w:val="24"/>
+        </w:rPr>
+        <w:t>database</w:t>
+      </w:r>
+      <w:proofErr w:type="spellEnd"/>
+      <w:r>
+        <w:rPr>
+          <w:rStyle w:val="CodigoCar"/>
+          <w:sz w:val="24"/>
+          <w:szCs w:val="24"/>
+        </w:rPr>
+        <w:t>]]</w:t>
+      </w:r>
+      <w:r>
+        <w:t xml:space="preserve"> del archivo </w:t>
+      </w:r>
+      <w:r>
+        <w:rPr>
+          <w:i/>
+          <w:iCs/>
+        </w:rPr>
+        <w:t>TOML</w:t>
+      </w:r>
+      <w:r>
+        <w:t xml:space="preserve">. Sin embargo, </w:t>
+      </w:r>
+      <w:r>
+        <w:rPr>
+          <w:b/>
+          <w:bCs/>
+        </w:rPr>
+        <w:t>por políticas de seguridad del SGC, esta práctica está desaconsejada</w:t>
+      </w:r>
+      <w:r>
+        <w:t>, ya que expone contraseñas en archivos de texto plano que pueden ser compartidos o subidos a repositorios institucionales.</w:t>
+      </w:r>
+    </w:p>
+    <w:p>
+      <w:pPr>
+        <w:spacing w:after="0" w:line="288" w:lineRule="auto"/>
+      </w:pPr>
+    </w:p>
+    <w:p>
+      <w:pPr>
+        <w:pStyle w:val="Codigo"/>
+      </w:pPr>
+      <w:r>
+        <w:t># NO RECOMENDADO EN PRODUCCIÓN</w:t>
+      </w:r>
+    </w:p>
+    <w:p>
+      <w:pPr>
+        <w:pStyle w:val="Codigo"/>
+      </w:pPr>
+      <w:r>
+        <w:t>[[</w:t>
+      </w:r>
+      <w:proofErr w:type="spellStart"/>
+      <w:r>
+        <w:t>database</w:t>
+      </w:r>
+      <w:proofErr w:type="spellEnd"/>
+      <w:r>
+        <w:t>]]</w:t>
+      </w:r>
+    </w:p>
+    <w:p>
+      <w:pPr>
+        <w:pStyle w:val="Codigo"/>
+        <w:rPr>
+          <w:lang w:val="en-US"/>
+        </w:rPr>
+      </w:pPr>
+      <w:r>
+        <w:rPr>
+          <w:lang w:val="en-US"/>
+        </w:rPr>
+        <w:t>name = "</w:t>
+      </w:r>
+      <w:proofErr w:type="spellStart"/>
+      <w:r>
+        <w:rPr>
+          <w:lang w:val="en-US"/>
+        </w:rPr>
+        <w:t>Local_Test</w:t>
+      </w:r>
+      <w:proofErr w:type="spellEnd"/>
+      <w:r>
+        <w:rPr>
+          <w:lang w:val="en-US"/>
+        </w:rPr>
+        <w:t>"</w:t>
+      </w:r>
+    </w:p>
+    <w:p>
+      <w:pPr>
+        <w:pStyle w:val="Codigo"/>
+        <w:rPr>
+          <w:lang w:val="en-US"/>
+        </w:rPr>
+      </w:pPr>
+      <w:r>
+        <w:rPr>
+          <w:lang w:val="en-US"/>
+        </w:rPr>
+        <w:t>host = "localhost"</w:t>
+      </w:r>
+    </w:p>
+    <w:p>
+      <w:pPr>
+        <w:pStyle w:val="Codigo"/>
+      </w:pPr>
+      <w:proofErr w:type="spellStart"/>
+      <w:r>
+        <w:t>user</w:t>
+      </w:r>
+      <w:proofErr w:type="spellEnd"/>
+      <w:r>
+        <w:t xml:space="preserve"> = "consulta"</w:t>
+      </w:r>
+    </w:p>
+    <w:p>
+      <w:pPr>
+        <w:pStyle w:val="Codigo"/>
+      </w:pPr>
+      <w:proofErr w:type="spellStart"/>
+      <w:r>
+        <w:t>password</w:t>
+      </w:r>
+      <w:proofErr w:type="spellEnd"/>
+      <w:r>
+        <w:t xml:space="preserve"> = "</w:t>
+      </w:r>
+      <w:proofErr w:type="spellStart"/>
+      <w:r>
+        <w:t>pwd</w:t>
+      </w:r>
+      <w:proofErr w:type="spellEnd"/>
+      <w:r>
+        <w:t>"</w:t>
+      </w:r>
+    </w:p>
+    <w:p>
+      <w:pPr>
+        <w:pStyle w:val="Codigo"/>
+      </w:pPr>
+      <w:proofErr w:type="spellStart"/>
+      <w:r>
+        <w:t>database</w:t>
+      </w:r>
+      <w:proofErr w:type="spellEnd"/>
+      <w:r>
+        <w:t xml:space="preserve"> = "</w:t>
+      </w:r>
+      <w:proofErr w:type="spellStart"/>
+      <w:r>
+        <w:t>seiscomp</w:t>
+      </w:r>
+      <w:proofErr w:type="spellEnd"/>
+      <w:r>
+        <w:t>"</w:t>
+      </w:r>
+    </w:p>
+    <w:p>
+      <w:pPr>
+        <w:pStyle w:val="Codigo"/>
+      </w:pPr>
+      <w:proofErr w:type="spellStart"/>
+      <w:r>
+        <w:t>port</w:t>
+      </w:r>
+      <w:proofErr w:type="spellEnd"/>
+      <w:r>
+        <w:t xml:space="preserve"> = 3306</w:t>
+      </w:r>
+    </w:p>
+    <w:p>
+      <w:pPr>
+        <w:spacing w:after="0"/>
+      </w:pPr>
+    </w:p>
+    <w:p>
+      <w:pPr>
+        <w:spacing w:after="0"/>
+      </w:pPr>
+    </w:p>
+    <w:p>
+      <w:pPr>
+        <w:spacing w:after="0"/>
+      </w:pPr>
+    </w:p>
+    <w:p>
+      <w:pPr>
+        <w:spacing w:after="0"/>
+      </w:pPr>
+    </w:p>
+    <w:p>
+      <w:pPr>
+        <w:spacing w:after="0"/>
+      </w:pPr>
+    </w:p>
+    <w:p>
+      <w:pPr>
+        <w:pStyle w:val="Ttulo1"/>
+        <w:numPr>
+          <w:ilvl w:val="0"/>
+          <w:numId w:val="13"/>
+        </w:numPr>
+      </w:pPr>
+      <w:bookmarkStart w:id="11" w:name="_heading=h.10rk36impnk7" w:colFirst="0" w:colLast="0"/>
+      <w:bookmarkEnd w:id="11"/>
+      <w:r>
+        <w:lastRenderedPageBreak/>
+        <w:t>CONFIGURACIÓN DE REGLAS (ARCHIVO TOML)</w:t>
+      </w:r>
+    </w:p>
+    <w:p>
+      <w:pPr>
+        <w:spacing w:after="0"/>
+      </w:pPr>
+    </w:p>
+    <w:p>
+      <w:pPr>
+        <w:spacing w:after="0"/>
+      </w:pPr>
+      <w:bookmarkStart w:id="12" w:name="_heading=h.34dwzsi3mg22" w:colFirst="0" w:colLast="0"/>
+      <w:bookmarkEnd w:id="12"/>
+      <w:r>
+        <w:t>La ejecución central</w:t>
+      </w:r>
+      <w:r>
+        <w:t xml:space="preserve"> de </w:t>
+      </w:r>
+      <w:proofErr w:type="spellStart"/>
+      <w:r>
+        <w:t>SieveComP</w:t>
+      </w:r>
+      <w:proofErr w:type="spellEnd"/>
+      <w:r>
+        <w:t xml:space="preserve"> </w:t>
+      </w:r>
+      <w:r>
+        <w:t>se basa en</w:t>
+      </w:r>
+      <w:r>
+        <w:t xml:space="preserve"> su sistema de configuración declarativa en archivos TOML. Este formato permite que los sismólogos definan reglas de validación y control de calidad en un lenguaje estructurado y legible, sin requerir conocimientos profundos de programación en Python.</w:t>
+      </w:r>
+    </w:p>
+    <w:p>
+      <w:pPr>
+        <w:spacing w:after="0"/>
+      </w:pPr>
+    </w:p>
+    <w:p>
+      <w:pPr>
+        <w:spacing w:after="0"/>
+      </w:pPr>
+      <w:r>
+        <w:t>A continuación, se describen las subsecciones principales que conforman el archivo de configuración.</w:t>
+      </w:r>
+    </w:p>
+    <w:p>
+      <w:pPr>
+        <w:pStyle w:val="Ttulo2"/>
+        <w:numPr>
+          <w:ilvl w:val="1"/>
+          <w:numId w:val="13"/>
+        </w:numPr>
+      </w:pPr>
+      <w:r>
+        <w:t>M</w:t>
+      </w:r>
+      <w:r>
+        <w:t>APEO DE CAMPOS Y CONSULTAS SQL</w:t>
+      </w:r>
     </w:p>
     <w:p>
       <w:pPr>
@@ -3423,244 +3966,842 @@
           <w:numId w:val="13"/>
         </w:numPr>
       </w:pPr>
-      <w:bookmarkStart w:id="11" w:name="bookmark=id.sepc1857vhnu" w:colFirst="0" w:colLast="0"/>
-      <w:bookmarkStart w:id="12" w:name="_heading=h.upii45vx2ovc" w:colFirst="0" w:colLast="0"/>
-      <w:bookmarkEnd w:id="11"/>
-      <w:bookmarkEnd w:id="12"/>
-      <w:r>
-        <w:lastRenderedPageBreak/>
-        <w:t>BARRA DE HERRAMIENTAS DE LOCALIZACIÓN</w:t>
-      </w:r>
-    </w:p>
-    <w:p>
-      <w:pPr>
-        <w:spacing w:after="0"/>
-      </w:pPr>
-    </w:p>
-    <w:p>
-      <w:pPr>
-        <w:spacing w:after="0"/>
-      </w:pPr>
-      <w:r>
-        <w:t xml:space="preserve">3 </w:t>
-      </w:r>
-    </w:p>
-    <w:p>
-      <w:pPr>
-        <w:pStyle w:val="Ttulo4"/>
+      <w:bookmarkStart w:id="13" w:name="_heading=h.wewcnrvrahv9" w:colFirst="0" w:colLast="0"/>
+      <w:bookmarkStart w:id="14" w:name="_heading=h.qyqi6q9pzbrf" w:colFirst="0" w:colLast="0"/>
+      <w:bookmarkEnd w:id="13"/>
+      <w:bookmarkEnd w:id="14"/>
+      <w:r>
+        <w:t>CONFIGURACIÓN DE METADATOS (SETTINGS)</w:t>
+      </w:r>
+    </w:p>
+    <w:p>
+      <w:pPr>
+        <w:spacing w:after="0"/>
+      </w:pPr>
+    </w:p>
+    <w:p>
+      <w:pPr>
+        <w:spacing w:after="0"/>
+      </w:pPr>
+      <w:r>
+        <w:t xml:space="preserve">El bloque </w:t>
+      </w:r>
+      <w:r>
+        <w:rPr>
+          <w:rStyle w:val="CodigoCar"/>
+        </w:rPr>
+        <w:t>[</w:t>
+      </w:r>
+      <w:proofErr w:type="spellStart"/>
+      <w:r>
+        <w:rPr>
+          <w:rStyle w:val="CodigoCar"/>
+        </w:rPr>
+        <w:t>settings</w:t>
+      </w:r>
+      <w:proofErr w:type="spellEnd"/>
+      <w:r>
+        <w:rPr>
+          <w:rStyle w:val="CodigoCar"/>
+        </w:rPr>
+        <w:t>]</w:t>
+      </w:r>
+      <w:r>
+        <w:t xml:space="preserve"> </w:t>
+      </w:r>
+      <w:r>
+        <w:t xml:space="preserve">es opcional y permite </w:t>
+      </w:r>
+      <w:r>
+        <w:t>sobrescribir</w:t>
+      </w:r>
+      <w:r>
+        <w:t xml:space="preserve"> los nombres de las columnas que la base de datos retorna por defecto. Es útil si el catálogo utiliza alias diferentes para clasificar los eventos, los tiempos o la información del autor.</w:t>
+      </w:r>
+    </w:p>
+    <w:p>
+      <w:pPr>
+        <w:spacing w:after="0"/>
+      </w:pPr>
+    </w:p>
+    <w:p>
+      <w:pPr>
+        <w:pStyle w:val="Codigo"/>
+        <w:rPr>
+          <w:lang w:val="en-US"/>
+        </w:rPr>
+      </w:pPr>
+      <w:r>
+        <w:rPr>
+          <w:lang w:val="en-US"/>
+        </w:rPr>
+        <w:t>[settings]</w:t>
+      </w:r>
+    </w:p>
+    <w:p>
+      <w:pPr>
+        <w:pStyle w:val="Codigo"/>
+        <w:rPr>
+          <w:lang w:val="en-US"/>
+        </w:rPr>
+      </w:pPr>
+      <w:proofErr w:type="spellStart"/>
+      <w:r>
+        <w:rPr>
+          <w:lang w:val="en-US"/>
+        </w:rPr>
+        <w:t>event_type_column</w:t>
+      </w:r>
+      <w:proofErr w:type="spellEnd"/>
+      <w:r>
+        <w:rPr>
+          <w:lang w:val="en-US"/>
+        </w:rPr>
+        <w:t xml:space="preserve"> = "</w:t>
+      </w:r>
+      <w:proofErr w:type="spellStart"/>
+      <w:r>
+        <w:rPr>
+          <w:lang w:val="en-US"/>
+        </w:rPr>
+        <w:t>event_type</w:t>
+      </w:r>
+      <w:proofErr w:type="spellEnd"/>
+      <w:r>
+        <w:rPr>
+          <w:lang w:val="en-US"/>
+        </w:rPr>
+        <w:t>"</w:t>
+      </w:r>
+    </w:p>
+    <w:p>
+      <w:pPr>
+        <w:pStyle w:val="Codigo"/>
+        <w:rPr>
+          <w:lang w:val="en-US"/>
+        </w:rPr>
+      </w:pPr>
+      <w:proofErr w:type="spellStart"/>
+      <w:r>
+        <w:rPr>
+          <w:lang w:val="en-US"/>
+        </w:rPr>
+        <w:t>time_column</w:t>
+      </w:r>
+      <w:proofErr w:type="spellEnd"/>
+      <w:r>
+        <w:rPr>
+          <w:lang w:val="en-US"/>
+        </w:rPr>
+        <w:t xml:space="preserve">       = "</w:t>
+      </w:r>
+      <w:proofErr w:type="spellStart"/>
+      <w:r>
+        <w:rPr>
+          <w:lang w:val="en-US"/>
+        </w:rPr>
+        <w:t>time_value</w:t>
+      </w:r>
+      <w:proofErr w:type="spellEnd"/>
+      <w:r>
+        <w:rPr>
+          <w:lang w:val="en-US"/>
+        </w:rPr>
+        <w:t>"</w:t>
+      </w:r>
+    </w:p>
+    <w:p>
+      <w:pPr>
+        <w:pStyle w:val="Codigo"/>
+        <w:rPr>
+          <w:lang w:val="en-US"/>
+        </w:rPr>
+      </w:pPr>
+      <w:proofErr w:type="spellStart"/>
+      <w:r>
+        <w:rPr>
+          <w:lang w:val="en-US"/>
+        </w:rPr>
+        <w:t>author_column</w:t>
+      </w:r>
+      <w:proofErr w:type="spellEnd"/>
+      <w:r>
+        <w:rPr>
+          <w:lang w:val="en-US"/>
+        </w:rPr>
+        <w:t xml:space="preserve">     = "</w:t>
+      </w:r>
+      <w:proofErr w:type="spellStart"/>
+      <w:r>
+        <w:rPr>
+          <w:lang w:val="en-US"/>
+        </w:rPr>
+        <w:t>creationInfo_author</w:t>
+      </w:r>
+      <w:proofErr w:type="spellEnd"/>
+      <w:r>
+        <w:rPr>
+          <w:lang w:val="en-US"/>
+        </w:rPr>
+        <w:t>"</w:t>
+      </w:r>
+    </w:p>
+    <w:p>
+      <w:pPr>
+        <w:spacing w:after="0"/>
+        <w:rPr>
+          <w:lang w:val="en-US"/>
+        </w:rPr>
+      </w:pPr>
+    </w:p>
+    <w:p>
+      <w:pPr>
+        <w:pStyle w:val="Prrafodelista"/>
         <w:numPr>
-          <w:ilvl w:val="3"/>
+          <w:ilvl w:val="0"/>
+          <w:numId w:val="45"/>
+        </w:numPr>
+        <w:spacing w:after="0"/>
+      </w:pPr>
+      <w:proofErr w:type="spellStart"/>
+      <w:r>
+        <w:rPr>
+          <w:rStyle w:val="CodigoCar"/>
+        </w:rPr>
+        <w:t>event_type_column</w:t>
+      </w:r>
+      <w:proofErr w:type="spellEnd"/>
+      <w:r>
+        <w:t xml:space="preserve">: Identifica la columna que contiene la clasificación del evento (ej. </w:t>
+      </w:r>
+      <w:r>
+        <w:t>“</w:t>
+      </w:r>
+      <w:proofErr w:type="spellStart"/>
+      <w:r>
+        <w:t>earthquake</w:t>
+      </w:r>
+      <w:proofErr w:type="spellEnd"/>
+      <w:r>
+        <w:t>”</w:t>
+      </w:r>
+      <w:r>
+        <w:t xml:space="preserve">, </w:t>
+      </w:r>
+      <w:r>
+        <w:t>“</w:t>
+      </w:r>
+      <w:proofErr w:type="spellStart"/>
+      <w:r>
+        <w:t>not</w:t>
+      </w:r>
+      <w:proofErr w:type="spellEnd"/>
+      <w:r>
+        <w:t xml:space="preserve"> </w:t>
+      </w:r>
+      <w:proofErr w:type="spellStart"/>
+      <w:r>
+        <w:t>locatable</w:t>
+      </w:r>
+      <w:proofErr w:type="spellEnd"/>
+      <w:r>
+        <w:t>”</w:t>
+      </w:r>
+      <w:r>
+        <w:t>). Se usa para filtrar y agrupar eventos en las reglas.</w:t>
+      </w:r>
+    </w:p>
+    <w:p>
+      <w:pPr>
+        <w:pStyle w:val="Prrafodelista"/>
+        <w:numPr>
+          <w:ilvl w:val="0"/>
+          <w:numId w:val="45"/>
+        </w:numPr>
+        <w:spacing w:after="0"/>
+      </w:pPr>
+      <w:proofErr w:type="spellStart"/>
+      <w:r>
+        <w:rPr>
+          <w:rStyle w:val="CodigoCar"/>
+        </w:rPr>
+        <w:t>time_column</w:t>
+      </w:r>
+      <w:proofErr w:type="spellEnd"/>
+      <w:r>
+        <w:t>: Identifica la columna con los tiempos de origen. Fundamental para ordenar los datos y aplicar búsquedas de duplicados temporales.</w:t>
+      </w:r>
+    </w:p>
+    <w:p>
+      <w:pPr>
+        <w:pStyle w:val="Prrafodelista"/>
+        <w:numPr>
+          <w:ilvl w:val="0"/>
+          <w:numId w:val="45"/>
+        </w:numPr>
+        <w:spacing w:after="0"/>
+      </w:pPr>
+      <w:proofErr w:type="spellStart"/>
+      <w:r>
+        <w:rPr>
+          <w:rStyle w:val="CodigoCar"/>
+        </w:rPr>
+        <w:t>author_column</w:t>
+      </w:r>
+      <w:proofErr w:type="spellEnd"/>
+      <w:r>
+        <w:t>: Identifica la columna con la información del autor o fuente de procesamiento, útil para excluir eventos automáticos y enfocar la revisión en aquellos revisados manualmente.</w:t>
+      </w:r>
+    </w:p>
+    <w:p>
+      <w:pPr>
+        <w:spacing w:after="0"/>
+      </w:pPr>
+    </w:p>
+    <w:p>
+      <w:pPr>
+        <w:pStyle w:val="Ttulo3"/>
+        <w:numPr>
+          <w:ilvl w:val="2"/>
           <w:numId w:val="13"/>
         </w:numPr>
       </w:pPr>
-      <w:bookmarkStart w:id="13" w:name="_heading=h.jtmxxy2er7qf" w:colFirst="0" w:colLast="0"/>
-      <w:bookmarkEnd w:id="13"/>
-      <w:r>
-        <w:t>LOCALIZADOR</w:t>
-      </w:r>
-    </w:p>
-    <w:p>
-      <w:pPr>
-        <w:spacing w:after="0"/>
-      </w:pPr>
-      <w:r>
-        <w:rPr>
-          <w:b/>
-          <w:bCs/>
-        </w:rPr>
-        <w:t>F</w:t>
-      </w:r>
-    </w:p>
-    <w:p>
-      <w:bookmarkStart w:id="14" w:name="_heading=h.ts3iz02ve5x3" w:colFirst="0" w:colLast="0"/>
-      <w:bookmarkEnd w:id="14"/>
-    </w:p>
-    <w:p>
-      <w:pPr>
-        <w:pStyle w:val="Ttulo4"/>
+      <w:bookmarkStart w:id="15" w:name="_heading=h.wp0p73jnsasv" w:colFirst="0" w:colLast="0"/>
+      <w:bookmarkEnd w:id="15"/>
+      <w:r>
+        <w:t>DEFINICIÓN DE CONEXIONES A LA BASE DE DATOS (DATABASE)</w:t>
+      </w:r>
+      <w:r>
+        <w:t xml:space="preserve"> </w:t>
+      </w:r>
+    </w:p>
+    <w:p>
+      <w:pPr>
+        <w:spacing w:after="0"/>
+      </w:pPr>
+    </w:p>
+    <w:p>
+      <w:pPr>
+        <w:spacing w:after="0"/>
+      </w:pPr>
+      <w:r>
+        <w:t xml:space="preserve">Bloque encargado de enlazar </w:t>
+      </w:r>
+      <w:proofErr w:type="spellStart"/>
+      <w:r>
+        <w:t>SieveComP</w:t>
+      </w:r>
+      <w:proofErr w:type="spellEnd"/>
+      <w:r>
+        <w:t xml:space="preserve"> con las credenciales seguras (ver </w:t>
+      </w:r>
+      <w:r>
+        <w:t xml:space="preserve">sección </w:t>
+      </w:r>
+      <w:r>
+        <w:t xml:space="preserve">5.2). Para proteger la infraestructura del SGC, no se escriben las contraseñas directamente, sino que se referencia el </w:t>
+      </w:r>
+      <w:proofErr w:type="gramStart"/>
+      <w:r>
+        <w:t xml:space="preserve">archivo </w:t>
+      </w:r>
+      <w:r>
+        <w:rPr>
+          <w:rStyle w:val="CodigoCar"/>
+        </w:rPr>
+        <w:t>.</w:t>
+      </w:r>
+      <w:proofErr w:type="spellStart"/>
+      <w:r>
+        <w:rPr>
+          <w:rStyle w:val="CodigoCar"/>
+        </w:rPr>
+        <w:t>env</w:t>
+      </w:r>
+      <w:proofErr w:type="spellEnd"/>
+      <w:proofErr w:type="gramEnd"/>
+      <w:r>
+        <w:t>:</w:t>
+      </w:r>
+    </w:p>
+    <w:p>
+      <w:pPr>
+        <w:spacing w:after="0"/>
+      </w:pPr>
+    </w:p>
+    <w:p>
+      <w:pPr>
+        <w:pStyle w:val="Codigo"/>
+        <w:rPr>
+          <w:lang w:val="en-US"/>
+        </w:rPr>
+      </w:pPr>
+      <w:r>
+        <w:rPr>
+          <w:lang w:val="en-US"/>
+        </w:rPr>
+        <w:t>[[database]]</w:t>
+      </w:r>
+    </w:p>
+    <w:p>
+      <w:pPr>
+        <w:pStyle w:val="Codigo"/>
+        <w:rPr>
+          <w:lang w:val="en-US"/>
+        </w:rPr>
+      </w:pPr>
+      <w:r>
+        <w:rPr>
+          <w:lang w:val="en-US"/>
+        </w:rPr>
+        <w:t>name       = "Conexion_SC6"</w:t>
+      </w:r>
+    </w:p>
+    <w:p>
+      <w:pPr>
+        <w:pStyle w:val="Codigo"/>
+        <w:rPr>
+          <w:lang w:val="en-US"/>
+        </w:rPr>
+      </w:pPr>
+      <w:proofErr w:type="spellStart"/>
+      <w:r>
+        <w:rPr>
+          <w:lang w:val="en-US"/>
+        </w:rPr>
+        <w:lastRenderedPageBreak/>
+        <w:t>env_file</w:t>
+      </w:r>
+      <w:proofErr w:type="spellEnd"/>
+      <w:r>
+        <w:rPr>
+          <w:lang w:val="en-US"/>
+        </w:rPr>
+        <w:t xml:space="preserve">   = "credentials</w:t>
+      </w:r>
+      <w:proofErr w:type="gramStart"/>
+      <w:r>
+        <w:rPr>
+          <w:lang w:val="en-US"/>
+        </w:rPr>
+        <w:t>/.env</w:t>
+      </w:r>
+      <w:proofErr w:type="gramEnd"/>
+      <w:r>
+        <w:rPr>
+          <w:lang w:val="en-US"/>
+        </w:rPr>
+        <w:t>"</w:t>
+      </w:r>
+    </w:p>
+    <w:p>
+      <w:pPr>
+        <w:pStyle w:val="Codigo"/>
+      </w:pPr>
+      <w:proofErr w:type="spellStart"/>
+      <w:r>
+        <w:t>env_prefix</w:t>
+      </w:r>
+      <w:proofErr w:type="spellEnd"/>
+      <w:r>
+        <w:t xml:space="preserve"> = "SERVER_SC6_"</w:t>
+      </w:r>
+    </w:p>
+    <w:p>
+      <w:pPr>
+        <w:spacing w:after="0"/>
+      </w:pPr>
+    </w:p>
+    <w:p>
+      <w:pPr>
+        <w:spacing w:after="0"/>
+      </w:pPr>
+      <w:r>
+        <w:t>En donde:</w:t>
+      </w:r>
+    </w:p>
+    <w:p>
+      <w:pPr>
+        <w:pStyle w:val="Prrafodelista"/>
         <w:numPr>
-          <w:ilvl w:val="3"/>
+          <w:ilvl w:val="0"/>
+          <w:numId w:val="45"/>
+        </w:numPr>
+        <w:spacing w:after="0"/>
+      </w:pPr>
+      <w:proofErr w:type="spellStart"/>
+      <w:r>
+        <w:rPr>
+          <w:rStyle w:val="CodigoCar"/>
+        </w:rPr>
+        <w:t>name</w:t>
+      </w:r>
+      <w:proofErr w:type="spellEnd"/>
+      <w:r>
+        <w:t>: Etiqueta identificadora de la conexión. Es obligatoria si se configuran múltiples bases de datos, ya que será referenciada por las consultas SQL.</w:t>
+      </w:r>
+    </w:p>
+    <w:p>
+      <w:pPr>
+        <w:pStyle w:val="Prrafodelista"/>
+        <w:numPr>
+          <w:ilvl w:val="0"/>
+          <w:numId w:val="45"/>
+        </w:numPr>
+        <w:spacing w:after="0"/>
+      </w:pPr>
+      <w:proofErr w:type="spellStart"/>
+      <w:r>
+        <w:rPr>
+          <w:rStyle w:val="CodigoCar"/>
+        </w:rPr>
+        <w:t>env_file</w:t>
+      </w:r>
+      <w:proofErr w:type="spellEnd"/>
+      <w:r>
+        <w:t xml:space="preserve">: Ruta (relativa o absoluta) hacia el archivo </w:t>
+      </w:r>
+      <w:proofErr w:type="gramStart"/>
+      <w:r>
+        <w:t>oculto .</w:t>
+      </w:r>
+      <w:proofErr w:type="spellStart"/>
+      <w:r>
+        <w:t>env</w:t>
+      </w:r>
+      <w:proofErr w:type="spellEnd"/>
+      <w:proofErr w:type="gramEnd"/>
+      <w:r>
+        <w:t xml:space="preserve"> donde residen las credenciales.</w:t>
+      </w:r>
+    </w:p>
+    <w:p>
+      <w:pPr>
+        <w:pStyle w:val="Prrafodelista"/>
+        <w:numPr>
+          <w:ilvl w:val="0"/>
+          <w:numId w:val="45"/>
+        </w:numPr>
+        <w:spacing w:after="0"/>
+      </w:pPr>
+      <w:proofErr w:type="spellStart"/>
+      <w:r>
+        <w:rPr>
+          <w:rStyle w:val="CodigoCar"/>
+        </w:rPr>
+        <w:t>env_prefix</w:t>
+      </w:r>
+      <w:proofErr w:type="spellEnd"/>
+      <w:r>
+        <w:t xml:space="preserve">: Prefijo que le indica a </w:t>
+      </w:r>
+      <w:proofErr w:type="spellStart"/>
+      <w:r>
+        <w:t>SieveComP</w:t>
+      </w:r>
+      <w:proofErr w:type="spellEnd"/>
+      <w:r>
+        <w:t xml:space="preserve"> qué grupo de variables buscar dentro del </w:t>
+      </w:r>
+      <w:proofErr w:type="gramStart"/>
+      <w:r>
+        <w:t xml:space="preserve">archivo </w:t>
+      </w:r>
+      <w:r>
+        <w:rPr>
+          <w:rStyle w:val="CodigoCar"/>
+        </w:rPr>
+        <w:t>.</w:t>
+      </w:r>
+      <w:proofErr w:type="spellStart"/>
+      <w:r>
+        <w:rPr>
+          <w:rStyle w:val="CodigoCar"/>
+        </w:rPr>
+        <w:t>env</w:t>
+      </w:r>
+      <w:proofErr w:type="spellEnd"/>
+      <w:proofErr w:type="gramEnd"/>
+      <w:r>
+        <w:t xml:space="preserve"> (ej. al definir SERVER_SC6_, buscará SERVER_SC6_HOST, SERVER_SC6_USER, etc.).</w:t>
+      </w:r>
+    </w:p>
+    <w:p>
+      <w:pPr>
+        <w:pStyle w:val="Prrafodelista"/>
+        <w:spacing w:after="0"/>
+      </w:pPr>
+    </w:p>
+    <w:p>
+      <w:pPr>
+        <w:pStyle w:val="Ttulo3"/>
+        <w:numPr>
+          <w:ilvl w:val="2"/>
           <w:numId w:val="13"/>
         </w:numPr>
       </w:pPr>
-      <w:bookmarkStart w:id="15" w:name="_heading=h.srq65hozgm06" w:colFirst="0" w:colLast="0"/>
-      <w:bookmarkEnd w:id="15"/>
-      <w:r>
-        <w:t>PERFILES (MODELOS DE VELOCIDAD)</w:t>
-      </w:r>
-    </w:p>
-    <w:p>
-      <w:pPr>
-        <w:spacing w:after="0"/>
-      </w:pPr>
-    </w:p>
-    <w:p>
-      <w:pPr>
-        <w:spacing w:after="0"/>
-      </w:pPr>
-      <w:r>
-        <w:t>zador.</w:t>
-      </w:r>
-    </w:p>
-    <w:p>
-      <w:pPr>
-        <w:pStyle w:val="Ttulo4"/>
-        <w:numPr>
-          <w:ilvl w:val="3"/>
-          <w:numId w:val="13"/>
-        </w:numPr>
-      </w:pPr>
-      <w:r>
-        <w:t>AJUSTES MANUALES DE LOCALIZACIÓN</w:t>
-      </w:r>
-    </w:p>
-    <w:p>
-      <w:pPr>
-        <w:spacing w:after="0"/>
-      </w:pPr>
-    </w:p>
-    <w:p>
-      <w:pPr>
-        <w:spacing w:after="0"/>
-      </w:pPr>
-      <w:r>
-        <w:rPr>
-          <w:b/>
-          <w:bCs/>
-        </w:rPr>
-        <w:t>a</w:t>
-      </w:r>
-    </w:p>
-    <w:p>
-      <w:pPr>
-        <w:pStyle w:val="Ttulo4"/>
-        <w:numPr>
-          <w:ilvl w:val="3"/>
-          <w:numId w:val="13"/>
-        </w:numPr>
-      </w:pPr>
-      <w:bookmarkStart w:id="16" w:name="bookmark=id.6wp7hvpq7v39" w:colFirst="0" w:colLast="0"/>
-      <w:bookmarkStart w:id="17" w:name="_heading=h.vghvn3h95v" w:colFirst="0" w:colLast="0"/>
-      <w:bookmarkEnd w:id="16"/>
-      <w:bookmarkEnd w:id="17"/>
-      <w:r>
-        <w:t>PICADO DE FASES - PICKER</w:t>
-      </w:r>
-    </w:p>
-    <w:p>
-      <w:pPr>
-        <w:spacing w:after="0"/>
-      </w:pPr>
-      <w:r>
-        <w:t xml:space="preserve">El </w:t>
-      </w:r>
-      <w:bookmarkStart w:id="18" w:name="_heading=h.14e1fovmkkp" w:colFirst="0" w:colLast="0"/>
-      <w:bookmarkEnd w:id="18"/>
-    </w:p>
-    <w:p>
-      <w:pPr>
-        <w:spacing w:after="0"/>
-      </w:pPr>
-    </w:p>
-    <w:p>
-      <w:pPr>
-        <w:pStyle w:val="Ttulo4"/>
-        <w:numPr>
-          <w:ilvl w:val="3"/>
-          <w:numId w:val="13"/>
-        </w:numPr>
-      </w:pPr>
-      <w:bookmarkStart w:id="19" w:name="_heading=h.3sro9yodxf2c" w:colFirst="0" w:colLast="0"/>
-      <w:bookmarkEnd w:id="19"/>
-      <w:r>
-        <w:t>CÁLCULO DE MAGNITUD</w:t>
-      </w:r>
-    </w:p>
-    <w:p>
-      <w:pPr>
-        <w:spacing w:after="0"/>
-      </w:pPr>
-    </w:p>
-    <w:p>
-      <w:pPr>
-        <w:spacing w:after="0"/>
-      </w:pPr>
-      <w:r>
-        <w:t xml:space="preserve">La </w:t>
-      </w:r>
-    </w:p>
-    <w:p>
-      <w:bookmarkStart w:id="20" w:name="_heading=h.xlplvubhhrib" w:colFirst="0" w:colLast="0"/>
-      <w:bookmarkEnd w:id="20"/>
-    </w:p>
-    <w:p>
-      <w:pPr>
-        <w:pStyle w:val="Ttulo4"/>
-        <w:numPr>
-          <w:ilvl w:val="3"/>
-          <w:numId w:val="13"/>
-        </w:numPr>
-      </w:pPr>
-      <w:bookmarkStart w:id="21" w:name="_heading=h.zel6l3ljbm4o" w:colFirst="0" w:colLast="0"/>
-      <w:bookmarkEnd w:id="21"/>
-      <w:r>
-        <w:t xml:space="preserve">BOTONES RELOCATE Y COMMIT </w:t>
-      </w:r>
-    </w:p>
-    <w:p>
-      <w:pPr>
-        <w:pBdr>
-          <w:top w:val="nil"/>
-          <w:left w:val="nil"/>
-          <w:bottom w:val="nil"/>
-          <w:right w:val="nil"/>
-          <w:between w:val="nil"/>
-        </w:pBdr>
-        <w:spacing w:after="0"/>
-        <w:ind w:left="720"/>
-      </w:pPr>
-    </w:p>
-    <w:p>
-      <w:pPr>
+      <w:r>
+        <w:t>DE</w:t>
+      </w:r>
+      <w:r>
+        <w:t>CLARACIÓN DE LAS CONSULTAS (QUERIES)</w:t>
+      </w:r>
+    </w:p>
+    <w:p>
+      <w:pPr>
+        <w:spacing w:after="0"/>
+      </w:pPr>
+    </w:p>
+    <w:p>
+      <w:pPr>
+        <w:spacing w:after="0"/>
+      </w:pPr>
+      <w:r>
+        <w:t xml:space="preserve">En lugar de escribir lógica SQL dentro del TOML, </w:t>
+      </w:r>
+      <w:proofErr w:type="spellStart"/>
+      <w:r>
+        <w:t>SieveComP</w:t>
+      </w:r>
+      <w:proofErr w:type="spellEnd"/>
+      <w:r>
+        <w:t xml:space="preserve"> lee archivos .</w:t>
+      </w:r>
+      <w:proofErr w:type="spellStart"/>
+      <w:r>
+        <w:t>sql</w:t>
+      </w:r>
+      <w:proofErr w:type="spellEnd"/>
+      <w:r>
+        <w:t xml:space="preserve"> estáticos, manteniendo el código limpio.</w:t>
+      </w:r>
+    </w:p>
+    <w:p>
+      <w:pPr>
+        <w:spacing w:after="0"/>
+      </w:pPr>
+    </w:p>
+    <w:p>
+      <w:pPr>
+        <w:pStyle w:val="Codigo"/>
+      </w:pPr>
+      <w:r>
+        <w:t>[[</w:t>
+      </w:r>
+      <w:proofErr w:type="spellStart"/>
+      <w:r>
+        <w:t>queries</w:t>
+      </w:r>
+      <w:proofErr w:type="spellEnd"/>
+      <w:r>
+        <w:t>]]</w:t>
+      </w:r>
+    </w:p>
+    <w:p>
+      <w:pPr>
+        <w:pStyle w:val="Codigo"/>
+      </w:pPr>
+      <w:proofErr w:type="spellStart"/>
+      <w:r>
+        <w:t>name</w:t>
+      </w:r>
+      <w:proofErr w:type="spellEnd"/>
+      <w:r>
+        <w:t xml:space="preserve">        = "</w:t>
+      </w:r>
+      <w:proofErr w:type="spellStart"/>
+      <w:r>
+        <w:t>sismicidad_reciente</w:t>
+      </w:r>
+      <w:proofErr w:type="spellEnd"/>
+      <w:r>
+        <w:t>"</w:t>
+      </w:r>
+    </w:p>
+    <w:p>
+      <w:pPr>
+        <w:pStyle w:val="Codigo"/>
+      </w:pPr>
+      <w:proofErr w:type="spellStart"/>
+      <w:r>
+        <w:t>sql_file</w:t>
+      </w:r>
+      <w:proofErr w:type="spellEnd"/>
+      <w:r>
+        <w:t xml:space="preserve">    = "</w:t>
+      </w:r>
+      <w:proofErr w:type="spellStart"/>
+      <w:r>
+        <w:t>queries</w:t>
+      </w:r>
+      <w:proofErr w:type="spellEnd"/>
+      <w:r>
+        <w:t>/</w:t>
+      </w:r>
+      <w:proofErr w:type="spellStart"/>
+      <w:r>
+        <w:t>consulta_general.sql</w:t>
+      </w:r>
+      <w:proofErr w:type="spellEnd"/>
+      <w:r>
+        <w:t>"</w:t>
+      </w:r>
+    </w:p>
+    <w:p>
+      <w:pPr>
+        <w:pStyle w:val="Codigo"/>
+      </w:pPr>
+      <w:proofErr w:type="spellStart"/>
+      <w:r>
+        <w:t>description</w:t>
+      </w:r>
+      <w:proofErr w:type="spellEnd"/>
+      <w:r>
+        <w:t xml:space="preserve"> = "Consulta eventos de los últimos 7 días"</w:t>
+      </w:r>
+    </w:p>
+    <w:p>
+      <w:pPr>
+        <w:pStyle w:val="Codigo"/>
+      </w:pPr>
+      <w:proofErr w:type="spellStart"/>
+      <w:r>
+        <w:t>database</w:t>
+      </w:r>
+      <w:proofErr w:type="spellEnd"/>
+      <w:r>
+        <w:t xml:space="preserve">    = "Conexion_SC6"</w:t>
+      </w:r>
+    </w:p>
+    <w:p>
+      <w:pPr>
+        <w:pStyle w:val="Codigo"/>
+      </w:pPr>
+      <w:proofErr w:type="spellStart"/>
+      <w:r>
+        <w:t>skip</w:t>
+      </w:r>
+      <w:proofErr w:type="spellEnd"/>
+      <w:r>
+        <w:t xml:space="preserve">        = false</w:t>
+      </w:r>
+    </w:p>
+    <w:p>
+      <w:pPr>
+        <w:spacing w:after="0"/>
+      </w:pPr>
+    </w:p>
+    <w:p>
+      <w:pPr>
+        <w:spacing w:after="0"/>
+      </w:pPr>
+      <w:r>
+        <w:t>En donde:</w:t>
+      </w:r>
+    </w:p>
+    <w:p>
+      <w:pPr>
+        <w:pStyle w:val="Prrafodelista"/>
         <w:numPr>
           <w:ilvl w:val="0"/>
-          <w:numId w:val="38"/>
+          <w:numId w:val="45"/>
         </w:numPr>
-        <w:pBdr>
-          <w:top w:val="nil"/>
-          <w:left w:val="nil"/>
-          <w:bottom w:val="nil"/>
-          <w:right w:val="nil"/>
-          <w:between w:val="nil"/>
-        </w:pBdr>
-        <w:spacing w:after="0"/>
-        <w:rPr>
-          <w:color w:val="000000"/>
-        </w:rPr>
-      </w:pPr>
-      <w:r>
-        <w:rPr>
-          <w:b/>
-          <w:bCs/>
-        </w:rPr>
-        <w:t xml:space="preserve">Relocate: </w:t>
-      </w:r>
-    </w:p>
-    <w:p>
-      <w:pPr>
-        <w:pStyle w:val="Ttulo4"/>
+        <w:spacing w:after="0"/>
+      </w:pPr>
+      <w:proofErr w:type="spellStart"/>
+      <w:r>
+        <w:rPr>
+          <w:rStyle w:val="CodigoCar"/>
+        </w:rPr>
+        <w:t>name</w:t>
+      </w:r>
+      <w:proofErr w:type="spellEnd"/>
+      <w:r>
+        <w:t>: Etiqueta asignada a la consulta, utilizada en los reportes y registros (logs).</w:t>
+      </w:r>
+    </w:p>
+    <w:p>
+      <w:pPr>
+        <w:pStyle w:val="Prrafodelista"/>
         <w:numPr>
-          <w:ilvl w:val="3"/>
-          <w:numId w:val="13"/>
+          <w:ilvl w:val="0"/>
+          <w:numId w:val="45"/>
         </w:numPr>
-      </w:pPr>
-      <w:r>
-        <w:t>COMENTARIOS</w:t>
-      </w:r>
-    </w:p>
-    <w:p>
-      <w:r>
-        <w:t xml:space="preserve">Adicionalmente, </w:t>
+        <w:spacing w:after="0"/>
+      </w:pPr>
+      <w:proofErr w:type="spellStart"/>
+      <w:r>
+        <w:rPr>
+          <w:rStyle w:val="CodigoCar"/>
+        </w:rPr>
+        <w:t>sql_file</w:t>
+      </w:r>
+      <w:proofErr w:type="spellEnd"/>
+      <w:r>
+        <w:t>: Ruta al archivo SQL que contiene la instrucción de extracción de datos.</w:t>
+      </w:r>
+    </w:p>
+    <w:p>
+      <w:pPr>
+        <w:pStyle w:val="Prrafodelista"/>
+        <w:numPr>
+          <w:ilvl w:val="0"/>
+          <w:numId w:val="45"/>
+        </w:numPr>
+        <w:spacing w:after="0"/>
+      </w:pPr>
+      <w:proofErr w:type="spellStart"/>
+      <w:r>
+        <w:rPr>
+          <w:rStyle w:val="CodigoCar"/>
+        </w:rPr>
+        <w:t>description</w:t>
+      </w:r>
+      <w:proofErr w:type="spellEnd"/>
+      <w:r>
+        <w:t xml:space="preserve"> (Opcional): Descripción legible por humanos para documentar qué hace la consulta.</w:t>
+      </w:r>
+    </w:p>
+    <w:p>
+      <w:pPr>
+        <w:pStyle w:val="Prrafodelista"/>
+        <w:numPr>
+          <w:ilvl w:val="0"/>
+          <w:numId w:val="45"/>
+        </w:numPr>
+        <w:spacing w:after="0"/>
+      </w:pPr>
+      <w:proofErr w:type="spellStart"/>
+      <w:r>
+        <w:rPr>
+          <w:rStyle w:val="CodigoCar"/>
+        </w:rPr>
+        <w:t>database</w:t>
+      </w:r>
+      <w:proofErr w:type="spellEnd"/>
+      <w:r>
+        <w:t>: Nombre de la conexión a utilizar. Solo es opcional si existe una única base de datos configurada; de lo contrario, es obligatorio.</w:t>
+      </w:r>
+    </w:p>
+    <w:p>
+      <w:pPr>
+        <w:pStyle w:val="Prrafodelista"/>
+        <w:numPr>
+          <w:ilvl w:val="0"/>
+          <w:numId w:val="45"/>
+        </w:numPr>
+        <w:spacing w:after="0"/>
+      </w:pPr>
+      <w:proofErr w:type="spellStart"/>
+      <w:r>
+        <w:rPr>
+          <w:rStyle w:val="CodigoCar"/>
+        </w:rPr>
+        <w:t>skip</w:t>
+      </w:r>
+      <w:proofErr w:type="spellEnd"/>
+      <w:r>
+        <w:t xml:space="preserve"> (Opcional): Valor booleano (true o false). Si se define como true, la consulta se desactiva temporalmente sin necesidad de borrarla del archivo.</w:t>
       </w:r>
     </w:p>
     <w:p>
@@ -3671,30 +4812,67 @@
           <w:numId w:val="13"/>
         </w:numPr>
       </w:pPr>
-      <w:bookmarkStart w:id="22" w:name="_heading=h.d5a66na1z336" w:colFirst="0" w:colLast="0"/>
-      <w:bookmarkEnd w:id="22"/>
-      <w:r>
-        <w:t xml:space="preserve">PESTAÑA DE MAGNITUDES - </w:t>
-      </w:r>
-      <w:r>
-        <w:rPr>
-          <w:i/>
-          <w:iCs/>
-        </w:rPr>
-        <w:t>MAGNITUDES</w:t>
-      </w:r>
-    </w:p>
-    <w:p>
-      <w:pPr>
-        <w:spacing w:after="0"/>
-      </w:pPr>
-    </w:p>
-    <w:p>
-      <w:pPr>
-        <w:spacing w:after="0"/>
-      </w:pPr>
-      <w:r>
-        <w:t xml:space="preserve">Al </w:t>
+      <w:bookmarkStart w:id="16" w:name="_heading=h.74wt5utwkj2z" w:colFirst="0" w:colLast="0"/>
+      <w:bookmarkEnd w:id="16"/>
+      <w:r>
+        <w:t>TIPOS DE MAGNITUDES</w:t>
+      </w:r>
+    </w:p>
+    <w:p>
+      <w:pPr>
+        <w:spacing w:after="0"/>
+      </w:pPr>
+      <w:r>
+        <w:t>En la</w:t>
+      </w:r>
+    </w:p>
+    <w:p>
+      <w:pPr>
+        <w:spacing w:after="0"/>
+      </w:pPr>
+    </w:p>
+    <w:p>
+      <w:pPr>
+        <w:pStyle w:val="Ttulo2"/>
+        <w:numPr>
+          <w:ilvl w:val="1"/>
+          <w:numId w:val="13"/>
+        </w:numPr>
+      </w:pPr>
+      <w:bookmarkStart w:id="17" w:name="_heading=h.iefnk6ku4nun" w:colFirst="0" w:colLast="0"/>
+      <w:bookmarkEnd w:id="17"/>
+      <w:r>
+        <w:lastRenderedPageBreak/>
+        <w:t>MÓDULOS IMPLICADOS EN EL CÁLCULO DE MAGNITUDES</w:t>
+      </w:r>
+    </w:p>
+    <w:p>
+      <w:pPr>
+        <w:spacing w:after="0"/>
+      </w:pPr>
+    </w:p>
+    <w:p>
+      <w:pPr>
+        <w:spacing w:after="0"/>
+      </w:pPr>
+      <w:r>
+        <w:t xml:space="preserve">Hay dos módulos para medir amplitudes a partir de las formas de onda </w:t>
+      </w:r>
+      <w:proofErr w:type="spellStart"/>
+      <w:r>
+        <w:t>scamp</w:t>
+      </w:r>
+      <w:proofErr w:type="spellEnd"/>
+      <w:r>
+        <w:t xml:space="preserve"> y </w:t>
+      </w:r>
+      <w:proofErr w:type="spellStart"/>
+      <w:r>
+        <w:t>scautopick</w:t>
+      </w:r>
+      <w:proofErr w:type="spellEnd"/>
+      <w:r>
+        <w:t>.</w:t>
       </w:r>
     </w:p>
     <w:p>
@@ -3710,24 +4888,23 @@
           <w:numId w:val="13"/>
         </w:numPr>
       </w:pPr>
-      <w:bookmarkStart w:id="23" w:name="_heading=h.fjmgtigpox3y" w:colFirst="0" w:colLast="0"/>
-      <w:bookmarkEnd w:id="23"/>
-      <w:r>
-        <w:t>TIPOS DE MAGNITUDES CALCULADAS</w:t>
-      </w:r>
-    </w:p>
-    <w:p>
-      <w:pPr>
-        <w:spacing w:after="0"/>
-      </w:pPr>
-    </w:p>
-    <w:p>
-      <w:pPr>
-        <w:spacing w:after="0"/>
-      </w:pPr>
-      <w:r>
-        <w:lastRenderedPageBreak/>
-        <w:t xml:space="preserve">En esta </w:t>
+      <w:bookmarkStart w:id="18" w:name="_heading=h.8vy72mimtewy" w:colFirst="0" w:colLast="0"/>
+      <w:bookmarkEnd w:id="18"/>
+      <w:r>
+        <w:t>SCAMP</w:t>
+      </w:r>
+    </w:p>
+    <w:p>
+      <w:pPr>
+        <w:spacing w:after="0"/>
+      </w:pPr>
+    </w:p>
+    <w:p>
+      <w:pPr>
+        <w:spacing w:after="0"/>
+      </w:pPr>
+      <w:r>
+        <w:t>Usualmente.</w:t>
       </w:r>
     </w:p>
     <w:p>
@@ -3743,23 +4920,23 @@
           <w:numId w:val="13"/>
         </w:numPr>
       </w:pPr>
-      <w:bookmarkStart w:id="24" w:name="_heading=h.7wkkkh14jdx0" w:colFirst="0" w:colLast="0"/>
-      <w:bookmarkEnd w:id="24"/>
-      <w:r>
-        <w:t xml:space="preserve">MAPA, TABLA E INFORMACIÓN </w:t>
-      </w:r>
-    </w:p>
-    <w:p>
-      <w:pPr>
-        <w:spacing w:after="0"/>
-      </w:pPr>
-    </w:p>
-    <w:p>
-      <w:pPr>
-        <w:spacing w:after="0"/>
-      </w:pPr>
-      <w:r>
-        <w:t xml:space="preserve">El mapa </w:t>
+      <w:bookmarkStart w:id="19" w:name="_heading=h.izmv83s53jlr" w:colFirst="0" w:colLast="0"/>
+      <w:bookmarkEnd w:id="19"/>
+      <w:r>
+        <w:t>SCAUTOPICK</w:t>
+      </w:r>
+    </w:p>
+    <w:p>
+      <w:pPr>
+        <w:spacing w:after="0"/>
+      </w:pPr>
+    </w:p>
+    <w:p>
+      <w:pPr>
+        <w:spacing w:after="0"/>
+      </w:pPr>
+      <w:r>
+        <w:t>Calcula.</w:t>
       </w:r>
     </w:p>
     <w:p>
@@ -3775,26 +4952,26 @@
           <w:numId w:val="13"/>
         </w:numPr>
       </w:pPr>
-      <w:bookmarkStart w:id="25" w:name="_heading=h.a0qbyxdurqoo" w:colFirst="0" w:colLast="0"/>
-      <w:bookmarkEnd w:id="25"/>
-      <w:r>
-        <w:t>GRÁFICA DE MAGNITUD RESIDUAL</w:t>
-      </w:r>
-    </w:p>
-    <w:p>
-      <w:pPr>
-        <w:spacing w:after="0"/>
-      </w:pPr>
-    </w:p>
-    <w:p>
-      <w:pPr>
-        <w:spacing w:after="0"/>
-      </w:pPr>
-      <w:r>
-        <w:t xml:space="preserve">Esta </w:t>
-      </w:r>
-      <w:bookmarkStart w:id="26" w:name="_heading=h.kbtewncwidxs" w:colFirst="0" w:colLast="0"/>
-      <w:bookmarkEnd w:id="26"/>
+      <w:bookmarkStart w:id="20" w:name="_heading=h.5p96gx21sz41" w:colFirst="0" w:colLast="0"/>
+      <w:bookmarkEnd w:id="20"/>
+      <w:r>
+        <w:t>SCMAG</w:t>
+      </w:r>
+    </w:p>
+    <w:p>
+      <w:pPr>
+        <w:spacing w:after="0"/>
+      </w:pPr>
+    </w:p>
+    <w:p>
+      <w:pPr>
+        <w:spacing w:after="0"/>
+      </w:pPr>
+      <w:proofErr w:type="gramStart"/>
+      <w:r>
+        <w:t>En .</w:t>
+      </w:r>
+      <w:proofErr w:type="gramEnd"/>
     </w:p>
     <w:p>
       <w:pPr>
@@ -3809,169 +4986,36 @@
           <w:numId w:val="13"/>
         </w:numPr>
       </w:pPr>
-      <w:bookmarkStart w:id="27" w:name="_heading=h.yoigfwaaqngv" w:colFirst="0" w:colLast="0"/>
-      <w:bookmarkEnd w:id="27"/>
-      <w:r>
-        <w:t xml:space="preserve">BARRA DE HERRAMIENTAS </w:t>
-      </w:r>
-    </w:p>
-    <w:p>
-      <w:pPr>
-        <w:spacing w:after="0"/>
-      </w:pPr>
-    </w:p>
-    <w:p>
-      <w:pPr>
-        <w:spacing w:after="0"/>
-      </w:pPr>
-      <w:r>
-        <w:t xml:space="preserve">En la </w:t>
-      </w:r>
-    </w:p>
-    <w:p>
-      <w:pPr>
-        <w:spacing w:after="0"/>
-      </w:pPr>
-    </w:p>
-    <w:p>
-      <w:pPr>
-        <w:pStyle w:val="Ttulo3"/>
-        <w:numPr>
-          <w:ilvl w:val="2"/>
-          <w:numId w:val="13"/>
-        </w:numPr>
-      </w:pPr>
-      <w:bookmarkStart w:id="28" w:name="_heading=h.ditsi6uksrma" w:colFirst="0" w:colLast="0"/>
-      <w:bookmarkEnd w:id="28"/>
-      <w:r>
-        <w:t xml:space="preserve"> BOTÓN WAVEFORMS</w:t>
-      </w:r>
-    </w:p>
-    <w:p>
-      <w:pPr>
-        <w:spacing w:after="0"/>
-      </w:pPr>
-    </w:p>
-    <w:p>
-      <w:pPr>
-        <w:spacing w:after="0"/>
-      </w:pPr>
-      <w:r>
-        <w:t xml:space="preserve">Después </w:t>
-      </w:r>
-    </w:p>
-    <w:p>
-      <w:pPr>
-        <w:pStyle w:val="Ttulo2"/>
-        <w:numPr>
-          <w:ilvl w:val="1"/>
-          <w:numId w:val="13"/>
-        </w:numPr>
-      </w:pPr>
-      <w:bookmarkStart w:id="29" w:name="bookmark=id.631hmagv5unr" w:colFirst="0" w:colLast="0"/>
-      <w:bookmarkStart w:id="30" w:name="_heading=h.84nwi33eo4l2" w:colFirst="0" w:colLast="0"/>
-      <w:bookmarkEnd w:id="29"/>
-      <w:bookmarkEnd w:id="30"/>
-      <w:r>
-        <w:t>PESTAÑA DE EVENTO - EVENT</w:t>
-      </w:r>
-    </w:p>
-    <w:p>
-      <w:pPr>
-        <w:spacing w:after="0"/>
-      </w:pPr>
-    </w:p>
-    <w:p>
-      <w:pPr>
-        <w:spacing w:after="0"/>
-        <w:rPr>
-          <w:color w:val="000000"/>
-          <w:sz w:val="18"/>
-          <w:szCs w:val="18"/>
-        </w:rPr>
-      </w:pPr>
-      <w:r>
-        <w:t xml:space="preserve">La </w:t>
-      </w:r>
-    </w:p>
-    <w:p>
-      <w:pPr>
-        <w:pStyle w:val="Ttulo2"/>
-        <w:numPr>
-          <w:ilvl w:val="1"/>
-          <w:numId w:val="13"/>
-        </w:numPr>
-      </w:pPr>
-      <w:bookmarkStart w:id="31" w:name="_heading=h.jy9wwj7wlt1j" w:colFirst="0" w:colLast="0"/>
-      <w:bookmarkEnd w:id="31"/>
-      <w:r>
-        <w:t xml:space="preserve">PESTAÑA DE LISTADO DE EVENTOS - EVENTS </w:t>
-      </w:r>
-    </w:p>
-    <w:p>
-      <w:pPr>
-        <w:spacing w:after="0"/>
-      </w:pPr>
-    </w:p>
-    <w:p>
-      <w:pPr>
-        <w:spacing w:after="0"/>
-        <w:rPr>
-          <w:color w:val="000000"/>
-          <w:sz w:val="20"/>
-          <w:szCs w:val="20"/>
-        </w:rPr>
-      </w:pPr>
-      <w:r>
-        <w:t xml:space="preserve">En esta pestaña </w:t>
-      </w:r>
-    </w:p>
-    <w:p>
-      <w:pPr>
-        <w:pStyle w:val="Ttulo2"/>
-        <w:numPr>
-          <w:ilvl w:val="1"/>
-          <w:numId w:val="13"/>
-        </w:numPr>
-      </w:pPr>
-      <w:bookmarkStart w:id="32" w:name="_heading=h.3srs01eew5tk" w:colFirst="0" w:colLast="0"/>
-      <w:bookmarkEnd w:id="32"/>
-      <w:r>
-        <w:t xml:space="preserve">CONFIGURACIONES </w:t>
-      </w:r>
-    </w:p>
-    <w:p>
-      <w:pPr>
-        <w:spacing w:after="0"/>
-      </w:pPr>
-    </w:p>
-    <w:p>
-      <w:pPr>
-        <w:spacing w:after="0"/>
-        <w:rPr>
-          <w:color w:val="000000"/>
-          <w:sz w:val="18"/>
-          <w:szCs w:val="18"/>
-        </w:rPr>
-      </w:pPr>
-      <w:r>
-        <w:t xml:space="preserve">Todas </w:t>
-      </w:r>
-    </w:p>
-    <w:p>
-      <w:pPr>
-        <w:pBdr>
-          <w:top w:val="nil"/>
-          <w:left w:val="nil"/>
-          <w:bottom w:val="nil"/>
-          <w:right w:val="nil"/>
-          <w:between w:val="nil"/>
-        </w:pBdr>
-        <w:spacing w:line="240" w:lineRule="auto"/>
-        <w:rPr>
-          <w:color w:val="000000"/>
-          <w:sz w:val="20"/>
-          <w:szCs w:val="20"/>
+      <w:bookmarkStart w:id="21" w:name="_heading=h.337427syy9oz" w:colFirst="0" w:colLast="0"/>
+      <w:bookmarkEnd w:id="21"/>
+      <w:r>
+        <w:t>SELECCIÓN DE ALGORITMOS - MODELOS DE VELOCIDAD</w:t>
+      </w:r>
+    </w:p>
+    <w:p>
+      <w:pPr>
+        <w:spacing w:after="0"/>
+      </w:pPr>
+    </w:p>
+    <w:p>
+      <w:pPr>
+        <w:spacing w:after="0"/>
+        <w:rPr>
+          <w:b/>
+          <w:bCs/>
+        </w:rPr>
+      </w:pPr>
+      <w:r>
+        <w:t>El.</w:t>
+      </w:r>
+    </w:p>
+    <w:p>
+      <w:pPr>
+        <w:widowControl w:val="0"/>
+        <w:spacing w:after="0"/>
+        <w:rPr>
+          <w:b/>
+          <w:bCs/>
         </w:rPr>
       </w:pPr>
     </w:p>
@@ -3983,299 +5027,11 @@
           <w:numId w:val="13"/>
         </w:numPr>
       </w:pPr>
-      <w:bookmarkStart w:id="33" w:name="_heading=h.10rk36impnk7" w:colFirst="0" w:colLast="0"/>
-      <w:bookmarkEnd w:id="33"/>
-      <w:r>
-        <w:t>OTROS ELEMENTOS DE APOYO</w:t>
-      </w:r>
-    </w:p>
-    <w:p>
-      <w:pPr>
-        <w:spacing w:after="0"/>
-      </w:pPr>
-    </w:p>
-    <w:p>
-      <w:pPr>
-        <w:spacing w:after="0"/>
-      </w:pPr>
-      <w:r>
-        <w:t>A continuación</w:t>
-      </w:r>
-      <w:bookmarkStart w:id="34" w:name="_heading=h.34dwzsi3mg22" w:colFirst="0" w:colLast="0"/>
-      <w:bookmarkEnd w:id="34"/>
-      <w:r>
-        <w:t>.</w:t>
-      </w:r>
-    </w:p>
-    <w:p>
-      <w:pPr>
-        <w:pStyle w:val="Ttulo2"/>
-        <w:numPr>
-          <w:ilvl w:val="1"/>
-          <w:numId w:val="13"/>
-        </w:numPr>
-      </w:pPr>
-      <w:r>
-        <w:t>TIPOS DE ALGORITMOS</w:t>
-      </w:r>
-    </w:p>
-    <w:p>
-      <w:pPr>
-        <w:spacing w:after="0"/>
-      </w:pPr>
-    </w:p>
-    <w:p>
-      <w:pPr>
-        <w:spacing w:after="0"/>
-      </w:pPr>
-      <w:r>
-        <w:lastRenderedPageBreak/>
-        <w:t xml:space="preserve">SeisComP </w:t>
-      </w:r>
-    </w:p>
-    <w:p>
-      <w:bookmarkStart w:id="35" w:name="_heading=h.wewcnrvrahv9" w:colFirst="0" w:colLast="0"/>
-      <w:bookmarkEnd w:id="35"/>
-    </w:p>
-    <w:p>
-      <w:pPr>
-        <w:pStyle w:val="Ttulo3"/>
-        <w:numPr>
-          <w:ilvl w:val="2"/>
-          <w:numId w:val="13"/>
-        </w:numPr>
-      </w:pPr>
-      <w:bookmarkStart w:id="36" w:name="_heading=h.qyqi6q9pzbrf" w:colFirst="0" w:colLast="0"/>
-      <w:bookmarkEnd w:id="36"/>
-      <w:r>
-        <w:t>ALGORITMOS DE AGRUPACIÓN DE PICKS TIPOS DE ALGORITMOS</w:t>
-      </w:r>
-    </w:p>
-    <w:p>
-      <w:pPr>
-        <w:spacing w:after="0"/>
-      </w:pPr>
-    </w:p>
-    <w:p>
-      <w:pPr>
-        <w:spacing w:after="0"/>
-      </w:pPr>
-      <w:r>
-        <w:t xml:space="preserve">SeisComP </w:t>
-      </w:r>
-    </w:p>
-    <w:p>
-      <w:pPr>
-        <w:spacing w:after="0"/>
-      </w:pPr>
-    </w:p>
-    <w:p>
-      <w:pPr>
-        <w:pStyle w:val="Ttulo3"/>
-        <w:numPr>
-          <w:ilvl w:val="2"/>
-          <w:numId w:val="13"/>
-        </w:numPr>
-      </w:pPr>
-      <w:bookmarkStart w:id="37" w:name="_heading=h.wp0p73jnsasv" w:colFirst="0" w:colLast="0"/>
-      <w:bookmarkEnd w:id="37"/>
-      <w:r>
-        <w:t xml:space="preserve">ALGORITMOS DE LOCALIZACIÓN </w:t>
-      </w:r>
-    </w:p>
-    <w:p>
-      <w:pPr>
-        <w:spacing w:after="0"/>
-      </w:pPr>
-    </w:p>
-    <w:p>
-      <w:pPr>
-        <w:spacing w:after="0"/>
-      </w:pPr>
-      <w:r>
-        <w:t>SeisComP</w:t>
-      </w:r>
-    </w:p>
-    <w:p>
-      <w:pPr>
-        <w:spacing w:after="0"/>
-      </w:pPr>
-    </w:p>
-    <w:p>
-      <w:pPr>
-        <w:pStyle w:val="Ttulo2"/>
-        <w:numPr>
-          <w:ilvl w:val="1"/>
-          <w:numId w:val="13"/>
-        </w:numPr>
-      </w:pPr>
-      <w:bookmarkStart w:id="38" w:name="_heading=h.74wt5utwkj2z" w:colFirst="0" w:colLast="0"/>
-      <w:bookmarkEnd w:id="38"/>
-      <w:r>
-        <w:t>TIPOS DE MAGNITUDES</w:t>
-      </w:r>
-    </w:p>
-    <w:p>
-      <w:pPr>
-        <w:spacing w:after="0"/>
-      </w:pPr>
-      <w:r>
-        <w:t>En la</w:t>
-      </w:r>
-    </w:p>
-    <w:p>
-      <w:pPr>
-        <w:spacing w:after="0"/>
-      </w:pPr>
-    </w:p>
-    <w:p>
-      <w:pPr>
-        <w:pStyle w:val="Ttulo2"/>
-        <w:numPr>
-          <w:ilvl w:val="1"/>
-          <w:numId w:val="13"/>
-        </w:numPr>
-      </w:pPr>
-      <w:bookmarkStart w:id="39" w:name="_heading=h.iefnk6ku4nun" w:colFirst="0" w:colLast="0"/>
-      <w:bookmarkEnd w:id="39"/>
-      <w:r>
-        <w:t>MÓDULOS IMPLICADOS EN EL CÁLCULO DE MAGNITUDES</w:t>
-      </w:r>
-    </w:p>
-    <w:p>
-      <w:pPr>
-        <w:spacing w:after="0"/>
-      </w:pPr>
-    </w:p>
-    <w:p>
-      <w:pPr>
-        <w:spacing w:after="0"/>
-      </w:pPr>
-      <w:r>
-        <w:t>Hay dos módulos para medir amplitudes a partir de las formas de onda scamp y scautopick.</w:t>
-      </w:r>
-    </w:p>
-    <w:p>
-      <w:pPr>
-        <w:spacing w:after="0"/>
-      </w:pPr>
-    </w:p>
-    <w:p>
-      <w:pPr>
-        <w:pStyle w:val="Ttulo3"/>
-        <w:numPr>
-          <w:ilvl w:val="2"/>
-          <w:numId w:val="13"/>
-        </w:numPr>
-      </w:pPr>
-      <w:bookmarkStart w:id="40" w:name="_heading=h.8vy72mimtewy" w:colFirst="0" w:colLast="0"/>
-      <w:bookmarkEnd w:id="40"/>
-      <w:r>
-        <w:t>SCAMP</w:t>
-      </w:r>
-    </w:p>
-    <w:p>
-      <w:pPr>
-        <w:spacing w:after="0"/>
-      </w:pPr>
-    </w:p>
-    <w:p>
-      <w:pPr>
-        <w:spacing w:after="0"/>
-      </w:pPr>
-      <w:r>
-        <w:t>Usualmente.</w:t>
-      </w:r>
-    </w:p>
-    <w:p>
-      <w:pPr>
-        <w:spacing w:after="0"/>
-      </w:pPr>
-    </w:p>
-    <w:p>
-      <w:pPr>
-        <w:pStyle w:val="Ttulo3"/>
-        <w:numPr>
-          <w:ilvl w:val="2"/>
-          <w:numId w:val="13"/>
-        </w:numPr>
-      </w:pPr>
-      <w:bookmarkStart w:id="41" w:name="_heading=h.izmv83s53jlr" w:colFirst="0" w:colLast="0"/>
-      <w:bookmarkEnd w:id="41"/>
-      <w:r>
-        <w:t>SCAUTOPICK</w:t>
-      </w:r>
-    </w:p>
-    <w:p>
-      <w:pPr>
-        <w:spacing w:after="0"/>
-      </w:pPr>
-    </w:p>
-    <w:p>
-      <w:pPr>
-        <w:spacing w:after="0"/>
-      </w:pPr>
-      <w:r>
-        <w:t>Calcula.</w:t>
-      </w:r>
-    </w:p>
-    <w:p>
-      <w:pPr>
-        <w:spacing w:after="0"/>
-      </w:pPr>
-    </w:p>
-    <w:p>
-      <w:pPr>
-        <w:pStyle w:val="Ttulo3"/>
-        <w:numPr>
-          <w:ilvl w:val="2"/>
-          <w:numId w:val="13"/>
-        </w:numPr>
-      </w:pPr>
-      <w:bookmarkStart w:id="42" w:name="_heading=h.5p96gx21sz41" w:colFirst="0" w:colLast="0"/>
-      <w:bookmarkEnd w:id="42"/>
-      <w:r>
-        <w:t>SCMAG</w:t>
-      </w:r>
-    </w:p>
-    <w:p>
-      <w:pPr>
-        <w:spacing w:after="0"/>
-      </w:pPr>
-    </w:p>
-    <w:p>
-      <w:pPr>
-        <w:spacing w:after="0"/>
-      </w:pPr>
-      <w:proofErr w:type="gramStart"/>
-      <w:r>
-        <w:t>En .</w:t>
-      </w:r>
-      <w:proofErr w:type="gramEnd"/>
-    </w:p>
-    <w:p>
-      <w:pPr>
-        <w:spacing w:after="0"/>
-      </w:pPr>
-    </w:p>
-    <w:p>
-      <w:pPr>
-        <w:pStyle w:val="Ttulo3"/>
-        <w:numPr>
-          <w:ilvl w:val="2"/>
-          <w:numId w:val="13"/>
-        </w:numPr>
-      </w:pPr>
-      <w:bookmarkStart w:id="43" w:name="_heading=h.337427syy9oz" w:colFirst="0" w:colLast="0"/>
-      <w:bookmarkEnd w:id="43"/>
-      <w:r>
-        <w:t>SELECCIÓN DE ALGORITMOS - MODELOS DE VELOCIDAD</w:t>
-      </w:r>
-    </w:p>
-    <w:p>
-      <w:pPr>
-        <w:spacing w:after="0"/>
-      </w:pPr>
+      <w:bookmarkStart w:id="22" w:name="_heading=h.fnugoucc49im" w:colFirst="0" w:colLast="0"/>
+      <w:bookmarkEnd w:id="22"/>
+      <w:r>
+        <w:t>DOCUMENTOS ASOCIADOS</w:t>
+      </w:r>
     </w:p>
     <w:p>
       <w:pPr>
@@ -4285,17 +5041,30 @@
           <w:bCs/>
         </w:rPr>
       </w:pPr>
-      <w:r>
-        <w:t>El.</w:t>
-      </w:r>
-    </w:p>
-    <w:p>
-      <w:pPr>
-        <w:widowControl w:val="0"/>
-        <w:spacing w:after="0"/>
+    </w:p>
+    <w:p>
+      <w:pPr>
+        <w:spacing w:after="0"/>
+        <w:rPr>
+          <w:highlight w:val="yellow"/>
+        </w:rPr>
+      </w:pPr>
+      <w:r>
         <w:rPr>
           <w:b/>
           <w:bCs/>
+        </w:rPr>
+        <w:t>IN-</w:t>
+      </w:r>
+      <w:r>
+        <w:t xml:space="preserve"> </w:t>
+      </w:r>
+    </w:p>
+    <w:p>
+      <w:pPr>
+        <w:spacing w:after="0"/>
+        <w:rPr>
+          <w:highlight w:val="yellow"/>
         </w:rPr>
       </w:pPr>
     </w:p>
@@ -4307,58 +5076,8 @@
           <w:numId w:val="13"/>
         </w:numPr>
       </w:pPr>
-      <w:bookmarkStart w:id="44" w:name="_heading=h.fnugoucc49im" w:colFirst="0" w:colLast="0"/>
-      <w:bookmarkEnd w:id="44"/>
-      <w:r>
-        <w:lastRenderedPageBreak/>
-        <w:t>DOCUMENTOS ASOCIADOS</w:t>
-      </w:r>
-    </w:p>
-    <w:p>
-      <w:pPr>
-        <w:spacing w:after="0"/>
-        <w:rPr>
-          <w:b/>
-          <w:bCs/>
-        </w:rPr>
-      </w:pPr>
-    </w:p>
-    <w:p>
-      <w:pPr>
-        <w:spacing w:after="0"/>
-        <w:rPr>
-          <w:highlight w:val="yellow"/>
-        </w:rPr>
-      </w:pPr>
-      <w:r>
-        <w:rPr>
-          <w:b/>
-          <w:bCs/>
-        </w:rPr>
-        <w:t>IN-</w:t>
-      </w:r>
-      <w:r>
-        <w:t xml:space="preserve"> </w:t>
-      </w:r>
-    </w:p>
-    <w:p>
-      <w:pPr>
-        <w:spacing w:after="0"/>
-        <w:rPr>
-          <w:highlight w:val="yellow"/>
-        </w:rPr>
-      </w:pPr>
-    </w:p>
-    <w:p>
-      <w:pPr>
-        <w:pStyle w:val="Ttulo1"/>
-        <w:numPr>
-          <w:ilvl w:val="0"/>
-          <w:numId w:val="13"/>
-        </w:numPr>
-      </w:pPr>
-      <w:bookmarkStart w:id="45" w:name="_heading=h.36xr58wu6gih" w:colFirst="0" w:colLast="0"/>
-      <w:bookmarkEnd w:id="45"/>
+      <w:bookmarkStart w:id="23" w:name="_heading=h.36xr58wu6gih" w:colFirst="0" w:colLast="0"/>
+      <w:bookmarkEnd w:id="23"/>
       <w:r>
         <w:t>BIBLIOGRAFÍA</w:t>
       </w:r>
@@ -4371,12 +5090,57 @@
     <w:p>
       <w:pPr>
         <w:spacing w:after="0"/>
-      </w:pPr>
-      <w:r>
         <w:rPr>
           <w:lang w:val="en-US"/>
         </w:rPr>
-        <w:t xml:space="preserve">Harris, C. R., Millman, K. J., van der Walt, S. J., Gommers, R., Virtanen, P., Cournapeau, D., ... &amp; Oliphant, T. E. (2020). Array programming with NumPy. Nature, 585(7825), 357-362. doi: </w:t>
+      </w:pPr>
+      <w:r>
+        <w:rPr>
+          <w:lang w:val="en-US"/>
+        </w:rPr>
+        <w:t xml:space="preserve">Harris, C. R., Millman, K. J., van der Walt, S. J., </w:t>
+      </w:r>
+      <w:proofErr w:type="spellStart"/>
+      <w:r>
+        <w:rPr>
+          <w:lang w:val="en-US"/>
+        </w:rPr>
+        <w:t>Gommers</w:t>
+      </w:r>
+      <w:proofErr w:type="spellEnd"/>
+      <w:r>
+        <w:rPr>
+          <w:lang w:val="en-US"/>
+        </w:rPr>
+        <w:t xml:space="preserve">, R., Virtanen, P., </w:t>
+      </w:r>
+      <w:proofErr w:type="spellStart"/>
+      <w:r>
+        <w:rPr>
+          <w:lang w:val="en-US"/>
+        </w:rPr>
+        <w:t>Cournapeau</w:t>
+      </w:r>
+      <w:proofErr w:type="spellEnd"/>
+      <w:r>
+        <w:rPr>
+          <w:lang w:val="en-US"/>
+        </w:rPr>
+        <w:t xml:space="preserve">, D., ... &amp; Oliphant, T. E. (2020). Array programming with NumPy. Nature, 585(7825), 357-362. </w:t>
+      </w:r>
+      <w:proofErr w:type="spellStart"/>
+      <w:r>
+        <w:rPr>
+          <w:lang w:val="en-US"/>
+        </w:rPr>
+        <w:t>doi</w:t>
+      </w:r>
+      <w:proofErr w:type="spellEnd"/>
+      <w:r>
+        <w:rPr>
+          <w:lang w:val="en-US"/>
+        </w:rPr>
+        <w:t xml:space="preserve">: </w:t>
       </w:r>
       <w:hyperlink r:id="rId8" w:tgtFrame="_blank" w:history="1">
         <w:r>
@@ -4384,21 +5148,7 @@
             <w:rStyle w:val="Hipervnculo"/>
             <w:lang w:val="en-US"/>
           </w:rPr>
-          <w:t>https://doi.org/10.1038/s41586-020-2</w:t>
-        </w:r>
-        <w:r>
-          <w:rPr>
-            <w:rStyle w:val="Hipervnculo"/>
-            <w:lang w:val="en-US"/>
-          </w:rPr>
-          <w:t>6</w:t>
-        </w:r>
-        <w:r>
-          <w:rPr>
-            <w:rStyle w:val="Hipervnculo"/>
-            <w:lang w:val="en-US"/>
-          </w:rPr>
-          <w:t>49-2</w:t>
+          <w:t>https://doi.org/10.1038/s41586-020-2649-2</w:t>
         </w:r>
       </w:hyperlink>
     </w:p>
@@ -4413,12 +5163,29 @@
     <w:p>
       <w:pPr>
         <w:spacing w:after="0"/>
-      </w:pPr>
-      <w:r>
         <w:rPr>
           <w:lang w:val="en-US"/>
         </w:rPr>
-        <w:t xml:space="preserve">McKinney, W. (2010). Data Structures for Statistical Computing in Python. Proceedings of the 9th Python in Science Conference, 51-56. doi: </w:t>
+      </w:pPr>
+      <w:r>
+        <w:rPr>
+          <w:lang w:val="en-US"/>
+        </w:rPr>
+        <w:t xml:space="preserve">McKinney, W. (2010). Data Structures for Statistical Computing in Python. Proceedings of the 9th Python in Science Conference, 51-56. </w:t>
+      </w:r>
+      <w:proofErr w:type="spellStart"/>
+      <w:r>
+        <w:rPr>
+          <w:lang w:val="en-US"/>
+        </w:rPr>
+        <w:t>doi</w:t>
+      </w:r>
+      <w:proofErr w:type="spellEnd"/>
+      <w:r>
+        <w:rPr>
+          <w:lang w:val="en-US"/>
+        </w:rPr>
+        <w:t xml:space="preserve">: </w:t>
       </w:r>
       <w:hyperlink r:id="rId9" w:tgtFrame="_blank" w:history="1">
         <w:r>
@@ -4446,7 +5213,21 @@
         <w:rPr>
           <w:lang w:val="en-US"/>
         </w:rPr>
-        <w:t xml:space="preserve">Gillies, S., y otros. (2007). Shapely: manipulation and analysis of geometric objects. </w:t>
+        <w:t xml:space="preserve">Gillies, S., y </w:t>
+      </w:r>
+      <w:proofErr w:type="spellStart"/>
+      <w:r>
+        <w:rPr>
+          <w:lang w:val="en-US"/>
+        </w:rPr>
+        <w:t>otros</w:t>
+      </w:r>
+      <w:proofErr w:type="spellEnd"/>
+      <w:r>
+        <w:rPr>
+          <w:lang w:val="en-US"/>
+        </w:rPr>
+        <w:t xml:space="preserve">. (2007). Shapely: manipulation and analysis of geometric objects. </w:t>
       </w:r>
       <w:r>
         <w:t xml:space="preserve">Toblerity.org. Recuperado de: </w:t>
@@ -4469,17 +5250,45 @@
       <w:pPr>
         <w:spacing w:after="0"/>
       </w:pPr>
-      <w:r>
-        <w:t xml:space="preserve">Streamlit Inc. </w:t>
+      <w:proofErr w:type="spellStart"/>
+      <w:r>
+        <w:lastRenderedPageBreak/>
+        <w:t>Streamlit</w:t>
+      </w:r>
+      <w:proofErr w:type="spellEnd"/>
+      <w:r>
+        <w:t xml:space="preserve"> Inc. </w:t>
       </w:r>
       <w:r>
         <w:rPr>
           <w:lang w:val="en-US"/>
         </w:rPr>
-        <w:t xml:space="preserve">(2019). Streamlit: The fastest way to build and share data apps. </w:t>
-      </w:r>
-      <w:r>
-        <w:t xml:space="preserve">Software library. Recuperado de: </w:t>
+        <w:t xml:space="preserve">(2019). </w:t>
+      </w:r>
+      <w:proofErr w:type="spellStart"/>
+      <w:r>
+        <w:rPr>
+          <w:lang w:val="en-US"/>
+        </w:rPr>
+        <w:t>Streamlit</w:t>
+      </w:r>
+      <w:proofErr w:type="spellEnd"/>
+      <w:r>
+        <w:rPr>
+          <w:lang w:val="en-US"/>
+        </w:rPr>
+        <w:t xml:space="preserve">: The fastest way to build and share data apps. </w:t>
+      </w:r>
+      <w:r>
+        <w:t xml:space="preserve">Software </w:t>
+      </w:r>
+      <w:proofErr w:type="spellStart"/>
+      <w:r>
+        <w:t>library</w:t>
+      </w:r>
+      <w:proofErr w:type="spellEnd"/>
+      <w:r>
+        <w:t xml:space="preserve">. Recuperado de: </w:t>
       </w:r>
       <w:hyperlink r:id="rId11" w:tgtFrame="_blank" w:history="1">
         <w:r>
@@ -4513,45 +5322,107 @@
         </w:rPr>
       </w:pPr>
       <w:r>
+        <w:t xml:space="preserve">Bormann, P., &amp; Saul, J. (2008). </w:t>
+      </w:r>
+      <w:r>
         <w:rPr>
           <w:lang w:val="en-US"/>
         </w:rPr>
-        <w:t>Bormann, P., &amp; Saul, J. (2008). The new IASPEI standard broadband magnitude m B. Seismological Research Letters, 79(5), 698-705. doi: https://doi.org/10.1785/gssrl.79.5.698</w:t>
-      </w:r>
-    </w:p>
-    <w:p>
-      <w:pPr>
-        <w:spacing w:after="0"/>
+        <w:t xml:space="preserve">The new IASPEI standard broadband magnitude m B. Seismological Research Letters, 79(5), 698-705. </w:t>
+      </w:r>
+      <w:proofErr w:type="spellStart"/>
+      <w:r>
         <w:rPr>
           <w:lang w:val="en-US"/>
         </w:rPr>
-      </w:pPr>
-    </w:p>
-    <w:p>
-      <w:pPr>
-        <w:spacing w:after="0"/>
-      </w:pPr>
+        <w:t>doi</w:t>
+      </w:r>
+      <w:proofErr w:type="spellEnd"/>
       <w:r>
         <w:rPr>
           <w:lang w:val="en-US"/>
         </w:rPr>
+        <w:t>: https://doi.org/10.1785/gssrl.79.5.698</w:t>
+      </w:r>
+    </w:p>
+    <w:p>
+      <w:pPr>
+        <w:spacing w:after="0"/>
+        <w:rPr>
+          <w:lang w:val="en-US"/>
+        </w:rPr>
+      </w:pPr>
+    </w:p>
+    <w:p>
+      <w:pPr>
+        <w:spacing w:after="0"/>
+      </w:pPr>
+      <w:r>
+        <w:rPr>
+          <w:lang w:val="en-US"/>
+        </w:rPr>
         <w:t xml:space="preserve">  Brune, J. (1970). Tectonic Stress and the Spectra of Seismic Shear Waves from Earthquakes. </w:t>
       </w:r>
-      <w:r>
-        <w:t>Journal of Geophysical Research. 75 (26), 4997-5009. doi: 10.1029/JB075i026p04997</w:t>
-      </w:r>
-    </w:p>
-    <w:p>
-      <w:pPr>
-        <w:spacing w:after="0"/>
-      </w:pPr>
-    </w:p>
-    <w:p>
-      <w:pPr>
-        <w:spacing w:after="0"/>
-      </w:pPr>
-      <w:r>
-        <w:t xml:space="preserve">  Eraso, J. (2010) Cálculo de la Magnitud de Momento Mw mediante análisis espectral. Informe Interno. / Red Sismológica Nacional de Colombia - INGEOMINAS. - Bogotá </w:t>
+      <w:proofErr w:type="spellStart"/>
+      <w:r>
+        <w:t>Journal</w:t>
+      </w:r>
+      <w:proofErr w:type="spellEnd"/>
+      <w:r>
+        <w:t xml:space="preserve"> </w:t>
+      </w:r>
+      <w:proofErr w:type="spellStart"/>
+      <w:r>
+        <w:t>of</w:t>
+      </w:r>
+      <w:proofErr w:type="spellEnd"/>
+      <w:r>
+        <w:t xml:space="preserve"> </w:t>
+      </w:r>
+      <w:proofErr w:type="spellStart"/>
+      <w:r>
+        <w:t>Geophysical</w:t>
+      </w:r>
+      <w:proofErr w:type="spellEnd"/>
+      <w:r>
+        <w:t xml:space="preserve"> </w:t>
+      </w:r>
+      <w:proofErr w:type="spellStart"/>
+      <w:r>
+        <w:t>Research</w:t>
+      </w:r>
+      <w:proofErr w:type="spellEnd"/>
+      <w:r>
+        <w:t xml:space="preserve">. 75 (26), 4997-5009. </w:t>
+      </w:r>
+      <w:proofErr w:type="spellStart"/>
+      <w:r>
+        <w:t>doi</w:t>
+      </w:r>
+      <w:proofErr w:type="spellEnd"/>
+      <w:r>
+        <w:t>: 10.1029/JB075i026p04997</w:t>
+      </w:r>
+    </w:p>
+    <w:p>
+      <w:pPr>
+        <w:spacing w:after="0"/>
+      </w:pPr>
+    </w:p>
+    <w:p>
+      <w:pPr>
+        <w:spacing w:after="0"/>
+      </w:pPr>
+      <w:r>
+        <w:t xml:space="preserve">  Eraso, J. (2010) Cálculo de la Magnitud de Momento </w:t>
+      </w:r>
+      <w:proofErr w:type="spellStart"/>
+      <w:r>
+        <w:t>Mw</w:t>
+      </w:r>
+      <w:proofErr w:type="spellEnd"/>
+      <w:r>
+        <w:t xml:space="preserve"> mediante análisis espectral. Informe Interno. / Red Sismológica Nacional de Colombia - INGEOMINAS. - Bogotá </w:t>
       </w:r>
       <w:proofErr w:type="gramStart"/>
       <w:r>
@@ -4581,28 +5452,42 @@
         <w:rPr>
           <w:lang w:val="en-US"/>
         </w:rPr>
-        <w:t>Gutenberg, B. &amp; C. F. Richter (1956). Magnitude and energy of earthquakes. Annali di Geofísica. 9. 1-15. ISSN 1593-5213. doi:10.4401/ag-5590</w:t>
-      </w:r>
-    </w:p>
-    <w:p>
-      <w:pPr>
-        <w:spacing w:after="0"/>
+        <w:t xml:space="preserve">Gutenberg, B. &amp; C. F. Richter (1956). Magnitude and energy of earthquakes. Annali di </w:t>
+      </w:r>
+      <w:proofErr w:type="spellStart"/>
+      <w:r>
         <w:rPr>
           <w:lang w:val="en-US"/>
         </w:rPr>
-      </w:pPr>
-    </w:p>
-    <w:p>
-      <w:pPr>
-        <w:spacing w:after="0"/>
+        <w:t>Geofísica</w:t>
+      </w:r>
+      <w:proofErr w:type="spellEnd"/>
+      <w:r>
         <w:rPr>
           <w:lang w:val="en-US"/>
         </w:rPr>
-      </w:pPr>
-      <w:r>
+        <w:t>. 9. 1-15. ISSN 1593-5213. doi:10.4401/ag-5590</w:t>
+      </w:r>
+    </w:p>
+    <w:p>
+      <w:pPr>
+        <w:spacing w:after="0"/>
         <w:rPr>
           <w:lang w:val="en-US"/>
         </w:rPr>
+      </w:pPr>
+    </w:p>
+    <w:p>
+      <w:pPr>
+        <w:spacing w:after="0"/>
+        <w:rPr>
+          <w:lang w:val="en-US"/>
+        </w:rPr>
+      </w:pPr>
+      <w:r>
+        <w:rPr>
+          <w:lang w:val="en-US"/>
+        </w:rPr>
         <w:t xml:space="preserve">  Kanamori, H., &amp; Rivera, L. (2008</w:t>
       </w:r>
       <w:proofErr w:type="gramStart"/>
@@ -4617,30 +5502,30 @@
         <w:rPr>
           <w:lang w:val="en-US"/>
         </w:rPr>
-        <w:t xml:space="preserve"> inversion of W phase: speeding up seismic tsunami warning. Geophysical Journal International. 175 (1), 222–238. doi: https://doi.org/10.1111/j.1365-246X.2008.03887.x</w:t>
-      </w:r>
-    </w:p>
-    <w:p>
-      <w:pPr>
-        <w:spacing w:after="0"/>
+        <w:t xml:space="preserve"> inversion of W phase: speeding up seismic tsunami warning. Geophysical Journal International. 175 (1), 222–238. </w:t>
+      </w:r>
+      <w:proofErr w:type="spellStart"/>
+      <w:r>
         <w:rPr>
           <w:lang w:val="en-US"/>
         </w:rPr>
-      </w:pPr>
-    </w:p>
-    <w:p>
-      <w:pPr>
-        <w:spacing w:after="0"/>
+        <w:t>doi</w:t>
+      </w:r>
+      <w:proofErr w:type="spellEnd"/>
+      <w:r>
         <w:rPr>
           <w:lang w:val="en-US"/>
         </w:rPr>
-      </w:pPr>
-      <w:r>
+        <w:t>: https://doi.org/10.1111/j.1365-246X.2008.03887.x</w:t>
+      </w:r>
+    </w:p>
+    <w:p>
+      <w:pPr>
+        <w:spacing w:after="0"/>
         <w:rPr>
           <w:lang w:val="en-US"/>
         </w:rPr>
-        <w:t xml:space="preserve">  Kikuchi, M., &amp; Kanamori, H. (1991). Inversion of complex body waves—III. Bulletin of the Seismological Society of America. 81 (6): 2335–2350. doi: https://doi.org/10.1785/BSSA0810062335</w:t>
-      </w:r>
+      </w:pPr>
     </w:p>
     <w:p>
       <w:pPr>
@@ -4649,28 +5534,94 @@
           <w:lang w:val="en-US"/>
         </w:rPr>
       </w:pPr>
-    </w:p>
-    <w:p>
-      <w:pPr>
-        <w:spacing w:after="0"/>
+      <w:r>
         <w:rPr>
           <w:lang w:val="en-US"/>
         </w:rPr>
-      </w:pPr>
+        <w:t xml:space="preserve">  Kikuchi, M., &amp; Kanamori, H. (1991). Inversion of complex body waves—III. Bulletin of the Seismological Society of America. 81 (6): 2335–2350. </w:t>
+      </w:r>
+      <w:proofErr w:type="spellStart"/>
       <w:r>
         <w:rPr>
           <w:lang w:val="en-US"/>
         </w:rPr>
+        <w:t>doi</w:t>
+      </w:r>
+      <w:proofErr w:type="spellEnd"/>
+      <w:r>
+        <w:rPr>
+          <w:lang w:val="en-US"/>
+        </w:rPr>
+        <w:t>: https://doi.org/10.1785/BSSA0810062335</w:t>
+      </w:r>
+    </w:p>
+    <w:p>
+      <w:pPr>
+        <w:spacing w:after="0"/>
+        <w:rPr>
+          <w:lang w:val="en-US"/>
+        </w:rPr>
+      </w:pPr>
+    </w:p>
+    <w:p>
+      <w:pPr>
+        <w:spacing w:after="0"/>
+        <w:rPr>
+          <w:lang w:val="en-US"/>
+        </w:rPr>
+      </w:pPr>
+      <w:r>
+        <w:rPr>
+          <w:lang w:val="en-US"/>
+        </w:rPr>
         <w:t xml:space="preserve">  </w:t>
       </w:r>
       <w:r>
-        <w:t xml:space="preserve">Londoño, J., &amp; Romero, J. (2017). Local magnitude scale for Valle Medio del Magdalena región, Colombia. </w:t>
+        <w:t xml:space="preserve">Londoño, J., &amp; Romero, J. (2017). Local </w:t>
+      </w:r>
+      <w:proofErr w:type="spellStart"/>
+      <w:r>
+        <w:t>magnitude</w:t>
+      </w:r>
+      <w:proofErr w:type="spellEnd"/>
+      <w:r>
+        <w:t xml:space="preserve"> </w:t>
+      </w:r>
+      <w:proofErr w:type="spellStart"/>
+      <w:r>
+        <w:t>scale</w:t>
+      </w:r>
+      <w:proofErr w:type="spellEnd"/>
+      <w:r>
+        <w:t xml:space="preserve"> </w:t>
+      </w:r>
+      <w:proofErr w:type="spellStart"/>
+      <w:r>
+        <w:t>for</w:t>
+      </w:r>
+      <w:proofErr w:type="spellEnd"/>
+      <w:r>
+        <w:t xml:space="preserve"> Valle Medio del Magdalena región, Colombia. </w:t>
       </w:r>
       <w:r>
         <w:rPr>
           <w:lang w:val="en-US"/>
         </w:rPr>
-        <w:t>Journal of South American Earth Sciences. 80, 237-243. doi: https://doi.org/10.1016/j.jsames.2019.04.003</w:t>
+        <w:t xml:space="preserve">Journal of South American Earth Sciences. 80, 237-243. </w:t>
+      </w:r>
+      <w:proofErr w:type="spellStart"/>
+      <w:r>
+        <w:rPr>
+          <w:lang w:val="en-US"/>
+        </w:rPr>
+        <w:t>doi</w:t>
+      </w:r>
+      <w:proofErr w:type="spellEnd"/>
+      <w:r>
+        <w:rPr>
+          <w:lang w:val="en-US"/>
+        </w:rPr>
+        <w:t>: https://doi.org/10.1016/j.jsames.2019.04.003</w:t>
       </w:r>
     </w:p>
     <w:p>
@@ -4697,8 +5648,8 @@
           <w:numId w:val="13"/>
         </w:numPr>
       </w:pPr>
-      <w:bookmarkStart w:id="46" w:name="_heading=h.kxbtccd8dklk" w:colFirst="0" w:colLast="0"/>
-      <w:bookmarkEnd w:id="46"/>
+      <w:bookmarkStart w:id="24" w:name="_heading=h.kxbtccd8dklk" w:colFirst="0" w:colLast="0"/>
+      <w:bookmarkEnd w:id="24"/>
       <w:r>
         <w:t>HISTORIAL DE VERSIONES</w:t>
       </w:r>
@@ -4831,6 +5782,7 @@
                 <w:b/>
                 <w:bCs/>
               </w:rPr>
+              <w:lastRenderedPageBreak/>
               <w:t xml:space="preserve">Nombre: </w:t>
             </w:r>
             <w:r>
@@ -4850,8 +5802,13 @@
               <w:t xml:space="preserve">Cargo: </w:t>
             </w:r>
             <w:r>
-              <w:t>Contratista Dirección de Geoamenazas</w:t>
+              <w:t xml:space="preserve">Contratista Dirección de </w:t>
             </w:r>
+            <w:proofErr w:type="spellStart"/>
+            <w:r>
+              <w:t>Geoamenazas</w:t>
+            </w:r>
+            <w:proofErr w:type="spellEnd"/>
           </w:p>
         </w:tc>
         <w:tc>

</xml_diff>